<commit_message>
Knowledge - 3/22/2026 part 1
</commit_message>
<xml_diff>
--- a/Knowledge/2-Science/1-Formal sciences/0-Intro to Formal sciences/5-My Source/2-Formal system.docx
+++ b/Knowledge/2-Science/1-Formal sciences/0-Intro to Formal sciences/5-My Source/2-Formal system.docx
@@ -84,7 +84,27 @@
           <w:szCs w:val="18"/>
           <w:highlight w:val="lightGray"/>
         </w:rPr>
-        <w:t xml:space="preserve">: Persons Table -&gt; ID Column: 1, Name_En Column: Motasem Essam] -&gt; </w:t>
+        <w:t xml:space="preserve">: Persons Table -&gt; ID Column: 1, </w:t>
+      </w:r>
+      <w:proofErr w:type="spellStart"/>
+      <w:r>
+        <w:rPr>
+          <w:rFonts w:ascii="Arial" w:eastAsia="Arial" w:hAnsi="Arial"/>
+          <w:sz w:val="18"/>
+          <w:szCs w:val="18"/>
+          <w:highlight w:val="lightGray"/>
+        </w:rPr>
+        <w:t>Name_En</w:t>
+      </w:r>
+      <w:proofErr w:type="spellEnd"/>
+      <w:r>
+        <w:rPr>
+          <w:rFonts w:ascii="Arial" w:eastAsia="Arial" w:hAnsi="Arial"/>
+          <w:sz w:val="18"/>
+          <w:szCs w:val="18"/>
+          <w:highlight w:val="lightGray"/>
+        </w:rPr>
+        <w:t xml:space="preserve"> Column: Motasem Essam] -&gt; </w:t>
       </w:r>
       <w:r>
         <w:rPr>
@@ -487,16 +507,36 @@
           <w:sz w:val="18"/>
           <w:highlight w:val="lightGray"/>
         </w:rPr>
-        <w:t xml:space="preserve">: Persons Table -&gt; ID Column: 1, Name_En Column: Motasem Essam] -&gt; </w:t>
-      </w:r>
-      <w:r>
-        <w:rPr>
-          <w:rFonts w:ascii="Arial" w:eastAsia="Arial" w:hAnsi="Arial"/>
-          <w:b/>
+        <w:t xml:space="preserve">: Persons Table -&gt; ID Column: 1, </w:t>
+      </w:r>
+      <w:proofErr w:type="spellStart"/>
+      <w:r>
+        <w:rPr>
+          <w:rFonts w:ascii="Arial" w:eastAsia="Arial" w:hAnsi="Arial"/>
           <w:color w:val="000000"/>
           <w:sz w:val="18"/>
           <w:highlight w:val="lightGray"/>
         </w:rPr>
+        <w:t>Name_En</w:t>
+      </w:r>
+      <w:proofErr w:type="spellEnd"/>
+      <w:r>
+        <w:rPr>
+          <w:rFonts w:ascii="Arial" w:eastAsia="Arial" w:hAnsi="Arial"/>
+          <w:color w:val="000000"/>
+          <w:sz w:val="18"/>
+          <w:highlight w:val="lightGray"/>
+        </w:rPr>
+        <w:t xml:space="preserve"> Column: Motasem Essam] -&gt; </w:t>
+      </w:r>
+      <w:r>
+        <w:rPr>
+          <w:rFonts w:ascii="Arial" w:eastAsia="Arial" w:hAnsi="Arial"/>
+          <w:b/>
+          <w:color w:val="000000"/>
+          <w:sz w:val="18"/>
+          <w:highlight w:val="lightGray"/>
+        </w:rPr>
         <w:t>From:</w:t>
       </w:r>
       <w:r>
@@ -506,16 +546,36 @@
           <w:sz w:val="18"/>
           <w:highlight w:val="lightGray"/>
         </w:rPr>
-        <w:t xml:space="preserve"> [Chatgpt (GPT-4-turbo)] </w:t>
-      </w:r>
-      <w:r>
-        <w:rPr>
-          <w:rFonts w:ascii="Arial" w:eastAsia="Arial" w:hAnsi="Arial"/>
-          <w:b/>
+        <w:t xml:space="preserve"> [</w:t>
+      </w:r>
+      <w:proofErr w:type="spellStart"/>
+      <w:r>
+        <w:rPr>
+          <w:rFonts w:ascii="Arial" w:eastAsia="Arial" w:hAnsi="Arial"/>
           <w:color w:val="000000"/>
           <w:sz w:val="18"/>
           <w:highlight w:val="lightGray"/>
         </w:rPr>
+        <w:t>Chatgpt</w:t>
+      </w:r>
+      <w:proofErr w:type="spellEnd"/>
+      <w:r>
+        <w:rPr>
+          <w:rFonts w:ascii="Arial" w:eastAsia="Arial" w:hAnsi="Arial"/>
+          <w:color w:val="000000"/>
+          <w:sz w:val="18"/>
+          <w:highlight w:val="lightGray"/>
+        </w:rPr>
+        <w:t xml:space="preserve"> (GPT-4-turbo)] </w:t>
+      </w:r>
+      <w:r>
+        <w:rPr>
+          <w:rFonts w:ascii="Arial" w:eastAsia="Arial" w:hAnsi="Arial"/>
+          <w:b/>
+          <w:color w:val="000000"/>
+          <w:sz w:val="18"/>
+          <w:highlight w:val="lightGray"/>
+        </w:rPr>
         <w:t xml:space="preserve">on </w:t>
       </w:r>
       <w:r>
@@ -537,7 +597,7 @@
       </w:r>
       <w:r>
         <w:rPr>
-          <w:rFonts w:ascii="Arial" w:eastAsia="Arial" w:hAnsi="Arial" w:cs="Roboto Mono"/>
+          <w:rFonts w:ascii="Roboto Mono" w:eastAsia="Arial" w:hAnsi="Roboto Mono" w:cs="Roboto Mono"/>
         </w:rPr>
         <w:t>*A formal system is a set of rules and symbols used to generate and manipulate statements, typically in the context of logic or mathematics.</w:t>
       </w:r>
@@ -716,7 +776,27 @@
           <w:szCs w:val="18"/>
           <w:highlight w:val="lightGray"/>
         </w:rPr>
-        <w:t xml:space="preserve">: Persons Table -&gt; ID Column: 1, Name_En Column: Motasem Essam] -&gt; </w:t>
+        <w:t xml:space="preserve">: Persons Table -&gt; ID Column: 1, </w:t>
+      </w:r>
+      <w:proofErr w:type="spellStart"/>
+      <w:r>
+        <w:rPr>
+          <w:rFonts w:ascii="Arial" w:eastAsia="Arial" w:hAnsi="Arial"/>
+          <w:sz w:val="18"/>
+          <w:szCs w:val="18"/>
+          <w:highlight w:val="lightGray"/>
+        </w:rPr>
+        <w:t>Name_En</w:t>
+      </w:r>
+      <w:proofErr w:type="spellEnd"/>
+      <w:r>
+        <w:rPr>
+          <w:rFonts w:ascii="Arial" w:eastAsia="Arial" w:hAnsi="Arial"/>
+          <w:sz w:val="18"/>
+          <w:szCs w:val="18"/>
+          <w:highlight w:val="lightGray"/>
+        </w:rPr>
+        <w:t xml:space="preserve"> Column: Motasem Essam] -&gt; </w:t>
       </w:r>
       <w:r>
         <w:rPr>
@@ -857,7 +937,27 @@
           <w:szCs w:val="18"/>
           <w:highlight w:val="lightGray"/>
         </w:rPr>
-        <w:t>…semidecidable sets, respectively</w:t>
+        <w:t>…</w:t>
+      </w:r>
+      <w:proofErr w:type="spellStart"/>
+      <w:r>
+        <w:rPr>
+          <w:rFonts w:ascii="Arial" w:eastAsia="Arial" w:hAnsi="Arial"/>
+          <w:sz w:val="18"/>
+          <w:szCs w:val="18"/>
+          <w:highlight w:val="lightGray"/>
+        </w:rPr>
+        <w:t>semidecidable</w:t>
+      </w:r>
+      <w:proofErr w:type="spellEnd"/>
+      <w:r>
+        <w:rPr>
+          <w:rFonts w:ascii="Arial" w:eastAsia="Arial" w:hAnsi="Arial"/>
+          <w:sz w:val="18"/>
+          <w:szCs w:val="18"/>
+          <w:highlight w:val="lightGray"/>
+        </w:rPr>
+        <w:t xml:space="preserve"> sets, respectively</w:t>
       </w:r>
       <w:r>
         <w:rPr>
@@ -1200,7 +1300,24 @@
           <w:rFonts w:ascii="Roboto Mono" w:eastAsia="Roboto Mono" w:hAnsi="Roboto Mono" w:cs="Roboto Mono"/>
           <w:color w:val="202122"/>
         </w:rPr>
-        <w:t xml:space="preserve">In some cases an </w:t>
+        <w:lastRenderedPageBreak/>
+        <w:t xml:space="preserve">In some </w:t>
+      </w:r>
+      <w:proofErr w:type="gramStart"/>
+      <w:r>
+        <w:rPr>
+          <w:rFonts w:ascii="Roboto Mono" w:eastAsia="Roboto Mono" w:hAnsi="Roboto Mono" w:cs="Roboto Mono"/>
+          <w:color w:val="202122"/>
+        </w:rPr>
+        <w:t>cases</w:t>
+      </w:r>
+      <w:proofErr w:type="gramEnd"/>
+      <w:r>
+        <w:rPr>
+          <w:rFonts w:ascii="Roboto Mono" w:eastAsia="Roboto Mono" w:hAnsi="Roboto Mono" w:cs="Roboto Mono"/>
+          <w:color w:val="202122"/>
+        </w:rPr>
+        <w:t xml:space="preserve"> an </w:t>
       </w:r>
       <w:hyperlink r:id="rId28">
         <w:r>
@@ -1268,12 +1385,21 @@
         <w:t xml:space="preserve"> or </w:t>
       </w:r>
       <w:hyperlink r:id="rId31">
+        <w:proofErr w:type="spellStart"/>
         <w:r>
           <w:rPr>
             <w:rFonts w:ascii="Roboto Mono" w:eastAsia="Roboto Mono" w:hAnsi="Roboto Mono" w:cs="Roboto Mono"/>
             <w:color w:val="3366CC"/>
           </w:rPr>
-          <w:t>semidecidable sets</w:t>
+          <w:t>semidecidable</w:t>
+        </w:r>
+        <w:proofErr w:type="spellEnd"/>
+        <w:r>
+          <w:rPr>
+            <w:rFonts w:ascii="Roboto Mono" w:eastAsia="Roboto Mono" w:hAnsi="Roboto Mono" w:cs="Roboto Mono"/>
+            <w:color w:val="3366CC"/>
+          </w:rPr>
+          <w:t xml:space="preserve"> sets</w:t>
         </w:r>
       </w:hyperlink>
       <w:r>
@@ -1310,16 +1436,36 @@
           <w:sz w:val="18"/>
           <w:highlight w:val="lightGray"/>
         </w:rPr>
-        <w:t xml:space="preserve">: Persons Table -&gt; ID Column: 1, Name_En Column: Motasem Essam] -&gt; </w:t>
-      </w:r>
-      <w:r>
-        <w:rPr>
-          <w:rFonts w:ascii="Arial" w:eastAsia="Arial" w:hAnsi="Arial"/>
-          <w:b/>
+        <w:t xml:space="preserve">: Persons Table -&gt; ID Column: 1, </w:t>
+      </w:r>
+      <w:proofErr w:type="spellStart"/>
+      <w:r>
+        <w:rPr>
+          <w:rFonts w:ascii="Arial" w:eastAsia="Arial" w:hAnsi="Arial"/>
           <w:color w:val="000000"/>
           <w:sz w:val="18"/>
           <w:highlight w:val="lightGray"/>
         </w:rPr>
+        <w:t>Name_En</w:t>
+      </w:r>
+      <w:proofErr w:type="spellEnd"/>
+      <w:r>
+        <w:rPr>
+          <w:rFonts w:ascii="Arial" w:eastAsia="Arial" w:hAnsi="Arial"/>
+          <w:color w:val="000000"/>
+          <w:sz w:val="18"/>
+          <w:highlight w:val="lightGray"/>
+        </w:rPr>
+        <w:t xml:space="preserve"> Column: Motasem Essam] -&gt; </w:t>
+      </w:r>
+      <w:r>
+        <w:rPr>
+          <w:rFonts w:ascii="Arial" w:eastAsia="Arial" w:hAnsi="Arial"/>
+          <w:b/>
+          <w:color w:val="000000"/>
+          <w:sz w:val="18"/>
+          <w:highlight w:val="lightGray"/>
+        </w:rPr>
         <w:t>From:</w:t>
       </w:r>
       <w:r>
@@ -1329,7 +1475,27 @@
           <w:sz w:val="18"/>
           <w:highlight w:val="lightGray"/>
         </w:rPr>
-        <w:t xml:space="preserve"> [Chatgpt (GPT-4-turbo)] </w:t>
+        <w:t xml:space="preserve"> [</w:t>
+      </w:r>
+      <w:proofErr w:type="spellStart"/>
+      <w:r>
+        <w:rPr>
+          <w:rFonts w:ascii="Arial" w:eastAsia="Arial" w:hAnsi="Arial"/>
+          <w:color w:val="000000"/>
+          <w:sz w:val="18"/>
+          <w:highlight w:val="lightGray"/>
+        </w:rPr>
+        <w:t>Chatgpt</w:t>
+      </w:r>
+      <w:proofErr w:type="spellEnd"/>
+      <w:r>
+        <w:rPr>
+          <w:rFonts w:ascii="Arial" w:eastAsia="Arial" w:hAnsi="Arial"/>
+          <w:color w:val="000000"/>
+          <w:sz w:val="18"/>
+          <w:highlight w:val="lightGray"/>
+        </w:rPr>
+        <w:t xml:space="preserve"> (GPT-4-turbo)] </w:t>
       </w:r>
       <w:r>
         <w:rPr>
@@ -1565,6 +1731,7 @@
       <w:bookmarkStart w:id="2" w:name="_heading=h.u2ab22dd3jgj" w:colFirst="0" w:colLast="0"/>
       <w:bookmarkEnd w:id="2"/>
       <w:r>
+        <w:lastRenderedPageBreak/>
         <w:t xml:space="preserve">Examples </w:t>
       </w:r>
     </w:p>
@@ -1591,16 +1758,36 @@
           <w:sz w:val="18"/>
           <w:highlight w:val="lightGray"/>
         </w:rPr>
-        <w:t xml:space="preserve">: Persons Table -&gt; ID Column: 1, Name_En Column: Motasem Essam] -&gt; </w:t>
-      </w:r>
-      <w:r>
-        <w:rPr>
-          <w:rFonts w:ascii="Arial" w:eastAsia="Arial" w:hAnsi="Arial"/>
-          <w:b/>
+        <w:t xml:space="preserve">: Persons Table -&gt; ID Column: 1, </w:t>
+      </w:r>
+      <w:proofErr w:type="spellStart"/>
+      <w:r>
+        <w:rPr>
+          <w:rFonts w:ascii="Arial" w:eastAsia="Arial" w:hAnsi="Arial"/>
           <w:color w:val="000000"/>
           <w:sz w:val="18"/>
           <w:highlight w:val="lightGray"/>
         </w:rPr>
+        <w:t>Name_En</w:t>
+      </w:r>
+      <w:proofErr w:type="spellEnd"/>
+      <w:r>
+        <w:rPr>
+          <w:rFonts w:ascii="Arial" w:eastAsia="Arial" w:hAnsi="Arial"/>
+          <w:color w:val="000000"/>
+          <w:sz w:val="18"/>
+          <w:highlight w:val="lightGray"/>
+        </w:rPr>
+        <w:t xml:space="preserve"> Column: Motasem Essam] -&gt; </w:t>
+      </w:r>
+      <w:r>
+        <w:rPr>
+          <w:rFonts w:ascii="Arial" w:eastAsia="Arial" w:hAnsi="Arial"/>
+          <w:b/>
+          <w:color w:val="000000"/>
+          <w:sz w:val="18"/>
+          <w:highlight w:val="lightGray"/>
+        </w:rPr>
         <w:t>From:</w:t>
       </w:r>
       <w:r>
@@ -1610,7 +1797,27 @@
           <w:sz w:val="18"/>
           <w:highlight w:val="lightGray"/>
         </w:rPr>
-        <w:t xml:space="preserve"> [Chatgpt (GPT-4-turbo)] </w:t>
+        <w:t xml:space="preserve"> [</w:t>
+      </w:r>
+      <w:proofErr w:type="spellStart"/>
+      <w:r>
+        <w:rPr>
+          <w:rFonts w:ascii="Arial" w:eastAsia="Arial" w:hAnsi="Arial"/>
+          <w:color w:val="000000"/>
+          <w:sz w:val="18"/>
+          <w:highlight w:val="lightGray"/>
+        </w:rPr>
+        <w:t>Chatgpt</w:t>
+      </w:r>
+      <w:proofErr w:type="spellEnd"/>
+      <w:r>
+        <w:rPr>
+          <w:rFonts w:ascii="Arial" w:eastAsia="Arial" w:hAnsi="Arial"/>
+          <w:color w:val="000000"/>
+          <w:sz w:val="18"/>
+          <w:highlight w:val="lightGray"/>
+        </w:rPr>
+        <w:t xml:space="preserve"> (GPT-4-turbo)] </w:t>
       </w:r>
       <w:r>
         <w:rPr>
@@ -1870,7 +2077,27 @@
           <w:szCs w:val="18"/>
           <w:highlight w:val="lightGray"/>
         </w:rPr>
-        <w:t xml:space="preserve"> Persons Table -&gt; ID Column: 1, Name_En Column: Motasem Essam] </w:t>
+        <w:t xml:space="preserve"> Persons Table -&gt; ID Column: 1, </w:t>
+      </w:r>
+      <w:proofErr w:type="spellStart"/>
+      <w:r>
+        <w:rPr>
+          <w:rFonts w:ascii="Arial" w:eastAsia="Arial" w:hAnsi="Arial"/>
+          <w:sz w:val="18"/>
+          <w:szCs w:val="18"/>
+          <w:highlight w:val="lightGray"/>
+        </w:rPr>
+        <w:t>Name_En</w:t>
+      </w:r>
+      <w:proofErr w:type="spellEnd"/>
+      <w:r>
+        <w:rPr>
+          <w:rFonts w:ascii="Arial" w:eastAsia="Arial" w:hAnsi="Arial"/>
+          <w:sz w:val="18"/>
+          <w:szCs w:val="18"/>
+          <w:highlight w:val="lightGray"/>
+        </w:rPr>
+        <w:t xml:space="preserve"> Column: Motasem Essam] </w:t>
       </w:r>
       <w:r>
         <w:rPr>
@@ -1890,7 +2117,27 @@
           <w:szCs w:val="18"/>
           <w:highlight w:val="lightGray"/>
         </w:rPr>
-        <w:t xml:space="preserve"> Persons Table -&gt; ID Column: 1, Name_En Column: </w:t>
+        <w:t xml:space="preserve"> Persons Table -&gt; ID Column: 1, </w:t>
+      </w:r>
+      <w:proofErr w:type="spellStart"/>
+      <w:r>
+        <w:rPr>
+          <w:rFonts w:ascii="Arial" w:eastAsia="Arial" w:hAnsi="Arial"/>
+          <w:sz w:val="18"/>
+          <w:szCs w:val="18"/>
+          <w:highlight w:val="lightGray"/>
+        </w:rPr>
+        <w:t>Name_En</w:t>
+      </w:r>
+      <w:proofErr w:type="spellEnd"/>
+      <w:r>
+        <w:rPr>
+          <w:rFonts w:ascii="Arial" w:eastAsia="Arial" w:hAnsi="Arial"/>
+          <w:sz w:val="18"/>
+          <w:szCs w:val="18"/>
+          <w:highlight w:val="lightGray"/>
+        </w:rPr>
+        <w:t xml:space="preserve"> Column: </w:t>
       </w:r>
       <w:r>
         <w:rPr>
@@ -1965,8 +2212,14 @@
           <w:numId w:val="65"/>
         </w:numPr>
         <w:spacing w:after="0" w:line="276" w:lineRule="auto"/>
-      </w:pPr>
-      <w:r>
+        <w:rPr>
+          <w:rFonts w:ascii="Roboto Mono" w:hAnsi="Roboto Mono"/>
+        </w:rPr>
+      </w:pPr>
+      <w:r>
+        <w:rPr>
+          <w:rFonts w:ascii="Roboto Mono" w:hAnsi="Roboto Mono"/>
+        </w:rPr>
         <w:t>Abstract structure</w:t>
       </w:r>
     </w:p>
@@ -1978,8 +2231,14 @@
           <w:numId w:val="65"/>
         </w:numPr>
         <w:spacing w:after="0" w:line="276" w:lineRule="auto"/>
-      </w:pPr>
-      <w:r>
+        <w:rPr>
+          <w:rFonts w:ascii="Roboto Mono" w:hAnsi="Roboto Mono"/>
+        </w:rPr>
+      </w:pPr>
+      <w:r>
+        <w:rPr>
+          <w:rFonts w:ascii="Roboto Mono" w:hAnsi="Roboto Mono"/>
+        </w:rPr>
         <w:t>Formalization</w:t>
       </w:r>
     </w:p>
@@ -1991,8 +2250,14 @@
           <w:numId w:val="65"/>
         </w:numPr>
         <w:spacing w:after="0" w:line="276" w:lineRule="auto"/>
-      </w:pPr>
-      <w:r>
+        <w:rPr>
+          <w:rFonts w:ascii="Roboto Mono" w:hAnsi="Roboto Mono"/>
+        </w:rPr>
+      </w:pPr>
+      <w:r>
+        <w:rPr>
+          <w:rFonts w:ascii="Roboto Mono" w:hAnsi="Roboto Mono"/>
+        </w:rPr>
         <w:t>Axiom</w:t>
       </w:r>
     </w:p>
@@ -2004,8 +2269,14 @@
           <w:numId w:val="65"/>
         </w:numPr>
         <w:spacing w:after="0" w:line="276" w:lineRule="auto"/>
-      </w:pPr>
-      <w:r>
+        <w:rPr>
+          <w:rFonts w:ascii="Roboto Mono" w:hAnsi="Roboto Mono"/>
+        </w:rPr>
+      </w:pPr>
+      <w:r>
+        <w:rPr>
+          <w:rFonts w:ascii="Roboto Mono" w:hAnsi="Roboto Mono"/>
+        </w:rPr>
         <w:t>Axiomatic system</w:t>
       </w:r>
     </w:p>
@@ -2017,8 +2288,14 @@
           <w:numId w:val="65"/>
         </w:numPr>
         <w:spacing w:after="0" w:line="276" w:lineRule="auto"/>
-      </w:pPr>
-      <w:r>
+        <w:rPr>
+          <w:rFonts w:ascii="Roboto Mono" w:hAnsi="Roboto Mono"/>
+        </w:rPr>
+      </w:pPr>
+      <w:r>
+        <w:rPr>
+          <w:rFonts w:ascii="Roboto Mono" w:hAnsi="Roboto Mono"/>
+        </w:rPr>
         <w:t>Theorems</w:t>
       </w:r>
     </w:p>
@@ -2030,8 +2307,14 @@
           <w:numId w:val="65"/>
         </w:numPr>
         <w:spacing w:after="0" w:line="276" w:lineRule="auto"/>
-      </w:pPr>
-      <w:r>
+        <w:rPr>
+          <w:rFonts w:ascii="Roboto Mono" w:hAnsi="Roboto Mono"/>
+        </w:rPr>
+      </w:pPr>
+      <w:r>
+        <w:rPr>
+          <w:rFonts w:ascii="Roboto Mono" w:hAnsi="Roboto Mono"/>
+        </w:rPr>
         <w:t>Inference rules</w:t>
       </w:r>
     </w:p>
@@ -2114,7 +2397,27 @@
           <w:szCs w:val="18"/>
           <w:highlight w:val="lightGray"/>
         </w:rPr>
-        <w:t xml:space="preserve">: Persons Table -&gt; ID Column: 1, Name_En Column: Motasem Essam] -&gt; </w:t>
+        <w:t xml:space="preserve">: Persons Table -&gt; ID Column: 1, </w:t>
+      </w:r>
+      <w:proofErr w:type="spellStart"/>
+      <w:r>
+        <w:rPr>
+          <w:rFonts w:ascii="Arial" w:eastAsia="Arial" w:hAnsi="Arial"/>
+          <w:sz w:val="18"/>
+          <w:szCs w:val="18"/>
+          <w:highlight w:val="lightGray"/>
+        </w:rPr>
+        <w:t>Name_En</w:t>
+      </w:r>
+      <w:proofErr w:type="spellEnd"/>
+      <w:r>
+        <w:rPr>
+          <w:rFonts w:ascii="Arial" w:eastAsia="Arial" w:hAnsi="Arial"/>
+          <w:sz w:val="18"/>
+          <w:szCs w:val="18"/>
+          <w:highlight w:val="lightGray"/>
+        </w:rPr>
+        <w:t xml:space="preserve"> Column: Motasem Essam] -&gt; </w:t>
       </w:r>
       <w:r>
         <w:rPr>
@@ -2181,7 +2484,17 @@
           <w:szCs w:val="18"/>
           <w:highlight w:val="lightGray"/>
         </w:rPr>
-        <w:t xml:space="preserve">: Wiki Source - Abstract structure] -&gt; </w:t>
+        <w:t xml:space="preserve">: Wiki Source - Abstract </w:t>
+      </w:r>
+      <w:r>
+        <w:rPr>
+          <w:rFonts w:ascii="Arial" w:eastAsia="Arial" w:hAnsi="Arial"/>
+          <w:sz w:val="18"/>
+          <w:szCs w:val="18"/>
+          <w:highlight w:val="lightGray"/>
+        </w:rPr>
+        <w:lastRenderedPageBreak/>
+        <w:t xml:space="preserve">structure] -&gt; </w:t>
       </w:r>
       <w:r>
         <w:rPr>
@@ -2255,7 +2568,27 @@
           <w:szCs w:val="18"/>
           <w:highlight w:val="lightGray"/>
         </w:rPr>
-        <w:t>…Kasparovian approaches)</w:t>
+        <w:t>…</w:t>
+      </w:r>
+      <w:proofErr w:type="spellStart"/>
+      <w:r>
+        <w:rPr>
+          <w:rFonts w:ascii="Arial" w:eastAsia="Arial" w:hAnsi="Arial"/>
+          <w:sz w:val="18"/>
+          <w:szCs w:val="18"/>
+          <w:highlight w:val="lightGray"/>
+        </w:rPr>
+        <w:t>Kasparovian</w:t>
+      </w:r>
+      <w:proofErr w:type="spellEnd"/>
+      <w:r>
+        <w:rPr>
+          <w:rFonts w:ascii="Arial" w:eastAsia="Arial" w:hAnsi="Arial"/>
+          <w:sz w:val="18"/>
+          <w:szCs w:val="18"/>
+          <w:highlight w:val="lightGray"/>
+        </w:rPr>
+        <w:t xml:space="preserve"> approaches)</w:t>
       </w:r>
       <w:r>
         <w:rPr>
@@ -2596,7 +2929,23 @@
           <w:rFonts w:ascii="Roboto Mono" w:eastAsia="Roboto Mono" w:hAnsi="Roboto Mono" w:cs="Roboto Mono"/>
           <w:color w:val="202122"/>
         </w:rPr>
-        <w:t xml:space="preserve">. An abstract structure must include precise rules of behaviour which can be used to determine whether a candidate implementation actually matches the abstract structure in question, and it must be free from </w:t>
+        <w:t xml:space="preserve">. An abstract structure must include precise rules of </w:t>
+      </w:r>
+      <w:proofErr w:type="spellStart"/>
+      <w:r>
+        <w:rPr>
+          <w:rFonts w:ascii="Roboto Mono" w:eastAsia="Roboto Mono" w:hAnsi="Roboto Mono" w:cs="Roboto Mono"/>
+          <w:color w:val="202122"/>
+        </w:rPr>
+        <w:t>behaviour</w:t>
+      </w:r>
+      <w:proofErr w:type="spellEnd"/>
+      <w:r>
+        <w:rPr>
+          <w:rFonts w:ascii="Roboto Mono" w:eastAsia="Roboto Mono" w:hAnsi="Roboto Mono" w:cs="Roboto Mono"/>
+          <w:color w:val="202122"/>
+        </w:rPr>
+        <w:t xml:space="preserve"> which can be used to determine whether a candidate implementation actually matches the abstract structure in question, and it must be free from </w:t>
       </w:r>
       <w:hyperlink r:id="rId49">
         <w:r>
@@ -2631,6 +2980,7 @@
         <w:t xml:space="preserve">, but there is no room for debate over whether a given sequence of moves is or is not a valid game of chess (for example </w:t>
       </w:r>
       <w:hyperlink r:id="rId51">
+        <w:proofErr w:type="spellStart"/>
         <w:r>
           <w:rPr>
             <w:rFonts w:ascii="Roboto Mono" w:eastAsia="Roboto Mono" w:hAnsi="Roboto Mono" w:cs="Roboto Mono"/>
@@ -2638,6 +2988,7 @@
           </w:rPr>
           <w:t>Kasparovian</w:t>
         </w:r>
+        <w:proofErr w:type="spellEnd"/>
       </w:hyperlink>
       <w:r>
         <w:rPr>
@@ -2675,6 +3026,7 @@
           <w:sz w:val="18"/>
           <w:highlight w:val="lightGray"/>
         </w:rPr>
+        <w:lastRenderedPageBreak/>
         <w:t># Source: AI Source: Provided by: [Data Path</w:t>
       </w:r>
       <w:r>
@@ -2684,16 +3036,36 @@
           <w:sz w:val="18"/>
           <w:highlight w:val="lightGray"/>
         </w:rPr>
-        <w:t xml:space="preserve">: Persons Table -&gt; ID Column: 1, Name_En Column: Motasem Essam] -&gt; </w:t>
-      </w:r>
-      <w:r>
-        <w:rPr>
-          <w:rFonts w:ascii="Arial" w:eastAsia="Arial" w:hAnsi="Arial"/>
-          <w:b/>
+        <w:t xml:space="preserve">: Persons Table -&gt; ID Column: 1, </w:t>
+      </w:r>
+      <w:proofErr w:type="spellStart"/>
+      <w:r>
+        <w:rPr>
+          <w:rFonts w:ascii="Arial" w:eastAsia="Arial" w:hAnsi="Arial"/>
           <w:color w:val="000000"/>
           <w:sz w:val="18"/>
           <w:highlight w:val="lightGray"/>
         </w:rPr>
+        <w:t>Name_En</w:t>
+      </w:r>
+      <w:proofErr w:type="spellEnd"/>
+      <w:r>
+        <w:rPr>
+          <w:rFonts w:ascii="Arial" w:eastAsia="Arial" w:hAnsi="Arial"/>
+          <w:color w:val="000000"/>
+          <w:sz w:val="18"/>
+          <w:highlight w:val="lightGray"/>
+        </w:rPr>
+        <w:t xml:space="preserve"> Column: Motasem Essam] -&gt; </w:t>
+      </w:r>
+      <w:r>
+        <w:rPr>
+          <w:rFonts w:ascii="Arial" w:eastAsia="Arial" w:hAnsi="Arial"/>
+          <w:b/>
+          <w:color w:val="000000"/>
+          <w:sz w:val="18"/>
+          <w:highlight w:val="lightGray"/>
+        </w:rPr>
         <w:t>From:</w:t>
       </w:r>
       <w:r>
@@ -2703,7 +3075,27 @@
           <w:sz w:val="18"/>
           <w:highlight w:val="lightGray"/>
         </w:rPr>
-        <w:t xml:space="preserve"> [Chatgpt (GPT-4-turbo)] </w:t>
+        <w:t xml:space="preserve"> [</w:t>
+      </w:r>
+      <w:proofErr w:type="spellStart"/>
+      <w:r>
+        <w:rPr>
+          <w:rFonts w:ascii="Arial" w:eastAsia="Arial" w:hAnsi="Arial"/>
+          <w:color w:val="000000"/>
+          <w:sz w:val="18"/>
+          <w:highlight w:val="lightGray"/>
+        </w:rPr>
+        <w:t>Chatgpt</w:t>
+      </w:r>
+      <w:proofErr w:type="spellEnd"/>
+      <w:r>
+        <w:rPr>
+          <w:rFonts w:ascii="Arial" w:eastAsia="Arial" w:hAnsi="Arial"/>
+          <w:color w:val="000000"/>
+          <w:sz w:val="18"/>
+          <w:highlight w:val="lightGray"/>
+        </w:rPr>
+        <w:t xml:space="preserve"> (GPT-4-turbo)] </w:t>
       </w:r>
       <w:r>
         <w:rPr>
@@ -2991,16 +3383,36 @@
           <w:sz w:val="18"/>
           <w:highlight w:val="lightGray"/>
         </w:rPr>
-        <w:t xml:space="preserve">: Persons Table -&gt; ID Column: 1, Name_En Column: Motasem Essam] -&gt; </w:t>
-      </w:r>
-      <w:r>
-        <w:rPr>
-          <w:rFonts w:ascii="Arial" w:eastAsia="Arial" w:hAnsi="Arial"/>
-          <w:b/>
+        <w:t xml:space="preserve">: Persons Table -&gt; ID Column: 1, </w:t>
+      </w:r>
+      <w:proofErr w:type="spellStart"/>
+      <w:r>
+        <w:rPr>
+          <w:rFonts w:ascii="Arial" w:eastAsia="Arial" w:hAnsi="Arial"/>
           <w:color w:val="000000"/>
           <w:sz w:val="18"/>
           <w:highlight w:val="lightGray"/>
         </w:rPr>
+        <w:t>Name_En</w:t>
+      </w:r>
+      <w:proofErr w:type="spellEnd"/>
+      <w:r>
+        <w:rPr>
+          <w:rFonts w:ascii="Arial" w:eastAsia="Arial" w:hAnsi="Arial"/>
+          <w:color w:val="000000"/>
+          <w:sz w:val="18"/>
+          <w:highlight w:val="lightGray"/>
+        </w:rPr>
+        <w:t xml:space="preserve"> Column: Motasem Essam] -&gt; </w:t>
+      </w:r>
+      <w:r>
+        <w:rPr>
+          <w:rFonts w:ascii="Arial" w:eastAsia="Arial" w:hAnsi="Arial"/>
+          <w:b/>
+          <w:color w:val="000000"/>
+          <w:sz w:val="18"/>
+          <w:highlight w:val="lightGray"/>
+        </w:rPr>
         <w:t>From:</w:t>
       </w:r>
       <w:r>
@@ -3010,7 +3422,27 @@
           <w:sz w:val="18"/>
           <w:highlight w:val="lightGray"/>
         </w:rPr>
-        <w:t xml:space="preserve"> [Chatgpt (GPT-4-turbo)] </w:t>
+        <w:t xml:space="preserve"> [</w:t>
+      </w:r>
+      <w:proofErr w:type="spellStart"/>
+      <w:r>
+        <w:rPr>
+          <w:rFonts w:ascii="Arial" w:eastAsia="Arial" w:hAnsi="Arial"/>
+          <w:color w:val="000000"/>
+          <w:sz w:val="18"/>
+          <w:highlight w:val="lightGray"/>
+        </w:rPr>
+        <w:t>Chatgpt</w:t>
+      </w:r>
+      <w:proofErr w:type="spellEnd"/>
+      <w:r>
+        <w:rPr>
+          <w:rFonts w:ascii="Arial" w:eastAsia="Arial" w:hAnsi="Arial"/>
+          <w:color w:val="000000"/>
+          <w:sz w:val="18"/>
+          <w:highlight w:val="lightGray"/>
+        </w:rPr>
+        <w:t xml:space="preserve"> (GPT-4-turbo)] </w:t>
       </w:r>
       <w:r>
         <w:rPr>
@@ -3055,7 +3487,21 @@
         <w:rPr>
           <w:rFonts w:ascii="Roboto Mono" w:eastAsia="Roboto Mono" w:hAnsi="Roboto Mono" w:cs="Roboto Mono"/>
         </w:rPr>
-        <w:t>: The individual objects or entities that make up the structure. Or The fundamental building blocks of any abstract structure. These can be numbers, objects, data points, or abstract concepts.</w:t>
+        <w:t xml:space="preserve">: The individual objects or entities that make up the structure. Or </w:t>
+      </w:r>
+      <w:proofErr w:type="gramStart"/>
+      <w:r>
+        <w:rPr>
+          <w:rFonts w:ascii="Roboto Mono" w:eastAsia="Roboto Mono" w:hAnsi="Roboto Mono" w:cs="Roboto Mono"/>
+        </w:rPr>
+        <w:t>The</w:t>
+      </w:r>
+      <w:proofErr w:type="gramEnd"/>
+      <w:r>
+        <w:rPr>
+          <w:rFonts w:ascii="Roboto Mono" w:eastAsia="Roboto Mono" w:hAnsi="Roboto Mono" w:cs="Roboto Mono"/>
+        </w:rPr>
+        <w:t xml:space="preserve"> fundamental building blocks of any abstract structure. These can be numbers, objects, data points, or abstract concepts.</w:t>
       </w:r>
     </w:p>
     <w:p>
@@ -3081,7 +3527,21 @@
         <w:rPr>
           <w:rFonts w:ascii="Roboto Mono" w:eastAsia="Roboto Mono" w:hAnsi="Roboto Mono" w:cs="Roboto Mono"/>
         </w:rPr>
-        <w:t>: In a group (a mathematical abstract structure),In a set, the elements are the individual members of the set (e.g., integers under addition).</w:t>
+        <w:t>: In a group (a mathematical abstract structure</w:t>
+      </w:r>
+      <w:proofErr w:type="gramStart"/>
+      <w:r>
+        <w:rPr>
+          <w:rFonts w:ascii="Roboto Mono" w:eastAsia="Roboto Mono" w:hAnsi="Roboto Mono" w:cs="Roboto Mono"/>
+        </w:rPr>
+        <w:t>),In</w:t>
+      </w:r>
+      <w:proofErr w:type="gramEnd"/>
+      <w:r>
+        <w:rPr>
+          <w:rFonts w:ascii="Roboto Mono" w:eastAsia="Roboto Mono" w:hAnsi="Roboto Mono" w:cs="Roboto Mono"/>
+        </w:rPr>
+        <w:t xml:space="preserve"> a set, the elements are the individual members of the set (e.g., integers under addition).</w:t>
       </w:r>
     </w:p>
     <w:p>
@@ -3126,16 +3586,36 @@
           <w:sz w:val="18"/>
           <w:highlight w:val="lightGray"/>
         </w:rPr>
-        <w:t xml:space="preserve">: Persons Table -&gt; ID Column: 1, Name_En Column: Motasem Essam] -&gt; </w:t>
-      </w:r>
-      <w:r>
-        <w:rPr>
-          <w:rFonts w:ascii="Arial" w:eastAsia="Arial" w:hAnsi="Arial"/>
-          <w:b/>
+        <w:t xml:space="preserve">: Persons Table -&gt; ID Column: 1, </w:t>
+      </w:r>
+      <w:proofErr w:type="spellStart"/>
+      <w:r>
+        <w:rPr>
+          <w:rFonts w:ascii="Arial" w:eastAsia="Arial" w:hAnsi="Arial"/>
           <w:color w:val="000000"/>
           <w:sz w:val="18"/>
           <w:highlight w:val="lightGray"/>
         </w:rPr>
+        <w:t>Name_En</w:t>
+      </w:r>
+      <w:proofErr w:type="spellEnd"/>
+      <w:r>
+        <w:rPr>
+          <w:rFonts w:ascii="Arial" w:eastAsia="Arial" w:hAnsi="Arial"/>
+          <w:color w:val="000000"/>
+          <w:sz w:val="18"/>
+          <w:highlight w:val="lightGray"/>
+        </w:rPr>
+        <w:t xml:space="preserve"> Column: Motasem Essam] -&gt; </w:t>
+      </w:r>
+      <w:r>
+        <w:rPr>
+          <w:rFonts w:ascii="Arial" w:eastAsia="Arial" w:hAnsi="Arial"/>
+          <w:b/>
+          <w:color w:val="000000"/>
+          <w:sz w:val="18"/>
+          <w:highlight w:val="lightGray"/>
+        </w:rPr>
         <w:t>From:</w:t>
       </w:r>
       <w:r>
@@ -3145,7 +3625,27 @@
           <w:sz w:val="18"/>
           <w:highlight w:val="lightGray"/>
         </w:rPr>
-        <w:t xml:space="preserve"> [Chatgpt (GPT-4-turbo)] </w:t>
+        <w:t xml:space="preserve"> [</w:t>
+      </w:r>
+      <w:proofErr w:type="spellStart"/>
+      <w:r>
+        <w:rPr>
+          <w:rFonts w:ascii="Arial" w:eastAsia="Arial" w:hAnsi="Arial"/>
+          <w:color w:val="000000"/>
+          <w:sz w:val="18"/>
+          <w:highlight w:val="lightGray"/>
+        </w:rPr>
+        <w:t>Chatgpt</w:t>
+      </w:r>
+      <w:proofErr w:type="spellEnd"/>
+      <w:r>
+        <w:rPr>
+          <w:rFonts w:ascii="Arial" w:eastAsia="Arial" w:hAnsi="Arial"/>
+          <w:color w:val="000000"/>
+          <w:sz w:val="18"/>
+          <w:highlight w:val="lightGray"/>
+        </w:rPr>
+        <w:t xml:space="preserve"> (GPT-4-turbo)] </w:t>
       </w:r>
       <w:r>
         <w:rPr>
@@ -3184,6 +3684,7 @@
           <w:rFonts w:ascii="Roboto Mono" w:eastAsia="Roboto Mono" w:hAnsi="Roboto Mono" w:cs="Roboto Mono"/>
           <w:b/>
         </w:rPr>
+        <w:lastRenderedPageBreak/>
         <w:t>Definition</w:t>
       </w:r>
       <w:r>
@@ -3275,16 +3776,36 @@
           <w:sz w:val="18"/>
           <w:highlight w:val="lightGray"/>
         </w:rPr>
-        <w:t xml:space="preserve">: Persons Table -&gt; ID Column: 1, Name_En Column: Motasem Essam] -&gt; </w:t>
-      </w:r>
-      <w:r>
-        <w:rPr>
-          <w:rFonts w:ascii="Arial" w:eastAsia="Arial" w:hAnsi="Arial"/>
-          <w:b/>
+        <w:t xml:space="preserve">: Persons Table -&gt; ID Column: 1, </w:t>
+      </w:r>
+      <w:proofErr w:type="spellStart"/>
+      <w:r>
+        <w:rPr>
+          <w:rFonts w:ascii="Arial" w:eastAsia="Arial" w:hAnsi="Arial"/>
           <w:color w:val="000000"/>
           <w:sz w:val="18"/>
           <w:highlight w:val="lightGray"/>
         </w:rPr>
+        <w:t>Name_En</w:t>
+      </w:r>
+      <w:proofErr w:type="spellEnd"/>
+      <w:r>
+        <w:rPr>
+          <w:rFonts w:ascii="Arial" w:eastAsia="Arial" w:hAnsi="Arial"/>
+          <w:color w:val="000000"/>
+          <w:sz w:val="18"/>
+          <w:highlight w:val="lightGray"/>
+        </w:rPr>
+        <w:t xml:space="preserve"> Column: Motasem Essam] -&gt; </w:t>
+      </w:r>
+      <w:r>
+        <w:rPr>
+          <w:rFonts w:ascii="Arial" w:eastAsia="Arial" w:hAnsi="Arial"/>
+          <w:b/>
+          <w:color w:val="000000"/>
+          <w:sz w:val="18"/>
+          <w:highlight w:val="lightGray"/>
+        </w:rPr>
         <w:t>From:</w:t>
       </w:r>
       <w:r>
@@ -3294,7 +3815,27 @@
           <w:sz w:val="18"/>
           <w:highlight w:val="lightGray"/>
         </w:rPr>
-        <w:t xml:space="preserve"> [Chatgpt (GPT-4-turbo)] </w:t>
+        <w:t xml:space="preserve"> [</w:t>
+      </w:r>
+      <w:proofErr w:type="spellStart"/>
+      <w:r>
+        <w:rPr>
+          <w:rFonts w:ascii="Arial" w:eastAsia="Arial" w:hAnsi="Arial"/>
+          <w:color w:val="000000"/>
+          <w:sz w:val="18"/>
+          <w:highlight w:val="lightGray"/>
+        </w:rPr>
+        <w:t>Chatgpt</w:t>
+      </w:r>
+      <w:proofErr w:type="spellEnd"/>
+      <w:r>
+        <w:rPr>
+          <w:rFonts w:ascii="Arial" w:eastAsia="Arial" w:hAnsi="Arial"/>
+          <w:color w:val="000000"/>
+          <w:sz w:val="18"/>
+          <w:highlight w:val="lightGray"/>
+        </w:rPr>
+        <w:t xml:space="preserve"> (GPT-4-turbo)] </w:t>
       </w:r>
       <w:r>
         <w:rPr>
@@ -3402,16 +3943,36 @@
           <w:sz w:val="18"/>
           <w:highlight w:val="lightGray"/>
         </w:rPr>
-        <w:t xml:space="preserve">: Persons Table -&gt; ID Column: 1, Name_En Column: Motasem Essam] -&gt; </w:t>
-      </w:r>
-      <w:r>
-        <w:rPr>
-          <w:rFonts w:ascii="Arial" w:eastAsia="Arial" w:hAnsi="Arial"/>
-          <w:b/>
+        <w:t xml:space="preserve">: Persons Table -&gt; ID Column: 1, </w:t>
+      </w:r>
+      <w:proofErr w:type="spellStart"/>
+      <w:r>
+        <w:rPr>
+          <w:rFonts w:ascii="Arial" w:eastAsia="Arial" w:hAnsi="Arial"/>
           <w:color w:val="000000"/>
           <w:sz w:val="18"/>
           <w:highlight w:val="lightGray"/>
         </w:rPr>
+        <w:t>Name_En</w:t>
+      </w:r>
+      <w:proofErr w:type="spellEnd"/>
+      <w:r>
+        <w:rPr>
+          <w:rFonts w:ascii="Arial" w:eastAsia="Arial" w:hAnsi="Arial"/>
+          <w:color w:val="000000"/>
+          <w:sz w:val="18"/>
+          <w:highlight w:val="lightGray"/>
+        </w:rPr>
+        <w:t xml:space="preserve"> Column: Motasem Essam] -&gt; </w:t>
+      </w:r>
+      <w:r>
+        <w:rPr>
+          <w:rFonts w:ascii="Arial" w:eastAsia="Arial" w:hAnsi="Arial"/>
+          <w:b/>
+          <w:color w:val="000000"/>
+          <w:sz w:val="18"/>
+          <w:highlight w:val="lightGray"/>
+        </w:rPr>
         <w:t>From:</w:t>
       </w:r>
       <w:r>
@@ -3421,7 +3982,27 @@
           <w:sz w:val="18"/>
           <w:highlight w:val="lightGray"/>
         </w:rPr>
-        <w:t xml:space="preserve"> [Chatgpt (GPT-4-turbo)] </w:t>
+        <w:t xml:space="preserve"> [</w:t>
+      </w:r>
+      <w:proofErr w:type="spellStart"/>
+      <w:r>
+        <w:rPr>
+          <w:rFonts w:ascii="Arial" w:eastAsia="Arial" w:hAnsi="Arial"/>
+          <w:color w:val="000000"/>
+          <w:sz w:val="18"/>
+          <w:highlight w:val="lightGray"/>
+        </w:rPr>
+        <w:t>Chatgpt</w:t>
+      </w:r>
+      <w:proofErr w:type="spellEnd"/>
+      <w:r>
+        <w:rPr>
+          <w:rFonts w:ascii="Arial" w:eastAsia="Arial" w:hAnsi="Arial"/>
+          <w:color w:val="000000"/>
+          <w:sz w:val="18"/>
+          <w:highlight w:val="lightGray"/>
+        </w:rPr>
+        <w:t xml:space="preserve"> (GPT-4-turbo)] </w:t>
       </w:r>
       <w:r>
         <w:rPr>
@@ -3465,7 +4046,14 @@
         <w:rPr>
           <w:rFonts w:ascii="Roboto Mono" w:eastAsia="Roboto Mono" w:hAnsi="Roboto Mono" w:cs="Roboto Mono"/>
         </w:rPr>
-        <w:t>: The connections or associations between the elements within the structure. Or The relationships describe how elements are connected or interact with each other within the structure. This can involve hierarchy, associations, or other forms of interaction.</w:t>
+        <w:t xml:space="preserve">: The connections or associations between the elements within the structure. Or The relationships describe how elements are connected or interact with each </w:t>
+      </w:r>
+      <w:r>
+        <w:rPr>
+          <w:rFonts w:ascii="Roboto Mono" w:eastAsia="Roboto Mono" w:hAnsi="Roboto Mono" w:cs="Roboto Mono"/>
+        </w:rPr>
+        <w:lastRenderedPageBreak/>
+        <w:t>other within the structure. This can involve hierarchy, associations, or other forms of interaction.</w:t>
       </w:r>
       <w:r>
         <w:rPr>
@@ -3540,16 +4128,36 @@
           <w:sz w:val="18"/>
           <w:highlight w:val="lightGray"/>
         </w:rPr>
-        <w:t xml:space="preserve">: Persons Table -&gt; ID Column: 1, Name_En Column: Motasem Essam] -&gt; </w:t>
-      </w:r>
-      <w:r>
-        <w:rPr>
-          <w:rFonts w:ascii="Arial" w:eastAsia="Arial" w:hAnsi="Arial"/>
-          <w:b/>
+        <w:t xml:space="preserve">: Persons Table -&gt; ID Column: 1, </w:t>
+      </w:r>
+      <w:proofErr w:type="spellStart"/>
+      <w:r>
+        <w:rPr>
+          <w:rFonts w:ascii="Arial" w:eastAsia="Arial" w:hAnsi="Arial"/>
           <w:color w:val="000000"/>
           <w:sz w:val="18"/>
           <w:highlight w:val="lightGray"/>
         </w:rPr>
+        <w:t>Name_En</w:t>
+      </w:r>
+      <w:proofErr w:type="spellEnd"/>
+      <w:r>
+        <w:rPr>
+          <w:rFonts w:ascii="Arial" w:eastAsia="Arial" w:hAnsi="Arial"/>
+          <w:color w:val="000000"/>
+          <w:sz w:val="18"/>
+          <w:highlight w:val="lightGray"/>
+        </w:rPr>
+        <w:t xml:space="preserve"> Column: Motasem Essam] -&gt; </w:t>
+      </w:r>
+      <w:r>
+        <w:rPr>
+          <w:rFonts w:ascii="Arial" w:eastAsia="Arial" w:hAnsi="Arial"/>
+          <w:b/>
+          <w:color w:val="000000"/>
+          <w:sz w:val="18"/>
+          <w:highlight w:val="lightGray"/>
+        </w:rPr>
         <w:t>From:</w:t>
       </w:r>
       <w:r>
@@ -3559,7 +4167,27 @@
           <w:sz w:val="18"/>
           <w:highlight w:val="lightGray"/>
         </w:rPr>
-        <w:t xml:space="preserve"> [Chatgpt (GPT-4-turbo)] </w:t>
+        <w:t xml:space="preserve"> [</w:t>
+      </w:r>
+      <w:proofErr w:type="spellStart"/>
+      <w:r>
+        <w:rPr>
+          <w:rFonts w:ascii="Arial" w:eastAsia="Arial" w:hAnsi="Arial"/>
+          <w:color w:val="000000"/>
+          <w:sz w:val="18"/>
+          <w:highlight w:val="lightGray"/>
+        </w:rPr>
+        <w:t>Chatgpt</w:t>
+      </w:r>
+      <w:proofErr w:type="spellEnd"/>
+      <w:r>
+        <w:rPr>
+          <w:rFonts w:ascii="Arial" w:eastAsia="Arial" w:hAnsi="Arial"/>
+          <w:color w:val="000000"/>
+          <w:sz w:val="18"/>
+          <w:highlight w:val="lightGray"/>
+        </w:rPr>
+        <w:t xml:space="preserve"> (GPT-4-turbo)] </w:t>
       </w:r>
       <w:r>
         <w:rPr>
@@ -3673,16 +4301,36 @@
           <w:sz w:val="18"/>
           <w:highlight w:val="lightGray"/>
         </w:rPr>
-        <w:t xml:space="preserve">: Persons Table -&gt; ID Column: 1, Name_En Column: Motasem Essam] -&gt; </w:t>
-      </w:r>
-      <w:r>
-        <w:rPr>
-          <w:rFonts w:ascii="Arial" w:eastAsia="Arial" w:hAnsi="Arial"/>
-          <w:b/>
+        <w:t xml:space="preserve">: Persons Table -&gt; ID Column: 1, </w:t>
+      </w:r>
+      <w:proofErr w:type="spellStart"/>
+      <w:r>
+        <w:rPr>
+          <w:rFonts w:ascii="Arial" w:eastAsia="Arial" w:hAnsi="Arial"/>
           <w:color w:val="000000"/>
           <w:sz w:val="18"/>
           <w:highlight w:val="lightGray"/>
         </w:rPr>
+        <w:t>Name_En</w:t>
+      </w:r>
+      <w:proofErr w:type="spellEnd"/>
+      <w:r>
+        <w:rPr>
+          <w:rFonts w:ascii="Arial" w:eastAsia="Arial" w:hAnsi="Arial"/>
+          <w:color w:val="000000"/>
+          <w:sz w:val="18"/>
+          <w:highlight w:val="lightGray"/>
+        </w:rPr>
+        <w:t xml:space="preserve"> Column: Motasem Essam] -&gt; </w:t>
+      </w:r>
+      <w:r>
+        <w:rPr>
+          <w:rFonts w:ascii="Arial" w:eastAsia="Arial" w:hAnsi="Arial"/>
+          <w:b/>
+          <w:color w:val="000000"/>
+          <w:sz w:val="18"/>
+          <w:highlight w:val="lightGray"/>
+        </w:rPr>
         <w:t>From:</w:t>
       </w:r>
       <w:r>
@@ -3692,7 +4340,27 @@
           <w:sz w:val="18"/>
           <w:highlight w:val="lightGray"/>
         </w:rPr>
-        <w:t xml:space="preserve"> [Chatgpt (GPT-4-turbo)] </w:t>
+        <w:t xml:space="preserve"> [</w:t>
+      </w:r>
+      <w:proofErr w:type="spellStart"/>
+      <w:r>
+        <w:rPr>
+          <w:rFonts w:ascii="Arial" w:eastAsia="Arial" w:hAnsi="Arial"/>
+          <w:color w:val="000000"/>
+          <w:sz w:val="18"/>
+          <w:highlight w:val="lightGray"/>
+        </w:rPr>
+        <w:t>Chatgpt</w:t>
+      </w:r>
+      <w:proofErr w:type="spellEnd"/>
+      <w:r>
+        <w:rPr>
+          <w:rFonts w:ascii="Arial" w:eastAsia="Arial" w:hAnsi="Arial"/>
+          <w:color w:val="000000"/>
+          <w:sz w:val="18"/>
+          <w:highlight w:val="lightGray"/>
+        </w:rPr>
+        <w:t xml:space="preserve"> (GPT-4-turbo)] </w:t>
       </w:r>
       <w:r>
         <w:rPr>
@@ -3812,16 +4480,36 @@
           <w:sz w:val="18"/>
           <w:highlight w:val="lightGray"/>
         </w:rPr>
-        <w:t xml:space="preserve">: Persons Table -&gt; ID Column: 1, Name_En Column: Motasem Essam] -&gt; </w:t>
-      </w:r>
-      <w:r>
-        <w:rPr>
-          <w:rFonts w:ascii="Arial" w:eastAsia="Arial" w:hAnsi="Arial"/>
-          <w:b/>
+        <w:t xml:space="preserve">: Persons Table -&gt; ID Column: 1, </w:t>
+      </w:r>
+      <w:proofErr w:type="spellStart"/>
+      <w:r>
+        <w:rPr>
+          <w:rFonts w:ascii="Arial" w:eastAsia="Arial" w:hAnsi="Arial"/>
           <w:color w:val="000000"/>
           <w:sz w:val="18"/>
           <w:highlight w:val="lightGray"/>
         </w:rPr>
+        <w:t>Name_En</w:t>
+      </w:r>
+      <w:proofErr w:type="spellEnd"/>
+      <w:r>
+        <w:rPr>
+          <w:rFonts w:ascii="Arial" w:eastAsia="Arial" w:hAnsi="Arial"/>
+          <w:color w:val="000000"/>
+          <w:sz w:val="18"/>
+          <w:highlight w:val="lightGray"/>
+        </w:rPr>
+        <w:t xml:space="preserve"> Column: Motasem Essam] -&gt; </w:t>
+      </w:r>
+      <w:r>
+        <w:rPr>
+          <w:rFonts w:ascii="Arial" w:eastAsia="Arial" w:hAnsi="Arial"/>
+          <w:b/>
+          <w:color w:val="000000"/>
+          <w:sz w:val="18"/>
+          <w:highlight w:val="lightGray"/>
+        </w:rPr>
         <w:t>From:</w:t>
       </w:r>
       <w:r>
@@ -3831,7 +4519,27 @@
           <w:sz w:val="18"/>
           <w:highlight w:val="lightGray"/>
         </w:rPr>
-        <w:t xml:space="preserve"> [Chatgpt (GPT-4-turbo)] </w:t>
+        <w:t xml:space="preserve"> [</w:t>
+      </w:r>
+      <w:proofErr w:type="spellStart"/>
+      <w:r>
+        <w:rPr>
+          <w:rFonts w:ascii="Arial" w:eastAsia="Arial" w:hAnsi="Arial"/>
+          <w:color w:val="000000"/>
+          <w:sz w:val="18"/>
+          <w:highlight w:val="lightGray"/>
+        </w:rPr>
+        <w:t>Chatgpt</w:t>
+      </w:r>
+      <w:proofErr w:type="spellEnd"/>
+      <w:r>
+        <w:rPr>
+          <w:rFonts w:ascii="Arial" w:eastAsia="Arial" w:hAnsi="Arial"/>
+          <w:color w:val="000000"/>
+          <w:sz w:val="18"/>
+          <w:highlight w:val="lightGray"/>
+        </w:rPr>
+        <w:t xml:space="preserve"> (GPT-4-turbo)] </w:t>
       </w:r>
       <w:r>
         <w:rPr>
@@ -3875,7 +4583,14 @@
         <w:rPr>
           <w:rFonts w:ascii="Roboto Mono" w:eastAsia="Roboto Mono" w:hAnsi="Roboto Mono" w:cs="Roboto Mono"/>
         </w:rPr>
-        <w:t>: Some abstract structures require an identity or neutral element, which doesn’t change other elements when combined with them using the defined operations.</w:t>
+        <w:t xml:space="preserve">: Some abstract structures require an identity or neutral element, which doesn’t change other elements when </w:t>
+      </w:r>
+      <w:r>
+        <w:rPr>
+          <w:rFonts w:ascii="Roboto Mono" w:eastAsia="Roboto Mono" w:hAnsi="Roboto Mono" w:cs="Roboto Mono"/>
+        </w:rPr>
+        <w:lastRenderedPageBreak/>
+        <w:t>combined with them using the defined operations.</w:t>
       </w:r>
       <w:r>
         <w:rPr>
@@ -3953,16 +4668,36 @@
           <w:sz w:val="18"/>
           <w:highlight w:val="lightGray"/>
         </w:rPr>
-        <w:t xml:space="preserve">: Persons Table -&gt; ID Column: 1, Name_En Column: Motasem Essam] -&gt; </w:t>
-      </w:r>
-      <w:r>
-        <w:rPr>
-          <w:rFonts w:ascii="Arial" w:eastAsia="Arial" w:hAnsi="Arial"/>
-          <w:b/>
+        <w:t xml:space="preserve">: Persons Table -&gt; ID Column: 1, </w:t>
+      </w:r>
+      <w:proofErr w:type="spellStart"/>
+      <w:r>
+        <w:rPr>
+          <w:rFonts w:ascii="Arial" w:eastAsia="Arial" w:hAnsi="Arial"/>
           <w:color w:val="000000"/>
           <w:sz w:val="18"/>
           <w:highlight w:val="lightGray"/>
         </w:rPr>
+        <w:t>Name_En</w:t>
+      </w:r>
+      <w:proofErr w:type="spellEnd"/>
+      <w:r>
+        <w:rPr>
+          <w:rFonts w:ascii="Arial" w:eastAsia="Arial" w:hAnsi="Arial"/>
+          <w:color w:val="000000"/>
+          <w:sz w:val="18"/>
+          <w:highlight w:val="lightGray"/>
+        </w:rPr>
+        <w:t xml:space="preserve"> Column: Motasem Essam] -&gt; </w:t>
+      </w:r>
+      <w:r>
+        <w:rPr>
+          <w:rFonts w:ascii="Arial" w:eastAsia="Arial" w:hAnsi="Arial"/>
+          <w:b/>
+          <w:color w:val="000000"/>
+          <w:sz w:val="18"/>
+          <w:highlight w:val="lightGray"/>
+        </w:rPr>
         <w:t>From:</w:t>
       </w:r>
       <w:r>
@@ -3972,7 +4707,27 @@
           <w:sz w:val="18"/>
           <w:highlight w:val="lightGray"/>
         </w:rPr>
-        <w:t xml:space="preserve"> [Chatgpt (GPT-4-turbo)] </w:t>
+        <w:t xml:space="preserve"> [</w:t>
+      </w:r>
+      <w:proofErr w:type="spellStart"/>
+      <w:r>
+        <w:rPr>
+          <w:rFonts w:ascii="Arial" w:eastAsia="Arial" w:hAnsi="Arial"/>
+          <w:color w:val="000000"/>
+          <w:sz w:val="18"/>
+          <w:highlight w:val="lightGray"/>
+        </w:rPr>
+        <w:t>Chatgpt</w:t>
+      </w:r>
+      <w:proofErr w:type="spellEnd"/>
+      <w:r>
+        <w:rPr>
+          <w:rFonts w:ascii="Arial" w:eastAsia="Arial" w:hAnsi="Arial"/>
+          <w:color w:val="000000"/>
+          <w:sz w:val="18"/>
+          <w:highlight w:val="lightGray"/>
+        </w:rPr>
+        <w:t xml:space="preserve"> (GPT-4-turbo)] </w:t>
       </w:r>
       <w:r>
         <w:rPr>
@@ -4094,16 +4849,36 @@
           <w:sz w:val="18"/>
           <w:highlight w:val="lightGray"/>
         </w:rPr>
-        <w:t xml:space="preserve">: Persons Table -&gt; ID Column: 1, Name_En Column: Motasem Essam] -&gt; </w:t>
-      </w:r>
-      <w:r>
-        <w:rPr>
-          <w:rFonts w:ascii="Arial" w:eastAsia="Arial" w:hAnsi="Arial"/>
-          <w:b/>
+        <w:t xml:space="preserve">: Persons Table -&gt; ID Column: 1, </w:t>
+      </w:r>
+      <w:proofErr w:type="spellStart"/>
+      <w:r>
+        <w:rPr>
+          <w:rFonts w:ascii="Arial" w:eastAsia="Arial" w:hAnsi="Arial"/>
           <w:color w:val="000000"/>
           <w:sz w:val="18"/>
           <w:highlight w:val="lightGray"/>
         </w:rPr>
+        <w:t>Name_En</w:t>
+      </w:r>
+      <w:proofErr w:type="spellEnd"/>
+      <w:r>
+        <w:rPr>
+          <w:rFonts w:ascii="Arial" w:eastAsia="Arial" w:hAnsi="Arial"/>
+          <w:color w:val="000000"/>
+          <w:sz w:val="18"/>
+          <w:highlight w:val="lightGray"/>
+        </w:rPr>
+        <w:t xml:space="preserve"> Column: Motasem Essam] -&gt; </w:t>
+      </w:r>
+      <w:r>
+        <w:rPr>
+          <w:rFonts w:ascii="Arial" w:eastAsia="Arial" w:hAnsi="Arial"/>
+          <w:b/>
+          <w:color w:val="000000"/>
+          <w:sz w:val="18"/>
+          <w:highlight w:val="lightGray"/>
+        </w:rPr>
         <w:t>From:</w:t>
       </w:r>
       <w:r>
@@ -4113,7 +4888,27 @@
           <w:sz w:val="18"/>
           <w:highlight w:val="lightGray"/>
         </w:rPr>
-        <w:t xml:space="preserve"> [Chatgpt (GPT-4-turbo)] </w:t>
+        <w:t xml:space="preserve"> [</w:t>
+      </w:r>
+      <w:proofErr w:type="spellStart"/>
+      <w:r>
+        <w:rPr>
+          <w:rFonts w:ascii="Arial" w:eastAsia="Arial" w:hAnsi="Arial"/>
+          <w:color w:val="000000"/>
+          <w:sz w:val="18"/>
+          <w:highlight w:val="lightGray"/>
+        </w:rPr>
+        <w:t>Chatgpt</w:t>
+      </w:r>
+      <w:proofErr w:type="spellEnd"/>
+      <w:r>
+        <w:rPr>
+          <w:rFonts w:ascii="Arial" w:eastAsia="Arial" w:hAnsi="Arial"/>
+          <w:color w:val="000000"/>
+          <w:sz w:val="18"/>
+          <w:highlight w:val="lightGray"/>
+        </w:rPr>
+        <w:t xml:space="preserve"> (GPT-4-turbo)] </w:t>
       </w:r>
       <w:r>
         <w:rPr>
@@ -4248,16 +5043,36 @@
           <w:sz w:val="18"/>
           <w:highlight w:val="lightGray"/>
         </w:rPr>
-        <w:t xml:space="preserve">: Persons Table -&gt; ID Column: 1, Name_En Column: Motasem Essam] -&gt; </w:t>
-      </w:r>
-      <w:r>
-        <w:rPr>
-          <w:rFonts w:ascii="Arial" w:eastAsia="Arial" w:hAnsi="Arial"/>
-          <w:b/>
+        <w:t xml:space="preserve">: Persons Table -&gt; ID Column: 1, </w:t>
+      </w:r>
+      <w:proofErr w:type="spellStart"/>
+      <w:r>
+        <w:rPr>
+          <w:rFonts w:ascii="Arial" w:eastAsia="Arial" w:hAnsi="Arial"/>
           <w:color w:val="000000"/>
           <w:sz w:val="18"/>
           <w:highlight w:val="lightGray"/>
         </w:rPr>
+        <w:t>Name_En</w:t>
+      </w:r>
+      <w:proofErr w:type="spellEnd"/>
+      <w:r>
+        <w:rPr>
+          <w:rFonts w:ascii="Arial" w:eastAsia="Arial" w:hAnsi="Arial"/>
+          <w:color w:val="000000"/>
+          <w:sz w:val="18"/>
+          <w:highlight w:val="lightGray"/>
+        </w:rPr>
+        <w:t xml:space="preserve"> Column: Motasem Essam] -&gt; </w:t>
+      </w:r>
+      <w:r>
+        <w:rPr>
+          <w:rFonts w:ascii="Arial" w:eastAsia="Arial" w:hAnsi="Arial"/>
+          <w:b/>
+          <w:color w:val="000000"/>
+          <w:sz w:val="18"/>
+          <w:highlight w:val="lightGray"/>
+        </w:rPr>
         <w:t>From:</w:t>
       </w:r>
       <w:r>
@@ -4267,7 +5082,27 @@
           <w:sz w:val="18"/>
           <w:highlight w:val="lightGray"/>
         </w:rPr>
-        <w:t xml:space="preserve"> [Chatgpt (GPT-4-turbo)] </w:t>
+        <w:t xml:space="preserve"> [</w:t>
+      </w:r>
+      <w:proofErr w:type="spellStart"/>
+      <w:r>
+        <w:rPr>
+          <w:rFonts w:ascii="Arial" w:eastAsia="Arial" w:hAnsi="Arial"/>
+          <w:color w:val="000000"/>
+          <w:sz w:val="18"/>
+          <w:highlight w:val="lightGray"/>
+        </w:rPr>
+        <w:t>Chatgpt</w:t>
+      </w:r>
+      <w:proofErr w:type="spellEnd"/>
+      <w:r>
+        <w:rPr>
+          <w:rFonts w:ascii="Arial" w:eastAsia="Arial" w:hAnsi="Arial"/>
+          <w:color w:val="000000"/>
+          <w:sz w:val="18"/>
+          <w:highlight w:val="lightGray"/>
+        </w:rPr>
+        <w:t xml:space="preserve"> (GPT-4-turbo)] </w:t>
       </w:r>
       <w:r>
         <w:rPr>
@@ -4305,6 +5140,7 @@
           <w:rFonts w:ascii="Roboto Mono" w:eastAsia="Roboto Mono" w:hAnsi="Roboto Mono" w:cs="Roboto Mono"/>
           <w:b/>
         </w:rPr>
+        <w:lastRenderedPageBreak/>
         <w:t>Definition</w:t>
       </w:r>
       <w:r>
@@ -4482,7 +5318,27 @@
           <w:szCs w:val="18"/>
           <w:highlight w:val="lightGray"/>
         </w:rPr>
-        <w:t xml:space="preserve">: Persons Table -&gt; ID Column: 1, Name_En Column: Motasem Essam] -&gt; </w:t>
+        <w:t xml:space="preserve">: Persons Table -&gt; ID Column: 1, </w:t>
+      </w:r>
+      <w:proofErr w:type="spellStart"/>
+      <w:r>
+        <w:rPr>
+          <w:rFonts w:ascii="Arial" w:eastAsia="Arial" w:hAnsi="Arial"/>
+          <w:sz w:val="18"/>
+          <w:szCs w:val="18"/>
+          <w:highlight w:val="lightGray"/>
+        </w:rPr>
+        <w:t>Name_En</w:t>
+      </w:r>
+      <w:proofErr w:type="spellEnd"/>
+      <w:r>
+        <w:rPr>
+          <w:rFonts w:ascii="Arial" w:eastAsia="Arial" w:hAnsi="Arial"/>
+          <w:sz w:val="18"/>
+          <w:szCs w:val="18"/>
+          <w:highlight w:val="lightGray"/>
+        </w:rPr>
+        <w:t xml:space="preserve"> Column: Motasem Essam] -&gt; </w:t>
       </w:r>
       <w:r>
         <w:rPr>
@@ -4844,6 +5700,7 @@
           <w:rFonts w:ascii="Roboto Mono" w:eastAsia="Roboto Mono" w:hAnsi="Roboto Mono" w:cs="Roboto Mono"/>
           <w:color w:val="202122"/>
         </w:rPr>
+        <w:lastRenderedPageBreak/>
         <w:t xml:space="preserve">A </w:t>
       </w:r>
       <w:hyperlink r:id="rId59">
@@ -4914,16 +5771,36 @@
           <w:sz w:val="18"/>
           <w:highlight w:val="lightGray"/>
         </w:rPr>
-        <w:t xml:space="preserve">: Persons Table -&gt; ID Column: 1, Name_En Column: Motasem Essam] -&gt; </w:t>
-      </w:r>
-      <w:r>
-        <w:rPr>
-          <w:rFonts w:ascii="Arial" w:eastAsia="Arial" w:hAnsi="Arial"/>
-          <w:b/>
+        <w:t xml:space="preserve">: Persons Table -&gt; ID Column: 1, </w:t>
+      </w:r>
+      <w:proofErr w:type="spellStart"/>
+      <w:r>
+        <w:rPr>
+          <w:rFonts w:ascii="Arial" w:eastAsia="Arial" w:hAnsi="Arial"/>
           <w:color w:val="000000"/>
           <w:sz w:val="18"/>
           <w:highlight w:val="lightGray"/>
         </w:rPr>
+        <w:t>Name_En</w:t>
+      </w:r>
+      <w:proofErr w:type="spellEnd"/>
+      <w:r>
+        <w:rPr>
+          <w:rFonts w:ascii="Arial" w:eastAsia="Arial" w:hAnsi="Arial"/>
+          <w:color w:val="000000"/>
+          <w:sz w:val="18"/>
+          <w:highlight w:val="lightGray"/>
+        </w:rPr>
+        <w:t xml:space="preserve"> Column: Motasem Essam] -&gt; </w:t>
+      </w:r>
+      <w:r>
+        <w:rPr>
+          <w:rFonts w:ascii="Arial" w:eastAsia="Arial" w:hAnsi="Arial"/>
+          <w:b/>
+          <w:color w:val="000000"/>
+          <w:sz w:val="18"/>
+          <w:highlight w:val="lightGray"/>
+        </w:rPr>
         <w:t>From:</w:t>
       </w:r>
       <w:r>
@@ -4933,7 +5810,27 @@
           <w:sz w:val="18"/>
           <w:highlight w:val="lightGray"/>
         </w:rPr>
-        <w:t xml:space="preserve"> [Chatgpt (GPT-4-turbo)] </w:t>
+        <w:t xml:space="preserve"> [</w:t>
+      </w:r>
+      <w:proofErr w:type="spellStart"/>
+      <w:r>
+        <w:rPr>
+          <w:rFonts w:ascii="Arial" w:eastAsia="Arial" w:hAnsi="Arial"/>
+          <w:color w:val="000000"/>
+          <w:sz w:val="18"/>
+          <w:highlight w:val="lightGray"/>
+        </w:rPr>
+        <w:t>Chatgpt</w:t>
+      </w:r>
+      <w:proofErr w:type="spellEnd"/>
+      <w:r>
+        <w:rPr>
+          <w:rFonts w:ascii="Arial" w:eastAsia="Arial" w:hAnsi="Arial"/>
+          <w:color w:val="000000"/>
+          <w:sz w:val="18"/>
+          <w:highlight w:val="lightGray"/>
+        </w:rPr>
+        <w:t xml:space="preserve"> (GPT-4-turbo)] </w:t>
       </w:r>
       <w:r>
         <w:rPr>
@@ -5031,7 +5928,21 @@
         <w:rPr>
           <w:rFonts w:ascii="Roboto Mono" w:eastAsia="Roboto Mono" w:hAnsi="Roboto Mono" w:cs="Roboto Mono"/>
         </w:rPr>
-        <w:t>Example: Set of natural numbers {1,2,3,…}</w:t>
+        <w:t>Example: Set of natural numbers {1,</w:t>
+      </w:r>
+      <w:proofErr w:type="gramStart"/>
+      <w:r>
+        <w:rPr>
+          <w:rFonts w:ascii="Roboto Mono" w:eastAsia="Roboto Mono" w:hAnsi="Roboto Mono" w:cs="Roboto Mono"/>
+        </w:rPr>
+        <w:t>2,3,…</w:t>
+      </w:r>
+      <w:proofErr w:type="gramEnd"/>
+      <w:r>
+        <w:rPr>
+          <w:rFonts w:ascii="Roboto Mono" w:eastAsia="Roboto Mono" w:hAnsi="Roboto Mono" w:cs="Roboto Mono"/>
+        </w:rPr>
+        <w:t>}</w:t>
       </w:r>
     </w:p>
     <w:p>
@@ -5100,7 +6011,21 @@
         <w:rPr>
           <w:rFonts w:ascii="Roboto Mono" w:eastAsia="Roboto Mono" w:hAnsi="Roboto Mono" w:cs="Roboto Mono"/>
         </w:rPr>
-        <w:t>Example: The set of integers with addition as the operation (Z,+).</w:t>
+        <w:t>Example: The set of integers with addition as the operation (</w:t>
+      </w:r>
+      <w:proofErr w:type="gramStart"/>
+      <w:r>
+        <w:rPr>
+          <w:rFonts w:ascii="Roboto Mono" w:eastAsia="Roboto Mono" w:hAnsi="Roboto Mono" w:cs="Roboto Mono"/>
+        </w:rPr>
+        <w:t>Z,+</w:t>
+      </w:r>
+      <w:proofErr w:type="gramEnd"/>
+      <w:r>
+        <w:rPr>
+          <w:rFonts w:ascii="Roboto Mono" w:eastAsia="Roboto Mono" w:hAnsi="Roboto Mono" w:cs="Roboto Mono"/>
+        </w:rPr>
+        <w:t>).</w:t>
       </w:r>
     </w:p>
     <w:p>
@@ -5296,7 +6221,21 @@
         <w:rPr>
           <w:rFonts w:ascii="Nova Mono" w:eastAsia="Nova Mono" w:hAnsi="Nova Mono" w:cs="Nova Mono"/>
         </w:rPr>
-        <w:t>Example: The set of real numbers with addition and multiplication (R,+,⋅).</w:t>
+        <w:t>Example: The set of real numbers with addition and multiplication (</w:t>
+      </w:r>
+      <w:proofErr w:type="gramStart"/>
+      <w:r>
+        <w:rPr>
+          <w:rFonts w:ascii="Nova Mono" w:eastAsia="Nova Mono" w:hAnsi="Nova Mono" w:cs="Nova Mono"/>
+        </w:rPr>
+        <w:t>R,+</w:t>
+      </w:r>
+      <w:proofErr w:type="gramEnd"/>
+      <w:r>
+        <w:rPr>
+          <w:rFonts w:ascii="Nova Mono" w:eastAsia="Nova Mono" w:hAnsi="Nova Mono" w:cs="Nova Mono"/>
+        </w:rPr>
+        <w:t>,⋅).</w:t>
       </w:r>
     </w:p>
     <w:p/>
@@ -5334,16 +6273,36 @@
           <w:sz w:val="18"/>
           <w:highlight w:val="lightGray"/>
         </w:rPr>
-        <w:t xml:space="preserve">: Persons Table -&gt; ID Column: 1, Name_En Column: Motasem Essam] -&gt; </w:t>
-      </w:r>
-      <w:r>
-        <w:rPr>
-          <w:rFonts w:ascii="Arial" w:eastAsia="Arial" w:hAnsi="Arial"/>
-          <w:b/>
+        <w:t xml:space="preserve">: Persons Table -&gt; ID Column: 1, </w:t>
+      </w:r>
+      <w:proofErr w:type="spellStart"/>
+      <w:r>
+        <w:rPr>
+          <w:rFonts w:ascii="Arial" w:eastAsia="Arial" w:hAnsi="Arial"/>
           <w:color w:val="000000"/>
           <w:sz w:val="18"/>
           <w:highlight w:val="lightGray"/>
         </w:rPr>
+        <w:t>Name_En</w:t>
+      </w:r>
+      <w:proofErr w:type="spellEnd"/>
+      <w:r>
+        <w:rPr>
+          <w:rFonts w:ascii="Arial" w:eastAsia="Arial" w:hAnsi="Arial"/>
+          <w:color w:val="000000"/>
+          <w:sz w:val="18"/>
+          <w:highlight w:val="lightGray"/>
+        </w:rPr>
+        <w:t xml:space="preserve"> Column: Motasem Essam] -&gt; </w:t>
+      </w:r>
+      <w:r>
+        <w:rPr>
+          <w:rFonts w:ascii="Arial" w:eastAsia="Arial" w:hAnsi="Arial"/>
+          <w:b/>
+          <w:color w:val="000000"/>
+          <w:sz w:val="18"/>
+          <w:highlight w:val="lightGray"/>
+        </w:rPr>
         <w:t>From:</w:t>
       </w:r>
       <w:r>
@@ -5353,7 +6312,27 @@
           <w:sz w:val="18"/>
           <w:highlight w:val="lightGray"/>
         </w:rPr>
-        <w:t xml:space="preserve"> [Chatgpt (GPT-4-turbo)] </w:t>
+        <w:t xml:space="preserve"> [</w:t>
+      </w:r>
+      <w:proofErr w:type="spellStart"/>
+      <w:r>
+        <w:rPr>
+          <w:rFonts w:ascii="Arial" w:eastAsia="Arial" w:hAnsi="Arial"/>
+          <w:color w:val="000000"/>
+          <w:sz w:val="18"/>
+          <w:highlight w:val="lightGray"/>
+        </w:rPr>
+        <w:t>Chatgpt</w:t>
+      </w:r>
+      <w:proofErr w:type="spellEnd"/>
+      <w:r>
+        <w:rPr>
+          <w:rFonts w:ascii="Arial" w:eastAsia="Arial" w:hAnsi="Arial"/>
+          <w:color w:val="000000"/>
+          <w:sz w:val="18"/>
+          <w:highlight w:val="lightGray"/>
+        </w:rPr>
+        <w:t xml:space="preserve"> (GPT-4-turbo)] </w:t>
       </w:r>
       <w:r>
         <w:rPr>
@@ -5388,6 +6367,7 @@
           <w:rFonts w:ascii="Roboto Mono" w:eastAsia="Roboto Mono" w:hAnsi="Roboto Mono" w:cs="Roboto Mono"/>
           <w:b/>
         </w:rPr>
+        <w:lastRenderedPageBreak/>
         <w:t>Mathematical Structure (e.g., Group Theory)</w:t>
       </w:r>
       <w:r>
@@ -5742,6 +6722,7 @@
           <w:rFonts w:ascii="Roboto Mono" w:eastAsia="Roboto Mono" w:hAnsi="Roboto Mono" w:cs="Roboto Mono"/>
           <w:b/>
         </w:rPr>
+        <w:lastRenderedPageBreak/>
         <w:t>Operations</w:t>
       </w:r>
       <w:r>
@@ -5997,16 +6978,36 @@
           <w:sz w:val="18"/>
           <w:highlight w:val="lightGray"/>
         </w:rPr>
-        <w:t xml:space="preserve">: Persons Table -&gt; ID Column: 1, Name_En Column: Motasem Essam] -&gt; </w:t>
-      </w:r>
-      <w:r>
-        <w:rPr>
-          <w:rFonts w:ascii="Arial" w:eastAsia="Arial" w:hAnsi="Arial"/>
-          <w:b/>
+        <w:t xml:space="preserve">: Persons Table -&gt; ID Column: 1, </w:t>
+      </w:r>
+      <w:proofErr w:type="spellStart"/>
+      <w:r>
+        <w:rPr>
+          <w:rFonts w:ascii="Arial" w:eastAsia="Arial" w:hAnsi="Arial"/>
           <w:color w:val="000000"/>
           <w:sz w:val="18"/>
           <w:highlight w:val="lightGray"/>
         </w:rPr>
+        <w:t>Name_En</w:t>
+      </w:r>
+      <w:proofErr w:type="spellEnd"/>
+      <w:r>
+        <w:rPr>
+          <w:rFonts w:ascii="Arial" w:eastAsia="Arial" w:hAnsi="Arial"/>
+          <w:color w:val="000000"/>
+          <w:sz w:val="18"/>
+          <w:highlight w:val="lightGray"/>
+        </w:rPr>
+        <w:t xml:space="preserve"> Column: Motasem Essam] -&gt; </w:t>
+      </w:r>
+      <w:r>
+        <w:rPr>
+          <w:rFonts w:ascii="Arial" w:eastAsia="Arial" w:hAnsi="Arial"/>
+          <w:b/>
+          <w:color w:val="000000"/>
+          <w:sz w:val="18"/>
+          <w:highlight w:val="lightGray"/>
+        </w:rPr>
         <w:t>From:</w:t>
       </w:r>
       <w:r>
@@ -6016,7 +7017,27 @@
           <w:sz w:val="18"/>
           <w:highlight w:val="lightGray"/>
         </w:rPr>
-        <w:t xml:space="preserve"> [Chatgpt (GPT-4-turbo)] </w:t>
+        <w:t xml:space="preserve"> [</w:t>
+      </w:r>
+      <w:proofErr w:type="spellStart"/>
+      <w:r>
+        <w:rPr>
+          <w:rFonts w:ascii="Arial" w:eastAsia="Arial" w:hAnsi="Arial"/>
+          <w:color w:val="000000"/>
+          <w:sz w:val="18"/>
+          <w:highlight w:val="lightGray"/>
+        </w:rPr>
+        <w:t>Chatgpt</w:t>
+      </w:r>
+      <w:proofErr w:type="spellEnd"/>
+      <w:r>
+        <w:rPr>
+          <w:rFonts w:ascii="Arial" w:eastAsia="Arial" w:hAnsi="Arial"/>
+          <w:color w:val="000000"/>
+          <w:sz w:val="18"/>
+          <w:highlight w:val="lightGray"/>
+        </w:rPr>
+        <w:t xml:space="preserve"> (GPT-4-turbo)] </w:t>
       </w:r>
       <w:r>
         <w:rPr>
@@ -6196,7 +7217,27 @@
           <w:szCs w:val="18"/>
           <w:highlight w:val="lightGray"/>
         </w:rPr>
-        <w:t xml:space="preserve">: Persons Table -&gt; ID Column: 1, Name_En Column: Motasem Essam] -&gt; </w:t>
+        <w:t xml:space="preserve">: Persons Table -&gt; ID Column: 1, </w:t>
+      </w:r>
+      <w:proofErr w:type="spellStart"/>
+      <w:r>
+        <w:rPr>
+          <w:rFonts w:ascii="Arial" w:eastAsia="Arial" w:hAnsi="Arial"/>
+          <w:sz w:val="18"/>
+          <w:szCs w:val="18"/>
+          <w:highlight w:val="lightGray"/>
+        </w:rPr>
+        <w:t>Name_En</w:t>
+      </w:r>
+      <w:proofErr w:type="spellEnd"/>
+      <w:r>
+        <w:rPr>
+          <w:rFonts w:ascii="Arial" w:eastAsia="Arial" w:hAnsi="Arial"/>
+          <w:sz w:val="18"/>
+          <w:szCs w:val="18"/>
+          <w:highlight w:val="lightGray"/>
+        </w:rPr>
+        <w:t xml:space="preserve"> Column: Motasem Essam] -&gt; </w:t>
       </w:r>
       <w:r>
         <w:rPr>
@@ -6709,7 +7750,15 @@
           <w:rFonts w:ascii="Roboto Mono" w:eastAsia="Roboto Mono" w:hAnsi="Roboto Mono" w:cs="Roboto Mono"/>
           <w:color w:val="202122"/>
         </w:rPr>
-        <w:t xml:space="preserve"> and questions about the consistency of mathematical systems. It represents one of the three major philosophical approaches to mathematics developed during this period, alongside </w:t>
+        <w:t xml:space="preserve"> and questions about the consistency of mathematical systems. It represents one of the three major philosophical approaches to </w:t>
+      </w:r>
+      <w:r>
+        <w:rPr>
+          <w:rFonts w:ascii="Roboto Mono" w:eastAsia="Roboto Mono" w:hAnsi="Roboto Mono" w:cs="Roboto Mono"/>
+          <w:color w:val="202122"/>
+        </w:rPr>
+        <w:lastRenderedPageBreak/>
+        <w:t xml:space="preserve">mathematics developed during this period, alongside </w:t>
       </w:r>
       <w:hyperlink r:id="rId76">
         <w:r>
@@ -6795,16 +7844,36 @@
           <w:sz w:val="18"/>
           <w:highlight w:val="lightGray"/>
         </w:rPr>
-        <w:t xml:space="preserve">: Persons Table -&gt; ID Column: 1, Name_En Column: Motasem Essam] -&gt; </w:t>
-      </w:r>
-      <w:r>
-        <w:rPr>
-          <w:rFonts w:ascii="Arial" w:eastAsia="Arial" w:hAnsi="Arial"/>
-          <w:b/>
+        <w:t xml:space="preserve">: Persons Table -&gt; ID Column: 1, </w:t>
+      </w:r>
+      <w:proofErr w:type="spellStart"/>
+      <w:r>
+        <w:rPr>
+          <w:rFonts w:ascii="Arial" w:eastAsia="Arial" w:hAnsi="Arial"/>
           <w:color w:val="000000"/>
           <w:sz w:val="18"/>
           <w:highlight w:val="lightGray"/>
         </w:rPr>
+        <w:t>Name_En</w:t>
+      </w:r>
+      <w:proofErr w:type="spellEnd"/>
+      <w:r>
+        <w:rPr>
+          <w:rFonts w:ascii="Arial" w:eastAsia="Arial" w:hAnsi="Arial"/>
+          <w:color w:val="000000"/>
+          <w:sz w:val="18"/>
+          <w:highlight w:val="lightGray"/>
+        </w:rPr>
+        <w:t xml:space="preserve"> Column: Motasem Essam] -&gt; </w:t>
+      </w:r>
+      <w:r>
+        <w:rPr>
+          <w:rFonts w:ascii="Arial" w:eastAsia="Arial" w:hAnsi="Arial"/>
+          <w:b/>
+          <w:color w:val="000000"/>
+          <w:sz w:val="18"/>
+          <w:highlight w:val="lightGray"/>
+        </w:rPr>
         <w:t>From:</w:t>
       </w:r>
       <w:r>
@@ -6814,7 +7883,27 @@
           <w:sz w:val="18"/>
           <w:highlight w:val="lightGray"/>
         </w:rPr>
-        <w:t xml:space="preserve"> [Chatgpt (GPT-4-turbo)] </w:t>
+        <w:t xml:space="preserve"> [</w:t>
+      </w:r>
+      <w:proofErr w:type="spellStart"/>
+      <w:r>
+        <w:rPr>
+          <w:rFonts w:ascii="Arial" w:eastAsia="Arial" w:hAnsi="Arial"/>
+          <w:color w:val="000000"/>
+          <w:sz w:val="18"/>
+          <w:highlight w:val="lightGray"/>
+        </w:rPr>
+        <w:t>Chatgpt</w:t>
+      </w:r>
+      <w:proofErr w:type="spellEnd"/>
+      <w:r>
+        <w:rPr>
+          <w:rFonts w:ascii="Arial" w:eastAsia="Arial" w:hAnsi="Arial"/>
+          <w:color w:val="000000"/>
+          <w:sz w:val="18"/>
+          <w:highlight w:val="lightGray"/>
+        </w:rPr>
+        <w:t xml:space="preserve"> (GPT-4-turbo)] </w:t>
       </w:r>
       <w:r>
         <w:rPr>
@@ -7014,6 +8103,7 @@
           <w:rFonts w:ascii="Roboto Mono" w:eastAsia="Roboto Mono" w:hAnsi="Roboto Mono" w:cs="Roboto Mono"/>
           <w:i/>
         </w:rPr>
+        <w:lastRenderedPageBreak/>
         <w:t>The aim of formalization is to reduce ambiguity, enhance clarity, and often to facilitate computation or logical analysis.</w:t>
       </w:r>
     </w:p>
@@ -7127,7 +8217,29 @@
           <w:szCs w:val="18"/>
           <w:highlight w:val="lightGray"/>
         </w:rPr>
-        <w:t xml:space="preserve">: Persons Table -&gt; ID Column: 1, Name_En Column: Motasem Essam] -&gt; </w:t>
+        <w:t xml:space="preserve">: Persons Table -&gt; ID Column: 1, </w:t>
+      </w:r>
+      <w:proofErr w:type="spellStart"/>
+      <w:r>
+        <w:rPr>
+          <w:rFonts w:ascii="Arial" w:eastAsia="Arial" w:hAnsi="Arial"/>
+          <w:color w:val="000000" w:themeColor="text1"/>
+          <w:sz w:val="18"/>
+          <w:szCs w:val="18"/>
+          <w:highlight w:val="lightGray"/>
+        </w:rPr>
+        <w:t>Name_En</w:t>
+      </w:r>
+      <w:proofErr w:type="spellEnd"/>
+      <w:r>
+        <w:rPr>
+          <w:rFonts w:ascii="Arial" w:eastAsia="Arial" w:hAnsi="Arial"/>
+          <w:color w:val="000000" w:themeColor="text1"/>
+          <w:sz w:val="18"/>
+          <w:szCs w:val="18"/>
+          <w:highlight w:val="lightGray"/>
+        </w:rPr>
+        <w:t xml:space="preserve"> Column: Motasem Essam] -&gt; </w:t>
       </w:r>
       <w:r>
         <w:rPr>
@@ -7482,12 +8594,21 @@
         <w:t xml:space="preserve"> word </w:t>
       </w:r>
       <w:hyperlink r:id="rId86" w:anchor="Ancient_Greek">
+        <w:proofErr w:type="spellStart"/>
         <w:r>
           <w:rPr>
             <w:rFonts w:ascii="Roboto Mono" w:eastAsia="Roboto Mono" w:hAnsi="Roboto Mono" w:cs="Roboto Mono"/>
             <w:color w:val="3366CC"/>
           </w:rPr>
-          <w:t>ἀξίωμα</w:t>
+          <w:t>ἀξίωμ</w:t>
+        </w:r>
+        <w:proofErr w:type="spellEnd"/>
+        <w:r>
+          <w:rPr>
+            <w:rFonts w:ascii="Roboto Mono" w:eastAsia="Roboto Mono" w:hAnsi="Roboto Mono" w:cs="Roboto Mono"/>
+            <w:color w:val="3366CC"/>
+          </w:rPr>
+          <w:t>α</w:t>
         </w:r>
       </w:hyperlink>
       <w:r>
@@ -7497,6 +8618,7 @@
         </w:rPr>
         <w:t xml:space="preserve"> (</w:t>
       </w:r>
+      <w:proofErr w:type="spellStart"/>
       <w:r>
         <w:rPr>
           <w:rFonts w:ascii="Roboto Mono" w:eastAsia="Roboto Mono" w:hAnsi="Roboto Mono" w:cs="Roboto Mono"/>
@@ -7505,6 +8627,7 @@
         </w:rPr>
         <w:t>axíōma</w:t>
       </w:r>
+      <w:proofErr w:type="spellEnd"/>
       <w:r>
         <w:rPr>
           <w:rFonts w:ascii="Roboto Mono" w:eastAsia="Roboto Mono" w:hAnsi="Roboto Mono" w:cs="Roboto Mono"/>
@@ -7560,16 +8683,36 @@
           <w:sz w:val="18"/>
           <w:highlight w:val="lightGray"/>
         </w:rPr>
-        <w:t xml:space="preserve">: Persons Table -&gt; ID Column: 1, Name_En Column: Motasem Essam] -&gt; </w:t>
-      </w:r>
-      <w:r>
-        <w:rPr>
-          <w:rFonts w:ascii="Arial" w:eastAsia="Arial" w:hAnsi="Arial"/>
-          <w:b/>
+        <w:t xml:space="preserve">: Persons Table -&gt; ID Column: 1, </w:t>
+      </w:r>
+      <w:proofErr w:type="spellStart"/>
+      <w:r>
+        <w:rPr>
+          <w:rFonts w:ascii="Arial" w:eastAsia="Arial" w:hAnsi="Arial"/>
           <w:color w:val="000000"/>
           <w:sz w:val="18"/>
           <w:highlight w:val="lightGray"/>
         </w:rPr>
+        <w:t>Name_En</w:t>
+      </w:r>
+      <w:proofErr w:type="spellEnd"/>
+      <w:r>
+        <w:rPr>
+          <w:rFonts w:ascii="Arial" w:eastAsia="Arial" w:hAnsi="Arial"/>
+          <w:color w:val="000000"/>
+          <w:sz w:val="18"/>
+          <w:highlight w:val="lightGray"/>
+        </w:rPr>
+        <w:t xml:space="preserve"> Column: Motasem Essam] -&gt; </w:t>
+      </w:r>
+      <w:r>
+        <w:rPr>
+          <w:rFonts w:ascii="Arial" w:eastAsia="Arial" w:hAnsi="Arial"/>
+          <w:b/>
+          <w:color w:val="000000"/>
+          <w:sz w:val="18"/>
+          <w:highlight w:val="lightGray"/>
+        </w:rPr>
         <w:t>From:</w:t>
       </w:r>
       <w:r>
@@ -7579,7 +8722,27 @@
           <w:sz w:val="18"/>
           <w:highlight w:val="lightGray"/>
         </w:rPr>
-        <w:t xml:space="preserve"> [Chatgpt (GPT-4-turbo)] </w:t>
+        <w:t xml:space="preserve"> [</w:t>
+      </w:r>
+      <w:proofErr w:type="spellStart"/>
+      <w:r>
+        <w:rPr>
+          <w:rFonts w:ascii="Arial" w:eastAsia="Arial" w:hAnsi="Arial"/>
+          <w:color w:val="000000"/>
+          <w:sz w:val="18"/>
+          <w:highlight w:val="lightGray"/>
+        </w:rPr>
+        <w:t>Chatgpt</w:t>
+      </w:r>
+      <w:proofErr w:type="spellEnd"/>
+      <w:r>
+        <w:rPr>
+          <w:rFonts w:ascii="Arial" w:eastAsia="Arial" w:hAnsi="Arial"/>
+          <w:color w:val="000000"/>
+          <w:sz w:val="18"/>
+          <w:highlight w:val="lightGray"/>
+        </w:rPr>
+        <w:t xml:space="preserve"> (GPT-4-turbo)] </w:t>
       </w:r>
       <w:r>
         <w:rPr>
@@ -7688,6 +8851,7 @@
       <w:bookmarkStart w:id="26" w:name="_heading=h.l518sdir3isw" w:colFirst="0" w:colLast="0"/>
       <w:bookmarkEnd w:id="26"/>
       <w:r>
+        <w:lastRenderedPageBreak/>
         <w:t>Key Concepts and Definitions in Axiom</w:t>
       </w:r>
     </w:p>
@@ -7770,7 +8934,27 @@
           <w:szCs w:val="18"/>
           <w:highlight w:val="lightGray"/>
         </w:rPr>
-        <w:t xml:space="preserve">: Persons Table -&gt; ID Column: 1, Name_En Column: Motasem Essam] -&gt; </w:t>
+        <w:t xml:space="preserve">: Persons Table -&gt; ID Column: 1, </w:t>
+      </w:r>
+      <w:proofErr w:type="spellStart"/>
+      <w:r>
+        <w:rPr>
+          <w:rFonts w:ascii="Arial" w:eastAsia="Arial" w:hAnsi="Arial"/>
+          <w:sz w:val="18"/>
+          <w:szCs w:val="18"/>
+          <w:highlight w:val="lightGray"/>
+        </w:rPr>
+        <w:t>Name_En</w:t>
+      </w:r>
+      <w:proofErr w:type="spellEnd"/>
+      <w:r>
+        <w:rPr>
+          <w:rFonts w:ascii="Arial" w:eastAsia="Arial" w:hAnsi="Arial"/>
+          <w:sz w:val="18"/>
+          <w:szCs w:val="18"/>
+          <w:highlight w:val="lightGray"/>
+        </w:rPr>
+        <w:t xml:space="preserve"> Column: Motasem Essam] -&gt; </w:t>
       </w:r>
       <w:r>
         <w:rPr>
@@ -8044,16 +9228,36 @@
           <w:sz w:val="18"/>
           <w:highlight w:val="lightGray"/>
         </w:rPr>
-        <w:t xml:space="preserve">: Persons Table -&gt; ID Column: 1, Name_En Column: Motasem Essam] -&gt; </w:t>
-      </w:r>
-      <w:r>
-        <w:rPr>
-          <w:rFonts w:ascii="Arial" w:eastAsia="Arial" w:hAnsi="Arial"/>
-          <w:b/>
+        <w:t xml:space="preserve">: Persons Table -&gt; ID Column: 1, </w:t>
+      </w:r>
+      <w:proofErr w:type="spellStart"/>
+      <w:r>
+        <w:rPr>
+          <w:rFonts w:ascii="Arial" w:eastAsia="Arial" w:hAnsi="Arial"/>
           <w:color w:val="000000"/>
           <w:sz w:val="18"/>
           <w:highlight w:val="lightGray"/>
         </w:rPr>
+        <w:t>Name_En</w:t>
+      </w:r>
+      <w:proofErr w:type="spellEnd"/>
+      <w:r>
+        <w:rPr>
+          <w:rFonts w:ascii="Arial" w:eastAsia="Arial" w:hAnsi="Arial"/>
+          <w:color w:val="000000"/>
+          <w:sz w:val="18"/>
+          <w:highlight w:val="lightGray"/>
+        </w:rPr>
+        <w:t xml:space="preserve"> Column: Motasem Essam] -&gt; </w:t>
+      </w:r>
+      <w:r>
+        <w:rPr>
+          <w:rFonts w:ascii="Arial" w:eastAsia="Arial" w:hAnsi="Arial"/>
+          <w:b/>
+          <w:color w:val="000000"/>
+          <w:sz w:val="18"/>
+          <w:highlight w:val="lightGray"/>
+        </w:rPr>
         <w:t>From:</w:t>
       </w:r>
       <w:r>
@@ -8063,7 +9267,27 @@
           <w:sz w:val="18"/>
           <w:highlight w:val="lightGray"/>
         </w:rPr>
-        <w:t xml:space="preserve"> [Chatgpt (GPT-4-turbo)] </w:t>
+        <w:t xml:space="preserve"> [</w:t>
+      </w:r>
+      <w:proofErr w:type="spellStart"/>
+      <w:r>
+        <w:rPr>
+          <w:rFonts w:ascii="Arial" w:eastAsia="Arial" w:hAnsi="Arial"/>
+          <w:color w:val="000000"/>
+          <w:sz w:val="18"/>
+          <w:highlight w:val="lightGray"/>
+        </w:rPr>
+        <w:t>Chatgpt</w:t>
+      </w:r>
+      <w:proofErr w:type="spellEnd"/>
+      <w:r>
+        <w:rPr>
+          <w:rFonts w:ascii="Arial" w:eastAsia="Arial" w:hAnsi="Arial"/>
+          <w:color w:val="000000"/>
+          <w:sz w:val="18"/>
+          <w:highlight w:val="lightGray"/>
+        </w:rPr>
+        <w:t xml:space="preserve"> (GPT-4-turbo)] </w:t>
       </w:r>
       <w:r>
         <w:rPr>
@@ -8357,7 +9581,27 @@
           <w:szCs w:val="18"/>
           <w:highlight w:val="lightGray"/>
         </w:rPr>
-        <w:t xml:space="preserve">: Persons Table -&gt; ID Column: 1, Name_En Column: Motasem Essam] -&gt; </w:t>
+        <w:t xml:space="preserve">: Persons Table -&gt; ID Column: 1, </w:t>
+      </w:r>
+      <w:proofErr w:type="spellStart"/>
+      <w:r>
+        <w:rPr>
+          <w:rFonts w:ascii="Arial" w:eastAsia="Arial" w:hAnsi="Arial"/>
+          <w:sz w:val="18"/>
+          <w:szCs w:val="18"/>
+          <w:highlight w:val="lightGray"/>
+        </w:rPr>
+        <w:t>Name_En</w:t>
+      </w:r>
+      <w:proofErr w:type="spellEnd"/>
+      <w:r>
+        <w:rPr>
+          <w:rFonts w:ascii="Arial" w:eastAsia="Arial" w:hAnsi="Arial"/>
+          <w:sz w:val="18"/>
+          <w:szCs w:val="18"/>
+          <w:highlight w:val="lightGray"/>
+        </w:rPr>
+        <w:t xml:space="preserve"> Column: Motasem Essam] -&gt; </w:t>
       </w:r>
       <w:r>
         <w:rPr>
@@ -8562,6 +9806,7 @@
         <w:rPr>
           <w:rFonts w:ascii="Roboto Mono" w:eastAsia="Roboto Mono" w:hAnsi="Roboto Mono" w:cs="Roboto Mono"/>
         </w:rPr>
+        <w:lastRenderedPageBreak/>
         <w:t>Examples. The following sentences are propositions.</w:t>
       </w:r>
     </w:p>
@@ -8697,7 +9942,27 @@
           <w:szCs w:val="18"/>
           <w:highlight w:val="lightGray"/>
         </w:rPr>
-        <w:t xml:space="preserve">: Persons Table -&gt; ID Column: 1, Name_En Column: Motasem Essam] -&gt; </w:t>
+        <w:t xml:space="preserve">: Persons Table -&gt; ID Column: 1, </w:t>
+      </w:r>
+      <w:proofErr w:type="spellStart"/>
+      <w:r>
+        <w:rPr>
+          <w:rFonts w:ascii="Arial" w:eastAsia="Arial" w:hAnsi="Arial"/>
+          <w:sz w:val="18"/>
+          <w:szCs w:val="18"/>
+          <w:highlight w:val="lightGray"/>
+        </w:rPr>
+        <w:t>Name_En</w:t>
+      </w:r>
+      <w:proofErr w:type="spellEnd"/>
+      <w:r>
+        <w:rPr>
+          <w:rFonts w:ascii="Arial" w:eastAsia="Arial" w:hAnsi="Arial"/>
+          <w:sz w:val="18"/>
+          <w:szCs w:val="18"/>
+          <w:highlight w:val="lightGray"/>
+        </w:rPr>
+        <w:t xml:space="preserve"> Column: Motasem Essam] -&gt; </w:t>
       </w:r>
       <w:r>
         <w:rPr>
@@ -9036,7 +10301,21 @@
         <w:rPr>
           <w:rFonts w:ascii="Roboto Mono" w:hAnsi="Roboto Mono"/>
         </w:rPr>
-        <w:t xml:space="preserve">Interrogative, imperative and exclamatory sentences are not propositions. As it stands, Sentence 4 is not a proposition. It becomes a proposition if the value of x is known. Of course it is true if x </w:t>
+        <w:t xml:space="preserve">Interrogative, imperative and exclamatory sentences are not propositions. As it stands, Sentence 4 is not a proposition. It becomes a proposition if the value of x is known. </w:t>
+      </w:r>
+      <w:proofErr w:type="gramStart"/>
+      <w:r>
+        <w:rPr>
+          <w:rFonts w:ascii="Roboto Mono" w:hAnsi="Roboto Mono"/>
+        </w:rPr>
+        <w:t>Of course</w:t>
+      </w:r>
+      <w:proofErr w:type="gramEnd"/>
+      <w:r>
+        <w:rPr>
+          <w:rFonts w:ascii="Roboto Mono" w:hAnsi="Roboto Mono"/>
+        </w:rPr>
+        <w:t xml:space="preserve"> it is true if x </w:t>
       </w:r>
       <w:r>
         <w:rPr>
@@ -9098,16 +10377,36 @@
           <w:sz w:val="18"/>
           <w:highlight w:val="lightGray"/>
         </w:rPr>
-        <w:t xml:space="preserve">: Persons Table -&gt; ID Column: 1, Name_En Column: Motasem Essam] -&gt; </w:t>
-      </w:r>
-      <w:r>
-        <w:rPr>
-          <w:rFonts w:ascii="Arial" w:eastAsia="Arial" w:hAnsi="Arial"/>
-          <w:b/>
+        <w:t xml:space="preserve">: Persons Table -&gt; ID Column: 1, </w:t>
+      </w:r>
+      <w:proofErr w:type="spellStart"/>
+      <w:r>
+        <w:rPr>
+          <w:rFonts w:ascii="Arial" w:eastAsia="Arial" w:hAnsi="Arial"/>
           <w:color w:val="000000"/>
           <w:sz w:val="18"/>
           <w:highlight w:val="lightGray"/>
         </w:rPr>
+        <w:t>Name_En</w:t>
+      </w:r>
+      <w:proofErr w:type="spellEnd"/>
+      <w:r>
+        <w:rPr>
+          <w:rFonts w:ascii="Arial" w:eastAsia="Arial" w:hAnsi="Arial"/>
+          <w:color w:val="000000"/>
+          <w:sz w:val="18"/>
+          <w:highlight w:val="lightGray"/>
+        </w:rPr>
+        <w:t xml:space="preserve"> Column: Motasem Essam] -&gt; </w:t>
+      </w:r>
+      <w:r>
+        <w:rPr>
+          <w:rFonts w:ascii="Arial" w:eastAsia="Arial" w:hAnsi="Arial"/>
+          <w:b/>
+          <w:color w:val="000000"/>
+          <w:sz w:val="18"/>
+          <w:highlight w:val="lightGray"/>
+        </w:rPr>
         <w:t>From:</w:t>
       </w:r>
       <w:r>
@@ -9117,7 +10416,27 @@
           <w:sz w:val="18"/>
           <w:highlight w:val="lightGray"/>
         </w:rPr>
-        <w:t xml:space="preserve"> [Chatgpt (GPT-4-turbo)] </w:t>
+        <w:t xml:space="preserve"> [</w:t>
+      </w:r>
+      <w:proofErr w:type="spellStart"/>
+      <w:r>
+        <w:rPr>
+          <w:rFonts w:ascii="Arial" w:eastAsia="Arial" w:hAnsi="Arial"/>
+          <w:color w:val="000000"/>
+          <w:sz w:val="18"/>
+          <w:highlight w:val="lightGray"/>
+        </w:rPr>
+        <w:t>Chatgpt</w:t>
+      </w:r>
+      <w:proofErr w:type="spellEnd"/>
+      <w:r>
+        <w:rPr>
+          <w:rFonts w:ascii="Arial" w:eastAsia="Arial" w:hAnsi="Arial"/>
+          <w:color w:val="000000"/>
+          <w:sz w:val="18"/>
+          <w:highlight w:val="lightGray"/>
+        </w:rPr>
+        <w:t xml:space="preserve"> (GPT-4-turbo)] </w:t>
       </w:r>
       <w:r>
         <w:rPr>
@@ -9172,7 +10491,14 @@
         <w:rPr>
           <w:rFonts w:ascii="Roboto Mono" w:eastAsia="Roboto Mono" w:hAnsi="Roboto Mono" w:cs="Roboto Mono"/>
         </w:rPr>
-        <w:t>: A statement is a declarative sentence or assertion that provides information or expresses an idea, opinion, or fact. For example, "The sky is blue" is a statement.</w:t>
+        <w:t xml:space="preserve">: A statement is a declarative sentence or assertion that provides information or expresses an idea, opinion, or fact. For example, "The sky </w:t>
+      </w:r>
+      <w:r>
+        <w:rPr>
+          <w:rFonts w:ascii="Roboto Mono" w:eastAsia="Roboto Mono" w:hAnsi="Roboto Mono" w:cs="Roboto Mono"/>
+        </w:rPr>
+        <w:lastRenderedPageBreak/>
+        <w:t>is blue" is a statement.</w:t>
       </w:r>
       <w:r>
         <w:rPr>
@@ -9392,7 +10718,29 @@
           <w:szCs w:val="18"/>
           <w:highlight w:val="lightGray"/>
         </w:rPr>
-        <w:t xml:space="preserve">: Persons Table -&gt; ID Column: 1, Name_En Column: Motasem Essam] -&gt; </w:t>
+        <w:t xml:space="preserve">: Persons Table -&gt; ID Column: 1, </w:t>
+      </w:r>
+      <w:proofErr w:type="spellStart"/>
+      <w:r>
+        <w:rPr>
+          <w:rFonts w:ascii="Arial" w:eastAsia="Arial" w:hAnsi="Arial"/>
+          <w:color w:val="000000" w:themeColor="text1"/>
+          <w:sz w:val="18"/>
+          <w:szCs w:val="18"/>
+          <w:highlight w:val="lightGray"/>
+        </w:rPr>
+        <w:t>Name_En</w:t>
+      </w:r>
+      <w:proofErr w:type="spellEnd"/>
+      <w:r>
+        <w:rPr>
+          <w:rFonts w:ascii="Arial" w:eastAsia="Arial" w:hAnsi="Arial"/>
+          <w:color w:val="000000" w:themeColor="text1"/>
+          <w:sz w:val="18"/>
+          <w:szCs w:val="18"/>
+          <w:highlight w:val="lightGray"/>
+        </w:rPr>
+        <w:t xml:space="preserve"> Column: Motasem Essam] -&gt; </w:t>
       </w:r>
       <w:r>
         <w:rPr>
@@ -9895,7 +11243,15 @@
           <w:rFonts w:ascii="Roboto Mono" w:eastAsia="Roboto Mono" w:hAnsi="Roboto Mono" w:cs="Roboto Mono"/>
           <w:color w:val="202122"/>
         </w:rPr>
-        <w:t xml:space="preserve">In the latter case, a (declarative) sentence is just one way of expressing an underlying statement. A statement is what a sentence means, it is the notion or idea that a sentence expresses, i.e., what it represents. For example, it could be said that "2 + 2 = 4" and "two plus two equals four" are two different sentences expressing the same statement. As another example, consider that the </w:t>
+        <w:t xml:space="preserve">In the latter case, a (declarative) sentence is just one way of expressing an underlying statement. A statement is what a sentence means, it is the notion or idea that a sentence expresses, i.e., what it represents. For example, it could be </w:t>
+      </w:r>
+      <w:r>
+        <w:rPr>
+          <w:rFonts w:ascii="Roboto Mono" w:eastAsia="Roboto Mono" w:hAnsi="Roboto Mono" w:cs="Roboto Mono"/>
+          <w:color w:val="202122"/>
+        </w:rPr>
+        <w:lastRenderedPageBreak/>
+        <w:t xml:space="preserve">said that "2 + 2 = 4" and "two plus two equals four" are two different sentences expressing the same statement. As another example, consider that the </w:t>
       </w:r>
       <w:hyperlink r:id="rId108">
         <w:r>
@@ -9986,16 +11342,36 @@
           <w:sz w:val="18"/>
           <w:highlight w:val="lightGray"/>
         </w:rPr>
-        <w:t xml:space="preserve">: Persons Table -&gt; ID Column: 1, Name_En Column: Motasem Essam] -&gt; </w:t>
-      </w:r>
-      <w:r>
-        <w:rPr>
-          <w:rFonts w:ascii="Arial" w:eastAsia="Arial" w:hAnsi="Arial"/>
-          <w:b/>
+        <w:t xml:space="preserve">: Persons Table -&gt; ID Column: 1, </w:t>
+      </w:r>
+      <w:proofErr w:type="spellStart"/>
+      <w:r>
+        <w:rPr>
+          <w:rFonts w:ascii="Arial" w:eastAsia="Arial" w:hAnsi="Arial"/>
           <w:color w:val="000000"/>
           <w:sz w:val="18"/>
           <w:highlight w:val="lightGray"/>
         </w:rPr>
+        <w:t>Name_En</w:t>
+      </w:r>
+      <w:proofErr w:type="spellEnd"/>
+      <w:r>
+        <w:rPr>
+          <w:rFonts w:ascii="Arial" w:eastAsia="Arial" w:hAnsi="Arial"/>
+          <w:color w:val="000000"/>
+          <w:sz w:val="18"/>
+          <w:highlight w:val="lightGray"/>
+        </w:rPr>
+        <w:t xml:space="preserve"> Column: Motasem Essam] -&gt; </w:t>
+      </w:r>
+      <w:r>
+        <w:rPr>
+          <w:rFonts w:ascii="Arial" w:eastAsia="Arial" w:hAnsi="Arial"/>
+          <w:b/>
+          <w:color w:val="000000"/>
+          <w:sz w:val="18"/>
+          <w:highlight w:val="lightGray"/>
+        </w:rPr>
         <w:t>From:</w:t>
       </w:r>
       <w:r>
@@ -10005,7 +11381,27 @@
           <w:sz w:val="18"/>
           <w:highlight w:val="lightGray"/>
         </w:rPr>
-        <w:t xml:space="preserve"> [Chatgpt (GPT-4-turbo)] </w:t>
+        <w:t xml:space="preserve"> [</w:t>
+      </w:r>
+      <w:proofErr w:type="spellStart"/>
+      <w:r>
+        <w:rPr>
+          <w:rFonts w:ascii="Arial" w:eastAsia="Arial" w:hAnsi="Arial"/>
+          <w:color w:val="000000"/>
+          <w:sz w:val="18"/>
+          <w:highlight w:val="lightGray"/>
+        </w:rPr>
+        <w:t>Chatgpt</w:t>
+      </w:r>
+      <w:proofErr w:type="spellEnd"/>
+      <w:r>
+        <w:rPr>
+          <w:rFonts w:ascii="Arial" w:eastAsia="Arial" w:hAnsi="Arial"/>
+          <w:color w:val="000000"/>
+          <w:sz w:val="18"/>
+          <w:highlight w:val="lightGray"/>
+        </w:rPr>
+        <w:t xml:space="preserve"> (GPT-4-turbo)] </w:t>
       </w:r>
       <w:r>
         <w:rPr>
@@ -10204,7 +11600,29 @@
           <w:szCs w:val="18"/>
           <w:highlight w:val="lightGray"/>
         </w:rPr>
-        <w:t xml:space="preserve">: Persons Table -&gt; ID Column: 1, Name_En Column: Motasem Essam] -&gt; </w:t>
+        <w:t xml:space="preserve">: Persons Table -&gt; ID Column: 1, </w:t>
+      </w:r>
+      <w:proofErr w:type="spellStart"/>
+      <w:r>
+        <w:rPr>
+          <w:rFonts w:ascii="Arial" w:eastAsia="Arial" w:hAnsi="Arial"/>
+          <w:color w:val="000000" w:themeColor="text1"/>
+          <w:sz w:val="18"/>
+          <w:szCs w:val="18"/>
+          <w:highlight w:val="lightGray"/>
+        </w:rPr>
+        <w:t>Name_En</w:t>
+      </w:r>
+      <w:proofErr w:type="spellEnd"/>
+      <w:r>
+        <w:rPr>
+          <w:rFonts w:ascii="Arial" w:eastAsia="Arial" w:hAnsi="Arial"/>
+          <w:color w:val="000000" w:themeColor="text1"/>
+          <w:sz w:val="18"/>
+          <w:szCs w:val="18"/>
+          <w:highlight w:val="lightGray"/>
+        </w:rPr>
+        <w:t xml:space="preserve"> Column: Motasem Essam] -&gt; </w:t>
       </w:r>
       <w:r>
         <w:rPr>
@@ -10549,6 +11967,7 @@
       <w:bookmarkStart w:id="34" w:name="_heading=h.gkn2ymvuhopt" w:colFirst="0" w:colLast="0"/>
       <w:bookmarkEnd w:id="34"/>
       <w:r>
+        <w:lastRenderedPageBreak/>
         <w:t>Sentences Types</w:t>
       </w:r>
     </w:p>
@@ -10622,7 +12041,29 @@
           <w:szCs w:val="18"/>
           <w:highlight w:val="lightGray"/>
         </w:rPr>
-        <w:t xml:space="preserve">: Persons Table -&gt; ID Column: 1, Name_En Column: Motasem Essam] -&gt; </w:t>
+        <w:t xml:space="preserve">: Persons Table -&gt; ID Column: 1, </w:t>
+      </w:r>
+      <w:proofErr w:type="spellStart"/>
+      <w:r>
+        <w:rPr>
+          <w:rFonts w:ascii="Arial" w:eastAsia="Arial" w:hAnsi="Arial"/>
+          <w:color w:val="000000" w:themeColor="text1"/>
+          <w:sz w:val="18"/>
+          <w:szCs w:val="18"/>
+          <w:highlight w:val="lightGray"/>
+        </w:rPr>
+        <w:t>Name_En</w:t>
+      </w:r>
+      <w:proofErr w:type="spellEnd"/>
+      <w:r>
+        <w:rPr>
+          <w:rFonts w:ascii="Arial" w:eastAsia="Arial" w:hAnsi="Arial"/>
+          <w:color w:val="000000" w:themeColor="text1"/>
+          <w:sz w:val="18"/>
+          <w:szCs w:val="18"/>
+          <w:highlight w:val="lightGray"/>
+        </w:rPr>
+        <w:t xml:space="preserve"> Column: Motasem Essam] -&gt; </w:t>
       </w:r>
       <w:r>
         <w:rPr>
@@ -10989,7 +12430,23 @@
           <w:rFonts w:ascii="Roboto Mono" w:eastAsia="Roboto Mono" w:hAnsi="Roboto Mono" w:cs="Roboto Mono"/>
           <w:color w:val="202122"/>
         </w:rPr>
-        <w:t>"Are you my friend?"</w:t>
+        <w:t xml:space="preserve">"Are </w:t>
+      </w:r>
+      <w:proofErr w:type="gramStart"/>
+      <w:r>
+        <w:rPr>
+          <w:rFonts w:ascii="Roboto Mono" w:eastAsia="Roboto Mono" w:hAnsi="Roboto Mono" w:cs="Roboto Mono"/>
+          <w:color w:val="202122"/>
+        </w:rPr>
+        <w:t>you</w:t>
+      </w:r>
+      <w:proofErr w:type="gramEnd"/>
+      <w:r>
+        <w:rPr>
+          <w:rFonts w:ascii="Roboto Mono" w:eastAsia="Roboto Mono" w:hAnsi="Roboto Mono" w:cs="Roboto Mono"/>
+          <w:color w:val="202122"/>
+        </w:rPr>
+        <w:t xml:space="preserve"> my friend?"</w:t>
       </w:r>
     </w:p>
     <w:p>
@@ -11148,16 +12605,36 @@
           <w:sz w:val="18"/>
           <w:highlight w:val="lightGray"/>
         </w:rPr>
-        <w:t xml:space="preserve">: Persons Table -&gt; ID Column: 1, Name_En Column: Motasem Essam] -&gt; </w:t>
-      </w:r>
-      <w:r>
-        <w:rPr>
-          <w:rFonts w:ascii="Arial" w:eastAsia="Arial" w:hAnsi="Arial"/>
-          <w:b/>
+        <w:t xml:space="preserve">: Persons Table -&gt; ID Column: 1, </w:t>
+      </w:r>
+      <w:proofErr w:type="spellStart"/>
+      <w:r>
+        <w:rPr>
+          <w:rFonts w:ascii="Arial" w:eastAsia="Arial" w:hAnsi="Arial"/>
           <w:color w:val="000000"/>
           <w:sz w:val="18"/>
           <w:highlight w:val="lightGray"/>
         </w:rPr>
+        <w:t>Name_En</w:t>
+      </w:r>
+      <w:proofErr w:type="spellEnd"/>
+      <w:r>
+        <w:rPr>
+          <w:rFonts w:ascii="Arial" w:eastAsia="Arial" w:hAnsi="Arial"/>
+          <w:color w:val="000000"/>
+          <w:sz w:val="18"/>
+          <w:highlight w:val="lightGray"/>
+        </w:rPr>
+        <w:t xml:space="preserve"> Column: Motasem Essam] -&gt; </w:t>
+      </w:r>
+      <w:r>
+        <w:rPr>
+          <w:rFonts w:ascii="Arial" w:eastAsia="Arial" w:hAnsi="Arial"/>
+          <w:b/>
+          <w:color w:val="000000"/>
+          <w:sz w:val="18"/>
+          <w:highlight w:val="lightGray"/>
+        </w:rPr>
         <w:t>From:</w:t>
       </w:r>
       <w:r>
@@ -11167,7 +12644,27 @@
           <w:sz w:val="18"/>
           <w:highlight w:val="lightGray"/>
         </w:rPr>
-        <w:t xml:space="preserve"> [Chatgpt (GPT-4-turbo)] </w:t>
+        <w:t xml:space="preserve"> [</w:t>
+      </w:r>
+      <w:proofErr w:type="spellStart"/>
+      <w:r>
+        <w:rPr>
+          <w:rFonts w:ascii="Arial" w:eastAsia="Arial" w:hAnsi="Arial"/>
+          <w:color w:val="000000"/>
+          <w:sz w:val="18"/>
+          <w:highlight w:val="lightGray"/>
+        </w:rPr>
+        <w:t>Chatgpt</w:t>
+      </w:r>
+      <w:proofErr w:type="spellEnd"/>
+      <w:r>
+        <w:rPr>
+          <w:rFonts w:ascii="Arial" w:eastAsia="Arial" w:hAnsi="Arial"/>
+          <w:color w:val="000000"/>
+          <w:sz w:val="18"/>
+          <w:highlight w:val="lightGray"/>
+        </w:rPr>
+        <w:t xml:space="preserve"> (GPT-4-turbo)] </w:t>
       </w:r>
       <w:r>
         <w:rPr>
@@ -11286,6 +12783,7 @@
         <w:rPr>
           <w:rFonts w:ascii="Roboto Mono" w:eastAsia="Roboto Mono" w:hAnsi="Roboto Mono" w:cs="Roboto Mono"/>
         </w:rPr>
+        <w:lastRenderedPageBreak/>
         <w:t>Example: "I like pizza." (This is a statement of opinion.)</w:t>
       </w:r>
       <w:r>
@@ -11506,6 +13004,7 @@
         <w:rPr>
           <w:rFonts w:ascii="Roboto Mono" w:eastAsia="Roboto Mono" w:hAnsi="Roboto Mono" w:cs="Roboto Mono"/>
         </w:rPr>
+        <w:lastRenderedPageBreak/>
         <w:t>Example: "I assert that 2 + 2 equals 4." (You're not just stating the fact; you're claiming it to be true and asserting your belief in its truth.)</w:t>
       </w:r>
     </w:p>
@@ -11753,6 +13252,7 @@
           <w:rFonts w:ascii="Roboto Mono" w:eastAsia="Roboto Mono" w:hAnsi="Roboto Mono" w:cs="Roboto Mono"/>
           <w:b/>
         </w:rPr>
+        <w:lastRenderedPageBreak/>
         <w:t>Conclusion:</w:t>
       </w:r>
     </w:p>
@@ -11840,7 +13340,27 @@
           <w:szCs w:val="18"/>
           <w:highlight w:val="lightGray"/>
         </w:rPr>
-        <w:t xml:space="preserve">: Persons Table -&gt; ID Column: 1, Name_En Column: Motasem Essam] -&gt; </w:t>
+        <w:t xml:space="preserve">: Persons Table -&gt; ID Column: 1, </w:t>
+      </w:r>
+      <w:proofErr w:type="spellStart"/>
+      <w:r>
+        <w:rPr>
+          <w:rFonts w:ascii="Arial" w:eastAsia="Arial" w:hAnsi="Arial"/>
+          <w:sz w:val="18"/>
+          <w:szCs w:val="18"/>
+          <w:highlight w:val="lightGray"/>
+        </w:rPr>
+        <w:t>Name_En</w:t>
+      </w:r>
+      <w:proofErr w:type="spellEnd"/>
+      <w:r>
+        <w:rPr>
+          <w:rFonts w:ascii="Arial" w:eastAsia="Arial" w:hAnsi="Arial"/>
+          <w:sz w:val="18"/>
+          <w:szCs w:val="18"/>
+          <w:highlight w:val="lightGray"/>
+        </w:rPr>
+        <w:t xml:space="preserve"> Column: Motasem Essam] -&gt; </w:t>
       </w:r>
       <w:r>
         <w:rPr>
@@ -12082,7 +13602,29 @@
           <w:szCs w:val="23"/>
           <w:highlight w:val="white"/>
         </w:rPr>
-        <w:t xml:space="preserve"> an assertion claims the reference of sentence, a statement is a sentence with a truth value, and a statement can be judged as true/false.</w:t>
+        <w:t xml:space="preserve"> </w:t>
+      </w:r>
+      <w:proofErr w:type="gramStart"/>
+      <w:r>
+        <w:rPr>
+          <w:rFonts w:ascii="Roboto Mono" w:eastAsia="Roboto Mono" w:hAnsi="Roboto Mono" w:cs="Roboto Mono"/>
+          <w:color w:val="0C0D0E"/>
+          <w:sz w:val="23"/>
+          <w:szCs w:val="23"/>
+          <w:highlight w:val="white"/>
+        </w:rPr>
+        <w:t>an</w:t>
+      </w:r>
+      <w:proofErr w:type="gramEnd"/>
+      <w:r>
+        <w:rPr>
+          <w:rFonts w:ascii="Roboto Mono" w:eastAsia="Roboto Mono" w:hAnsi="Roboto Mono" w:cs="Roboto Mono"/>
+          <w:color w:val="0C0D0E"/>
+          <w:sz w:val="23"/>
+          <w:szCs w:val="23"/>
+          <w:highlight w:val="white"/>
+        </w:rPr>
+        <w:t xml:space="preserve"> assertion claims the reference of sentence, a statement is a sentence with a truth value, and a statement can be judged as true/false.</w:t>
       </w:r>
     </w:p>
     <w:p>
@@ -12113,16 +13655,36 @@
           <w:sz w:val="18"/>
           <w:highlight w:val="lightGray"/>
         </w:rPr>
-        <w:t xml:space="preserve">: Persons Table -&gt; ID Column: 1, Name_En Column: Motasem Essam] -&gt; </w:t>
-      </w:r>
-      <w:r>
-        <w:rPr>
-          <w:rFonts w:ascii="Arial" w:eastAsia="Arial" w:hAnsi="Arial"/>
-          <w:b/>
+        <w:t xml:space="preserve">: Persons Table -&gt; ID Column: 1, </w:t>
+      </w:r>
+      <w:proofErr w:type="spellStart"/>
+      <w:r>
+        <w:rPr>
+          <w:rFonts w:ascii="Arial" w:eastAsia="Arial" w:hAnsi="Arial"/>
           <w:color w:val="000000"/>
           <w:sz w:val="18"/>
           <w:highlight w:val="lightGray"/>
         </w:rPr>
+        <w:t>Name_En</w:t>
+      </w:r>
+      <w:proofErr w:type="spellEnd"/>
+      <w:r>
+        <w:rPr>
+          <w:rFonts w:ascii="Arial" w:eastAsia="Arial" w:hAnsi="Arial"/>
+          <w:color w:val="000000"/>
+          <w:sz w:val="18"/>
+          <w:highlight w:val="lightGray"/>
+        </w:rPr>
+        <w:t xml:space="preserve"> Column: Motasem Essam] -&gt; </w:t>
+      </w:r>
+      <w:r>
+        <w:rPr>
+          <w:rFonts w:ascii="Arial" w:eastAsia="Arial" w:hAnsi="Arial"/>
+          <w:b/>
+          <w:color w:val="000000"/>
+          <w:sz w:val="18"/>
+          <w:highlight w:val="lightGray"/>
+        </w:rPr>
         <w:t>From:</w:t>
       </w:r>
       <w:r>
@@ -12132,7 +13694,27 @@
           <w:sz w:val="18"/>
           <w:highlight w:val="lightGray"/>
         </w:rPr>
-        <w:t xml:space="preserve"> [Chatgpt (GPT-4-turbo)] </w:t>
+        <w:t xml:space="preserve"> [</w:t>
+      </w:r>
+      <w:proofErr w:type="spellStart"/>
+      <w:r>
+        <w:rPr>
+          <w:rFonts w:ascii="Arial" w:eastAsia="Arial" w:hAnsi="Arial"/>
+          <w:color w:val="000000"/>
+          <w:sz w:val="18"/>
+          <w:highlight w:val="lightGray"/>
+        </w:rPr>
+        <w:t>Chatgpt</w:t>
+      </w:r>
+      <w:proofErr w:type="spellEnd"/>
+      <w:r>
+        <w:rPr>
+          <w:rFonts w:ascii="Arial" w:eastAsia="Arial" w:hAnsi="Arial"/>
+          <w:color w:val="000000"/>
+          <w:sz w:val="18"/>
+          <w:highlight w:val="lightGray"/>
+        </w:rPr>
+        <w:t xml:space="preserve"> (GPT-4-turbo)] </w:t>
       </w:r>
       <w:r>
         <w:rPr>
@@ -12305,7 +13887,14 @@
         <w:rPr>
           <w:rFonts w:ascii="Roboto Mono" w:eastAsia="Roboto Mono" w:hAnsi="Roboto Mono" w:cs="Roboto Mono"/>
         </w:rPr>
-        <w:t>: A statement is a specific type of sentence that makes a declaration or expresses information. A statement can be true or false and typically provides a fact, opinion, or observation.</w:t>
+        <w:t xml:space="preserve">: A statement is a specific type of sentence that makes a declaration or expresses information. A statement can be true or false and typically provides a fact, </w:t>
+      </w:r>
+      <w:r>
+        <w:rPr>
+          <w:rFonts w:ascii="Roboto Mono" w:eastAsia="Roboto Mono" w:hAnsi="Roboto Mono" w:cs="Roboto Mono"/>
+        </w:rPr>
+        <w:lastRenderedPageBreak/>
+        <w:t>opinion, or observation.</w:t>
       </w:r>
       <w:r>
         <w:rPr>
@@ -12565,6 +14154,7 @@
           <w:rFonts w:ascii="Roboto Mono" w:eastAsia="Roboto Mono" w:hAnsi="Roboto Mono" w:cs="Roboto Mono"/>
           <w:b/>
         </w:rPr>
+        <w:lastRenderedPageBreak/>
         <w:t>Difference</w:t>
       </w:r>
       <w:r>
@@ -12776,7 +14366,27 @@
           <w:szCs w:val="18"/>
           <w:highlight w:val="lightGray"/>
         </w:rPr>
-        <w:t xml:space="preserve">: Persons Table -&gt; ID Column: 1, Name_En Column: Motasem Essam] -&gt; </w:t>
+        <w:t xml:space="preserve">: Persons Table -&gt; ID Column: 1, </w:t>
+      </w:r>
+      <w:proofErr w:type="spellStart"/>
+      <w:r>
+        <w:rPr>
+          <w:rFonts w:ascii="Arial" w:eastAsia="Arial" w:hAnsi="Arial"/>
+          <w:sz w:val="18"/>
+          <w:szCs w:val="18"/>
+          <w:highlight w:val="lightGray"/>
+        </w:rPr>
+        <w:t>Name_En</w:t>
+      </w:r>
+      <w:proofErr w:type="spellEnd"/>
+      <w:r>
+        <w:rPr>
+          <w:rFonts w:ascii="Arial" w:eastAsia="Arial" w:hAnsi="Arial"/>
+          <w:sz w:val="18"/>
+          <w:szCs w:val="18"/>
+          <w:highlight w:val="lightGray"/>
+        </w:rPr>
+        <w:t xml:space="preserve"> Column: Motasem Essam] -&gt; </w:t>
       </w:r>
       <w:r>
         <w:rPr>
@@ -13101,16 +14711,36 @@
           <w:sz w:val="18"/>
           <w:highlight w:val="lightGray"/>
         </w:rPr>
-        <w:t xml:space="preserve">: Persons Table -&gt; ID Column: 1, Name_En Column: Motasem Essam] -&gt; </w:t>
-      </w:r>
-      <w:r>
-        <w:rPr>
-          <w:rFonts w:ascii="Arial" w:eastAsia="Arial" w:hAnsi="Arial"/>
-          <w:b/>
+        <w:t xml:space="preserve">: Persons Table -&gt; ID Column: 1, </w:t>
+      </w:r>
+      <w:proofErr w:type="spellStart"/>
+      <w:r>
+        <w:rPr>
+          <w:rFonts w:ascii="Arial" w:eastAsia="Arial" w:hAnsi="Arial"/>
           <w:color w:val="000000"/>
           <w:sz w:val="18"/>
           <w:highlight w:val="lightGray"/>
         </w:rPr>
+        <w:t>Name_En</w:t>
+      </w:r>
+      <w:proofErr w:type="spellEnd"/>
+      <w:r>
+        <w:rPr>
+          <w:rFonts w:ascii="Arial" w:eastAsia="Arial" w:hAnsi="Arial"/>
+          <w:color w:val="000000"/>
+          <w:sz w:val="18"/>
+          <w:highlight w:val="lightGray"/>
+        </w:rPr>
+        <w:t xml:space="preserve"> Column: Motasem Essam] -&gt; </w:t>
+      </w:r>
+      <w:r>
+        <w:rPr>
+          <w:rFonts w:ascii="Arial" w:eastAsia="Arial" w:hAnsi="Arial"/>
+          <w:b/>
+          <w:color w:val="000000"/>
+          <w:sz w:val="18"/>
+          <w:highlight w:val="lightGray"/>
+        </w:rPr>
         <w:t>From:</w:t>
       </w:r>
       <w:r>
@@ -13120,16 +14750,36 @@
           <w:sz w:val="18"/>
           <w:highlight w:val="lightGray"/>
         </w:rPr>
-        <w:t xml:space="preserve"> [Chatgpt (GPT-4-turbo)] </w:t>
-      </w:r>
-      <w:r>
-        <w:rPr>
-          <w:rFonts w:ascii="Arial" w:eastAsia="Arial" w:hAnsi="Arial"/>
-          <w:b/>
+        <w:t xml:space="preserve"> [</w:t>
+      </w:r>
+      <w:proofErr w:type="spellStart"/>
+      <w:r>
+        <w:rPr>
+          <w:rFonts w:ascii="Arial" w:eastAsia="Arial" w:hAnsi="Arial"/>
           <w:color w:val="000000"/>
           <w:sz w:val="18"/>
           <w:highlight w:val="lightGray"/>
         </w:rPr>
+        <w:t>Chatgpt</w:t>
+      </w:r>
+      <w:proofErr w:type="spellEnd"/>
+      <w:r>
+        <w:rPr>
+          <w:rFonts w:ascii="Arial" w:eastAsia="Arial" w:hAnsi="Arial"/>
+          <w:color w:val="000000"/>
+          <w:sz w:val="18"/>
+          <w:highlight w:val="lightGray"/>
+        </w:rPr>
+        <w:t xml:space="preserve"> (GPT-4-turbo)] </w:t>
+      </w:r>
+      <w:r>
+        <w:rPr>
+          <w:rFonts w:ascii="Arial" w:eastAsia="Arial" w:hAnsi="Arial"/>
+          <w:b/>
+          <w:color w:val="000000"/>
+          <w:sz w:val="18"/>
+          <w:highlight w:val="lightGray"/>
+        </w:rPr>
         <w:t xml:space="preserve">on </w:t>
       </w:r>
       <w:r>
@@ -13153,6 +14803,7 @@
         <w:rPr>
           <w:rFonts w:ascii="Roboto Mono" w:eastAsia="Roboto Mono" w:hAnsi="Roboto Mono" w:cs="Roboto Mono"/>
         </w:rPr>
+        <w:lastRenderedPageBreak/>
         <w:t>The terms "statement," "sentence," and "assertion" are closely related but have distinct meanings, especially in logic and philosophy. Here's how they differ:</w:t>
       </w:r>
     </w:p>
@@ -13366,6 +15017,7 @@
           <w:rFonts w:ascii="Roboto Mono" w:eastAsia="Roboto Mono" w:hAnsi="Roboto Mono" w:cs="Roboto Mono"/>
           <w:b/>
         </w:rPr>
+        <w:lastRenderedPageBreak/>
         <w:t>Example</w:t>
       </w:r>
       <w:r>
@@ -13679,6 +15331,7 @@
       <w:bookmarkStart w:id="38" w:name="_heading=h.a246pv855p0" w:colFirst="0" w:colLast="0"/>
       <w:bookmarkEnd w:id="38"/>
       <w:r>
+        <w:lastRenderedPageBreak/>
         <w:t>EXAMPLES OF axioms</w:t>
       </w:r>
     </w:p>
@@ -13706,16 +15359,36 @@
           <w:sz w:val="18"/>
           <w:highlight w:val="lightGray"/>
         </w:rPr>
-        <w:t xml:space="preserve">: Persons Table -&gt; ID Column: 1, Name_En Column: Motasem Essam] -&gt; </w:t>
-      </w:r>
-      <w:r>
-        <w:rPr>
-          <w:rFonts w:ascii="Arial" w:eastAsia="Arial" w:hAnsi="Arial"/>
-          <w:b/>
+        <w:t xml:space="preserve">: Persons Table -&gt; ID Column: 1, </w:t>
+      </w:r>
+      <w:proofErr w:type="spellStart"/>
+      <w:r>
+        <w:rPr>
+          <w:rFonts w:ascii="Arial" w:eastAsia="Arial" w:hAnsi="Arial"/>
           <w:color w:val="000000"/>
           <w:sz w:val="18"/>
           <w:highlight w:val="lightGray"/>
         </w:rPr>
+        <w:t>Name_En</w:t>
+      </w:r>
+      <w:proofErr w:type="spellEnd"/>
+      <w:r>
+        <w:rPr>
+          <w:rFonts w:ascii="Arial" w:eastAsia="Arial" w:hAnsi="Arial"/>
+          <w:color w:val="000000"/>
+          <w:sz w:val="18"/>
+          <w:highlight w:val="lightGray"/>
+        </w:rPr>
+        <w:t xml:space="preserve"> Column: Motasem Essam] -&gt; </w:t>
+      </w:r>
+      <w:r>
+        <w:rPr>
+          <w:rFonts w:ascii="Arial" w:eastAsia="Arial" w:hAnsi="Arial"/>
+          <w:b/>
+          <w:color w:val="000000"/>
+          <w:sz w:val="18"/>
+          <w:highlight w:val="lightGray"/>
+        </w:rPr>
         <w:t>From:</w:t>
       </w:r>
       <w:r>
@@ -13725,7 +15398,27 @@
           <w:sz w:val="18"/>
           <w:highlight w:val="lightGray"/>
         </w:rPr>
-        <w:t xml:space="preserve"> [Chatgpt (GPT-4-turbo)] </w:t>
+        <w:t xml:space="preserve"> [</w:t>
+      </w:r>
+      <w:proofErr w:type="spellStart"/>
+      <w:r>
+        <w:rPr>
+          <w:rFonts w:ascii="Arial" w:eastAsia="Arial" w:hAnsi="Arial"/>
+          <w:color w:val="000000"/>
+          <w:sz w:val="18"/>
+          <w:highlight w:val="lightGray"/>
+        </w:rPr>
+        <w:t>Chatgpt</w:t>
+      </w:r>
+      <w:proofErr w:type="spellEnd"/>
+      <w:r>
+        <w:rPr>
+          <w:rFonts w:ascii="Arial" w:eastAsia="Arial" w:hAnsi="Arial"/>
+          <w:color w:val="000000"/>
+          <w:sz w:val="18"/>
+          <w:highlight w:val="lightGray"/>
+        </w:rPr>
+        <w:t xml:space="preserve"> (GPT-4-turbo)] </w:t>
       </w:r>
       <w:r>
         <w:rPr>
@@ -13796,7 +15489,63 @@
         <w:rPr>
           <w:rFonts w:ascii="Roboto Mono" w:eastAsia="Roboto Mono" w:hAnsi="Roboto Mono" w:cs="Roboto Mono"/>
         </w:rPr>
-        <w:t>: For any two things, if they are equal to the same thing, they are equal to each other. (e.g., If a=ba = ba=b and b=cb = cb=c, then a=ca = ca=c).</w:t>
+        <w:t>: For any two things, if they are equal to the same thing, they are equal to each other. (e.g., If a=</w:t>
+      </w:r>
+      <w:proofErr w:type="spellStart"/>
+      <w:r>
+        <w:rPr>
+          <w:rFonts w:ascii="Roboto Mono" w:eastAsia="Roboto Mono" w:hAnsi="Roboto Mono" w:cs="Roboto Mono"/>
+        </w:rPr>
+        <w:t>ba</w:t>
+      </w:r>
+      <w:proofErr w:type="spellEnd"/>
+      <w:r>
+        <w:rPr>
+          <w:rFonts w:ascii="Roboto Mono" w:eastAsia="Roboto Mono" w:hAnsi="Roboto Mono" w:cs="Roboto Mono"/>
+        </w:rPr>
+        <w:t xml:space="preserve"> = </w:t>
+      </w:r>
+      <w:proofErr w:type="spellStart"/>
+      <w:r>
+        <w:rPr>
+          <w:rFonts w:ascii="Roboto Mono" w:eastAsia="Roboto Mono" w:hAnsi="Roboto Mono" w:cs="Roboto Mono"/>
+        </w:rPr>
+        <w:t>ba</w:t>
+      </w:r>
+      <w:proofErr w:type="spellEnd"/>
+      <w:r>
+        <w:rPr>
+          <w:rFonts w:ascii="Roboto Mono" w:eastAsia="Roboto Mono" w:hAnsi="Roboto Mono" w:cs="Roboto Mono"/>
+        </w:rPr>
+        <w:t>=b and b=</w:t>
+      </w:r>
+      <w:proofErr w:type="spellStart"/>
+      <w:r>
+        <w:rPr>
+          <w:rFonts w:ascii="Roboto Mono" w:eastAsia="Roboto Mono" w:hAnsi="Roboto Mono" w:cs="Roboto Mono"/>
+        </w:rPr>
+        <w:t>cb</w:t>
+      </w:r>
+      <w:proofErr w:type="spellEnd"/>
+      <w:r>
+        <w:rPr>
+          <w:rFonts w:ascii="Roboto Mono" w:eastAsia="Roboto Mono" w:hAnsi="Roboto Mono" w:cs="Roboto Mono"/>
+        </w:rPr>
+        <w:t xml:space="preserve"> = </w:t>
+      </w:r>
+      <w:proofErr w:type="spellStart"/>
+      <w:r>
+        <w:rPr>
+          <w:rFonts w:ascii="Roboto Mono" w:eastAsia="Roboto Mono" w:hAnsi="Roboto Mono" w:cs="Roboto Mono"/>
+        </w:rPr>
+        <w:t>cb</w:t>
+      </w:r>
+      <w:proofErr w:type="spellEnd"/>
+      <w:r>
+        <w:rPr>
+          <w:rFonts w:ascii="Roboto Mono" w:eastAsia="Roboto Mono" w:hAnsi="Roboto Mono" w:cs="Roboto Mono"/>
+        </w:rPr>
+        <w:t>=c, then a=ca = ca=c).</w:t>
       </w:r>
       <w:r>
         <w:rPr>
@@ -13852,7 +15601,63 @@
         <w:rPr>
           <w:rFonts w:ascii="Roboto Mono" w:eastAsia="Roboto Mono" w:hAnsi="Roboto Mono" w:cs="Roboto Mono"/>
         </w:rPr>
-        <w:t>: If aaa and bbb are numbers, then their sum, a+ba + ba+b, is also a number.</w:t>
+        <w:t xml:space="preserve">: If </w:t>
+      </w:r>
+      <w:proofErr w:type="spellStart"/>
+      <w:r>
+        <w:rPr>
+          <w:rFonts w:ascii="Roboto Mono" w:eastAsia="Roboto Mono" w:hAnsi="Roboto Mono" w:cs="Roboto Mono"/>
+        </w:rPr>
+        <w:t>aaa</w:t>
+      </w:r>
+      <w:proofErr w:type="spellEnd"/>
+      <w:r>
+        <w:rPr>
+          <w:rFonts w:ascii="Roboto Mono" w:eastAsia="Roboto Mono" w:hAnsi="Roboto Mono" w:cs="Roboto Mono"/>
+        </w:rPr>
+        <w:t xml:space="preserve"> and </w:t>
+      </w:r>
+      <w:proofErr w:type="spellStart"/>
+      <w:r>
+        <w:rPr>
+          <w:rFonts w:ascii="Roboto Mono" w:eastAsia="Roboto Mono" w:hAnsi="Roboto Mono" w:cs="Roboto Mono"/>
+        </w:rPr>
+        <w:t>bbb</w:t>
+      </w:r>
+      <w:proofErr w:type="spellEnd"/>
+      <w:r>
+        <w:rPr>
+          <w:rFonts w:ascii="Roboto Mono" w:eastAsia="Roboto Mono" w:hAnsi="Roboto Mono" w:cs="Roboto Mono"/>
+        </w:rPr>
+        <w:t xml:space="preserve"> are numbers, then their sum, </w:t>
+      </w:r>
+      <w:proofErr w:type="spellStart"/>
+      <w:r>
+        <w:rPr>
+          <w:rFonts w:ascii="Roboto Mono" w:eastAsia="Roboto Mono" w:hAnsi="Roboto Mono" w:cs="Roboto Mono"/>
+        </w:rPr>
+        <w:t>a+ba</w:t>
+      </w:r>
+      <w:proofErr w:type="spellEnd"/>
+      <w:r>
+        <w:rPr>
+          <w:rFonts w:ascii="Roboto Mono" w:eastAsia="Roboto Mono" w:hAnsi="Roboto Mono" w:cs="Roboto Mono"/>
+        </w:rPr>
+        <w:t xml:space="preserve"> + </w:t>
+      </w:r>
+      <w:proofErr w:type="spellStart"/>
+      <w:r>
+        <w:rPr>
+          <w:rFonts w:ascii="Roboto Mono" w:eastAsia="Roboto Mono" w:hAnsi="Roboto Mono" w:cs="Roboto Mono"/>
+        </w:rPr>
+        <w:t>ba+b</w:t>
+      </w:r>
+      <w:proofErr w:type="spellEnd"/>
+      <w:r>
+        <w:rPr>
+          <w:rFonts w:ascii="Roboto Mono" w:eastAsia="Roboto Mono" w:hAnsi="Roboto Mono" w:cs="Roboto Mono"/>
+        </w:rPr>
+        <w:t>, is also a number.</w:t>
       </w:r>
       <w:r>
         <w:rPr>
@@ -13924,7 +15729,21 @@
         <w:rPr>
           <w:rFonts w:ascii="Roboto Mono" w:eastAsia="Roboto Mono" w:hAnsi="Roboto Mono" w:cs="Roboto Mono"/>
         </w:rPr>
-        <w:t>: A straight line segment can be drawn joining any two points.</w:t>
+        <w:t xml:space="preserve">: A </w:t>
+      </w:r>
+      <w:proofErr w:type="gramStart"/>
+      <w:r>
+        <w:rPr>
+          <w:rFonts w:ascii="Roboto Mono" w:eastAsia="Roboto Mono" w:hAnsi="Roboto Mono" w:cs="Roboto Mono"/>
+        </w:rPr>
+        <w:t>straight line</w:t>
+      </w:r>
+      <w:proofErr w:type="gramEnd"/>
+      <w:r>
+        <w:rPr>
+          <w:rFonts w:ascii="Roboto Mono" w:eastAsia="Roboto Mono" w:hAnsi="Roboto Mono" w:cs="Roboto Mono"/>
+        </w:rPr>
+        <w:t xml:space="preserve"> segment can be drawn joining any two points.</w:t>
       </w:r>
       <w:r>
         <w:rPr>
@@ -13952,7 +15771,21 @@
         <w:rPr>
           <w:rFonts w:ascii="Roboto Mono" w:eastAsia="Roboto Mono" w:hAnsi="Roboto Mono" w:cs="Roboto Mono"/>
         </w:rPr>
-        <w:t>: Any straight line segment can be extended indefinitely in a straight line.</w:t>
+        <w:t xml:space="preserve">: Any </w:t>
+      </w:r>
+      <w:proofErr w:type="gramStart"/>
+      <w:r>
+        <w:rPr>
+          <w:rFonts w:ascii="Roboto Mono" w:eastAsia="Roboto Mono" w:hAnsi="Roboto Mono" w:cs="Roboto Mono"/>
+        </w:rPr>
+        <w:t>straight line</w:t>
+      </w:r>
+      <w:proofErr w:type="gramEnd"/>
+      <w:r>
+        <w:rPr>
+          <w:rFonts w:ascii="Roboto Mono" w:eastAsia="Roboto Mono" w:hAnsi="Roboto Mono" w:cs="Roboto Mono"/>
+        </w:rPr>
+        <w:t xml:space="preserve"> segment can be extended indefinitely in a straight line.</w:t>
       </w:r>
       <w:r>
         <w:rPr>
@@ -14039,7 +15872,77 @@
             <w:rPr>
               <w:rFonts w:ascii="Cardo" w:eastAsia="Cardo" w:hAnsi="Cardo" w:cs="Cardo"/>
             </w:rPr>
-            <w:t>: Two sets are equal if they have exactly the same elements. (i.e., A=BA = BA=B if and only if for all xxx, x∈A  ⟺  x∈Bx \in A \iff x \in Bx∈A⟺x∈B).</w:t>
+            <w:t xml:space="preserve">: Two sets are equal if they have exactly the same elements. (i.e., A=BA = BA=B if and only if for all xxx, </w:t>
+          </w:r>
+          <w:proofErr w:type="spellStart"/>
+          <w:r>
+            <w:rPr>
+              <w:rFonts w:ascii="Cardo" w:eastAsia="Cardo" w:hAnsi="Cardo" w:cs="Cardo"/>
+            </w:rPr>
+            <w:t>x∈</w:t>
+          </w:r>
+          <w:proofErr w:type="gramStart"/>
+          <w:r>
+            <w:rPr>
+              <w:rFonts w:ascii="Cardo" w:eastAsia="Cardo" w:hAnsi="Cardo" w:cs="Cardo"/>
+            </w:rPr>
+            <w:t>A</w:t>
+          </w:r>
+          <w:proofErr w:type="spellEnd"/>
+          <w:r>
+            <w:rPr>
+              <w:rFonts w:ascii="Cardo" w:eastAsia="Cardo" w:hAnsi="Cardo" w:cs="Cardo"/>
+            </w:rPr>
+            <w:t>  ⟺</w:t>
+          </w:r>
+          <w:proofErr w:type="gramEnd"/>
+          <w:r>
+            <w:rPr>
+              <w:rFonts w:ascii="Cardo" w:eastAsia="Cardo" w:hAnsi="Cardo" w:cs="Cardo"/>
+            </w:rPr>
+            <w:t>  </w:t>
+          </w:r>
+          <w:proofErr w:type="spellStart"/>
+          <w:r>
+            <w:rPr>
+              <w:rFonts w:ascii="Cardo" w:eastAsia="Cardo" w:hAnsi="Cardo" w:cs="Cardo"/>
+            </w:rPr>
+            <w:t>x∈Bx</w:t>
+          </w:r>
+          <w:proofErr w:type="spellEnd"/>
+          <w:r>
+            <w:rPr>
+              <w:rFonts w:ascii="Cardo" w:eastAsia="Cardo" w:hAnsi="Cardo" w:cs="Cardo"/>
+            </w:rPr>
+            <w:t xml:space="preserve"> \in A \</w:t>
+          </w:r>
+          <w:proofErr w:type="spellStart"/>
+          <w:r>
+            <w:rPr>
+              <w:rFonts w:ascii="Cardo" w:eastAsia="Cardo" w:hAnsi="Cardo" w:cs="Cardo"/>
+            </w:rPr>
+            <w:t>iff</w:t>
+          </w:r>
+          <w:proofErr w:type="spellEnd"/>
+          <w:r>
+            <w:rPr>
+              <w:rFonts w:ascii="Cardo" w:eastAsia="Cardo" w:hAnsi="Cardo" w:cs="Cardo"/>
+            </w:rPr>
+            <w:t xml:space="preserve"> x \in </w:t>
+          </w:r>
+          <w:proofErr w:type="spellStart"/>
+          <w:r>
+            <w:rPr>
+              <w:rFonts w:ascii="Cardo" w:eastAsia="Cardo" w:hAnsi="Cardo" w:cs="Cardo"/>
+            </w:rPr>
+            <w:t>Bx∈A⟺x∈B</w:t>
+          </w:r>
+          <w:proofErr w:type="spellEnd"/>
+          <w:r>
+            <w:rPr>
+              <w:rFonts w:ascii="Cardo" w:eastAsia="Cardo" w:hAnsi="Cardo" w:cs="Cardo"/>
+            </w:rPr>
+            <w:t>).</w:t>
           </w:r>
           <w:r>
             <w:rPr>
@@ -14069,7 +15972,143 @@
         <w:rPr>
           <w:rFonts w:ascii="Roboto Mono" w:eastAsia="Roboto Mono" w:hAnsi="Roboto Mono" w:cs="Roboto Mono"/>
         </w:rPr>
-        <w:t>: For any two sets aaa and bbb, there is a set that contains exactly aaa and bbb as elements. (i.e., {a,b}\{a, b\}{a,b} is a set containing aaa and bbb).</w:t>
+        <w:t xml:space="preserve">: For any two sets </w:t>
+      </w:r>
+      <w:proofErr w:type="spellStart"/>
+      <w:r>
+        <w:rPr>
+          <w:rFonts w:ascii="Roboto Mono" w:eastAsia="Roboto Mono" w:hAnsi="Roboto Mono" w:cs="Roboto Mono"/>
+        </w:rPr>
+        <w:t>aaa</w:t>
+      </w:r>
+      <w:proofErr w:type="spellEnd"/>
+      <w:r>
+        <w:rPr>
+          <w:rFonts w:ascii="Roboto Mono" w:eastAsia="Roboto Mono" w:hAnsi="Roboto Mono" w:cs="Roboto Mono"/>
+        </w:rPr>
+        <w:t xml:space="preserve"> and </w:t>
+      </w:r>
+      <w:proofErr w:type="spellStart"/>
+      <w:r>
+        <w:rPr>
+          <w:rFonts w:ascii="Roboto Mono" w:eastAsia="Roboto Mono" w:hAnsi="Roboto Mono" w:cs="Roboto Mono"/>
+        </w:rPr>
+        <w:t>bbb</w:t>
+      </w:r>
+      <w:proofErr w:type="spellEnd"/>
+      <w:r>
+        <w:rPr>
+          <w:rFonts w:ascii="Roboto Mono" w:eastAsia="Roboto Mono" w:hAnsi="Roboto Mono" w:cs="Roboto Mono"/>
+        </w:rPr>
+        <w:t xml:space="preserve">, there is a set that contains exactly </w:t>
+      </w:r>
+      <w:proofErr w:type="spellStart"/>
+      <w:r>
+        <w:rPr>
+          <w:rFonts w:ascii="Roboto Mono" w:eastAsia="Roboto Mono" w:hAnsi="Roboto Mono" w:cs="Roboto Mono"/>
+        </w:rPr>
+        <w:t>aaa</w:t>
+      </w:r>
+      <w:proofErr w:type="spellEnd"/>
+      <w:r>
+        <w:rPr>
+          <w:rFonts w:ascii="Roboto Mono" w:eastAsia="Roboto Mono" w:hAnsi="Roboto Mono" w:cs="Roboto Mono"/>
+        </w:rPr>
+        <w:t xml:space="preserve"> and </w:t>
+      </w:r>
+      <w:proofErr w:type="spellStart"/>
+      <w:r>
+        <w:rPr>
+          <w:rFonts w:ascii="Roboto Mono" w:eastAsia="Roboto Mono" w:hAnsi="Roboto Mono" w:cs="Roboto Mono"/>
+        </w:rPr>
+        <w:t>bbb</w:t>
+      </w:r>
+      <w:proofErr w:type="spellEnd"/>
+      <w:r>
+        <w:rPr>
+          <w:rFonts w:ascii="Roboto Mono" w:eastAsia="Roboto Mono" w:hAnsi="Roboto Mono" w:cs="Roboto Mono"/>
+        </w:rPr>
+        <w:t xml:space="preserve"> as elements. (i.e., {</w:t>
+      </w:r>
+      <w:proofErr w:type="spellStart"/>
+      <w:proofErr w:type="gramStart"/>
+      <w:r>
+        <w:rPr>
+          <w:rFonts w:ascii="Roboto Mono" w:eastAsia="Roboto Mono" w:hAnsi="Roboto Mono" w:cs="Roboto Mono"/>
+        </w:rPr>
+        <w:t>a,b</w:t>
+      </w:r>
+      <w:proofErr w:type="spellEnd"/>
+      <w:proofErr w:type="gramEnd"/>
+      <w:r>
+        <w:rPr>
+          <w:rFonts w:ascii="Roboto Mono" w:eastAsia="Roboto Mono" w:hAnsi="Roboto Mono" w:cs="Roboto Mono"/>
+        </w:rPr>
+        <w:t>}</w:t>
+      </w:r>
+      <w:proofErr w:type="gramStart"/>
+      <w:r>
+        <w:rPr>
+          <w:rFonts w:ascii="Roboto Mono" w:eastAsia="Roboto Mono" w:hAnsi="Roboto Mono" w:cs="Roboto Mono"/>
+        </w:rPr>
+        <w:t>\{</w:t>
+      </w:r>
+      <w:proofErr w:type="gramEnd"/>
+      <w:r>
+        <w:rPr>
+          <w:rFonts w:ascii="Roboto Mono" w:eastAsia="Roboto Mono" w:hAnsi="Roboto Mono" w:cs="Roboto Mono"/>
+        </w:rPr>
+        <w:t>a, b</w:t>
+      </w:r>
+      <w:proofErr w:type="gramStart"/>
+      <w:r>
+        <w:rPr>
+          <w:rFonts w:ascii="Roboto Mono" w:eastAsia="Roboto Mono" w:hAnsi="Roboto Mono" w:cs="Roboto Mono"/>
+        </w:rPr>
+        <w:t>\}{</w:t>
+      </w:r>
+      <w:proofErr w:type="spellStart"/>
+      <w:r>
+        <w:rPr>
+          <w:rFonts w:ascii="Roboto Mono" w:eastAsia="Roboto Mono" w:hAnsi="Roboto Mono" w:cs="Roboto Mono"/>
+        </w:rPr>
+        <w:t>a,b</w:t>
+      </w:r>
+      <w:proofErr w:type="spellEnd"/>
+      <w:proofErr w:type="gramEnd"/>
+      <w:r>
+        <w:rPr>
+          <w:rFonts w:ascii="Roboto Mono" w:eastAsia="Roboto Mono" w:hAnsi="Roboto Mono" w:cs="Roboto Mono"/>
+        </w:rPr>
+        <w:t xml:space="preserve">} is a set containing </w:t>
+      </w:r>
+      <w:proofErr w:type="spellStart"/>
+      <w:r>
+        <w:rPr>
+          <w:rFonts w:ascii="Roboto Mono" w:eastAsia="Roboto Mono" w:hAnsi="Roboto Mono" w:cs="Roboto Mono"/>
+        </w:rPr>
+        <w:t>aaa</w:t>
+      </w:r>
+      <w:proofErr w:type="spellEnd"/>
+      <w:r>
+        <w:rPr>
+          <w:rFonts w:ascii="Roboto Mono" w:eastAsia="Roboto Mono" w:hAnsi="Roboto Mono" w:cs="Roboto Mono"/>
+        </w:rPr>
+        <w:t xml:space="preserve"> and </w:t>
+      </w:r>
+      <w:proofErr w:type="spellStart"/>
+      <w:r>
+        <w:rPr>
+          <w:rFonts w:ascii="Roboto Mono" w:eastAsia="Roboto Mono" w:hAnsi="Roboto Mono" w:cs="Roboto Mono"/>
+        </w:rPr>
+        <w:t>bbb</w:t>
+      </w:r>
+      <w:proofErr w:type="spellEnd"/>
+      <w:r>
+        <w:rPr>
+          <w:rFonts w:ascii="Roboto Mono" w:eastAsia="Roboto Mono" w:hAnsi="Roboto Mono" w:cs="Roboto Mono"/>
+        </w:rPr>
+        <w:t>).</w:t>
       </w:r>
       <w:r>
         <w:rPr>
@@ -14147,7 +16186,35 @@
             <w:rPr>
               <w:rFonts w:ascii="Nova Mono" w:eastAsia="Nova Mono" w:hAnsi="Nova Mono" w:cs="Nova Mono"/>
             </w:rPr>
-            <w:t>: A statement cannot be both true and false at the same time (i.e., ¬(A∧¬A)\neg(A \land \neg A)¬(A∧¬A)).</w:t>
+            <w:t>: A statement cannot be both true and false at the same time (i.e., ¬(A∧¬</w:t>
+          </w:r>
+          <w:proofErr w:type="gramStart"/>
+          <w:r>
+            <w:rPr>
+              <w:rFonts w:ascii="Nova Mono" w:eastAsia="Nova Mono" w:hAnsi="Nova Mono" w:cs="Nova Mono"/>
+            </w:rPr>
+            <w:t>A)\neg(</w:t>
+          </w:r>
+          <w:proofErr w:type="gramEnd"/>
+          <w:r>
+            <w:rPr>
+              <w:rFonts w:ascii="Nova Mono" w:eastAsia="Nova Mono" w:hAnsi="Nova Mono" w:cs="Nova Mono"/>
+            </w:rPr>
+            <w:t xml:space="preserve">A \land \neg </w:t>
+          </w:r>
+          <w:proofErr w:type="gramStart"/>
+          <w:r>
+            <w:rPr>
+              <w:rFonts w:ascii="Nova Mono" w:eastAsia="Nova Mono" w:hAnsi="Nova Mono" w:cs="Nova Mono"/>
+            </w:rPr>
+            <w:t>A)¬</w:t>
+          </w:r>
+          <w:proofErr w:type="gramEnd"/>
+          <w:r>
+            <w:rPr>
+              <w:rFonts w:ascii="Nova Mono" w:eastAsia="Nova Mono" w:hAnsi="Nova Mono" w:cs="Nova Mono"/>
+            </w:rPr>
+            <w:t>(A∧¬A)).</w:t>
           </w:r>
           <w:r>
             <w:rPr>
@@ -14289,6 +16356,7 @@
           <w:rFonts w:ascii="Roboto Mono" w:eastAsia="Roboto Mono" w:hAnsi="Roboto Mono" w:cs="Roboto Mono"/>
           <w:b/>
         </w:rPr>
+        <w:lastRenderedPageBreak/>
         <w:t>Axiom of Moral Equality</w:t>
       </w:r>
       <w:r>
@@ -14382,16 +16450,36 @@
           <w:sz w:val="18"/>
           <w:highlight w:val="lightGray"/>
         </w:rPr>
-        <w:t xml:space="preserve">: Persons Table -&gt; ID Column: 1, Name_En Column: Motasem Essam] -&gt; </w:t>
-      </w:r>
-      <w:r>
-        <w:rPr>
-          <w:rFonts w:ascii="Arial" w:eastAsia="Arial" w:hAnsi="Arial"/>
-          <w:b/>
+        <w:t xml:space="preserve">: Persons Table -&gt; ID Column: 1, </w:t>
+      </w:r>
+      <w:proofErr w:type="spellStart"/>
+      <w:r>
+        <w:rPr>
+          <w:rFonts w:ascii="Arial" w:eastAsia="Arial" w:hAnsi="Arial"/>
           <w:color w:val="000000"/>
           <w:sz w:val="18"/>
           <w:highlight w:val="lightGray"/>
         </w:rPr>
+        <w:t>Name_En</w:t>
+      </w:r>
+      <w:proofErr w:type="spellEnd"/>
+      <w:r>
+        <w:rPr>
+          <w:rFonts w:ascii="Arial" w:eastAsia="Arial" w:hAnsi="Arial"/>
+          <w:color w:val="000000"/>
+          <w:sz w:val="18"/>
+          <w:highlight w:val="lightGray"/>
+        </w:rPr>
+        <w:t xml:space="preserve"> Column: Motasem Essam] -&gt; </w:t>
+      </w:r>
+      <w:r>
+        <w:rPr>
+          <w:rFonts w:ascii="Arial" w:eastAsia="Arial" w:hAnsi="Arial"/>
+          <w:b/>
+          <w:color w:val="000000"/>
+          <w:sz w:val="18"/>
+          <w:highlight w:val="lightGray"/>
+        </w:rPr>
         <w:t>From:</w:t>
       </w:r>
       <w:r>
@@ -14401,7 +16489,27 @@
           <w:sz w:val="18"/>
           <w:highlight w:val="lightGray"/>
         </w:rPr>
-        <w:t xml:space="preserve"> [Chatgpt (GPT-4-turbo)] </w:t>
+        <w:t xml:space="preserve"> [</w:t>
+      </w:r>
+      <w:proofErr w:type="spellStart"/>
+      <w:r>
+        <w:rPr>
+          <w:rFonts w:ascii="Arial" w:eastAsia="Arial" w:hAnsi="Arial"/>
+          <w:color w:val="000000"/>
+          <w:sz w:val="18"/>
+          <w:highlight w:val="lightGray"/>
+        </w:rPr>
+        <w:t>Chatgpt</w:t>
+      </w:r>
+      <w:proofErr w:type="spellEnd"/>
+      <w:r>
+        <w:rPr>
+          <w:rFonts w:ascii="Arial" w:eastAsia="Arial" w:hAnsi="Arial"/>
+          <w:color w:val="000000"/>
+          <w:sz w:val="18"/>
+          <w:highlight w:val="lightGray"/>
+        </w:rPr>
+        <w:t xml:space="preserve"> (GPT-4-turbo)] </w:t>
       </w:r>
       <w:r>
         <w:rPr>
@@ -14560,7 +16668,21 @@
         <w:rPr>
           <w:rFonts w:ascii="Roboto Mono" w:eastAsia="Roboto Mono" w:hAnsi="Roboto Mono" w:cs="Roboto Mono"/>
         </w:rPr>
-        <w:t>For example, "The sum of two even numbers is even" is an assertion because it presents a claim about a mathematical fact, which can be proved or disproved.</w:t>
+        <w:t xml:space="preserve">For example, "The sum of two even numbers </w:t>
+      </w:r>
+      <w:proofErr w:type="gramStart"/>
+      <w:r>
+        <w:rPr>
+          <w:rFonts w:ascii="Roboto Mono" w:eastAsia="Roboto Mono" w:hAnsi="Roboto Mono" w:cs="Roboto Mono"/>
+        </w:rPr>
+        <w:t>is</w:t>
+      </w:r>
+      <w:proofErr w:type="gramEnd"/>
+      <w:r>
+        <w:rPr>
+          <w:rFonts w:ascii="Roboto Mono" w:eastAsia="Roboto Mono" w:hAnsi="Roboto Mono" w:cs="Roboto Mono"/>
+        </w:rPr>
+        <w:t xml:space="preserve"> even" is an assertion because it presents a claim about a mathematical fact, which can be proved or disproved.</w:t>
       </w:r>
       <w:r>
         <w:rPr>
@@ -14629,6 +16751,7 @@
         <w:rPr>
           <w:rFonts w:ascii="Roboto Mono" w:eastAsia="Roboto Mono" w:hAnsi="Roboto Mono" w:cs="Roboto Mono"/>
         </w:rPr>
+        <w:lastRenderedPageBreak/>
         <w:t>Can be proved or disproved.</w:t>
       </w:r>
       <w:r>
@@ -14945,6 +17068,7 @@
           <w:rFonts w:ascii="Roboto Mono" w:eastAsia="Roboto Mono" w:hAnsi="Roboto Mono" w:cs="Roboto Mono"/>
           <w:b/>
         </w:rPr>
+        <w:lastRenderedPageBreak/>
         <w:t>Assertion</w:t>
       </w:r>
       <w:r>
@@ -15153,7 +17277,27 @@
           <w:szCs w:val="18"/>
           <w:highlight w:val="lightGray"/>
         </w:rPr>
-        <w:t xml:space="preserve">: Persons Table -&gt; ID Column: 1, Name_En Column: Motasem Essam] -&gt; </w:t>
+        <w:t xml:space="preserve">: Persons Table -&gt; ID Column: 1, </w:t>
+      </w:r>
+      <w:proofErr w:type="spellStart"/>
+      <w:r>
+        <w:rPr>
+          <w:rFonts w:ascii="Arial" w:eastAsia="Arial" w:hAnsi="Arial"/>
+          <w:sz w:val="18"/>
+          <w:szCs w:val="18"/>
+          <w:highlight w:val="lightGray"/>
+        </w:rPr>
+        <w:t>Name_En</w:t>
+      </w:r>
+      <w:proofErr w:type="spellEnd"/>
+      <w:r>
+        <w:rPr>
+          <w:rFonts w:ascii="Arial" w:eastAsia="Arial" w:hAnsi="Arial"/>
+          <w:sz w:val="18"/>
+          <w:szCs w:val="18"/>
+          <w:highlight w:val="lightGray"/>
+        </w:rPr>
+        <w:t xml:space="preserve"> Column: Motasem Essam] -&gt; </w:t>
       </w:r>
       <w:r>
         <w:rPr>
@@ -15458,11 +17602,31 @@
           <w:szCs w:val="18"/>
           <w:highlight w:val="lightGray"/>
         </w:rPr>
-        <w:t xml:space="preserve">: Persons Table -&gt; ID Column: 1, Name_En Column: Motasem Essam] -&gt; </w:t>
-      </w:r>
+        <w:t xml:space="preserve">: Persons Table -&gt; ID Column: 1, </w:t>
+      </w:r>
+      <w:proofErr w:type="spellStart"/>
       <w:r>
         <w:rPr>
           <w:rFonts w:asciiTheme="minorBidi" w:eastAsia="Arial" w:hAnsiTheme="minorBidi"/>
+          <w:sz w:val="18"/>
+          <w:szCs w:val="18"/>
+          <w:highlight w:val="lightGray"/>
+        </w:rPr>
+        <w:t>Name_En</w:t>
+      </w:r>
+      <w:proofErr w:type="spellEnd"/>
+      <w:r>
+        <w:rPr>
+          <w:rFonts w:asciiTheme="minorBidi" w:eastAsia="Arial" w:hAnsiTheme="minorBidi"/>
+          <w:sz w:val="18"/>
+          <w:szCs w:val="18"/>
+          <w:highlight w:val="lightGray"/>
+        </w:rPr>
+        <w:t xml:space="preserve"> Column: Motasem Essam] -&gt; </w:t>
+      </w:r>
+      <w:r>
+        <w:rPr>
+          <w:rFonts w:asciiTheme="minorBidi" w:eastAsia="Arial" w:hAnsiTheme="minorBidi"/>
           <w:b/>
           <w:bCs/>
           <w:sz w:val="18"/>
@@ -15662,6 +17826,7 @@
         <w:rPr>
           <w:rFonts w:ascii="Roboto Mono" w:eastAsia="Roboto Mono" w:hAnsi="Roboto Mono" w:cs="Roboto Mono"/>
         </w:rPr>
+        <w:lastRenderedPageBreak/>
         <w:t xml:space="preserve">*What exactly is an axiomatic system? I know it sounds like a big word for a complicated system, but it's actually not all that complicated. </w:t>
       </w:r>
     </w:p>
@@ -15782,11 +17947,31 @@
           <w:szCs w:val="18"/>
           <w:highlight w:val="lightGray"/>
         </w:rPr>
-        <w:t xml:space="preserve">: Persons Table -&gt; ID Column: 1, Name_En Column: Motasem Essam] -&gt; </w:t>
-      </w:r>
+        <w:t xml:space="preserve">: Persons Table -&gt; ID Column: 1, </w:t>
+      </w:r>
+      <w:proofErr w:type="spellStart"/>
       <w:r>
         <w:rPr>
           <w:rFonts w:asciiTheme="minorBidi" w:eastAsia="Arial" w:hAnsiTheme="minorBidi"/>
+          <w:sz w:val="18"/>
+          <w:szCs w:val="18"/>
+          <w:highlight w:val="lightGray"/>
+        </w:rPr>
+        <w:t>Name_En</w:t>
+      </w:r>
+      <w:proofErr w:type="spellEnd"/>
+      <w:r>
+        <w:rPr>
+          <w:rFonts w:asciiTheme="minorBidi" w:eastAsia="Arial" w:hAnsiTheme="minorBidi"/>
+          <w:sz w:val="18"/>
+          <w:szCs w:val="18"/>
+          <w:highlight w:val="lightGray"/>
+        </w:rPr>
+        <w:t xml:space="preserve"> Column: Motasem Essam] -&gt; </w:t>
+      </w:r>
+      <w:r>
+        <w:rPr>
+          <w:rFonts w:asciiTheme="minorBidi" w:eastAsia="Arial" w:hAnsiTheme="minorBidi"/>
           <w:b/>
           <w:bCs/>
           <w:sz w:val="18"/>
@@ -16049,6 +18234,7 @@
         <w:rPr>
           <w:rFonts w:ascii="Roboto Mono" w:eastAsia="Roboto Mono" w:hAnsi="Roboto Mono" w:cs="Roboto Mono"/>
         </w:rPr>
+        <w:lastRenderedPageBreak/>
         <w:t>2. A line segment can be extended infinitely in both directions.</w:t>
       </w:r>
     </w:p>
@@ -16150,7 +18336,27 @@
           <w:szCs w:val="18"/>
           <w:highlight w:val="lightGray"/>
         </w:rPr>
-        <w:t xml:space="preserve"> Persons Table -&gt; ID Column: 1, Name_En Column: Motasem Essam] </w:t>
+        <w:t xml:space="preserve"> Persons Table -&gt; ID Column: 1, </w:t>
+      </w:r>
+      <w:proofErr w:type="spellStart"/>
+      <w:r>
+        <w:rPr>
+          <w:rFonts w:ascii="Arial" w:eastAsia="Arial" w:hAnsi="Arial"/>
+          <w:sz w:val="18"/>
+          <w:szCs w:val="18"/>
+          <w:highlight w:val="lightGray"/>
+        </w:rPr>
+        <w:t>Name_En</w:t>
+      </w:r>
+      <w:proofErr w:type="spellEnd"/>
+      <w:r>
+        <w:rPr>
+          <w:rFonts w:ascii="Arial" w:eastAsia="Arial" w:hAnsi="Arial"/>
+          <w:sz w:val="18"/>
+          <w:szCs w:val="18"/>
+          <w:highlight w:val="lightGray"/>
+        </w:rPr>
+        <w:t xml:space="preserve"> Column: Motasem Essam] </w:t>
       </w:r>
       <w:r>
         <w:rPr>
@@ -16170,7 +18376,27 @@
           <w:szCs w:val="18"/>
           <w:highlight w:val="lightGray"/>
         </w:rPr>
-        <w:t xml:space="preserve"> Persons Table -&gt; ID Column: 1, Name_En Column: </w:t>
+        <w:t xml:space="preserve"> Persons Table -&gt; ID Column: 1, </w:t>
+      </w:r>
+      <w:proofErr w:type="spellStart"/>
+      <w:r>
+        <w:rPr>
+          <w:rFonts w:ascii="Arial" w:eastAsia="Arial" w:hAnsi="Arial"/>
+          <w:sz w:val="18"/>
+          <w:szCs w:val="18"/>
+          <w:highlight w:val="lightGray"/>
+        </w:rPr>
+        <w:t>Name_En</w:t>
+      </w:r>
+      <w:proofErr w:type="spellEnd"/>
+      <w:r>
+        <w:rPr>
+          <w:rFonts w:ascii="Arial" w:eastAsia="Arial" w:hAnsi="Arial"/>
+          <w:sz w:val="18"/>
+          <w:szCs w:val="18"/>
+          <w:highlight w:val="lightGray"/>
+        </w:rPr>
+        <w:t xml:space="preserve"> Column: </w:t>
       </w:r>
       <w:r>
         <w:rPr>
@@ -16398,7 +18624,27 @@
           <w:szCs w:val="18"/>
           <w:highlight w:val="lightGray"/>
         </w:rPr>
-        <w:t xml:space="preserve">: Persons Table -&gt; ID Column: 1, Name_En Column: Motasem Essam] -&gt; </w:t>
+        <w:t xml:space="preserve">: Persons Table -&gt; ID Column: 1, </w:t>
+      </w:r>
+      <w:proofErr w:type="spellStart"/>
+      <w:r>
+        <w:rPr>
+          <w:rFonts w:ascii="Arial" w:eastAsia="Arial" w:hAnsi="Arial"/>
+          <w:sz w:val="18"/>
+          <w:szCs w:val="18"/>
+          <w:highlight w:val="lightGray"/>
+        </w:rPr>
+        <w:t>Name_En</w:t>
+      </w:r>
+      <w:proofErr w:type="spellEnd"/>
+      <w:r>
+        <w:rPr>
+          <w:rFonts w:ascii="Arial" w:eastAsia="Arial" w:hAnsi="Arial"/>
+          <w:sz w:val="18"/>
+          <w:szCs w:val="18"/>
+          <w:highlight w:val="lightGray"/>
+        </w:rPr>
+        <w:t xml:space="preserve"> Column: Motasem Essam] -&gt; </w:t>
       </w:r>
       <w:r>
         <w:rPr>
@@ -16725,7 +18971,27 @@
           <w:szCs w:val="18"/>
           <w:highlight w:val="lightGray"/>
         </w:rPr>
-        <w:t xml:space="preserve">: Persons Table -&gt; ID Column: 1, Name_En Column: Motasem Essam] -&gt; </w:t>
+        <w:t xml:space="preserve">: Persons Table -&gt; ID Column: 1, </w:t>
+      </w:r>
+      <w:proofErr w:type="spellStart"/>
+      <w:r>
+        <w:rPr>
+          <w:rFonts w:ascii="Arial" w:eastAsia="Arial" w:hAnsi="Arial"/>
+          <w:sz w:val="18"/>
+          <w:szCs w:val="18"/>
+          <w:highlight w:val="lightGray"/>
+        </w:rPr>
+        <w:t>Name_En</w:t>
+      </w:r>
+      <w:proofErr w:type="spellEnd"/>
+      <w:r>
+        <w:rPr>
+          <w:rFonts w:ascii="Arial" w:eastAsia="Arial" w:hAnsi="Arial"/>
+          <w:sz w:val="18"/>
+          <w:szCs w:val="18"/>
+          <w:highlight w:val="lightGray"/>
+        </w:rPr>
+        <w:t xml:space="preserve"> Column: Motasem Essam] -&gt; </w:t>
       </w:r>
       <w:r>
         <w:rPr>
@@ -17080,7 +19346,27 @@
           <w:szCs w:val="18"/>
           <w:highlight w:val="lightGray"/>
         </w:rPr>
-        <w:t xml:space="preserve">: Persons Table -&gt; ID Column: 1, Name_En Column: Motasem Essam] -&gt; </w:t>
+        <w:t xml:space="preserve">: Persons Table -&gt; ID Column: 1, </w:t>
+      </w:r>
+      <w:proofErr w:type="spellStart"/>
+      <w:r>
+        <w:rPr>
+          <w:rFonts w:ascii="Arial" w:eastAsia="Arial" w:hAnsi="Arial"/>
+          <w:sz w:val="18"/>
+          <w:szCs w:val="18"/>
+          <w:highlight w:val="lightGray"/>
+        </w:rPr>
+        <w:t>Name_En</w:t>
+      </w:r>
+      <w:proofErr w:type="spellEnd"/>
+      <w:r>
+        <w:rPr>
+          <w:rFonts w:ascii="Arial" w:eastAsia="Arial" w:hAnsi="Arial"/>
+          <w:sz w:val="18"/>
+          <w:szCs w:val="18"/>
+          <w:highlight w:val="lightGray"/>
+        </w:rPr>
+        <w:t xml:space="preserve"> Column: Motasem Essam] -&gt; </w:t>
       </w:r>
       <w:r>
         <w:rPr>
@@ -17303,6 +19589,7 @@
         <w:rPr>
           <w:rFonts w:ascii="Arial" w:eastAsia="Arial" w:hAnsi="Arial" w:cs="Roboto Mono"/>
         </w:rPr>
+        <w:lastRenderedPageBreak/>
         <w:t>The third property is that of completeness. A complete axiomatic system is a system where for any statement, either the statement or its negative can be proved using the system. If there is any statement the system cannot prove or disprove, then the system is not complete. As you can see, this is a pretty big property to fill. This is why completeness is also not a required property. This property is a tough one to fulfill for any axiomatic system.</w:t>
       </w:r>
     </w:p>
@@ -17360,16 +19647,36 @@
           <w:sz w:val="18"/>
           <w:highlight w:val="lightGray"/>
         </w:rPr>
-        <w:t xml:space="preserve">: Persons Table -&gt; ID Column: 1, Name_En Column: Motasem Essam] -&gt; </w:t>
-      </w:r>
-      <w:r>
-        <w:rPr>
-          <w:rFonts w:ascii="Arial" w:eastAsia="Arial" w:hAnsi="Arial"/>
-          <w:b/>
+        <w:t xml:space="preserve">: Persons Table -&gt; ID Column: 1, </w:t>
+      </w:r>
+      <w:proofErr w:type="spellStart"/>
+      <w:r>
+        <w:rPr>
+          <w:rFonts w:ascii="Arial" w:eastAsia="Arial" w:hAnsi="Arial"/>
           <w:color w:val="000000"/>
           <w:sz w:val="18"/>
           <w:highlight w:val="lightGray"/>
         </w:rPr>
+        <w:t>Name_En</w:t>
+      </w:r>
+      <w:proofErr w:type="spellEnd"/>
+      <w:r>
+        <w:rPr>
+          <w:rFonts w:ascii="Arial" w:eastAsia="Arial" w:hAnsi="Arial"/>
+          <w:color w:val="000000"/>
+          <w:sz w:val="18"/>
+          <w:highlight w:val="lightGray"/>
+        </w:rPr>
+        <w:t xml:space="preserve"> Column: Motasem Essam] -&gt; </w:t>
+      </w:r>
+      <w:r>
+        <w:rPr>
+          <w:rFonts w:ascii="Arial" w:eastAsia="Arial" w:hAnsi="Arial"/>
+          <w:b/>
+          <w:color w:val="000000"/>
+          <w:sz w:val="18"/>
+          <w:highlight w:val="lightGray"/>
+        </w:rPr>
         <w:t>From:</w:t>
       </w:r>
       <w:r>
@@ -17379,7 +19686,27 @@
           <w:sz w:val="18"/>
           <w:highlight w:val="lightGray"/>
         </w:rPr>
-        <w:t xml:space="preserve"> [Chatgpt (GPT-4-turbo)] </w:t>
+        <w:t xml:space="preserve"> [</w:t>
+      </w:r>
+      <w:proofErr w:type="spellStart"/>
+      <w:r>
+        <w:rPr>
+          <w:rFonts w:ascii="Arial" w:eastAsia="Arial" w:hAnsi="Arial"/>
+          <w:color w:val="000000"/>
+          <w:sz w:val="18"/>
+          <w:highlight w:val="lightGray"/>
+        </w:rPr>
+        <w:t>Chatgpt</w:t>
+      </w:r>
+      <w:proofErr w:type="spellEnd"/>
+      <w:r>
+        <w:rPr>
+          <w:rFonts w:ascii="Arial" w:eastAsia="Arial" w:hAnsi="Arial"/>
+          <w:color w:val="000000"/>
+          <w:sz w:val="18"/>
+          <w:highlight w:val="lightGray"/>
+        </w:rPr>
+        <w:t xml:space="preserve"> (GPT-4-turbo)] </w:t>
       </w:r>
       <w:r>
         <w:rPr>
@@ -17895,7 +20222,27 @@
           <w:szCs w:val="18"/>
           <w:highlight w:val="lightGray"/>
         </w:rPr>
-        <w:t xml:space="preserve">: Persons Table -&gt; ID Column: 1, Name_En Column: Motasem Essam] -&gt; </w:t>
+        <w:t xml:space="preserve">: Persons Table -&gt; ID Column: 1, </w:t>
+      </w:r>
+      <w:proofErr w:type="spellStart"/>
+      <w:r>
+        <w:rPr>
+          <w:rFonts w:ascii="Arial" w:eastAsia="Arial" w:hAnsi="Arial"/>
+          <w:sz w:val="18"/>
+          <w:szCs w:val="18"/>
+          <w:highlight w:val="lightGray"/>
+        </w:rPr>
+        <w:t>Name_En</w:t>
+      </w:r>
+      <w:proofErr w:type="spellEnd"/>
+      <w:r>
+        <w:rPr>
+          <w:rFonts w:ascii="Arial" w:eastAsia="Arial" w:hAnsi="Arial"/>
+          <w:sz w:val="18"/>
+          <w:szCs w:val="18"/>
+          <w:highlight w:val="lightGray"/>
+        </w:rPr>
+        <w:t xml:space="preserve"> Column: Motasem Essam] -&gt; </w:t>
       </w:r>
       <w:r>
         <w:rPr>
@@ -17962,7 +20309,17 @@
           <w:szCs w:val="18"/>
           <w:highlight w:val="lightGray"/>
         </w:rPr>
-        <w:t xml:space="preserve">: Multi Sources - Theorem - Meaning, Types &amp; Examples] -&gt; </w:t>
+        <w:t xml:space="preserve">: Multi Sources - Theorem - </w:t>
+      </w:r>
+      <w:r>
+        <w:rPr>
+          <w:rFonts w:ascii="Arial" w:eastAsia="Arial" w:hAnsi="Arial"/>
+          <w:sz w:val="18"/>
+          <w:szCs w:val="18"/>
+          <w:highlight w:val="lightGray"/>
+        </w:rPr>
+        <w:lastRenderedPageBreak/>
+        <w:t xml:space="preserve">Meaning, Types &amp; Examples] -&gt; </w:t>
       </w:r>
       <w:r>
         <w:rPr>
@@ -18215,8 +20572,13 @@
       <w:bookmarkStart w:id="49" w:name="_heading=h.9wqeybg3o2by" w:colFirst="0" w:colLast="0"/>
       <w:bookmarkEnd w:id="49"/>
       <w:r>
-        <w:t>Types of Theorem</w:t>
-      </w:r>
+        <w:t xml:space="preserve">Types of </w:t>
+      </w:r>
+      <w:proofErr w:type="gramStart"/>
+      <w:r>
+        <w:t>Theorem</w:t>
+      </w:r>
+      <w:proofErr w:type="gramEnd"/>
     </w:p>
     <w:p>
       <w:pPr>
@@ -18283,7 +20645,27 @@
           <w:szCs w:val="18"/>
           <w:highlight w:val="lightGray"/>
         </w:rPr>
-        <w:t xml:space="preserve">: Persons Table -&gt; ID Column: 1, Name_En Column: Motasem Essam] -&gt; </w:t>
+        <w:t xml:space="preserve">: Persons Table -&gt; ID Column: 1, </w:t>
+      </w:r>
+      <w:proofErr w:type="spellStart"/>
+      <w:r>
+        <w:rPr>
+          <w:rFonts w:ascii="Arial" w:eastAsia="Arial" w:hAnsi="Arial"/>
+          <w:sz w:val="18"/>
+          <w:szCs w:val="18"/>
+          <w:highlight w:val="lightGray"/>
+        </w:rPr>
+        <w:t>Name_En</w:t>
+      </w:r>
+      <w:proofErr w:type="spellEnd"/>
+      <w:r>
+        <w:rPr>
+          <w:rFonts w:ascii="Arial" w:eastAsia="Arial" w:hAnsi="Arial"/>
+          <w:sz w:val="18"/>
+          <w:szCs w:val="18"/>
+          <w:highlight w:val="lightGray"/>
+        </w:rPr>
+        <w:t xml:space="preserve"> Column: Motasem Essam] -&gt; </w:t>
       </w:r>
       <w:r>
         <w:rPr>
@@ -18746,7 +21128,27 @@
           <w:szCs w:val="18"/>
           <w:highlight w:val="lightGray"/>
         </w:rPr>
-        <w:t xml:space="preserve">: Persons Table -&gt; ID Column: 1, Name_En Column: Motasem Essam] -&gt; </w:t>
+        <w:t xml:space="preserve">: Persons Table -&gt; ID Column: 1, </w:t>
+      </w:r>
+      <w:proofErr w:type="spellStart"/>
+      <w:r>
+        <w:rPr>
+          <w:rFonts w:ascii="Arial" w:eastAsia="Arial" w:hAnsi="Arial"/>
+          <w:sz w:val="18"/>
+          <w:szCs w:val="18"/>
+          <w:highlight w:val="lightGray"/>
+        </w:rPr>
+        <w:t>Name_En</w:t>
+      </w:r>
+      <w:proofErr w:type="spellEnd"/>
+      <w:r>
+        <w:rPr>
+          <w:rFonts w:ascii="Arial" w:eastAsia="Arial" w:hAnsi="Arial"/>
+          <w:sz w:val="18"/>
+          <w:szCs w:val="18"/>
+          <w:highlight w:val="lightGray"/>
+        </w:rPr>
+        <w:t xml:space="preserve"> Column: Motasem Essam] -&gt; </w:t>
       </w:r>
       <w:r>
         <w:rPr>
@@ -18945,6 +21347,7 @@
         <w:rPr>
           <w:noProof/>
         </w:rPr>
+        <w:lastRenderedPageBreak/>
         <w:drawing>
           <wp:inline distT="114300" distB="114300" distL="114300" distR="114300" wp14:anchorId="11E8B69F" wp14:editId="27B2B499">
             <wp:extent cx="5943600" cy="3200400"/>
@@ -19026,6 +21429,7 @@
           <w:szCs w:val="18"/>
           <w:highlight w:val="lightGray"/>
         </w:rPr>
+        <w:lastRenderedPageBreak/>
         <w:t># Source: Multi sources</w:t>
       </w:r>
       <w:r>
@@ -19075,7 +21479,27 @@
           <w:szCs w:val="18"/>
           <w:highlight w:val="lightGray"/>
         </w:rPr>
-        <w:t xml:space="preserve">: Persons Table -&gt; ID Column: 1, Name_En Column: Motasem Essam] -&gt; </w:t>
+        <w:t xml:space="preserve">: Persons Table -&gt; ID Column: 1, </w:t>
+      </w:r>
+      <w:proofErr w:type="spellStart"/>
+      <w:r>
+        <w:rPr>
+          <w:rFonts w:ascii="Arial" w:eastAsia="Arial" w:hAnsi="Arial"/>
+          <w:sz w:val="18"/>
+          <w:szCs w:val="18"/>
+          <w:highlight w:val="lightGray"/>
+        </w:rPr>
+        <w:t>Name_En</w:t>
+      </w:r>
+      <w:proofErr w:type="spellEnd"/>
+      <w:r>
+        <w:rPr>
+          <w:rFonts w:ascii="Arial" w:eastAsia="Arial" w:hAnsi="Arial"/>
+          <w:sz w:val="18"/>
+          <w:szCs w:val="18"/>
+          <w:highlight w:val="lightGray"/>
+        </w:rPr>
+        <w:t xml:space="preserve"> Column: Motasem Essam] -&gt; </w:t>
       </w:r>
       <w:r>
         <w:rPr>
@@ -19412,7 +21836,27 @@
           <w:szCs w:val="18"/>
           <w:highlight w:val="lightGray"/>
         </w:rPr>
-        <w:t xml:space="preserve">: Persons Table -&gt; ID Column: 1, Name_En Column: Motasem Essam] -&gt; </w:t>
+        <w:t xml:space="preserve">: Persons Table -&gt; ID Column: 1, </w:t>
+      </w:r>
+      <w:proofErr w:type="spellStart"/>
+      <w:r>
+        <w:rPr>
+          <w:rFonts w:ascii="Arial" w:eastAsia="Arial" w:hAnsi="Arial"/>
+          <w:sz w:val="18"/>
+          <w:szCs w:val="18"/>
+          <w:highlight w:val="lightGray"/>
+        </w:rPr>
+        <w:t>Name_En</w:t>
+      </w:r>
+      <w:proofErr w:type="spellEnd"/>
+      <w:r>
+        <w:rPr>
+          <w:rFonts w:ascii="Arial" w:eastAsia="Arial" w:hAnsi="Arial"/>
+          <w:sz w:val="18"/>
+          <w:szCs w:val="18"/>
+          <w:highlight w:val="lightGray"/>
+        </w:rPr>
+        <w:t xml:space="preserve"> Column: Motasem Essam] -&gt; </w:t>
       </w:r>
       <w:r>
         <w:rPr>
@@ -19739,7 +22183,27 @@
           <w:szCs w:val="18"/>
           <w:highlight w:val="lightGray"/>
         </w:rPr>
-        <w:t xml:space="preserve">: Persons Table -&gt; ID Column: 1, Name_En Column: Motasem Essam] -&gt; </w:t>
+        <w:t xml:space="preserve">: Persons Table -&gt; ID Column: 1, </w:t>
+      </w:r>
+      <w:proofErr w:type="spellStart"/>
+      <w:r>
+        <w:rPr>
+          <w:rFonts w:ascii="Arial" w:eastAsia="Arial" w:hAnsi="Arial"/>
+          <w:sz w:val="18"/>
+          <w:szCs w:val="18"/>
+          <w:highlight w:val="lightGray"/>
+        </w:rPr>
+        <w:t>Name_En</w:t>
+      </w:r>
+      <w:proofErr w:type="spellEnd"/>
+      <w:r>
+        <w:rPr>
+          <w:rFonts w:ascii="Arial" w:eastAsia="Arial" w:hAnsi="Arial"/>
+          <w:sz w:val="18"/>
+          <w:szCs w:val="18"/>
+          <w:highlight w:val="lightGray"/>
+        </w:rPr>
+        <w:t xml:space="preserve"> Column: Motasem Essam] -&gt; </w:t>
       </w:r>
       <w:r>
         <w:rPr>
@@ -19917,6 +22381,7 @@
         <w:rPr>
           <w:noProof/>
         </w:rPr>
+        <w:lastRenderedPageBreak/>
         <w:drawing>
           <wp:inline distT="114300" distB="114300" distL="114300" distR="114300" wp14:anchorId="75D6F8EB" wp14:editId="53183E30">
             <wp:extent cx="5943600" cy="622300"/>
@@ -20069,7 +22534,27 @@
           <w:szCs w:val="18"/>
           <w:highlight w:val="lightGray"/>
         </w:rPr>
-        <w:t xml:space="preserve">: Persons Table -&gt; ID Column: 1, Name_En Column: Motasem Essam] -&gt; </w:t>
+        <w:t xml:space="preserve">: Persons Table -&gt; ID Column: 1, </w:t>
+      </w:r>
+      <w:proofErr w:type="spellStart"/>
+      <w:r>
+        <w:rPr>
+          <w:rFonts w:ascii="Arial" w:eastAsia="Arial" w:hAnsi="Arial"/>
+          <w:sz w:val="18"/>
+          <w:szCs w:val="18"/>
+          <w:highlight w:val="lightGray"/>
+        </w:rPr>
+        <w:t>Name_En</w:t>
+      </w:r>
+      <w:proofErr w:type="spellEnd"/>
+      <w:r>
+        <w:rPr>
+          <w:rFonts w:ascii="Arial" w:eastAsia="Arial" w:hAnsi="Arial"/>
+          <w:sz w:val="18"/>
+          <w:szCs w:val="18"/>
+          <w:highlight w:val="lightGray"/>
+        </w:rPr>
+        <w:t xml:space="preserve"> Column: Motasem Essam] -&gt; </w:t>
       </w:r>
       <w:r>
         <w:rPr>
@@ -20316,6 +22801,7 @@
           <w:szCs w:val="18"/>
           <w:highlight w:val="lightGray"/>
         </w:rPr>
+        <w:lastRenderedPageBreak/>
         <w:t># Source: Multi sources</w:t>
       </w:r>
       <w:r>
@@ -20365,7 +22851,27 @@
           <w:szCs w:val="18"/>
           <w:highlight w:val="lightGray"/>
         </w:rPr>
-        <w:t xml:space="preserve">: Persons Table -&gt; ID Column: 1, Name_En Column: Motasem Essam] -&gt; </w:t>
+        <w:t xml:space="preserve">: Persons Table -&gt; ID Column: 1, </w:t>
+      </w:r>
+      <w:proofErr w:type="spellStart"/>
+      <w:r>
+        <w:rPr>
+          <w:rFonts w:ascii="Arial" w:eastAsia="Arial" w:hAnsi="Arial"/>
+          <w:sz w:val="18"/>
+          <w:szCs w:val="18"/>
+          <w:highlight w:val="lightGray"/>
+        </w:rPr>
+        <w:t>Name_En</w:t>
+      </w:r>
+      <w:proofErr w:type="spellEnd"/>
+      <w:r>
+        <w:rPr>
+          <w:rFonts w:ascii="Arial" w:eastAsia="Arial" w:hAnsi="Arial"/>
+          <w:sz w:val="18"/>
+          <w:szCs w:val="18"/>
+          <w:highlight w:val="lightGray"/>
+        </w:rPr>
+        <w:t xml:space="preserve"> Column: Motasem Essam] -&gt; </w:t>
       </w:r>
       <w:r>
         <w:rPr>
@@ -20697,7 +23203,27 @@
           <w:szCs w:val="18"/>
           <w:highlight w:val="lightGray"/>
         </w:rPr>
-        <w:t xml:space="preserve">: Persons Table -&gt; ID Column: 1, Name_En Column: Motasem Essam] -&gt; </w:t>
+        <w:t xml:space="preserve">: Persons Table -&gt; ID Column: 1, </w:t>
+      </w:r>
+      <w:proofErr w:type="spellStart"/>
+      <w:r>
+        <w:rPr>
+          <w:rFonts w:ascii="Arial" w:eastAsia="Arial" w:hAnsi="Arial"/>
+          <w:sz w:val="18"/>
+          <w:szCs w:val="18"/>
+          <w:highlight w:val="lightGray"/>
+        </w:rPr>
+        <w:t>Name_En</w:t>
+      </w:r>
+      <w:proofErr w:type="spellEnd"/>
+      <w:r>
+        <w:rPr>
+          <w:rFonts w:ascii="Arial" w:eastAsia="Arial" w:hAnsi="Arial"/>
+          <w:sz w:val="18"/>
+          <w:szCs w:val="18"/>
+          <w:highlight w:val="lightGray"/>
+        </w:rPr>
+        <w:t xml:space="preserve"> Column: Motasem Essam] -&gt; </w:t>
       </w:r>
       <w:r>
         <w:rPr>
@@ -20981,6 +23507,7 @@
           <w:szCs w:val="18"/>
           <w:highlight w:val="lightGray"/>
         </w:rPr>
+        <w:lastRenderedPageBreak/>
         <w:t># Source: Multi sources</w:t>
       </w:r>
       <w:r>
@@ -21030,7 +23557,27 @@
           <w:szCs w:val="18"/>
           <w:highlight w:val="lightGray"/>
         </w:rPr>
-        <w:t xml:space="preserve">: Persons Table -&gt; ID Column: 1, Name_En Column: Motasem Essam] -&gt; </w:t>
+        <w:t xml:space="preserve">: Persons Table -&gt; ID Column: 1, </w:t>
+      </w:r>
+      <w:proofErr w:type="spellStart"/>
+      <w:r>
+        <w:rPr>
+          <w:rFonts w:ascii="Arial" w:eastAsia="Arial" w:hAnsi="Arial"/>
+          <w:sz w:val="18"/>
+          <w:szCs w:val="18"/>
+          <w:highlight w:val="lightGray"/>
+        </w:rPr>
+        <w:t>Name_En</w:t>
+      </w:r>
+      <w:proofErr w:type="spellEnd"/>
+      <w:r>
+        <w:rPr>
+          <w:rFonts w:ascii="Arial" w:eastAsia="Arial" w:hAnsi="Arial"/>
+          <w:sz w:val="18"/>
+          <w:szCs w:val="18"/>
+          <w:highlight w:val="lightGray"/>
+        </w:rPr>
+        <w:t xml:space="preserve"> Column: Motasem Essam] -&gt; </w:t>
       </w:r>
       <w:r>
         <w:rPr>
@@ -21368,7 +23915,27 @@
           <w:szCs w:val="18"/>
           <w:highlight w:val="lightGray"/>
         </w:rPr>
-        <w:t xml:space="preserve">: Persons Table -&gt; ID Column: 1, Name_En Column: Motasem Essam] -&gt; </w:t>
+        <w:t xml:space="preserve">: Persons Table -&gt; ID Column: 1, </w:t>
+      </w:r>
+      <w:proofErr w:type="spellStart"/>
+      <w:r>
+        <w:rPr>
+          <w:rFonts w:ascii="Arial" w:eastAsia="Arial" w:hAnsi="Arial"/>
+          <w:sz w:val="18"/>
+          <w:szCs w:val="18"/>
+          <w:highlight w:val="lightGray"/>
+        </w:rPr>
+        <w:t>Name_En</w:t>
+      </w:r>
+      <w:proofErr w:type="spellEnd"/>
+      <w:r>
+        <w:rPr>
+          <w:rFonts w:ascii="Arial" w:eastAsia="Arial" w:hAnsi="Arial"/>
+          <w:sz w:val="18"/>
+          <w:szCs w:val="18"/>
+          <w:highlight w:val="lightGray"/>
+        </w:rPr>
+        <w:t xml:space="preserve"> Column: Motasem Essam] -&gt; </w:t>
       </w:r>
       <w:r>
         <w:rPr>
@@ -21577,6 +24144,7 @@
         <w:rPr>
           <w:rFonts w:ascii="Roboto Mono" w:eastAsia="Roboto Mono" w:hAnsi="Roboto Mono" w:cs="Roboto Mono"/>
         </w:rPr>
+        <w:lastRenderedPageBreak/>
         <w:t>Let A be the hypotenuse, B be the base, and C be the height of the triangle.</w:t>
       </w:r>
     </w:p>
@@ -22044,16 +24612,36 @@
           <w:sz w:val="18"/>
           <w:highlight w:val="lightGray"/>
         </w:rPr>
-        <w:t xml:space="preserve">: Persons Table -&gt; ID Column: 1, Name_En Column: Motasem Essam] -&gt; </w:t>
-      </w:r>
-      <w:r>
-        <w:rPr>
-          <w:rFonts w:ascii="Arial" w:eastAsia="Arial" w:hAnsi="Arial"/>
-          <w:b/>
+        <w:t xml:space="preserve">: Persons Table -&gt; ID Column: 1, </w:t>
+      </w:r>
+      <w:proofErr w:type="spellStart"/>
+      <w:r>
+        <w:rPr>
+          <w:rFonts w:ascii="Arial" w:eastAsia="Arial" w:hAnsi="Arial"/>
           <w:color w:val="000000"/>
           <w:sz w:val="18"/>
           <w:highlight w:val="lightGray"/>
         </w:rPr>
+        <w:t>Name_En</w:t>
+      </w:r>
+      <w:proofErr w:type="spellEnd"/>
+      <w:r>
+        <w:rPr>
+          <w:rFonts w:ascii="Arial" w:eastAsia="Arial" w:hAnsi="Arial"/>
+          <w:color w:val="000000"/>
+          <w:sz w:val="18"/>
+          <w:highlight w:val="lightGray"/>
+        </w:rPr>
+        <w:t xml:space="preserve"> Column: Motasem Essam] -&gt; </w:t>
+      </w:r>
+      <w:r>
+        <w:rPr>
+          <w:rFonts w:ascii="Arial" w:eastAsia="Arial" w:hAnsi="Arial"/>
+          <w:b/>
+          <w:color w:val="000000"/>
+          <w:sz w:val="18"/>
+          <w:highlight w:val="lightGray"/>
+        </w:rPr>
         <w:t>From:</w:t>
       </w:r>
       <w:r>
@@ -22063,7 +24651,27 @@
           <w:sz w:val="18"/>
           <w:highlight w:val="lightGray"/>
         </w:rPr>
-        <w:t xml:space="preserve"> [Chatgpt (GPT-4-turbo)] </w:t>
+        <w:t xml:space="preserve"> [</w:t>
+      </w:r>
+      <w:proofErr w:type="spellStart"/>
+      <w:r>
+        <w:rPr>
+          <w:rFonts w:ascii="Arial" w:eastAsia="Arial" w:hAnsi="Arial"/>
+          <w:color w:val="000000"/>
+          <w:sz w:val="18"/>
+          <w:highlight w:val="lightGray"/>
+        </w:rPr>
+        <w:t>Chatgpt</w:t>
+      </w:r>
+      <w:proofErr w:type="spellEnd"/>
+      <w:r>
+        <w:rPr>
+          <w:rFonts w:ascii="Arial" w:eastAsia="Arial" w:hAnsi="Arial"/>
+          <w:color w:val="000000"/>
+          <w:sz w:val="18"/>
+          <w:highlight w:val="lightGray"/>
+        </w:rPr>
+        <w:t xml:space="preserve"> (GPT-4-turbo)] </w:t>
       </w:r>
       <w:r>
         <w:rPr>
@@ -22169,16 +24777,36 @@
           <w:sz w:val="18"/>
           <w:highlight w:val="lightGray"/>
         </w:rPr>
-        <w:t xml:space="preserve">: Persons Table -&gt; ID Column: 1, Name_En Column: Motasem Essam] -&gt; </w:t>
-      </w:r>
-      <w:r>
-        <w:rPr>
-          <w:rFonts w:ascii="Arial" w:eastAsia="Arial" w:hAnsi="Arial"/>
-          <w:b/>
+        <w:t xml:space="preserve">: Persons Table -&gt; ID Column: 1, </w:t>
+      </w:r>
+      <w:proofErr w:type="spellStart"/>
+      <w:r>
+        <w:rPr>
+          <w:rFonts w:ascii="Arial" w:eastAsia="Arial" w:hAnsi="Arial"/>
           <w:color w:val="000000"/>
           <w:sz w:val="18"/>
           <w:highlight w:val="lightGray"/>
         </w:rPr>
+        <w:t>Name_En</w:t>
+      </w:r>
+      <w:proofErr w:type="spellEnd"/>
+      <w:r>
+        <w:rPr>
+          <w:rFonts w:ascii="Arial" w:eastAsia="Arial" w:hAnsi="Arial"/>
+          <w:color w:val="000000"/>
+          <w:sz w:val="18"/>
+          <w:highlight w:val="lightGray"/>
+        </w:rPr>
+        <w:t xml:space="preserve"> Column: Motasem Essam] -&gt; </w:t>
+      </w:r>
+      <w:r>
+        <w:rPr>
+          <w:rFonts w:ascii="Arial" w:eastAsia="Arial" w:hAnsi="Arial"/>
+          <w:b/>
+          <w:color w:val="000000"/>
+          <w:sz w:val="18"/>
+          <w:highlight w:val="lightGray"/>
+        </w:rPr>
         <w:t>From:</w:t>
       </w:r>
       <w:r>
@@ -22188,7 +24816,27 @@
           <w:sz w:val="18"/>
           <w:highlight w:val="lightGray"/>
         </w:rPr>
-        <w:t xml:space="preserve"> [Chatgpt (GPT-4-turbo)] </w:t>
+        <w:t xml:space="preserve"> [</w:t>
+      </w:r>
+      <w:proofErr w:type="spellStart"/>
+      <w:r>
+        <w:rPr>
+          <w:rFonts w:ascii="Arial" w:eastAsia="Arial" w:hAnsi="Arial"/>
+          <w:color w:val="000000"/>
+          <w:sz w:val="18"/>
+          <w:highlight w:val="lightGray"/>
+        </w:rPr>
+        <w:t>Chatgpt</w:t>
+      </w:r>
+      <w:proofErr w:type="spellEnd"/>
+      <w:r>
+        <w:rPr>
+          <w:rFonts w:ascii="Arial" w:eastAsia="Arial" w:hAnsi="Arial"/>
+          <w:color w:val="000000"/>
+          <w:sz w:val="18"/>
+          <w:highlight w:val="lightGray"/>
+        </w:rPr>
+        <w:t xml:space="preserve"> (GPT-4-turbo)] </w:t>
       </w:r>
       <w:r>
         <w:rPr>
@@ -22279,6 +24927,7 @@
           <w:rFonts w:ascii="Roboto Mono" w:eastAsia="Roboto Mono" w:hAnsi="Roboto Mono" w:cs="Roboto Mono"/>
           <w:b/>
         </w:rPr>
+        <w:lastRenderedPageBreak/>
         <w:t>Example</w:t>
       </w:r>
       <w:r>
@@ -23063,6 +25712,7 @@
           <w:rFonts w:ascii="Roboto Mono" w:eastAsia="Roboto Mono" w:hAnsi="Roboto Mono" w:cs="Roboto Mono"/>
           <w:b/>
         </w:rPr>
+        <w:lastRenderedPageBreak/>
         <w:t>Rule</w:t>
       </w:r>
       <w:sdt>

</xml_diff>

<commit_message>
Knowledge - 4/16/2026 - Part 1
</commit_message>
<xml_diff>
--- a/Knowledge/2-Science/1-Formal sciences/0-Intro to Formal sciences/5-My Source/2-Formal system.docx
+++ b/Knowledge/2-Science/1-Formal sciences/0-Intro to Formal sciences/5-My Source/2-Formal system.docx
@@ -84,27 +84,7 @@
           <w:szCs w:val="18"/>
           <w:highlight w:val="lightGray"/>
         </w:rPr>
-        <w:t xml:space="preserve">: Persons Table -&gt; ID Column: 1, </w:t>
-      </w:r>
-      <w:proofErr w:type="spellStart"/>
-      <w:r>
-        <w:rPr>
-          <w:rFonts w:ascii="Arial" w:eastAsia="Arial" w:hAnsi="Arial"/>
-          <w:sz w:val="18"/>
-          <w:szCs w:val="18"/>
-          <w:highlight w:val="lightGray"/>
-        </w:rPr>
-        <w:t>Name_En</w:t>
-      </w:r>
-      <w:proofErr w:type="spellEnd"/>
-      <w:r>
-        <w:rPr>
-          <w:rFonts w:ascii="Arial" w:eastAsia="Arial" w:hAnsi="Arial"/>
-          <w:sz w:val="18"/>
-          <w:szCs w:val="18"/>
-          <w:highlight w:val="lightGray"/>
-        </w:rPr>
-        <w:t xml:space="preserve"> Column: Motasem Essam] -&gt; </w:t>
+        <w:t xml:space="preserve">: Persons Table -&gt; ID Column: 1, Name_En Column: Motasem Essam] -&gt; </w:t>
       </w:r>
       <w:r>
         <w:rPr>
@@ -486,7 +466,8 @@
     <w:p>
       <w:pPr>
         <w:rPr>
-          <w:rFonts w:ascii="Roboto Mono" w:eastAsia="Roboto Mono" w:hAnsi="Roboto Mono" w:cs="Roboto Mono"/>
+          <w:rFonts w:ascii="Arial" w:eastAsia="Arial" w:hAnsi="Arial"/>
+          <w:b/>
           <w:shd w:val="clear" w:color="auto" w:fill="B7B7B7"/>
         </w:rPr>
       </w:pPr>
@@ -507,19 +488,18 @@
           <w:sz w:val="18"/>
           <w:highlight w:val="lightGray"/>
         </w:rPr>
-        <w:t xml:space="preserve">: Persons Table -&gt; ID Column: 1, </w:t>
-      </w:r>
-      <w:proofErr w:type="spellStart"/>
-      <w:r>
-        <w:rPr>
-          <w:rFonts w:ascii="Arial" w:eastAsia="Arial" w:hAnsi="Arial"/>
+        <w:t xml:space="preserve">: Persons Table -&gt; ID Column: 1, Name_En Column: Motasem Essam] -&gt; </w:t>
+      </w:r>
+      <w:r>
+        <w:rPr>
+          <w:rFonts w:ascii="Arial" w:eastAsia="Arial" w:hAnsi="Arial"/>
+          <w:b/>
           <w:color w:val="000000"/>
           <w:sz w:val="18"/>
           <w:highlight w:val="lightGray"/>
         </w:rPr>
-        <w:t>Name_En</w:t>
-      </w:r>
-      <w:proofErr w:type="spellEnd"/>
+        <w:t>From:</w:t>
+      </w:r>
       <w:r>
         <w:rPr>
           <w:rFonts w:ascii="Arial" w:eastAsia="Arial" w:hAnsi="Arial"/>
@@ -527,17 +507,16 @@
           <w:sz w:val="18"/>
           <w:highlight w:val="lightGray"/>
         </w:rPr>
-        <w:t xml:space="preserve"> Column: Motasem Essam] -&gt; </w:t>
-      </w:r>
-      <w:r>
-        <w:rPr>
-          <w:rFonts w:ascii="Arial" w:eastAsia="Arial" w:hAnsi="Arial"/>
-          <w:b/>
+        <w:t xml:space="preserve"> [</w:t>
+      </w:r>
+      <w:r>
+        <w:rPr>
+          <w:rFonts w:ascii="Arial" w:eastAsia="Arial" w:hAnsi="Arial"/>
           <w:color w:val="000000"/>
           <w:sz w:val="18"/>
           <w:highlight w:val="lightGray"/>
         </w:rPr>
-        <w:t>From:</w:t>
+        <w:t>ChatGPT</w:t>
       </w:r>
       <w:r>
         <w:rPr>
@@ -546,19 +525,18 @@
           <w:sz w:val="18"/>
           <w:highlight w:val="lightGray"/>
         </w:rPr>
-        <w:t xml:space="preserve"> [</w:t>
-      </w:r>
-      <w:proofErr w:type="spellStart"/>
-      <w:r>
-        <w:rPr>
-          <w:rFonts w:ascii="Arial" w:eastAsia="Arial" w:hAnsi="Arial"/>
+        <w:t xml:space="preserve">] </w:t>
+      </w:r>
+      <w:r>
+        <w:rPr>
+          <w:rFonts w:ascii="Arial" w:eastAsia="Arial" w:hAnsi="Arial"/>
+          <w:b/>
           <w:color w:val="000000"/>
           <w:sz w:val="18"/>
           <w:highlight w:val="lightGray"/>
         </w:rPr>
-        <w:t>Chatgpt</w:t>
-      </w:r>
-      <w:proofErr w:type="spellEnd"/>
+        <w:t xml:space="preserve">on </w:t>
+      </w:r>
       <w:r>
         <w:rPr>
           <w:rFonts w:ascii="Arial" w:eastAsia="Arial" w:hAnsi="Arial"/>
@@ -566,35 +544,16 @@
           <w:sz w:val="18"/>
           <w:highlight w:val="lightGray"/>
         </w:rPr>
-        <w:t xml:space="preserve"> (GPT-4-turbo)] </w:t>
-      </w:r>
-      <w:r>
-        <w:rPr>
-          <w:rFonts w:ascii="Arial" w:eastAsia="Arial" w:hAnsi="Arial"/>
-          <w:b/>
-          <w:color w:val="000000"/>
-          <w:sz w:val="18"/>
-          <w:highlight w:val="lightGray"/>
-        </w:rPr>
-        <w:t xml:space="preserve">on </w:t>
-      </w:r>
-      <w:r>
-        <w:rPr>
-          <w:rFonts w:ascii="Arial" w:eastAsia="Arial" w:hAnsi="Arial"/>
-          <w:color w:val="000000"/>
-          <w:sz w:val="18"/>
-          <w:highlight w:val="lightGray"/>
-        </w:rPr>
         <w:t>[7/17/2025]</w:t>
       </w:r>
-      <w:r>
-        <w:rPr>
-          <w:rFonts w:ascii="Arial" w:eastAsia="Arial" w:hAnsi="Arial"/>
-          <w:b/>
+    </w:p>
+    <w:p>
+      <w:pPr>
+        <w:rPr>
+          <w:rFonts w:ascii="Roboto Mono" w:eastAsia="Roboto Mono" w:hAnsi="Roboto Mono" w:cs="Roboto Mono"/>
           <w:shd w:val="clear" w:color="auto" w:fill="B7B7B7"/>
         </w:rPr>
-        <w:br/>
-      </w:r>
+      </w:pPr>
       <w:r>
         <w:rPr>
           <w:rFonts w:ascii="Roboto Mono" w:eastAsia="Arial" w:hAnsi="Roboto Mono" w:cs="Roboto Mono"/>
@@ -776,27 +735,7 @@
           <w:szCs w:val="18"/>
           <w:highlight w:val="lightGray"/>
         </w:rPr>
-        <w:t xml:space="preserve">: Persons Table -&gt; ID Column: 1, </w:t>
-      </w:r>
-      <w:proofErr w:type="spellStart"/>
-      <w:r>
-        <w:rPr>
-          <w:rFonts w:ascii="Arial" w:eastAsia="Arial" w:hAnsi="Arial"/>
-          <w:sz w:val="18"/>
-          <w:szCs w:val="18"/>
-          <w:highlight w:val="lightGray"/>
-        </w:rPr>
-        <w:t>Name_En</w:t>
-      </w:r>
-      <w:proofErr w:type="spellEnd"/>
-      <w:r>
-        <w:rPr>
-          <w:rFonts w:ascii="Arial" w:eastAsia="Arial" w:hAnsi="Arial"/>
-          <w:sz w:val="18"/>
-          <w:szCs w:val="18"/>
-          <w:highlight w:val="lightGray"/>
-        </w:rPr>
-        <w:t xml:space="preserve"> Column: Motasem Essam] -&gt; </w:t>
+        <w:t xml:space="preserve">: Persons Table -&gt; ID Column: 1, Name_En Column: Motasem Essam] -&gt; </w:t>
       </w:r>
       <w:r>
         <w:rPr>
@@ -937,27 +876,7 @@
           <w:szCs w:val="18"/>
           <w:highlight w:val="lightGray"/>
         </w:rPr>
-        <w:t>…</w:t>
-      </w:r>
-      <w:proofErr w:type="spellStart"/>
-      <w:r>
-        <w:rPr>
-          <w:rFonts w:ascii="Arial" w:eastAsia="Arial" w:hAnsi="Arial"/>
-          <w:sz w:val="18"/>
-          <w:szCs w:val="18"/>
-          <w:highlight w:val="lightGray"/>
-        </w:rPr>
-        <w:t>semidecidable</w:t>
-      </w:r>
-      <w:proofErr w:type="spellEnd"/>
-      <w:r>
-        <w:rPr>
-          <w:rFonts w:ascii="Arial" w:eastAsia="Arial" w:hAnsi="Arial"/>
-          <w:sz w:val="18"/>
-          <w:szCs w:val="18"/>
-          <w:highlight w:val="lightGray"/>
-        </w:rPr>
-        <w:t xml:space="preserve"> sets, respectively</w:t>
+        <w:t>…semidecidable sets, respectively</w:t>
       </w:r>
       <w:r>
         <w:rPr>
@@ -1300,24 +1219,7 @@
           <w:rFonts w:ascii="Roboto Mono" w:eastAsia="Roboto Mono" w:hAnsi="Roboto Mono" w:cs="Roboto Mono"/>
           <w:color w:val="202122"/>
         </w:rPr>
-        <w:lastRenderedPageBreak/>
-        <w:t xml:space="preserve">In some </w:t>
-      </w:r>
-      <w:proofErr w:type="gramStart"/>
-      <w:r>
-        <w:rPr>
-          <w:rFonts w:ascii="Roboto Mono" w:eastAsia="Roboto Mono" w:hAnsi="Roboto Mono" w:cs="Roboto Mono"/>
-          <w:color w:val="202122"/>
-        </w:rPr>
-        <w:t>cases</w:t>
-      </w:r>
-      <w:proofErr w:type="gramEnd"/>
-      <w:r>
-        <w:rPr>
-          <w:rFonts w:ascii="Roboto Mono" w:eastAsia="Roboto Mono" w:hAnsi="Roboto Mono" w:cs="Roboto Mono"/>
-          <w:color w:val="202122"/>
-        </w:rPr>
-        <w:t xml:space="preserve"> an </w:t>
+        <w:t xml:space="preserve">In some cases an </w:t>
       </w:r>
       <w:hyperlink r:id="rId28">
         <w:r>
@@ -1385,21 +1287,12 @@
         <w:t xml:space="preserve"> or </w:t>
       </w:r>
       <w:hyperlink r:id="rId31">
-        <w:proofErr w:type="spellStart"/>
         <w:r>
           <w:rPr>
             <w:rFonts w:ascii="Roboto Mono" w:eastAsia="Roboto Mono" w:hAnsi="Roboto Mono" w:cs="Roboto Mono"/>
             <w:color w:val="3366CC"/>
           </w:rPr>
-          <w:t>semidecidable</w:t>
-        </w:r>
-        <w:proofErr w:type="spellEnd"/>
-        <w:r>
-          <w:rPr>
-            <w:rFonts w:ascii="Roboto Mono" w:eastAsia="Roboto Mono" w:hAnsi="Roboto Mono" w:cs="Roboto Mono"/>
-            <w:color w:val="3366CC"/>
-          </w:rPr>
-          <w:t xml:space="preserve"> sets</w:t>
+          <w:t>semidecidable sets</w:t>
         </w:r>
       </w:hyperlink>
       <w:r>
@@ -1436,19 +1329,18 @@
           <w:sz w:val="18"/>
           <w:highlight w:val="lightGray"/>
         </w:rPr>
-        <w:t xml:space="preserve">: Persons Table -&gt; ID Column: 1, </w:t>
-      </w:r>
-      <w:proofErr w:type="spellStart"/>
-      <w:r>
-        <w:rPr>
-          <w:rFonts w:ascii="Arial" w:eastAsia="Arial" w:hAnsi="Arial"/>
+        <w:t xml:space="preserve">: Persons Table -&gt; ID Column: 1, Name_En Column: Motasem Essam] -&gt; </w:t>
+      </w:r>
+      <w:r>
+        <w:rPr>
+          <w:rFonts w:ascii="Arial" w:eastAsia="Arial" w:hAnsi="Arial"/>
+          <w:b/>
           <w:color w:val="000000"/>
           <w:sz w:val="18"/>
           <w:highlight w:val="lightGray"/>
         </w:rPr>
-        <w:t>Name_En</w:t>
-      </w:r>
-      <w:proofErr w:type="spellEnd"/>
+        <w:t>From:</w:t>
+      </w:r>
       <w:r>
         <w:rPr>
           <w:rFonts w:ascii="Arial" w:eastAsia="Arial" w:hAnsi="Arial"/>
@@ -1456,46 +1348,7 @@
           <w:sz w:val="18"/>
           <w:highlight w:val="lightGray"/>
         </w:rPr>
-        <w:t xml:space="preserve"> Column: Motasem Essam] -&gt; </w:t>
-      </w:r>
-      <w:r>
-        <w:rPr>
-          <w:rFonts w:ascii="Arial" w:eastAsia="Arial" w:hAnsi="Arial"/>
-          <w:b/>
-          <w:color w:val="000000"/>
-          <w:sz w:val="18"/>
-          <w:highlight w:val="lightGray"/>
-        </w:rPr>
-        <w:t>From:</w:t>
-      </w:r>
-      <w:r>
-        <w:rPr>
-          <w:rFonts w:ascii="Arial" w:eastAsia="Arial" w:hAnsi="Arial"/>
-          <w:color w:val="000000"/>
-          <w:sz w:val="18"/>
-          <w:highlight w:val="lightGray"/>
-        </w:rPr>
-        <w:t xml:space="preserve"> [</w:t>
-      </w:r>
-      <w:proofErr w:type="spellStart"/>
-      <w:r>
-        <w:rPr>
-          <w:rFonts w:ascii="Arial" w:eastAsia="Arial" w:hAnsi="Arial"/>
-          <w:color w:val="000000"/>
-          <w:sz w:val="18"/>
-          <w:highlight w:val="lightGray"/>
-        </w:rPr>
-        <w:t>Chatgpt</w:t>
-      </w:r>
-      <w:proofErr w:type="spellEnd"/>
-      <w:r>
-        <w:rPr>
-          <w:rFonts w:ascii="Arial" w:eastAsia="Arial" w:hAnsi="Arial"/>
-          <w:color w:val="000000"/>
-          <w:sz w:val="18"/>
-          <w:highlight w:val="lightGray"/>
-        </w:rPr>
-        <w:t xml:space="preserve"> (GPT-4-turbo)] </w:t>
+        <w:t xml:space="preserve"> [ChatGPT] </w:t>
       </w:r>
       <w:r>
         <w:rPr>
@@ -1731,7 +1584,6 @@
       <w:bookmarkStart w:id="2" w:name="_heading=h.u2ab22dd3jgj" w:colFirst="0" w:colLast="0"/>
       <w:bookmarkEnd w:id="2"/>
       <w:r>
-        <w:lastRenderedPageBreak/>
         <w:t xml:space="preserve">Examples </w:t>
       </w:r>
     </w:p>
@@ -1758,19 +1610,18 @@
           <w:sz w:val="18"/>
           <w:highlight w:val="lightGray"/>
         </w:rPr>
-        <w:t xml:space="preserve">: Persons Table -&gt; ID Column: 1, </w:t>
-      </w:r>
-      <w:proofErr w:type="spellStart"/>
-      <w:r>
-        <w:rPr>
-          <w:rFonts w:ascii="Arial" w:eastAsia="Arial" w:hAnsi="Arial"/>
+        <w:t xml:space="preserve">: Persons Table -&gt; ID Column: 1, Name_En Column: Motasem Essam] -&gt; </w:t>
+      </w:r>
+      <w:r>
+        <w:rPr>
+          <w:rFonts w:ascii="Arial" w:eastAsia="Arial" w:hAnsi="Arial"/>
+          <w:b/>
           <w:color w:val="000000"/>
           <w:sz w:val="18"/>
           <w:highlight w:val="lightGray"/>
         </w:rPr>
-        <w:t>Name_En</w:t>
-      </w:r>
-      <w:proofErr w:type="spellEnd"/>
+        <w:t>From:</w:t>
+      </w:r>
       <w:r>
         <w:rPr>
           <w:rFonts w:ascii="Arial" w:eastAsia="Arial" w:hAnsi="Arial"/>
@@ -1778,46 +1629,7 @@
           <w:sz w:val="18"/>
           <w:highlight w:val="lightGray"/>
         </w:rPr>
-        <w:t xml:space="preserve"> Column: Motasem Essam] -&gt; </w:t>
-      </w:r>
-      <w:r>
-        <w:rPr>
-          <w:rFonts w:ascii="Arial" w:eastAsia="Arial" w:hAnsi="Arial"/>
-          <w:b/>
-          <w:color w:val="000000"/>
-          <w:sz w:val="18"/>
-          <w:highlight w:val="lightGray"/>
-        </w:rPr>
-        <w:t>From:</w:t>
-      </w:r>
-      <w:r>
-        <w:rPr>
-          <w:rFonts w:ascii="Arial" w:eastAsia="Arial" w:hAnsi="Arial"/>
-          <w:color w:val="000000"/>
-          <w:sz w:val="18"/>
-          <w:highlight w:val="lightGray"/>
-        </w:rPr>
-        <w:t xml:space="preserve"> [</w:t>
-      </w:r>
-      <w:proofErr w:type="spellStart"/>
-      <w:r>
-        <w:rPr>
-          <w:rFonts w:ascii="Arial" w:eastAsia="Arial" w:hAnsi="Arial"/>
-          <w:color w:val="000000"/>
-          <w:sz w:val="18"/>
-          <w:highlight w:val="lightGray"/>
-        </w:rPr>
-        <w:t>Chatgpt</w:t>
-      </w:r>
-      <w:proofErr w:type="spellEnd"/>
-      <w:r>
-        <w:rPr>
-          <w:rFonts w:ascii="Arial" w:eastAsia="Arial" w:hAnsi="Arial"/>
-          <w:color w:val="000000"/>
-          <w:sz w:val="18"/>
-          <w:highlight w:val="lightGray"/>
-        </w:rPr>
-        <w:t xml:space="preserve"> (GPT-4-turbo)] </w:t>
+        <w:t xml:space="preserve"> [ChatGPT] </w:t>
       </w:r>
       <w:r>
         <w:rPr>
@@ -2077,27 +1889,7 @@
           <w:szCs w:val="18"/>
           <w:highlight w:val="lightGray"/>
         </w:rPr>
-        <w:t xml:space="preserve"> Persons Table -&gt; ID Column: 1, </w:t>
-      </w:r>
-      <w:proofErr w:type="spellStart"/>
-      <w:r>
-        <w:rPr>
-          <w:rFonts w:ascii="Arial" w:eastAsia="Arial" w:hAnsi="Arial"/>
-          <w:sz w:val="18"/>
-          <w:szCs w:val="18"/>
-          <w:highlight w:val="lightGray"/>
-        </w:rPr>
-        <w:t>Name_En</w:t>
-      </w:r>
-      <w:proofErr w:type="spellEnd"/>
-      <w:r>
-        <w:rPr>
-          <w:rFonts w:ascii="Arial" w:eastAsia="Arial" w:hAnsi="Arial"/>
-          <w:sz w:val="18"/>
-          <w:szCs w:val="18"/>
-          <w:highlight w:val="lightGray"/>
-        </w:rPr>
-        <w:t xml:space="preserve"> Column: Motasem Essam] </w:t>
+        <w:t xml:space="preserve"> Persons Table -&gt; ID Column: 1, Name_En Column: Motasem Essam] </w:t>
       </w:r>
       <w:r>
         <w:rPr>
@@ -2117,27 +1909,7 @@
           <w:szCs w:val="18"/>
           <w:highlight w:val="lightGray"/>
         </w:rPr>
-        <w:t xml:space="preserve"> Persons Table -&gt; ID Column: 1, </w:t>
-      </w:r>
-      <w:proofErr w:type="spellStart"/>
-      <w:r>
-        <w:rPr>
-          <w:rFonts w:ascii="Arial" w:eastAsia="Arial" w:hAnsi="Arial"/>
-          <w:sz w:val="18"/>
-          <w:szCs w:val="18"/>
-          <w:highlight w:val="lightGray"/>
-        </w:rPr>
-        <w:t>Name_En</w:t>
-      </w:r>
-      <w:proofErr w:type="spellEnd"/>
-      <w:r>
-        <w:rPr>
-          <w:rFonts w:ascii="Arial" w:eastAsia="Arial" w:hAnsi="Arial"/>
-          <w:sz w:val="18"/>
-          <w:szCs w:val="18"/>
-          <w:highlight w:val="lightGray"/>
-        </w:rPr>
-        <w:t xml:space="preserve"> Column: </w:t>
+        <w:t xml:space="preserve"> Persons Table -&gt; ID Column: 1, Name_En Column: </w:t>
       </w:r>
       <w:r>
         <w:rPr>
@@ -2325,6 +2097,7 @@
       <w:bookmarkStart w:id="4" w:name="_heading=h.e5p633u0y9sb" w:colFirst="0" w:colLast="0"/>
       <w:bookmarkEnd w:id="4"/>
       <w:r>
+        <w:lastRenderedPageBreak/>
         <w:t>1-Abstract structure</w:t>
       </w:r>
     </w:p>
@@ -2397,27 +2170,7 @@
           <w:szCs w:val="18"/>
           <w:highlight w:val="lightGray"/>
         </w:rPr>
-        <w:t xml:space="preserve">: Persons Table -&gt; ID Column: 1, </w:t>
-      </w:r>
-      <w:proofErr w:type="spellStart"/>
-      <w:r>
-        <w:rPr>
-          <w:rFonts w:ascii="Arial" w:eastAsia="Arial" w:hAnsi="Arial"/>
-          <w:sz w:val="18"/>
-          <w:szCs w:val="18"/>
-          <w:highlight w:val="lightGray"/>
-        </w:rPr>
-        <w:t>Name_En</w:t>
-      </w:r>
-      <w:proofErr w:type="spellEnd"/>
-      <w:r>
-        <w:rPr>
-          <w:rFonts w:ascii="Arial" w:eastAsia="Arial" w:hAnsi="Arial"/>
-          <w:sz w:val="18"/>
-          <w:szCs w:val="18"/>
-          <w:highlight w:val="lightGray"/>
-        </w:rPr>
-        <w:t xml:space="preserve"> Column: Motasem Essam] -&gt; </w:t>
+        <w:t xml:space="preserve">: Persons Table -&gt; ID Column: 1, Name_En Column: Motasem Essam] -&gt; </w:t>
       </w:r>
       <w:r>
         <w:rPr>
@@ -2484,17 +2237,7 @@
           <w:szCs w:val="18"/>
           <w:highlight w:val="lightGray"/>
         </w:rPr>
-        <w:t xml:space="preserve">: Wiki Source - Abstract </w:t>
-      </w:r>
-      <w:r>
-        <w:rPr>
-          <w:rFonts w:ascii="Arial" w:eastAsia="Arial" w:hAnsi="Arial"/>
-          <w:sz w:val="18"/>
-          <w:szCs w:val="18"/>
-          <w:highlight w:val="lightGray"/>
-        </w:rPr>
-        <w:lastRenderedPageBreak/>
-        <w:t xml:space="preserve">structure] -&gt; </w:t>
+        <w:t xml:space="preserve">: Wiki Source - Abstract structure] -&gt; </w:t>
       </w:r>
       <w:r>
         <w:rPr>
@@ -2568,27 +2311,7 @@
           <w:szCs w:val="18"/>
           <w:highlight w:val="lightGray"/>
         </w:rPr>
-        <w:t>…</w:t>
-      </w:r>
-      <w:proofErr w:type="spellStart"/>
-      <w:r>
-        <w:rPr>
-          <w:rFonts w:ascii="Arial" w:eastAsia="Arial" w:hAnsi="Arial"/>
-          <w:sz w:val="18"/>
-          <w:szCs w:val="18"/>
-          <w:highlight w:val="lightGray"/>
-        </w:rPr>
-        <w:t>Kasparovian</w:t>
-      </w:r>
-      <w:proofErr w:type="spellEnd"/>
-      <w:r>
-        <w:rPr>
-          <w:rFonts w:ascii="Arial" w:eastAsia="Arial" w:hAnsi="Arial"/>
-          <w:sz w:val="18"/>
-          <w:szCs w:val="18"/>
-          <w:highlight w:val="lightGray"/>
-        </w:rPr>
-        <w:t xml:space="preserve"> approaches)</w:t>
+        <w:t>…Kasparovian approaches)</w:t>
       </w:r>
       <w:r>
         <w:rPr>
@@ -2929,23 +2652,7 @@
           <w:rFonts w:ascii="Roboto Mono" w:eastAsia="Roboto Mono" w:hAnsi="Roboto Mono" w:cs="Roboto Mono"/>
           <w:color w:val="202122"/>
         </w:rPr>
-        <w:t xml:space="preserve">. An abstract structure must include precise rules of </w:t>
-      </w:r>
-      <w:proofErr w:type="spellStart"/>
-      <w:r>
-        <w:rPr>
-          <w:rFonts w:ascii="Roboto Mono" w:eastAsia="Roboto Mono" w:hAnsi="Roboto Mono" w:cs="Roboto Mono"/>
-          <w:color w:val="202122"/>
-        </w:rPr>
-        <w:t>behaviour</w:t>
-      </w:r>
-      <w:proofErr w:type="spellEnd"/>
-      <w:r>
-        <w:rPr>
-          <w:rFonts w:ascii="Roboto Mono" w:eastAsia="Roboto Mono" w:hAnsi="Roboto Mono" w:cs="Roboto Mono"/>
-          <w:color w:val="202122"/>
-        </w:rPr>
-        <w:t xml:space="preserve"> which can be used to determine whether a candidate implementation actually matches the abstract structure in question, and it must be free from </w:t>
+        <w:t xml:space="preserve">. An abstract structure must include precise rules of behaviour which can be used to determine whether a candidate implementation actually matches the abstract structure in question, and it must be free from </w:t>
       </w:r>
       <w:hyperlink r:id="rId49">
         <w:r>
@@ -2980,7 +2687,6 @@
         <w:t xml:space="preserve">, but there is no room for debate over whether a given sequence of moves is or is not a valid game of chess (for example </w:t>
       </w:r>
       <w:hyperlink r:id="rId51">
-        <w:proofErr w:type="spellStart"/>
         <w:r>
           <w:rPr>
             <w:rFonts w:ascii="Roboto Mono" w:eastAsia="Roboto Mono" w:hAnsi="Roboto Mono" w:cs="Roboto Mono"/>
@@ -2988,7 +2694,6 @@
           </w:rPr>
           <w:t>Kasparovian</w:t>
         </w:r>
-        <w:proofErr w:type="spellEnd"/>
       </w:hyperlink>
       <w:r>
         <w:rPr>
@@ -3026,7 +2731,6 @@
           <w:sz w:val="18"/>
           <w:highlight w:val="lightGray"/>
         </w:rPr>
-        <w:lastRenderedPageBreak/>
         <w:t># Source: AI Source: Provided by: [Data Path</w:t>
       </w:r>
       <w:r>
@@ -3036,19 +2740,18 @@
           <w:sz w:val="18"/>
           <w:highlight w:val="lightGray"/>
         </w:rPr>
-        <w:t xml:space="preserve">: Persons Table -&gt; ID Column: 1, </w:t>
-      </w:r>
-      <w:proofErr w:type="spellStart"/>
-      <w:r>
-        <w:rPr>
-          <w:rFonts w:ascii="Arial" w:eastAsia="Arial" w:hAnsi="Arial"/>
+        <w:t xml:space="preserve">: Persons Table -&gt; ID Column: 1, Name_En Column: Motasem Essam] -&gt; </w:t>
+      </w:r>
+      <w:r>
+        <w:rPr>
+          <w:rFonts w:ascii="Arial" w:eastAsia="Arial" w:hAnsi="Arial"/>
+          <w:b/>
           <w:color w:val="000000"/>
           <w:sz w:val="18"/>
           <w:highlight w:val="lightGray"/>
         </w:rPr>
-        <w:t>Name_En</w:t>
-      </w:r>
-      <w:proofErr w:type="spellEnd"/>
+        <w:t>From:</w:t>
+      </w:r>
       <w:r>
         <w:rPr>
           <w:rFonts w:ascii="Arial" w:eastAsia="Arial" w:hAnsi="Arial"/>
@@ -3056,46 +2759,7 @@
           <w:sz w:val="18"/>
           <w:highlight w:val="lightGray"/>
         </w:rPr>
-        <w:t xml:space="preserve"> Column: Motasem Essam] -&gt; </w:t>
-      </w:r>
-      <w:r>
-        <w:rPr>
-          <w:rFonts w:ascii="Arial" w:eastAsia="Arial" w:hAnsi="Arial"/>
-          <w:b/>
-          <w:color w:val="000000"/>
-          <w:sz w:val="18"/>
-          <w:highlight w:val="lightGray"/>
-        </w:rPr>
-        <w:t>From:</w:t>
-      </w:r>
-      <w:r>
-        <w:rPr>
-          <w:rFonts w:ascii="Arial" w:eastAsia="Arial" w:hAnsi="Arial"/>
-          <w:color w:val="000000"/>
-          <w:sz w:val="18"/>
-          <w:highlight w:val="lightGray"/>
-        </w:rPr>
-        <w:t xml:space="preserve"> [</w:t>
-      </w:r>
-      <w:proofErr w:type="spellStart"/>
-      <w:r>
-        <w:rPr>
-          <w:rFonts w:ascii="Arial" w:eastAsia="Arial" w:hAnsi="Arial"/>
-          <w:color w:val="000000"/>
-          <w:sz w:val="18"/>
-          <w:highlight w:val="lightGray"/>
-        </w:rPr>
-        <w:t>Chatgpt</w:t>
-      </w:r>
-      <w:proofErr w:type="spellEnd"/>
-      <w:r>
-        <w:rPr>
-          <w:rFonts w:ascii="Arial" w:eastAsia="Arial" w:hAnsi="Arial"/>
-          <w:color w:val="000000"/>
-          <w:sz w:val="18"/>
-          <w:highlight w:val="lightGray"/>
-        </w:rPr>
-        <w:t xml:space="preserve"> (GPT-4-turbo)] </w:t>
+        <w:t xml:space="preserve"> [ChatGPT] </w:t>
       </w:r>
       <w:r>
         <w:rPr>
@@ -3383,19 +3047,18 @@
           <w:sz w:val="18"/>
           <w:highlight w:val="lightGray"/>
         </w:rPr>
-        <w:t xml:space="preserve">: Persons Table -&gt; ID Column: 1, </w:t>
-      </w:r>
-      <w:proofErr w:type="spellStart"/>
-      <w:r>
-        <w:rPr>
-          <w:rFonts w:ascii="Arial" w:eastAsia="Arial" w:hAnsi="Arial"/>
+        <w:t xml:space="preserve">: Persons Table -&gt; ID Column: 1, Name_En Column: Motasem Essam] -&gt; </w:t>
+      </w:r>
+      <w:r>
+        <w:rPr>
+          <w:rFonts w:ascii="Arial" w:eastAsia="Arial" w:hAnsi="Arial"/>
+          <w:b/>
           <w:color w:val="000000"/>
           <w:sz w:val="18"/>
           <w:highlight w:val="lightGray"/>
         </w:rPr>
-        <w:t>Name_En</w:t>
-      </w:r>
-      <w:proofErr w:type="spellEnd"/>
+        <w:t>From:</w:t>
+      </w:r>
       <w:r>
         <w:rPr>
           <w:rFonts w:ascii="Arial" w:eastAsia="Arial" w:hAnsi="Arial"/>
@@ -3403,46 +3066,7 @@
           <w:sz w:val="18"/>
           <w:highlight w:val="lightGray"/>
         </w:rPr>
-        <w:t xml:space="preserve"> Column: Motasem Essam] -&gt; </w:t>
-      </w:r>
-      <w:r>
-        <w:rPr>
-          <w:rFonts w:ascii="Arial" w:eastAsia="Arial" w:hAnsi="Arial"/>
-          <w:b/>
-          <w:color w:val="000000"/>
-          <w:sz w:val="18"/>
-          <w:highlight w:val="lightGray"/>
-        </w:rPr>
-        <w:t>From:</w:t>
-      </w:r>
-      <w:r>
-        <w:rPr>
-          <w:rFonts w:ascii="Arial" w:eastAsia="Arial" w:hAnsi="Arial"/>
-          <w:color w:val="000000"/>
-          <w:sz w:val="18"/>
-          <w:highlight w:val="lightGray"/>
-        </w:rPr>
-        <w:t xml:space="preserve"> [</w:t>
-      </w:r>
-      <w:proofErr w:type="spellStart"/>
-      <w:r>
-        <w:rPr>
-          <w:rFonts w:ascii="Arial" w:eastAsia="Arial" w:hAnsi="Arial"/>
-          <w:color w:val="000000"/>
-          <w:sz w:val="18"/>
-          <w:highlight w:val="lightGray"/>
-        </w:rPr>
-        <w:t>Chatgpt</w:t>
-      </w:r>
-      <w:proofErr w:type="spellEnd"/>
-      <w:r>
-        <w:rPr>
-          <w:rFonts w:ascii="Arial" w:eastAsia="Arial" w:hAnsi="Arial"/>
-          <w:color w:val="000000"/>
-          <w:sz w:val="18"/>
-          <w:highlight w:val="lightGray"/>
-        </w:rPr>
-        <w:t xml:space="preserve"> (GPT-4-turbo)] </w:t>
+        <w:t xml:space="preserve"> [ChatGPT] </w:t>
       </w:r>
       <w:r>
         <w:rPr>
@@ -3487,21 +3111,7 @@
         <w:rPr>
           <w:rFonts w:ascii="Roboto Mono" w:eastAsia="Roboto Mono" w:hAnsi="Roboto Mono" w:cs="Roboto Mono"/>
         </w:rPr>
-        <w:t xml:space="preserve">: The individual objects or entities that make up the structure. Or </w:t>
-      </w:r>
-      <w:proofErr w:type="gramStart"/>
-      <w:r>
-        <w:rPr>
-          <w:rFonts w:ascii="Roboto Mono" w:eastAsia="Roboto Mono" w:hAnsi="Roboto Mono" w:cs="Roboto Mono"/>
-        </w:rPr>
-        <w:t>The</w:t>
-      </w:r>
-      <w:proofErr w:type="gramEnd"/>
-      <w:r>
-        <w:rPr>
-          <w:rFonts w:ascii="Roboto Mono" w:eastAsia="Roboto Mono" w:hAnsi="Roboto Mono" w:cs="Roboto Mono"/>
-        </w:rPr>
-        <w:t xml:space="preserve"> fundamental building blocks of any abstract structure. These can be numbers, objects, data points, or abstract concepts.</w:t>
+        <w:t>: The individual objects or entities that make up the structure. Or The fundamental building blocks of any abstract structure. These can be numbers, objects, data points, or abstract concepts.</w:t>
       </w:r>
     </w:p>
     <w:p>
@@ -3527,21 +3137,7 @@
         <w:rPr>
           <w:rFonts w:ascii="Roboto Mono" w:eastAsia="Roboto Mono" w:hAnsi="Roboto Mono" w:cs="Roboto Mono"/>
         </w:rPr>
-        <w:t>: In a group (a mathematical abstract structure</w:t>
-      </w:r>
-      <w:proofErr w:type="gramStart"/>
-      <w:r>
-        <w:rPr>
-          <w:rFonts w:ascii="Roboto Mono" w:eastAsia="Roboto Mono" w:hAnsi="Roboto Mono" w:cs="Roboto Mono"/>
-        </w:rPr>
-        <w:t>),In</w:t>
-      </w:r>
-      <w:proofErr w:type="gramEnd"/>
-      <w:r>
-        <w:rPr>
-          <w:rFonts w:ascii="Roboto Mono" w:eastAsia="Roboto Mono" w:hAnsi="Roboto Mono" w:cs="Roboto Mono"/>
-        </w:rPr>
-        <w:t xml:space="preserve"> a set, the elements are the individual members of the set (e.g., integers under addition).</w:t>
+        <w:t>: In a group (a mathematical abstract structure),In a set, the elements are the individual members of the set (e.g., integers under addition).</w:t>
       </w:r>
     </w:p>
     <w:p>
@@ -3558,6 +3154,7 @@
       <w:bookmarkStart w:id="8" w:name="_heading=h.re4a30cy2km6" w:colFirst="0" w:colLast="0"/>
       <w:bookmarkEnd w:id="8"/>
       <w:r>
+        <w:lastRenderedPageBreak/>
         <w:t>2. Operations/Functions</w:t>
       </w:r>
     </w:p>
@@ -3586,19 +3183,18 @@
           <w:sz w:val="18"/>
           <w:highlight w:val="lightGray"/>
         </w:rPr>
-        <w:t xml:space="preserve">: Persons Table -&gt; ID Column: 1, </w:t>
-      </w:r>
-      <w:proofErr w:type="spellStart"/>
-      <w:r>
-        <w:rPr>
-          <w:rFonts w:ascii="Arial" w:eastAsia="Arial" w:hAnsi="Arial"/>
+        <w:t xml:space="preserve">: Persons Table -&gt; ID Column: 1, Name_En Column: Motasem Essam] -&gt; </w:t>
+      </w:r>
+      <w:r>
+        <w:rPr>
+          <w:rFonts w:ascii="Arial" w:eastAsia="Arial" w:hAnsi="Arial"/>
+          <w:b/>
           <w:color w:val="000000"/>
           <w:sz w:val="18"/>
           <w:highlight w:val="lightGray"/>
         </w:rPr>
-        <w:t>Name_En</w:t>
-      </w:r>
-      <w:proofErr w:type="spellEnd"/>
+        <w:t>From:</w:t>
+      </w:r>
       <w:r>
         <w:rPr>
           <w:rFonts w:ascii="Arial" w:eastAsia="Arial" w:hAnsi="Arial"/>
@@ -3606,46 +3202,7 @@
           <w:sz w:val="18"/>
           <w:highlight w:val="lightGray"/>
         </w:rPr>
-        <w:t xml:space="preserve"> Column: Motasem Essam] -&gt; </w:t>
-      </w:r>
-      <w:r>
-        <w:rPr>
-          <w:rFonts w:ascii="Arial" w:eastAsia="Arial" w:hAnsi="Arial"/>
-          <w:b/>
-          <w:color w:val="000000"/>
-          <w:sz w:val="18"/>
-          <w:highlight w:val="lightGray"/>
-        </w:rPr>
-        <w:t>From:</w:t>
-      </w:r>
-      <w:r>
-        <w:rPr>
-          <w:rFonts w:ascii="Arial" w:eastAsia="Arial" w:hAnsi="Arial"/>
-          <w:color w:val="000000"/>
-          <w:sz w:val="18"/>
-          <w:highlight w:val="lightGray"/>
-        </w:rPr>
-        <w:t xml:space="preserve"> [</w:t>
-      </w:r>
-      <w:proofErr w:type="spellStart"/>
-      <w:r>
-        <w:rPr>
-          <w:rFonts w:ascii="Arial" w:eastAsia="Arial" w:hAnsi="Arial"/>
-          <w:color w:val="000000"/>
-          <w:sz w:val="18"/>
-          <w:highlight w:val="lightGray"/>
-        </w:rPr>
-        <w:t>Chatgpt</w:t>
-      </w:r>
-      <w:proofErr w:type="spellEnd"/>
-      <w:r>
-        <w:rPr>
-          <w:rFonts w:ascii="Arial" w:eastAsia="Arial" w:hAnsi="Arial"/>
-          <w:color w:val="000000"/>
-          <w:sz w:val="18"/>
-          <w:highlight w:val="lightGray"/>
-        </w:rPr>
-        <w:t xml:space="preserve"> (GPT-4-turbo)] </w:t>
+        <w:t xml:space="preserve"> [ChatGPT] </w:t>
       </w:r>
       <w:r>
         <w:rPr>
@@ -3684,7 +3241,6 @@
           <w:rFonts w:ascii="Roboto Mono" w:eastAsia="Roboto Mono" w:hAnsi="Roboto Mono" w:cs="Roboto Mono"/>
           <w:b/>
         </w:rPr>
-        <w:lastRenderedPageBreak/>
         <w:t>Definition</w:t>
       </w:r>
       <w:r>
@@ -3776,19 +3332,18 @@
           <w:sz w:val="18"/>
           <w:highlight w:val="lightGray"/>
         </w:rPr>
-        <w:t xml:space="preserve">: Persons Table -&gt; ID Column: 1, </w:t>
-      </w:r>
-      <w:proofErr w:type="spellStart"/>
-      <w:r>
-        <w:rPr>
-          <w:rFonts w:ascii="Arial" w:eastAsia="Arial" w:hAnsi="Arial"/>
+        <w:t xml:space="preserve">: Persons Table -&gt; ID Column: 1, Name_En Column: Motasem Essam] -&gt; </w:t>
+      </w:r>
+      <w:r>
+        <w:rPr>
+          <w:rFonts w:ascii="Arial" w:eastAsia="Arial" w:hAnsi="Arial"/>
+          <w:b/>
           <w:color w:val="000000"/>
           <w:sz w:val="18"/>
           <w:highlight w:val="lightGray"/>
         </w:rPr>
-        <w:t>Name_En</w:t>
-      </w:r>
-      <w:proofErr w:type="spellEnd"/>
+        <w:t>From:</w:t>
+      </w:r>
       <w:r>
         <w:rPr>
           <w:rFonts w:ascii="Arial" w:eastAsia="Arial" w:hAnsi="Arial"/>
@@ -3796,46 +3351,7 @@
           <w:sz w:val="18"/>
           <w:highlight w:val="lightGray"/>
         </w:rPr>
-        <w:t xml:space="preserve"> Column: Motasem Essam] -&gt; </w:t>
-      </w:r>
-      <w:r>
-        <w:rPr>
-          <w:rFonts w:ascii="Arial" w:eastAsia="Arial" w:hAnsi="Arial"/>
-          <w:b/>
-          <w:color w:val="000000"/>
-          <w:sz w:val="18"/>
-          <w:highlight w:val="lightGray"/>
-        </w:rPr>
-        <w:t>From:</w:t>
-      </w:r>
-      <w:r>
-        <w:rPr>
-          <w:rFonts w:ascii="Arial" w:eastAsia="Arial" w:hAnsi="Arial"/>
-          <w:color w:val="000000"/>
-          <w:sz w:val="18"/>
-          <w:highlight w:val="lightGray"/>
-        </w:rPr>
-        <w:t xml:space="preserve"> [</w:t>
-      </w:r>
-      <w:proofErr w:type="spellStart"/>
-      <w:r>
-        <w:rPr>
-          <w:rFonts w:ascii="Arial" w:eastAsia="Arial" w:hAnsi="Arial"/>
-          <w:color w:val="000000"/>
-          <w:sz w:val="18"/>
-          <w:highlight w:val="lightGray"/>
-        </w:rPr>
-        <w:t>Chatgpt</w:t>
-      </w:r>
-      <w:proofErr w:type="spellEnd"/>
-      <w:r>
-        <w:rPr>
-          <w:rFonts w:ascii="Arial" w:eastAsia="Arial" w:hAnsi="Arial"/>
-          <w:color w:val="000000"/>
-          <w:sz w:val="18"/>
-          <w:highlight w:val="lightGray"/>
-        </w:rPr>
-        <w:t xml:space="preserve"> (GPT-4-turbo)] </w:t>
+        <w:t xml:space="preserve"> [ChatGPT] </w:t>
       </w:r>
       <w:r>
         <w:rPr>
@@ -3943,19 +3459,18 @@
           <w:sz w:val="18"/>
           <w:highlight w:val="lightGray"/>
         </w:rPr>
-        <w:t xml:space="preserve">: Persons Table -&gt; ID Column: 1, </w:t>
-      </w:r>
-      <w:proofErr w:type="spellStart"/>
-      <w:r>
-        <w:rPr>
-          <w:rFonts w:ascii="Arial" w:eastAsia="Arial" w:hAnsi="Arial"/>
+        <w:t xml:space="preserve">: Persons Table -&gt; ID Column: 1, Name_En Column: Motasem Essam] -&gt; </w:t>
+      </w:r>
+      <w:r>
+        <w:rPr>
+          <w:rFonts w:ascii="Arial" w:eastAsia="Arial" w:hAnsi="Arial"/>
+          <w:b/>
           <w:color w:val="000000"/>
           <w:sz w:val="18"/>
           <w:highlight w:val="lightGray"/>
         </w:rPr>
-        <w:t>Name_En</w:t>
-      </w:r>
-      <w:proofErr w:type="spellEnd"/>
+        <w:t>From:</w:t>
+      </w:r>
       <w:r>
         <w:rPr>
           <w:rFonts w:ascii="Arial" w:eastAsia="Arial" w:hAnsi="Arial"/>
@@ -3963,46 +3478,7 @@
           <w:sz w:val="18"/>
           <w:highlight w:val="lightGray"/>
         </w:rPr>
-        <w:t xml:space="preserve"> Column: Motasem Essam] -&gt; </w:t>
-      </w:r>
-      <w:r>
-        <w:rPr>
-          <w:rFonts w:ascii="Arial" w:eastAsia="Arial" w:hAnsi="Arial"/>
-          <w:b/>
-          <w:color w:val="000000"/>
-          <w:sz w:val="18"/>
-          <w:highlight w:val="lightGray"/>
-        </w:rPr>
-        <w:t>From:</w:t>
-      </w:r>
-      <w:r>
-        <w:rPr>
-          <w:rFonts w:ascii="Arial" w:eastAsia="Arial" w:hAnsi="Arial"/>
-          <w:color w:val="000000"/>
-          <w:sz w:val="18"/>
-          <w:highlight w:val="lightGray"/>
-        </w:rPr>
-        <w:t xml:space="preserve"> [</w:t>
-      </w:r>
-      <w:proofErr w:type="spellStart"/>
-      <w:r>
-        <w:rPr>
-          <w:rFonts w:ascii="Arial" w:eastAsia="Arial" w:hAnsi="Arial"/>
-          <w:color w:val="000000"/>
-          <w:sz w:val="18"/>
-          <w:highlight w:val="lightGray"/>
-        </w:rPr>
-        <w:t>Chatgpt</w:t>
-      </w:r>
-      <w:proofErr w:type="spellEnd"/>
-      <w:r>
-        <w:rPr>
-          <w:rFonts w:ascii="Arial" w:eastAsia="Arial" w:hAnsi="Arial"/>
-          <w:color w:val="000000"/>
-          <w:sz w:val="18"/>
-          <w:highlight w:val="lightGray"/>
-        </w:rPr>
-        <w:t xml:space="preserve"> (GPT-4-turbo)] </w:t>
+        <w:t xml:space="preserve"> [ChatGPT] </w:t>
       </w:r>
       <w:r>
         <w:rPr>
@@ -4040,20 +3516,14 @@
           <w:rFonts w:ascii="Roboto Mono" w:eastAsia="Roboto Mono" w:hAnsi="Roboto Mono" w:cs="Roboto Mono"/>
           <w:b/>
         </w:rPr>
+        <w:lastRenderedPageBreak/>
         <w:t>Definition</w:t>
       </w:r>
       <w:r>
         <w:rPr>
           <w:rFonts w:ascii="Roboto Mono" w:eastAsia="Roboto Mono" w:hAnsi="Roboto Mono" w:cs="Roboto Mono"/>
         </w:rPr>
-        <w:t xml:space="preserve">: The connections or associations between the elements within the structure. Or The relationships describe how elements are connected or interact with each </w:t>
-      </w:r>
-      <w:r>
-        <w:rPr>
-          <w:rFonts w:ascii="Roboto Mono" w:eastAsia="Roboto Mono" w:hAnsi="Roboto Mono" w:cs="Roboto Mono"/>
-        </w:rPr>
-        <w:lastRenderedPageBreak/>
-        <w:t>other within the structure. This can involve hierarchy, associations, or other forms of interaction.</w:t>
+        <w:t>: The connections or associations between the elements within the structure. Or The relationships describe how elements are connected or interact with each other within the structure. This can involve hierarchy, associations, or other forms of interaction.</w:t>
       </w:r>
       <w:r>
         <w:rPr>
@@ -4128,19 +3598,18 @@
           <w:sz w:val="18"/>
           <w:highlight w:val="lightGray"/>
         </w:rPr>
-        <w:t xml:space="preserve">: Persons Table -&gt; ID Column: 1, </w:t>
-      </w:r>
-      <w:proofErr w:type="spellStart"/>
-      <w:r>
-        <w:rPr>
-          <w:rFonts w:ascii="Arial" w:eastAsia="Arial" w:hAnsi="Arial"/>
+        <w:t xml:space="preserve">: Persons Table -&gt; ID Column: 1, Name_En Column: Motasem Essam] -&gt; </w:t>
+      </w:r>
+      <w:r>
+        <w:rPr>
+          <w:rFonts w:ascii="Arial" w:eastAsia="Arial" w:hAnsi="Arial"/>
+          <w:b/>
           <w:color w:val="000000"/>
           <w:sz w:val="18"/>
           <w:highlight w:val="lightGray"/>
         </w:rPr>
-        <w:t>Name_En</w:t>
-      </w:r>
-      <w:proofErr w:type="spellEnd"/>
+        <w:t>From:</w:t>
+      </w:r>
       <w:r>
         <w:rPr>
           <w:rFonts w:ascii="Arial" w:eastAsia="Arial" w:hAnsi="Arial"/>
@@ -4148,46 +3617,7 @@
           <w:sz w:val="18"/>
           <w:highlight w:val="lightGray"/>
         </w:rPr>
-        <w:t xml:space="preserve"> Column: Motasem Essam] -&gt; </w:t>
-      </w:r>
-      <w:r>
-        <w:rPr>
-          <w:rFonts w:ascii="Arial" w:eastAsia="Arial" w:hAnsi="Arial"/>
-          <w:b/>
-          <w:color w:val="000000"/>
-          <w:sz w:val="18"/>
-          <w:highlight w:val="lightGray"/>
-        </w:rPr>
-        <w:t>From:</w:t>
-      </w:r>
-      <w:r>
-        <w:rPr>
-          <w:rFonts w:ascii="Arial" w:eastAsia="Arial" w:hAnsi="Arial"/>
-          <w:color w:val="000000"/>
-          <w:sz w:val="18"/>
-          <w:highlight w:val="lightGray"/>
-        </w:rPr>
-        <w:t xml:space="preserve"> [</w:t>
-      </w:r>
-      <w:proofErr w:type="spellStart"/>
-      <w:r>
-        <w:rPr>
-          <w:rFonts w:ascii="Arial" w:eastAsia="Arial" w:hAnsi="Arial"/>
-          <w:color w:val="000000"/>
-          <w:sz w:val="18"/>
-          <w:highlight w:val="lightGray"/>
-        </w:rPr>
-        <w:t>Chatgpt</w:t>
-      </w:r>
-      <w:proofErr w:type="spellEnd"/>
-      <w:r>
-        <w:rPr>
-          <w:rFonts w:ascii="Arial" w:eastAsia="Arial" w:hAnsi="Arial"/>
-          <w:color w:val="000000"/>
-          <w:sz w:val="18"/>
-          <w:highlight w:val="lightGray"/>
-        </w:rPr>
-        <w:t xml:space="preserve"> (GPT-4-turbo)] </w:t>
+        <w:t xml:space="preserve"> [ChatGPT] </w:t>
       </w:r>
       <w:r>
         <w:rPr>
@@ -4301,19 +3731,18 @@
           <w:sz w:val="18"/>
           <w:highlight w:val="lightGray"/>
         </w:rPr>
-        <w:t xml:space="preserve">: Persons Table -&gt; ID Column: 1, </w:t>
-      </w:r>
-      <w:proofErr w:type="spellStart"/>
-      <w:r>
-        <w:rPr>
-          <w:rFonts w:ascii="Arial" w:eastAsia="Arial" w:hAnsi="Arial"/>
+        <w:t xml:space="preserve">: Persons Table -&gt; ID Column: 1, Name_En Column: Motasem Essam] -&gt; </w:t>
+      </w:r>
+      <w:r>
+        <w:rPr>
+          <w:rFonts w:ascii="Arial" w:eastAsia="Arial" w:hAnsi="Arial"/>
+          <w:b/>
           <w:color w:val="000000"/>
           <w:sz w:val="18"/>
           <w:highlight w:val="lightGray"/>
         </w:rPr>
-        <w:t>Name_En</w:t>
-      </w:r>
-      <w:proofErr w:type="spellEnd"/>
+        <w:t>From:</w:t>
+      </w:r>
       <w:r>
         <w:rPr>
           <w:rFonts w:ascii="Arial" w:eastAsia="Arial" w:hAnsi="Arial"/>
@@ -4321,46 +3750,7 @@
           <w:sz w:val="18"/>
           <w:highlight w:val="lightGray"/>
         </w:rPr>
-        <w:t xml:space="preserve"> Column: Motasem Essam] -&gt; </w:t>
-      </w:r>
-      <w:r>
-        <w:rPr>
-          <w:rFonts w:ascii="Arial" w:eastAsia="Arial" w:hAnsi="Arial"/>
-          <w:b/>
-          <w:color w:val="000000"/>
-          <w:sz w:val="18"/>
-          <w:highlight w:val="lightGray"/>
-        </w:rPr>
-        <w:t>From:</w:t>
-      </w:r>
-      <w:r>
-        <w:rPr>
-          <w:rFonts w:ascii="Arial" w:eastAsia="Arial" w:hAnsi="Arial"/>
-          <w:color w:val="000000"/>
-          <w:sz w:val="18"/>
-          <w:highlight w:val="lightGray"/>
-        </w:rPr>
-        <w:t xml:space="preserve"> [</w:t>
-      </w:r>
-      <w:proofErr w:type="spellStart"/>
-      <w:r>
-        <w:rPr>
-          <w:rFonts w:ascii="Arial" w:eastAsia="Arial" w:hAnsi="Arial"/>
-          <w:color w:val="000000"/>
-          <w:sz w:val="18"/>
-          <w:highlight w:val="lightGray"/>
-        </w:rPr>
-        <w:t>Chatgpt</w:t>
-      </w:r>
-      <w:proofErr w:type="spellEnd"/>
-      <w:r>
-        <w:rPr>
-          <w:rFonts w:ascii="Arial" w:eastAsia="Arial" w:hAnsi="Arial"/>
-          <w:color w:val="000000"/>
-          <w:sz w:val="18"/>
-          <w:highlight w:val="lightGray"/>
-        </w:rPr>
-        <w:t xml:space="preserve"> (GPT-4-turbo)] </w:t>
+        <w:t xml:space="preserve"> [ChatGPT] </w:t>
       </w:r>
       <w:r>
         <w:rPr>
@@ -4480,19 +3870,18 @@
           <w:sz w:val="18"/>
           <w:highlight w:val="lightGray"/>
         </w:rPr>
-        <w:t xml:space="preserve">: Persons Table -&gt; ID Column: 1, </w:t>
-      </w:r>
-      <w:proofErr w:type="spellStart"/>
-      <w:r>
-        <w:rPr>
-          <w:rFonts w:ascii="Arial" w:eastAsia="Arial" w:hAnsi="Arial"/>
+        <w:t xml:space="preserve">: Persons Table -&gt; ID Column: 1, Name_En Column: Motasem Essam] -&gt; </w:t>
+      </w:r>
+      <w:r>
+        <w:rPr>
+          <w:rFonts w:ascii="Arial" w:eastAsia="Arial" w:hAnsi="Arial"/>
+          <w:b/>
           <w:color w:val="000000"/>
           <w:sz w:val="18"/>
           <w:highlight w:val="lightGray"/>
         </w:rPr>
-        <w:t>Name_En</w:t>
-      </w:r>
-      <w:proofErr w:type="spellEnd"/>
+        <w:t>From:</w:t>
+      </w:r>
       <w:r>
         <w:rPr>
           <w:rFonts w:ascii="Arial" w:eastAsia="Arial" w:hAnsi="Arial"/>
@@ -4500,46 +3889,7 @@
           <w:sz w:val="18"/>
           <w:highlight w:val="lightGray"/>
         </w:rPr>
-        <w:t xml:space="preserve"> Column: Motasem Essam] -&gt; </w:t>
-      </w:r>
-      <w:r>
-        <w:rPr>
-          <w:rFonts w:ascii="Arial" w:eastAsia="Arial" w:hAnsi="Arial"/>
-          <w:b/>
-          <w:color w:val="000000"/>
-          <w:sz w:val="18"/>
-          <w:highlight w:val="lightGray"/>
-        </w:rPr>
-        <w:t>From:</w:t>
-      </w:r>
-      <w:r>
-        <w:rPr>
-          <w:rFonts w:ascii="Arial" w:eastAsia="Arial" w:hAnsi="Arial"/>
-          <w:color w:val="000000"/>
-          <w:sz w:val="18"/>
-          <w:highlight w:val="lightGray"/>
-        </w:rPr>
-        <w:t xml:space="preserve"> [</w:t>
-      </w:r>
-      <w:proofErr w:type="spellStart"/>
-      <w:r>
-        <w:rPr>
-          <w:rFonts w:ascii="Arial" w:eastAsia="Arial" w:hAnsi="Arial"/>
-          <w:color w:val="000000"/>
-          <w:sz w:val="18"/>
-          <w:highlight w:val="lightGray"/>
-        </w:rPr>
-        <w:t>Chatgpt</w:t>
-      </w:r>
-      <w:proofErr w:type="spellEnd"/>
-      <w:r>
-        <w:rPr>
-          <w:rFonts w:ascii="Arial" w:eastAsia="Arial" w:hAnsi="Arial"/>
-          <w:color w:val="000000"/>
-          <w:sz w:val="18"/>
-          <w:highlight w:val="lightGray"/>
-        </w:rPr>
-        <w:t xml:space="preserve"> (GPT-4-turbo)] </w:t>
+        <w:t xml:space="preserve"> [ChatGPT] </w:t>
       </w:r>
       <w:r>
         <w:rPr>
@@ -4577,20 +3927,14 @@
           <w:rFonts w:ascii="Roboto Mono" w:eastAsia="Roboto Mono" w:hAnsi="Roboto Mono" w:cs="Roboto Mono"/>
           <w:b/>
         </w:rPr>
+        <w:lastRenderedPageBreak/>
         <w:t>Definition</w:t>
       </w:r>
       <w:r>
         <w:rPr>
           <w:rFonts w:ascii="Roboto Mono" w:eastAsia="Roboto Mono" w:hAnsi="Roboto Mono" w:cs="Roboto Mono"/>
         </w:rPr>
-        <w:t xml:space="preserve">: Some abstract structures require an identity or neutral element, which doesn’t change other elements when </w:t>
-      </w:r>
-      <w:r>
-        <w:rPr>
-          <w:rFonts w:ascii="Roboto Mono" w:eastAsia="Roboto Mono" w:hAnsi="Roboto Mono" w:cs="Roboto Mono"/>
-        </w:rPr>
-        <w:lastRenderedPageBreak/>
-        <w:t>combined with them using the defined operations.</w:t>
+        <w:t>: Some abstract structures require an identity or neutral element, which doesn’t change other elements when combined with them using the defined operations.</w:t>
       </w:r>
       <w:r>
         <w:rPr>
@@ -4668,19 +4012,18 @@
           <w:sz w:val="18"/>
           <w:highlight w:val="lightGray"/>
         </w:rPr>
-        <w:t xml:space="preserve">: Persons Table -&gt; ID Column: 1, </w:t>
-      </w:r>
-      <w:proofErr w:type="spellStart"/>
-      <w:r>
-        <w:rPr>
-          <w:rFonts w:ascii="Arial" w:eastAsia="Arial" w:hAnsi="Arial"/>
+        <w:t xml:space="preserve">: Persons Table -&gt; ID Column: 1, Name_En Column: Motasem Essam] -&gt; </w:t>
+      </w:r>
+      <w:r>
+        <w:rPr>
+          <w:rFonts w:ascii="Arial" w:eastAsia="Arial" w:hAnsi="Arial"/>
+          <w:b/>
           <w:color w:val="000000"/>
           <w:sz w:val="18"/>
           <w:highlight w:val="lightGray"/>
         </w:rPr>
-        <w:t>Name_En</w:t>
-      </w:r>
-      <w:proofErr w:type="spellEnd"/>
+        <w:t>From:</w:t>
+      </w:r>
       <w:r>
         <w:rPr>
           <w:rFonts w:ascii="Arial" w:eastAsia="Arial" w:hAnsi="Arial"/>
@@ -4688,46 +4031,7 @@
           <w:sz w:val="18"/>
           <w:highlight w:val="lightGray"/>
         </w:rPr>
-        <w:t xml:space="preserve"> Column: Motasem Essam] -&gt; </w:t>
-      </w:r>
-      <w:r>
-        <w:rPr>
-          <w:rFonts w:ascii="Arial" w:eastAsia="Arial" w:hAnsi="Arial"/>
-          <w:b/>
-          <w:color w:val="000000"/>
-          <w:sz w:val="18"/>
-          <w:highlight w:val="lightGray"/>
-        </w:rPr>
-        <w:t>From:</w:t>
-      </w:r>
-      <w:r>
-        <w:rPr>
-          <w:rFonts w:ascii="Arial" w:eastAsia="Arial" w:hAnsi="Arial"/>
-          <w:color w:val="000000"/>
-          <w:sz w:val="18"/>
-          <w:highlight w:val="lightGray"/>
-        </w:rPr>
-        <w:t xml:space="preserve"> [</w:t>
-      </w:r>
-      <w:proofErr w:type="spellStart"/>
-      <w:r>
-        <w:rPr>
-          <w:rFonts w:ascii="Arial" w:eastAsia="Arial" w:hAnsi="Arial"/>
-          <w:color w:val="000000"/>
-          <w:sz w:val="18"/>
-          <w:highlight w:val="lightGray"/>
-        </w:rPr>
-        <w:t>Chatgpt</w:t>
-      </w:r>
-      <w:proofErr w:type="spellEnd"/>
-      <w:r>
-        <w:rPr>
-          <w:rFonts w:ascii="Arial" w:eastAsia="Arial" w:hAnsi="Arial"/>
-          <w:color w:val="000000"/>
-          <w:sz w:val="18"/>
-          <w:highlight w:val="lightGray"/>
-        </w:rPr>
-        <w:t xml:space="preserve"> (GPT-4-turbo)] </w:t>
+        <w:t xml:space="preserve"> [ChatGPT] </w:t>
       </w:r>
       <w:r>
         <w:rPr>
@@ -4849,19 +4153,18 @@
           <w:sz w:val="18"/>
           <w:highlight w:val="lightGray"/>
         </w:rPr>
-        <w:t xml:space="preserve">: Persons Table -&gt; ID Column: 1, </w:t>
-      </w:r>
-      <w:proofErr w:type="spellStart"/>
-      <w:r>
-        <w:rPr>
-          <w:rFonts w:ascii="Arial" w:eastAsia="Arial" w:hAnsi="Arial"/>
+        <w:t xml:space="preserve">: Persons Table -&gt; ID Column: 1, Name_En Column: Motasem Essam] -&gt; </w:t>
+      </w:r>
+      <w:r>
+        <w:rPr>
+          <w:rFonts w:ascii="Arial" w:eastAsia="Arial" w:hAnsi="Arial"/>
+          <w:b/>
           <w:color w:val="000000"/>
           <w:sz w:val="18"/>
           <w:highlight w:val="lightGray"/>
         </w:rPr>
-        <w:t>Name_En</w:t>
-      </w:r>
-      <w:proofErr w:type="spellEnd"/>
+        <w:t>From:</w:t>
+      </w:r>
       <w:r>
         <w:rPr>
           <w:rFonts w:ascii="Arial" w:eastAsia="Arial" w:hAnsi="Arial"/>
@@ -4869,46 +4172,7 @@
           <w:sz w:val="18"/>
           <w:highlight w:val="lightGray"/>
         </w:rPr>
-        <w:t xml:space="preserve"> Column: Motasem Essam] -&gt; </w:t>
-      </w:r>
-      <w:r>
-        <w:rPr>
-          <w:rFonts w:ascii="Arial" w:eastAsia="Arial" w:hAnsi="Arial"/>
-          <w:b/>
-          <w:color w:val="000000"/>
-          <w:sz w:val="18"/>
-          <w:highlight w:val="lightGray"/>
-        </w:rPr>
-        <w:t>From:</w:t>
-      </w:r>
-      <w:r>
-        <w:rPr>
-          <w:rFonts w:ascii="Arial" w:eastAsia="Arial" w:hAnsi="Arial"/>
-          <w:color w:val="000000"/>
-          <w:sz w:val="18"/>
-          <w:highlight w:val="lightGray"/>
-        </w:rPr>
-        <w:t xml:space="preserve"> [</w:t>
-      </w:r>
-      <w:proofErr w:type="spellStart"/>
-      <w:r>
-        <w:rPr>
-          <w:rFonts w:ascii="Arial" w:eastAsia="Arial" w:hAnsi="Arial"/>
-          <w:color w:val="000000"/>
-          <w:sz w:val="18"/>
-          <w:highlight w:val="lightGray"/>
-        </w:rPr>
-        <w:t>Chatgpt</w:t>
-      </w:r>
-      <w:proofErr w:type="spellEnd"/>
-      <w:r>
-        <w:rPr>
-          <w:rFonts w:ascii="Arial" w:eastAsia="Arial" w:hAnsi="Arial"/>
-          <w:color w:val="000000"/>
-          <w:sz w:val="18"/>
-          <w:highlight w:val="lightGray"/>
-        </w:rPr>
-        <w:t xml:space="preserve"> (GPT-4-turbo)] </w:t>
+        <w:t xml:space="preserve"> [ChatGPT] </w:t>
       </w:r>
       <w:r>
         <w:rPr>
@@ -5016,6 +4280,7 @@
       <w:bookmarkStart w:id="16" w:name="_heading=h.sgsmxg75ybg4" w:colFirst="0" w:colLast="0"/>
       <w:bookmarkEnd w:id="16"/>
       <w:r>
+        <w:lastRenderedPageBreak/>
         <w:t>10. Mappings/Transformations</w:t>
       </w:r>
     </w:p>
@@ -5043,19 +4308,18 @@
           <w:sz w:val="18"/>
           <w:highlight w:val="lightGray"/>
         </w:rPr>
-        <w:t xml:space="preserve">: Persons Table -&gt; ID Column: 1, </w:t>
-      </w:r>
-      <w:proofErr w:type="spellStart"/>
-      <w:r>
-        <w:rPr>
-          <w:rFonts w:ascii="Arial" w:eastAsia="Arial" w:hAnsi="Arial"/>
+        <w:t xml:space="preserve">: Persons Table -&gt; ID Column: 1, Name_En Column: Motasem Essam] -&gt; </w:t>
+      </w:r>
+      <w:r>
+        <w:rPr>
+          <w:rFonts w:ascii="Arial" w:eastAsia="Arial" w:hAnsi="Arial"/>
+          <w:b/>
           <w:color w:val="000000"/>
           <w:sz w:val="18"/>
           <w:highlight w:val="lightGray"/>
         </w:rPr>
-        <w:t>Name_En</w:t>
-      </w:r>
-      <w:proofErr w:type="spellEnd"/>
+        <w:t>From:</w:t>
+      </w:r>
       <w:r>
         <w:rPr>
           <w:rFonts w:ascii="Arial" w:eastAsia="Arial" w:hAnsi="Arial"/>
@@ -5063,46 +4327,7 @@
           <w:sz w:val="18"/>
           <w:highlight w:val="lightGray"/>
         </w:rPr>
-        <w:t xml:space="preserve"> Column: Motasem Essam] -&gt; </w:t>
-      </w:r>
-      <w:r>
-        <w:rPr>
-          <w:rFonts w:ascii="Arial" w:eastAsia="Arial" w:hAnsi="Arial"/>
-          <w:b/>
-          <w:color w:val="000000"/>
-          <w:sz w:val="18"/>
-          <w:highlight w:val="lightGray"/>
-        </w:rPr>
-        <w:t>From:</w:t>
-      </w:r>
-      <w:r>
-        <w:rPr>
-          <w:rFonts w:ascii="Arial" w:eastAsia="Arial" w:hAnsi="Arial"/>
-          <w:color w:val="000000"/>
-          <w:sz w:val="18"/>
-          <w:highlight w:val="lightGray"/>
-        </w:rPr>
-        <w:t xml:space="preserve"> [</w:t>
-      </w:r>
-      <w:proofErr w:type="spellStart"/>
-      <w:r>
-        <w:rPr>
-          <w:rFonts w:ascii="Arial" w:eastAsia="Arial" w:hAnsi="Arial"/>
-          <w:color w:val="000000"/>
-          <w:sz w:val="18"/>
-          <w:highlight w:val="lightGray"/>
-        </w:rPr>
-        <w:t>Chatgpt</w:t>
-      </w:r>
-      <w:proofErr w:type="spellEnd"/>
-      <w:r>
-        <w:rPr>
-          <w:rFonts w:ascii="Arial" w:eastAsia="Arial" w:hAnsi="Arial"/>
-          <w:color w:val="000000"/>
-          <w:sz w:val="18"/>
-          <w:highlight w:val="lightGray"/>
-        </w:rPr>
-        <w:t xml:space="preserve"> (GPT-4-turbo)] </w:t>
+        <w:t xml:space="preserve"> [ChatGPT] </w:t>
       </w:r>
       <w:r>
         <w:rPr>
@@ -5140,7 +4365,6 @@
           <w:rFonts w:ascii="Roboto Mono" w:eastAsia="Roboto Mono" w:hAnsi="Roboto Mono" w:cs="Roboto Mono"/>
           <w:b/>
         </w:rPr>
-        <w:lastRenderedPageBreak/>
         <w:t>Definition</w:t>
       </w:r>
       <w:r>
@@ -5318,27 +4542,7 @@
           <w:szCs w:val="18"/>
           <w:highlight w:val="lightGray"/>
         </w:rPr>
-        <w:t xml:space="preserve">: Persons Table -&gt; ID Column: 1, </w:t>
-      </w:r>
-      <w:proofErr w:type="spellStart"/>
-      <w:r>
-        <w:rPr>
-          <w:rFonts w:ascii="Arial" w:eastAsia="Arial" w:hAnsi="Arial"/>
-          <w:sz w:val="18"/>
-          <w:szCs w:val="18"/>
-          <w:highlight w:val="lightGray"/>
-        </w:rPr>
-        <w:t>Name_En</w:t>
-      </w:r>
-      <w:proofErr w:type="spellEnd"/>
-      <w:r>
-        <w:rPr>
-          <w:rFonts w:ascii="Arial" w:eastAsia="Arial" w:hAnsi="Arial"/>
-          <w:sz w:val="18"/>
-          <w:szCs w:val="18"/>
-          <w:highlight w:val="lightGray"/>
-        </w:rPr>
-        <w:t xml:space="preserve"> Column: Motasem Essam] -&gt; </w:t>
+        <w:t xml:space="preserve">: Persons Table -&gt; ID Column: 1, Name_En Column: Motasem Essam] -&gt; </w:t>
       </w:r>
       <w:r>
         <w:rPr>
@@ -5700,7 +4904,6 @@
           <w:rFonts w:ascii="Roboto Mono" w:eastAsia="Roboto Mono" w:hAnsi="Roboto Mono" w:cs="Roboto Mono"/>
           <w:color w:val="202122"/>
         </w:rPr>
-        <w:lastRenderedPageBreak/>
         <w:t xml:space="preserve">A </w:t>
       </w:r>
       <w:hyperlink r:id="rId59">
@@ -5771,19 +4974,18 @@
           <w:sz w:val="18"/>
           <w:highlight w:val="lightGray"/>
         </w:rPr>
-        <w:t xml:space="preserve">: Persons Table -&gt; ID Column: 1, </w:t>
-      </w:r>
-      <w:proofErr w:type="spellStart"/>
-      <w:r>
-        <w:rPr>
-          <w:rFonts w:ascii="Arial" w:eastAsia="Arial" w:hAnsi="Arial"/>
+        <w:t xml:space="preserve">: Persons Table -&gt; ID Column: 1, Name_En Column: Motasem Essam] -&gt; </w:t>
+      </w:r>
+      <w:r>
+        <w:rPr>
+          <w:rFonts w:ascii="Arial" w:eastAsia="Arial" w:hAnsi="Arial"/>
+          <w:b/>
           <w:color w:val="000000"/>
           <w:sz w:val="18"/>
           <w:highlight w:val="lightGray"/>
         </w:rPr>
-        <w:t>Name_En</w:t>
-      </w:r>
-      <w:proofErr w:type="spellEnd"/>
+        <w:t>From:</w:t>
+      </w:r>
       <w:r>
         <w:rPr>
           <w:rFonts w:ascii="Arial" w:eastAsia="Arial" w:hAnsi="Arial"/>
@@ -5791,46 +4993,7 @@
           <w:sz w:val="18"/>
           <w:highlight w:val="lightGray"/>
         </w:rPr>
-        <w:t xml:space="preserve"> Column: Motasem Essam] -&gt; </w:t>
-      </w:r>
-      <w:r>
-        <w:rPr>
-          <w:rFonts w:ascii="Arial" w:eastAsia="Arial" w:hAnsi="Arial"/>
-          <w:b/>
-          <w:color w:val="000000"/>
-          <w:sz w:val="18"/>
-          <w:highlight w:val="lightGray"/>
-        </w:rPr>
-        <w:t>From:</w:t>
-      </w:r>
-      <w:r>
-        <w:rPr>
-          <w:rFonts w:ascii="Arial" w:eastAsia="Arial" w:hAnsi="Arial"/>
-          <w:color w:val="000000"/>
-          <w:sz w:val="18"/>
-          <w:highlight w:val="lightGray"/>
-        </w:rPr>
-        <w:t xml:space="preserve"> [</w:t>
-      </w:r>
-      <w:proofErr w:type="spellStart"/>
-      <w:r>
-        <w:rPr>
-          <w:rFonts w:ascii="Arial" w:eastAsia="Arial" w:hAnsi="Arial"/>
-          <w:color w:val="000000"/>
-          <w:sz w:val="18"/>
-          <w:highlight w:val="lightGray"/>
-        </w:rPr>
-        <w:t>Chatgpt</w:t>
-      </w:r>
-      <w:proofErr w:type="spellEnd"/>
-      <w:r>
-        <w:rPr>
-          <w:rFonts w:ascii="Arial" w:eastAsia="Arial" w:hAnsi="Arial"/>
-          <w:color w:val="000000"/>
-          <w:sz w:val="18"/>
-          <w:highlight w:val="lightGray"/>
-        </w:rPr>
-        <w:t xml:space="preserve"> (GPT-4-turbo)] </w:t>
+        <w:t xml:space="preserve"> [ChatGPT] </w:t>
       </w:r>
       <w:r>
         <w:rPr>
@@ -5928,21 +5091,7 @@
         <w:rPr>
           <w:rFonts w:ascii="Roboto Mono" w:eastAsia="Roboto Mono" w:hAnsi="Roboto Mono" w:cs="Roboto Mono"/>
         </w:rPr>
-        <w:t>Example: Set of natural numbers {1,</w:t>
-      </w:r>
-      <w:proofErr w:type="gramStart"/>
-      <w:r>
-        <w:rPr>
-          <w:rFonts w:ascii="Roboto Mono" w:eastAsia="Roboto Mono" w:hAnsi="Roboto Mono" w:cs="Roboto Mono"/>
-        </w:rPr>
-        <w:t>2,3,…</w:t>
-      </w:r>
-      <w:proofErr w:type="gramEnd"/>
-      <w:r>
-        <w:rPr>
-          <w:rFonts w:ascii="Roboto Mono" w:eastAsia="Roboto Mono" w:hAnsi="Roboto Mono" w:cs="Roboto Mono"/>
-        </w:rPr>
-        <w:t>}</w:t>
+        <w:t>Example: Set of natural numbers {1,2,3,…}</w:t>
       </w:r>
     </w:p>
     <w:p>
@@ -6011,21 +5160,7 @@
         <w:rPr>
           <w:rFonts w:ascii="Roboto Mono" w:eastAsia="Roboto Mono" w:hAnsi="Roboto Mono" w:cs="Roboto Mono"/>
         </w:rPr>
-        <w:t>Example: The set of integers with addition as the operation (</w:t>
-      </w:r>
-      <w:proofErr w:type="gramStart"/>
-      <w:r>
-        <w:rPr>
-          <w:rFonts w:ascii="Roboto Mono" w:eastAsia="Roboto Mono" w:hAnsi="Roboto Mono" w:cs="Roboto Mono"/>
-        </w:rPr>
-        <w:t>Z,+</w:t>
-      </w:r>
-      <w:proofErr w:type="gramEnd"/>
-      <w:r>
-        <w:rPr>
-          <w:rFonts w:ascii="Roboto Mono" w:eastAsia="Roboto Mono" w:hAnsi="Roboto Mono" w:cs="Roboto Mono"/>
-        </w:rPr>
-        <w:t>).</w:t>
+        <w:t>Example: The set of integers with addition as the operation (Z,+).</w:t>
       </w:r>
     </w:p>
     <w:p>
@@ -6221,21 +5356,7 @@
         <w:rPr>
           <w:rFonts w:ascii="Nova Mono" w:eastAsia="Nova Mono" w:hAnsi="Nova Mono" w:cs="Nova Mono"/>
         </w:rPr>
-        <w:t>Example: The set of real numbers with addition and multiplication (</w:t>
-      </w:r>
-      <w:proofErr w:type="gramStart"/>
-      <w:r>
-        <w:rPr>
-          <w:rFonts w:ascii="Nova Mono" w:eastAsia="Nova Mono" w:hAnsi="Nova Mono" w:cs="Nova Mono"/>
-        </w:rPr>
-        <w:t>R,+</w:t>
-      </w:r>
-      <w:proofErr w:type="gramEnd"/>
-      <w:r>
-        <w:rPr>
-          <w:rFonts w:ascii="Nova Mono" w:eastAsia="Nova Mono" w:hAnsi="Nova Mono" w:cs="Nova Mono"/>
-        </w:rPr>
-        <w:t>,⋅).</w:t>
+        <w:t>Example: The set of real numbers with addition and multiplication (R,+,⋅).</w:t>
       </w:r>
     </w:p>
     <w:p/>
@@ -6246,6 +5367,7 @@
       <w:bookmarkStart w:id="21" w:name="_heading=h.z61zxwc4ilou" w:colFirst="0" w:colLast="0"/>
       <w:bookmarkEnd w:id="21"/>
       <w:r>
+        <w:lastRenderedPageBreak/>
         <w:t>Examples of Abstract Structures and their Components:</w:t>
       </w:r>
     </w:p>
@@ -6273,19 +5395,18 @@
           <w:sz w:val="18"/>
           <w:highlight w:val="lightGray"/>
         </w:rPr>
-        <w:t xml:space="preserve">: Persons Table -&gt; ID Column: 1, </w:t>
-      </w:r>
-      <w:proofErr w:type="spellStart"/>
-      <w:r>
-        <w:rPr>
-          <w:rFonts w:ascii="Arial" w:eastAsia="Arial" w:hAnsi="Arial"/>
+        <w:t xml:space="preserve">: Persons Table -&gt; ID Column: 1, Name_En Column: Motasem Essam] -&gt; </w:t>
+      </w:r>
+      <w:r>
+        <w:rPr>
+          <w:rFonts w:ascii="Arial" w:eastAsia="Arial" w:hAnsi="Arial"/>
+          <w:b/>
           <w:color w:val="000000"/>
           <w:sz w:val="18"/>
           <w:highlight w:val="lightGray"/>
         </w:rPr>
-        <w:t>Name_En</w:t>
-      </w:r>
-      <w:proofErr w:type="spellEnd"/>
+        <w:t>From:</w:t>
+      </w:r>
       <w:r>
         <w:rPr>
           <w:rFonts w:ascii="Arial" w:eastAsia="Arial" w:hAnsi="Arial"/>
@@ -6293,46 +5414,7 @@
           <w:sz w:val="18"/>
           <w:highlight w:val="lightGray"/>
         </w:rPr>
-        <w:t xml:space="preserve"> Column: Motasem Essam] -&gt; </w:t>
-      </w:r>
-      <w:r>
-        <w:rPr>
-          <w:rFonts w:ascii="Arial" w:eastAsia="Arial" w:hAnsi="Arial"/>
-          <w:b/>
-          <w:color w:val="000000"/>
-          <w:sz w:val="18"/>
-          <w:highlight w:val="lightGray"/>
-        </w:rPr>
-        <w:t>From:</w:t>
-      </w:r>
-      <w:r>
-        <w:rPr>
-          <w:rFonts w:ascii="Arial" w:eastAsia="Arial" w:hAnsi="Arial"/>
-          <w:color w:val="000000"/>
-          <w:sz w:val="18"/>
-          <w:highlight w:val="lightGray"/>
-        </w:rPr>
-        <w:t xml:space="preserve"> [</w:t>
-      </w:r>
-      <w:proofErr w:type="spellStart"/>
-      <w:r>
-        <w:rPr>
-          <w:rFonts w:ascii="Arial" w:eastAsia="Arial" w:hAnsi="Arial"/>
-          <w:color w:val="000000"/>
-          <w:sz w:val="18"/>
-          <w:highlight w:val="lightGray"/>
-        </w:rPr>
-        <w:t>Chatgpt</w:t>
-      </w:r>
-      <w:proofErr w:type="spellEnd"/>
-      <w:r>
-        <w:rPr>
-          <w:rFonts w:ascii="Arial" w:eastAsia="Arial" w:hAnsi="Arial"/>
-          <w:color w:val="000000"/>
-          <w:sz w:val="18"/>
-          <w:highlight w:val="lightGray"/>
-        </w:rPr>
-        <w:t xml:space="preserve"> (GPT-4-turbo)] </w:t>
+        <w:t xml:space="preserve"> [ChatGPT] </w:t>
       </w:r>
       <w:r>
         <w:rPr>
@@ -6367,7 +5449,6 @@
           <w:rFonts w:ascii="Roboto Mono" w:eastAsia="Roboto Mono" w:hAnsi="Roboto Mono" w:cs="Roboto Mono"/>
           <w:b/>
         </w:rPr>
-        <w:lastRenderedPageBreak/>
         <w:t>Mathematical Structure (e.g., Group Theory)</w:t>
       </w:r>
       <w:r>
@@ -6694,6 +5775,7 @@
           <w:rFonts w:ascii="Roboto Mono" w:eastAsia="Roboto Mono" w:hAnsi="Roboto Mono" w:cs="Roboto Mono"/>
           <w:b/>
         </w:rPr>
+        <w:lastRenderedPageBreak/>
         <w:t>Elements</w:t>
       </w:r>
       <w:r>
@@ -6722,7 +5804,6 @@
           <w:rFonts w:ascii="Roboto Mono" w:eastAsia="Roboto Mono" w:hAnsi="Roboto Mono" w:cs="Roboto Mono"/>
           <w:b/>
         </w:rPr>
-        <w:lastRenderedPageBreak/>
         <w:t>Operations</w:t>
       </w:r>
       <w:r>
@@ -6978,19 +6059,18 @@
           <w:sz w:val="18"/>
           <w:highlight w:val="lightGray"/>
         </w:rPr>
-        <w:t xml:space="preserve">: Persons Table -&gt; ID Column: 1, </w:t>
-      </w:r>
-      <w:proofErr w:type="spellStart"/>
-      <w:r>
-        <w:rPr>
-          <w:rFonts w:ascii="Arial" w:eastAsia="Arial" w:hAnsi="Arial"/>
+        <w:t xml:space="preserve">: Persons Table -&gt; ID Column: 1, Name_En Column: Motasem Essam] -&gt; </w:t>
+      </w:r>
+      <w:r>
+        <w:rPr>
+          <w:rFonts w:ascii="Arial" w:eastAsia="Arial" w:hAnsi="Arial"/>
+          <w:b/>
           <w:color w:val="000000"/>
           <w:sz w:val="18"/>
           <w:highlight w:val="lightGray"/>
         </w:rPr>
-        <w:t>Name_En</w:t>
-      </w:r>
-      <w:proofErr w:type="spellEnd"/>
+        <w:t>From:</w:t>
+      </w:r>
       <w:r>
         <w:rPr>
           <w:rFonts w:ascii="Arial" w:eastAsia="Arial" w:hAnsi="Arial"/>
@@ -6998,46 +6078,7 @@
           <w:sz w:val="18"/>
           <w:highlight w:val="lightGray"/>
         </w:rPr>
-        <w:t xml:space="preserve"> Column: Motasem Essam] -&gt; </w:t>
-      </w:r>
-      <w:r>
-        <w:rPr>
-          <w:rFonts w:ascii="Arial" w:eastAsia="Arial" w:hAnsi="Arial"/>
-          <w:b/>
-          <w:color w:val="000000"/>
-          <w:sz w:val="18"/>
-          <w:highlight w:val="lightGray"/>
-        </w:rPr>
-        <w:t>From:</w:t>
-      </w:r>
-      <w:r>
-        <w:rPr>
-          <w:rFonts w:ascii="Arial" w:eastAsia="Arial" w:hAnsi="Arial"/>
-          <w:color w:val="000000"/>
-          <w:sz w:val="18"/>
-          <w:highlight w:val="lightGray"/>
-        </w:rPr>
-        <w:t xml:space="preserve"> [</w:t>
-      </w:r>
-      <w:proofErr w:type="spellStart"/>
-      <w:r>
-        <w:rPr>
-          <w:rFonts w:ascii="Arial" w:eastAsia="Arial" w:hAnsi="Arial"/>
-          <w:color w:val="000000"/>
-          <w:sz w:val="18"/>
-          <w:highlight w:val="lightGray"/>
-        </w:rPr>
-        <w:t>Chatgpt</w:t>
-      </w:r>
-      <w:proofErr w:type="spellEnd"/>
-      <w:r>
-        <w:rPr>
-          <w:rFonts w:ascii="Arial" w:eastAsia="Arial" w:hAnsi="Arial"/>
-          <w:color w:val="000000"/>
-          <w:sz w:val="18"/>
-          <w:highlight w:val="lightGray"/>
-        </w:rPr>
-        <w:t xml:space="preserve"> (GPT-4-turbo)] </w:t>
+        <w:t xml:space="preserve"> [ChatGPT] </w:t>
       </w:r>
       <w:r>
         <w:rPr>
@@ -7125,6 +6166,7 @@
           <w:rFonts w:ascii="Roboto Mono" w:eastAsia="Roboto Mono" w:hAnsi="Roboto Mono" w:cs="Roboto Mono"/>
           <w:b/>
         </w:rPr>
+        <w:lastRenderedPageBreak/>
         <w:t>Formalization</w:t>
       </w:r>
       <w:r>
@@ -7217,27 +6259,7 @@
           <w:szCs w:val="18"/>
           <w:highlight w:val="lightGray"/>
         </w:rPr>
-        <w:t xml:space="preserve">: Persons Table -&gt; ID Column: 1, </w:t>
-      </w:r>
-      <w:proofErr w:type="spellStart"/>
-      <w:r>
-        <w:rPr>
-          <w:rFonts w:ascii="Arial" w:eastAsia="Arial" w:hAnsi="Arial"/>
-          <w:sz w:val="18"/>
-          <w:szCs w:val="18"/>
-          <w:highlight w:val="lightGray"/>
-        </w:rPr>
-        <w:t>Name_En</w:t>
-      </w:r>
-      <w:proofErr w:type="spellEnd"/>
-      <w:r>
-        <w:rPr>
-          <w:rFonts w:ascii="Arial" w:eastAsia="Arial" w:hAnsi="Arial"/>
-          <w:sz w:val="18"/>
-          <w:szCs w:val="18"/>
-          <w:highlight w:val="lightGray"/>
-        </w:rPr>
-        <w:t xml:space="preserve"> Column: Motasem Essam] -&gt; </w:t>
+        <w:t xml:space="preserve">: Persons Table -&gt; ID Column: 1, Name_En Column: Motasem Essam] -&gt; </w:t>
       </w:r>
       <w:r>
         <w:rPr>
@@ -7718,7 +6740,15 @@
           <w:rFonts w:ascii="Roboto Mono" w:eastAsia="Roboto Mono" w:hAnsi="Roboto Mono" w:cs="Roboto Mono"/>
           <w:color w:val="202122"/>
         </w:rPr>
-        <w:t xml:space="preserve">Formalism emerged as a response to foundational crises in mathematics during the late nineteenth and early twentieth centuries, particularly concerns about </w:t>
+        <w:t xml:space="preserve">Formalism emerged as a response to foundational crises in mathematics during the late nineteenth and early twentieth </w:t>
+      </w:r>
+      <w:r>
+        <w:rPr>
+          <w:rFonts w:ascii="Roboto Mono" w:eastAsia="Roboto Mono" w:hAnsi="Roboto Mono" w:cs="Roboto Mono"/>
+          <w:color w:val="202122"/>
+        </w:rPr>
+        <w:lastRenderedPageBreak/>
+        <w:t xml:space="preserve">centuries, particularly concerns about </w:t>
       </w:r>
       <w:hyperlink r:id="rId74">
         <w:r>
@@ -7750,15 +6780,7 @@
           <w:rFonts w:ascii="Roboto Mono" w:eastAsia="Roboto Mono" w:hAnsi="Roboto Mono" w:cs="Roboto Mono"/>
           <w:color w:val="202122"/>
         </w:rPr>
-        <w:t xml:space="preserve"> and questions about the consistency of mathematical systems. It represents one of the three major philosophical approaches to </w:t>
-      </w:r>
-      <w:r>
-        <w:rPr>
-          <w:rFonts w:ascii="Roboto Mono" w:eastAsia="Roboto Mono" w:hAnsi="Roboto Mono" w:cs="Roboto Mono"/>
-          <w:color w:val="202122"/>
-        </w:rPr>
-        <w:lastRenderedPageBreak/>
-        <w:t xml:space="preserve">mathematics developed during this period, alongside </w:t>
+        <w:t xml:space="preserve"> and questions about the consistency of mathematical systems. It represents one of the three major philosophical approaches to mathematics developed during this period, alongside </w:t>
       </w:r>
       <w:hyperlink r:id="rId76">
         <w:r>
@@ -7844,19 +6866,18 @@
           <w:sz w:val="18"/>
           <w:highlight w:val="lightGray"/>
         </w:rPr>
-        <w:t xml:space="preserve">: Persons Table -&gt; ID Column: 1, </w:t>
-      </w:r>
-      <w:proofErr w:type="spellStart"/>
-      <w:r>
-        <w:rPr>
-          <w:rFonts w:ascii="Arial" w:eastAsia="Arial" w:hAnsi="Arial"/>
+        <w:t xml:space="preserve">: Persons Table -&gt; ID Column: 1, Name_En Column: Motasem Essam] -&gt; </w:t>
+      </w:r>
+      <w:r>
+        <w:rPr>
+          <w:rFonts w:ascii="Arial" w:eastAsia="Arial" w:hAnsi="Arial"/>
+          <w:b/>
           <w:color w:val="000000"/>
           <w:sz w:val="18"/>
           <w:highlight w:val="lightGray"/>
         </w:rPr>
-        <w:t>Name_En</w:t>
-      </w:r>
-      <w:proofErr w:type="spellEnd"/>
+        <w:t>From:</w:t>
+      </w:r>
       <w:r>
         <w:rPr>
           <w:rFonts w:ascii="Arial" w:eastAsia="Arial" w:hAnsi="Arial"/>
@@ -7864,46 +6885,7 @@
           <w:sz w:val="18"/>
           <w:highlight w:val="lightGray"/>
         </w:rPr>
-        <w:t xml:space="preserve"> Column: Motasem Essam] -&gt; </w:t>
-      </w:r>
-      <w:r>
-        <w:rPr>
-          <w:rFonts w:ascii="Arial" w:eastAsia="Arial" w:hAnsi="Arial"/>
-          <w:b/>
-          <w:color w:val="000000"/>
-          <w:sz w:val="18"/>
-          <w:highlight w:val="lightGray"/>
-        </w:rPr>
-        <w:t>From:</w:t>
-      </w:r>
-      <w:r>
-        <w:rPr>
-          <w:rFonts w:ascii="Arial" w:eastAsia="Arial" w:hAnsi="Arial"/>
-          <w:color w:val="000000"/>
-          <w:sz w:val="18"/>
-          <w:highlight w:val="lightGray"/>
-        </w:rPr>
-        <w:t xml:space="preserve"> [</w:t>
-      </w:r>
-      <w:proofErr w:type="spellStart"/>
-      <w:r>
-        <w:rPr>
-          <w:rFonts w:ascii="Arial" w:eastAsia="Arial" w:hAnsi="Arial"/>
-          <w:color w:val="000000"/>
-          <w:sz w:val="18"/>
-          <w:highlight w:val="lightGray"/>
-        </w:rPr>
-        <w:t>Chatgpt</w:t>
-      </w:r>
-      <w:proofErr w:type="spellEnd"/>
-      <w:r>
-        <w:rPr>
-          <w:rFonts w:ascii="Arial" w:eastAsia="Arial" w:hAnsi="Arial"/>
-          <w:color w:val="000000"/>
-          <w:sz w:val="18"/>
-          <w:highlight w:val="lightGray"/>
-        </w:rPr>
-        <w:t xml:space="preserve"> (GPT-4-turbo)] </w:t>
+        <w:t xml:space="preserve"> [ChatGPT] </w:t>
       </w:r>
       <w:r>
         <w:rPr>
@@ -8080,6 +7062,7 @@
           <w:b/>
           <w:i/>
         </w:rPr>
+        <w:lastRenderedPageBreak/>
         <w:t>Social Sciences</w:t>
       </w:r>
       <w:r>
@@ -8103,7 +7086,6 @@
           <w:rFonts w:ascii="Roboto Mono" w:eastAsia="Roboto Mono" w:hAnsi="Roboto Mono" w:cs="Roboto Mono"/>
           <w:i/>
         </w:rPr>
-        <w:lastRenderedPageBreak/>
         <w:t>The aim of formalization is to reduce ambiguity, enhance clarity, and often to facilitate computation or logical analysis.</w:t>
       </w:r>
     </w:p>
@@ -8217,29 +7199,7 @@
           <w:szCs w:val="18"/>
           <w:highlight w:val="lightGray"/>
         </w:rPr>
-        <w:t xml:space="preserve">: Persons Table -&gt; ID Column: 1, </w:t>
-      </w:r>
-      <w:proofErr w:type="spellStart"/>
-      <w:r>
-        <w:rPr>
-          <w:rFonts w:ascii="Arial" w:eastAsia="Arial" w:hAnsi="Arial"/>
-          <w:color w:val="000000" w:themeColor="text1"/>
-          <w:sz w:val="18"/>
-          <w:szCs w:val="18"/>
-          <w:highlight w:val="lightGray"/>
-        </w:rPr>
-        <w:t>Name_En</w:t>
-      </w:r>
-      <w:proofErr w:type="spellEnd"/>
-      <w:r>
-        <w:rPr>
-          <w:rFonts w:ascii="Arial" w:eastAsia="Arial" w:hAnsi="Arial"/>
-          <w:color w:val="000000" w:themeColor="text1"/>
-          <w:sz w:val="18"/>
-          <w:szCs w:val="18"/>
-          <w:highlight w:val="lightGray"/>
-        </w:rPr>
-        <w:t xml:space="preserve"> Column: Motasem Essam] -&gt; </w:t>
+        <w:t xml:space="preserve">: Persons Table -&gt; ID Column: 1, Name_En Column: Motasem Essam] -&gt; </w:t>
       </w:r>
       <w:r>
         <w:rPr>
@@ -8594,21 +7554,12 @@
         <w:t xml:space="preserve"> word </w:t>
       </w:r>
       <w:hyperlink r:id="rId86" w:anchor="Ancient_Greek">
-        <w:proofErr w:type="spellStart"/>
         <w:r>
           <w:rPr>
             <w:rFonts w:ascii="Roboto Mono" w:eastAsia="Roboto Mono" w:hAnsi="Roboto Mono" w:cs="Roboto Mono"/>
             <w:color w:val="3366CC"/>
           </w:rPr>
-          <w:t>ἀξίωμ</w:t>
-        </w:r>
-        <w:proofErr w:type="spellEnd"/>
-        <w:r>
-          <w:rPr>
-            <w:rFonts w:ascii="Roboto Mono" w:eastAsia="Roboto Mono" w:hAnsi="Roboto Mono" w:cs="Roboto Mono"/>
-            <w:color w:val="3366CC"/>
-          </w:rPr>
-          <w:t>α</w:t>
+          <w:t>ἀξίωμα</w:t>
         </w:r>
       </w:hyperlink>
       <w:r>
@@ -8618,7 +7569,6 @@
         </w:rPr>
         <w:t xml:space="preserve"> (</w:t>
       </w:r>
-      <w:proofErr w:type="spellStart"/>
       <w:r>
         <w:rPr>
           <w:rFonts w:ascii="Roboto Mono" w:eastAsia="Roboto Mono" w:hAnsi="Roboto Mono" w:cs="Roboto Mono"/>
@@ -8627,7 +7577,6 @@
         </w:rPr>
         <w:t>axíōma</w:t>
       </w:r>
-      <w:proofErr w:type="spellEnd"/>
       <w:r>
         <w:rPr>
           <w:rFonts w:ascii="Roboto Mono" w:eastAsia="Roboto Mono" w:hAnsi="Roboto Mono" w:cs="Roboto Mono"/>
@@ -8683,19 +7632,18 @@
           <w:sz w:val="18"/>
           <w:highlight w:val="lightGray"/>
         </w:rPr>
-        <w:t xml:space="preserve">: Persons Table -&gt; ID Column: 1, </w:t>
-      </w:r>
-      <w:proofErr w:type="spellStart"/>
-      <w:r>
-        <w:rPr>
-          <w:rFonts w:ascii="Arial" w:eastAsia="Arial" w:hAnsi="Arial"/>
+        <w:t xml:space="preserve">: Persons Table -&gt; ID Column: 1, Name_En Column: Motasem Essam] -&gt; </w:t>
+      </w:r>
+      <w:r>
+        <w:rPr>
+          <w:rFonts w:ascii="Arial" w:eastAsia="Arial" w:hAnsi="Arial"/>
+          <w:b/>
           <w:color w:val="000000"/>
           <w:sz w:val="18"/>
           <w:highlight w:val="lightGray"/>
         </w:rPr>
-        <w:t>Name_En</w:t>
-      </w:r>
-      <w:proofErr w:type="spellEnd"/>
+        <w:t>From:</w:t>
+      </w:r>
       <w:r>
         <w:rPr>
           <w:rFonts w:ascii="Arial" w:eastAsia="Arial" w:hAnsi="Arial"/>
@@ -8703,46 +7651,7 @@
           <w:sz w:val="18"/>
           <w:highlight w:val="lightGray"/>
         </w:rPr>
-        <w:t xml:space="preserve"> Column: Motasem Essam] -&gt; </w:t>
-      </w:r>
-      <w:r>
-        <w:rPr>
-          <w:rFonts w:ascii="Arial" w:eastAsia="Arial" w:hAnsi="Arial"/>
-          <w:b/>
-          <w:color w:val="000000"/>
-          <w:sz w:val="18"/>
-          <w:highlight w:val="lightGray"/>
-        </w:rPr>
-        <w:t>From:</w:t>
-      </w:r>
-      <w:r>
-        <w:rPr>
-          <w:rFonts w:ascii="Arial" w:eastAsia="Arial" w:hAnsi="Arial"/>
-          <w:color w:val="000000"/>
-          <w:sz w:val="18"/>
-          <w:highlight w:val="lightGray"/>
-        </w:rPr>
-        <w:t xml:space="preserve"> [</w:t>
-      </w:r>
-      <w:proofErr w:type="spellStart"/>
-      <w:r>
-        <w:rPr>
-          <w:rFonts w:ascii="Arial" w:eastAsia="Arial" w:hAnsi="Arial"/>
-          <w:color w:val="000000"/>
-          <w:sz w:val="18"/>
-          <w:highlight w:val="lightGray"/>
-        </w:rPr>
-        <w:t>Chatgpt</w:t>
-      </w:r>
-      <w:proofErr w:type="spellEnd"/>
-      <w:r>
-        <w:rPr>
-          <w:rFonts w:ascii="Arial" w:eastAsia="Arial" w:hAnsi="Arial"/>
-          <w:color w:val="000000"/>
-          <w:sz w:val="18"/>
-          <w:highlight w:val="lightGray"/>
-        </w:rPr>
-        <w:t xml:space="preserve"> (GPT-4-turbo)] </w:t>
+        <w:t xml:space="preserve"> [ChatGPT] </w:t>
       </w:r>
       <w:r>
         <w:rPr>
@@ -8934,27 +7843,7 @@
           <w:szCs w:val="18"/>
           <w:highlight w:val="lightGray"/>
         </w:rPr>
-        <w:t xml:space="preserve">: Persons Table -&gt; ID Column: 1, </w:t>
-      </w:r>
-      <w:proofErr w:type="spellStart"/>
-      <w:r>
-        <w:rPr>
-          <w:rFonts w:ascii="Arial" w:eastAsia="Arial" w:hAnsi="Arial"/>
-          <w:sz w:val="18"/>
-          <w:szCs w:val="18"/>
-          <w:highlight w:val="lightGray"/>
-        </w:rPr>
-        <w:t>Name_En</w:t>
-      </w:r>
-      <w:proofErr w:type="spellEnd"/>
-      <w:r>
-        <w:rPr>
-          <w:rFonts w:ascii="Arial" w:eastAsia="Arial" w:hAnsi="Arial"/>
-          <w:sz w:val="18"/>
-          <w:szCs w:val="18"/>
-          <w:highlight w:val="lightGray"/>
-        </w:rPr>
-        <w:t xml:space="preserve"> Column: Motasem Essam] -&gt; </w:t>
+        <w:t xml:space="preserve">: Persons Table -&gt; ID Column: 1, Name_En Column: Motasem Essam] -&gt; </w:t>
       </w:r>
       <w:r>
         <w:rPr>
@@ -9228,19 +8117,18 @@
           <w:sz w:val="18"/>
           <w:highlight w:val="lightGray"/>
         </w:rPr>
-        <w:t xml:space="preserve">: Persons Table -&gt; ID Column: 1, </w:t>
-      </w:r>
-      <w:proofErr w:type="spellStart"/>
-      <w:r>
-        <w:rPr>
-          <w:rFonts w:ascii="Arial" w:eastAsia="Arial" w:hAnsi="Arial"/>
+        <w:t xml:space="preserve">: Persons Table -&gt; ID Column: 1, Name_En Column: Motasem Essam] -&gt; </w:t>
+      </w:r>
+      <w:r>
+        <w:rPr>
+          <w:rFonts w:ascii="Arial" w:eastAsia="Arial" w:hAnsi="Arial"/>
+          <w:b/>
           <w:color w:val="000000"/>
           <w:sz w:val="18"/>
           <w:highlight w:val="lightGray"/>
         </w:rPr>
-        <w:t>Name_En</w:t>
-      </w:r>
-      <w:proofErr w:type="spellEnd"/>
+        <w:t>From:</w:t>
+      </w:r>
       <w:r>
         <w:rPr>
           <w:rFonts w:ascii="Arial" w:eastAsia="Arial" w:hAnsi="Arial"/>
@@ -9248,46 +8136,7 @@
           <w:sz w:val="18"/>
           <w:highlight w:val="lightGray"/>
         </w:rPr>
-        <w:t xml:space="preserve"> Column: Motasem Essam] -&gt; </w:t>
-      </w:r>
-      <w:r>
-        <w:rPr>
-          <w:rFonts w:ascii="Arial" w:eastAsia="Arial" w:hAnsi="Arial"/>
-          <w:b/>
-          <w:color w:val="000000"/>
-          <w:sz w:val="18"/>
-          <w:highlight w:val="lightGray"/>
-        </w:rPr>
-        <w:t>From:</w:t>
-      </w:r>
-      <w:r>
-        <w:rPr>
-          <w:rFonts w:ascii="Arial" w:eastAsia="Arial" w:hAnsi="Arial"/>
-          <w:color w:val="000000"/>
-          <w:sz w:val="18"/>
-          <w:highlight w:val="lightGray"/>
-        </w:rPr>
-        <w:t xml:space="preserve"> [</w:t>
-      </w:r>
-      <w:proofErr w:type="spellStart"/>
-      <w:r>
-        <w:rPr>
-          <w:rFonts w:ascii="Arial" w:eastAsia="Arial" w:hAnsi="Arial"/>
-          <w:color w:val="000000"/>
-          <w:sz w:val="18"/>
-          <w:highlight w:val="lightGray"/>
-        </w:rPr>
-        <w:t>Chatgpt</w:t>
-      </w:r>
-      <w:proofErr w:type="spellEnd"/>
-      <w:r>
-        <w:rPr>
-          <w:rFonts w:ascii="Arial" w:eastAsia="Arial" w:hAnsi="Arial"/>
-          <w:color w:val="000000"/>
-          <w:sz w:val="18"/>
-          <w:highlight w:val="lightGray"/>
-        </w:rPr>
-        <w:t xml:space="preserve"> (GPT-4-turbo)] </w:t>
+        <w:t xml:space="preserve"> [ChatGPT] </w:t>
       </w:r>
       <w:r>
         <w:rPr>
@@ -9581,27 +8430,7 @@
           <w:szCs w:val="18"/>
           <w:highlight w:val="lightGray"/>
         </w:rPr>
-        <w:t xml:space="preserve">: Persons Table -&gt; ID Column: 1, </w:t>
-      </w:r>
-      <w:proofErr w:type="spellStart"/>
-      <w:r>
-        <w:rPr>
-          <w:rFonts w:ascii="Arial" w:eastAsia="Arial" w:hAnsi="Arial"/>
-          <w:sz w:val="18"/>
-          <w:szCs w:val="18"/>
-          <w:highlight w:val="lightGray"/>
-        </w:rPr>
-        <w:t>Name_En</w:t>
-      </w:r>
-      <w:proofErr w:type="spellEnd"/>
-      <w:r>
-        <w:rPr>
-          <w:rFonts w:ascii="Arial" w:eastAsia="Arial" w:hAnsi="Arial"/>
-          <w:sz w:val="18"/>
-          <w:szCs w:val="18"/>
-          <w:highlight w:val="lightGray"/>
-        </w:rPr>
-        <w:t xml:space="preserve"> Column: Motasem Essam] -&gt; </w:t>
+        <w:t xml:space="preserve">: Persons Table -&gt; ID Column: 1, Name_En Column: Motasem Essam] -&gt; </w:t>
       </w:r>
       <w:r>
         <w:rPr>
@@ -9942,27 +8771,7 @@
           <w:szCs w:val="18"/>
           <w:highlight w:val="lightGray"/>
         </w:rPr>
-        <w:t xml:space="preserve">: Persons Table -&gt; ID Column: 1, </w:t>
-      </w:r>
-      <w:proofErr w:type="spellStart"/>
-      <w:r>
-        <w:rPr>
-          <w:rFonts w:ascii="Arial" w:eastAsia="Arial" w:hAnsi="Arial"/>
-          <w:sz w:val="18"/>
-          <w:szCs w:val="18"/>
-          <w:highlight w:val="lightGray"/>
-        </w:rPr>
-        <w:t>Name_En</w:t>
-      </w:r>
-      <w:proofErr w:type="spellEnd"/>
-      <w:r>
-        <w:rPr>
-          <w:rFonts w:ascii="Arial" w:eastAsia="Arial" w:hAnsi="Arial"/>
-          <w:sz w:val="18"/>
-          <w:szCs w:val="18"/>
-          <w:highlight w:val="lightGray"/>
-        </w:rPr>
-        <w:t xml:space="preserve"> Column: Motasem Essam] -&gt; </w:t>
+        <w:t xml:space="preserve">: Persons Table -&gt; ID Column: 1, Name_En Column: Motasem Essam] -&gt; </w:t>
       </w:r>
       <w:r>
         <w:rPr>
@@ -10301,21 +9110,7 @@
         <w:rPr>
           <w:rFonts w:ascii="Roboto Mono" w:hAnsi="Roboto Mono"/>
         </w:rPr>
-        <w:t xml:space="preserve">Interrogative, imperative and exclamatory sentences are not propositions. As it stands, Sentence 4 is not a proposition. It becomes a proposition if the value of x is known. </w:t>
-      </w:r>
-      <w:proofErr w:type="gramStart"/>
-      <w:r>
-        <w:rPr>
-          <w:rFonts w:ascii="Roboto Mono" w:hAnsi="Roboto Mono"/>
-        </w:rPr>
-        <w:t>Of course</w:t>
-      </w:r>
-      <w:proofErr w:type="gramEnd"/>
-      <w:r>
-        <w:rPr>
-          <w:rFonts w:ascii="Roboto Mono" w:hAnsi="Roboto Mono"/>
-        </w:rPr>
-        <w:t xml:space="preserve"> it is true if x </w:t>
+        <w:t xml:space="preserve">Interrogative, imperative and exclamatory sentences are not propositions. As it stands, Sentence 4 is not a proposition. It becomes a proposition if the value of x is known. Of course it is true if x </w:t>
       </w:r>
       <w:r>
         <w:rPr>
@@ -10377,19 +9172,18 @@
           <w:sz w:val="18"/>
           <w:highlight w:val="lightGray"/>
         </w:rPr>
-        <w:t xml:space="preserve">: Persons Table -&gt; ID Column: 1, </w:t>
-      </w:r>
-      <w:proofErr w:type="spellStart"/>
-      <w:r>
-        <w:rPr>
-          <w:rFonts w:ascii="Arial" w:eastAsia="Arial" w:hAnsi="Arial"/>
+        <w:t xml:space="preserve">: Persons Table -&gt; ID Column: 1, Name_En Column: Motasem Essam] -&gt; </w:t>
+      </w:r>
+      <w:r>
+        <w:rPr>
+          <w:rFonts w:ascii="Arial" w:eastAsia="Arial" w:hAnsi="Arial"/>
+          <w:b/>
           <w:color w:val="000000"/>
           <w:sz w:val="18"/>
           <w:highlight w:val="lightGray"/>
         </w:rPr>
-        <w:t>Name_En</w:t>
-      </w:r>
-      <w:proofErr w:type="spellEnd"/>
+        <w:t>From:</w:t>
+      </w:r>
       <w:r>
         <w:rPr>
           <w:rFonts w:ascii="Arial" w:eastAsia="Arial" w:hAnsi="Arial"/>
@@ -10397,46 +9191,7 @@
           <w:sz w:val="18"/>
           <w:highlight w:val="lightGray"/>
         </w:rPr>
-        <w:t xml:space="preserve"> Column: Motasem Essam] -&gt; </w:t>
-      </w:r>
-      <w:r>
-        <w:rPr>
-          <w:rFonts w:ascii="Arial" w:eastAsia="Arial" w:hAnsi="Arial"/>
-          <w:b/>
-          <w:color w:val="000000"/>
-          <w:sz w:val="18"/>
-          <w:highlight w:val="lightGray"/>
-        </w:rPr>
-        <w:t>From:</w:t>
-      </w:r>
-      <w:r>
-        <w:rPr>
-          <w:rFonts w:ascii="Arial" w:eastAsia="Arial" w:hAnsi="Arial"/>
-          <w:color w:val="000000"/>
-          <w:sz w:val="18"/>
-          <w:highlight w:val="lightGray"/>
-        </w:rPr>
-        <w:t xml:space="preserve"> [</w:t>
-      </w:r>
-      <w:proofErr w:type="spellStart"/>
-      <w:r>
-        <w:rPr>
-          <w:rFonts w:ascii="Arial" w:eastAsia="Arial" w:hAnsi="Arial"/>
-          <w:color w:val="000000"/>
-          <w:sz w:val="18"/>
-          <w:highlight w:val="lightGray"/>
-        </w:rPr>
-        <w:t>Chatgpt</w:t>
-      </w:r>
-      <w:proofErr w:type="spellEnd"/>
-      <w:r>
-        <w:rPr>
-          <w:rFonts w:ascii="Arial" w:eastAsia="Arial" w:hAnsi="Arial"/>
-          <w:color w:val="000000"/>
-          <w:sz w:val="18"/>
-          <w:highlight w:val="lightGray"/>
-        </w:rPr>
-        <w:t xml:space="preserve"> (GPT-4-turbo)] </w:t>
+        <w:t xml:space="preserve"> [ChatGPT] </w:t>
       </w:r>
       <w:r>
         <w:rPr>
@@ -10718,29 +9473,7 @@
           <w:szCs w:val="18"/>
           <w:highlight w:val="lightGray"/>
         </w:rPr>
-        <w:t xml:space="preserve">: Persons Table -&gt; ID Column: 1, </w:t>
-      </w:r>
-      <w:proofErr w:type="spellStart"/>
-      <w:r>
-        <w:rPr>
-          <w:rFonts w:ascii="Arial" w:eastAsia="Arial" w:hAnsi="Arial"/>
-          <w:color w:val="000000" w:themeColor="text1"/>
-          <w:sz w:val="18"/>
-          <w:szCs w:val="18"/>
-          <w:highlight w:val="lightGray"/>
-        </w:rPr>
-        <w:t>Name_En</w:t>
-      </w:r>
-      <w:proofErr w:type="spellEnd"/>
-      <w:r>
-        <w:rPr>
-          <w:rFonts w:ascii="Arial" w:eastAsia="Arial" w:hAnsi="Arial"/>
-          <w:color w:val="000000" w:themeColor="text1"/>
-          <w:sz w:val="18"/>
-          <w:szCs w:val="18"/>
-          <w:highlight w:val="lightGray"/>
-        </w:rPr>
-        <w:t xml:space="preserve"> Column: Motasem Essam] -&gt; </w:t>
+        <w:t xml:space="preserve">: Persons Table -&gt; ID Column: 1, Name_En Column: Motasem Essam] -&gt; </w:t>
       </w:r>
       <w:r>
         <w:rPr>
@@ -11342,19 +10075,18 @@
           <w:sz w:val="18"/>
           <w:highlight w:val="lightGray"/>
         </w:rPr>
-        <w:t xml:space="preserve">: Persons Table -&gt; ID Column: 1, </w:t>
-      </w:r>
-      <w:proofErr w:type="spellStart"/>
-      <w:r>
-        <w:rPr>
-          <w:rFonts w:ascii="Arial" w:eastAsia="Arial" w:hAnsi="Arial"/>
+        <w:t xml:space="preserve">: Persons Table -&gt; ID Column: 1, Name_En Column: Motasem Essam] -&gt; </w:t>
+      </w:r>
+      <w:r>
+        <w:rPr>
+          <w:rFonts w:ascii="Arial" w:eastAsia="Arial" w:hAnsi="Arial"/>
+          <w:b/>
           <w:color w:val="000000"/>
           <w:sz w:val="18"/>
           <w:highlight w:val="lightGray"/>
         </w:rPr>
-        <w:t>Name_En</w:t>
-      </w:r>
-      <w:proofErr w:type="spellEnd"/>
+        <w:t>From:</w:t>
+      </w:r>
       <w:r>
         <w:rPr>
           <w:rFonts w:ascii="Arial" w:eastAsia="Arial" w:hAnsi="Arial"/>
@@ -11362,46 +10094,7 @@
           <w:sz w:val="18"/>
           <w:highlight w:val="lightGray"/>
         </w:rPr>
-        <w:t xml:space="preserve"> Column: Motasem Essam] -&gt; </w:t>
-      </w:r>
-      <w:r>
-        <w:rPr>
-          <w:rFonts w:ascii="Arial" w:eastAsia="Arial" w:hAnsi="Arial"/>
-          <w:b/>
-          <w:color w:val="000000"/>
-          <w:sz w:val="18"/>
-          <w:highlight w:val="lightGray"/>
-        </w:rPr>
-        <w:t>From:</w:t>
-      </w:r>
-      <w:r>
-        <w:rPr>
-          <w:rFonts w:ascii="Arial" w:eastAsia="Arial" w:hAnsi="Arial"/>
-          <w:color w:val="000000"/>
-          <w:sz w:val="18"/>
-          <w:highlight w:val="lightGray"/>
-        </w:rPr>
-        <w:t xml:space="preserve"> [</w:t>
-      </w:r>
-      <w:proofErr w:type="spellStart"/>
-      <w:r>
-        <w:rPr>
-          <w:rFonts w:ascii="Arial" w:eastAsia="Arial" w:hAnsi="Arial"/>
-          <w:color w:val="000000"/>
-          <w:sz w:val="18"/>
-          <w:highlight w:val="lightGray"/>
-        </w:rPr>
-        <w:t>Chatgpt</w:t>
-      </w:r>
-      <w:proofErr w:type="spellEnd"/>
-      <w:r>
-        <w:rPr>
-          <w:rFonts w:ascii="Arial" w:eastAsia="Arial" w:hAnsi="Arial"/>
-          <w:color w:val="000000"/>
-          <w:sz w:val="18"/>
-          <w:highlight w:val="lightGray"/>
-        </w:rPr>
-        <w:t xml:space="preserve"> (GPT-4-turbo)] </w:t>
+        <w:t xml:space="preserve"> [ChatGPT] </w:t>
       </w:r>
       <w:r>
         <w:rPr>
@@ -11600,29 +10293,7 @@
           <w:szCs w:val="18"/>
           <w:highlight w:val="lightGray"/>
         </w:rPr>
-        <w:t xml:space="preserve">: Persons Table -&gt; ID Column: 1, </w:t>
-      </w:r>
-      <w:proofErr w:type="spellStart"/>
-      <w:r>
-        <w:rPr>
-          <w:rFonts w:ascii="Arial" w:eastAsia="Arial" w:hAnsi="Arial"/>
-          <w:color w:val="000000" w:themeColor="text1"/>
-          <w:sz w:val="18"/>
-          <w:szCs w:val="18"/>
-          <w:highlight w:val="lightGray"/>
-        </w:rPr>
-        <w:t>Name_En</w:t>
-      </w:r>
-      <w:proofErr w:type="spellEnd"/>
-      <w:r>
-        <w:rPr>
-          <w:rFonts w:ascii="Arial" w:eastAsia="Arial" w:hAnsi="Arial"/>
-          <w:color w:val="000000" w:themeColor="text1"/>
-          <w:sz w:val="18"/>
-          <w:szCs w:val="18"/>
-          <w:highlight w:val="lightGray"/>
-        </w:rPr>
-        <w:t xml:space="preserve"> Column: Motasem Essam] -&gt; </w:t>
+        <w:t xml:space="preserve">: Persons Table -&gt; ID Column: 1, Name_En Column: Motasem Essam] -&gt; </w:t>
       </w:r>
       <w:r>
         <w:rPr>
@@ -12041,29 +10712,7 @@
           <w:szCs w:val="18"/>
           <w:highlight w:val="lightGray"/>
         </w:rPr>
-        <w:t xml:space="preserve">: Persons Table -&gt; ID Column: 1, </w:t>
-      </w:r>
-      <w:proofErr w:type="spellStart"/>
-      <w:r>
-        <w:rPr>
-          <w:rFonts w:ascii="Arial" w:eastAsia="Arial" w:hAnsi="Arial"/>
-          <w:color w:val="000000" w:themeColor="text1"/>
-          <w:sz w:val="18"/>
-          <w:szCs w:val="18"/>
-          <w:highlight w:val="lightGray"/>
-        </w:rPr>
-        <w:t>Name_En</w:t>
-      </w:r>
-      <w:proofErr w:type="spellEnd"/>
-      <w:r>
-        <w:rPr>
-          <w:rFonts w:ascii="Arial" w:eastAsia="Arial" w:hAnsi="Arial"/>
-          <w:color w:val="000000" w:themeColor="text1"/>
-          <w:sz w:val="18"/>
-          <w:szCs w:val="18"/>
-          <w:highlight w:val="lightGray"/>
-        </w:rPr>
-        <w:t xml:space="preserve"> Column: Motasem Essam] -&gt; </w:t>
+        <w:t xml:space="preserve">: Persons Table -&gt; ID Column: 1, Name_En Column: Motasem Essam] -&gt; </w:t>
       </w:r>
       <w:r>
         <w:rPr>
@@ -12430,23 +11079,7 @@
           <w:rFonts w:ascii="Roboto Mono" w:eastAsia="Roboto Mono" w:hAnsi="Roboto Mono" w:cs="Roboto Mono"/>
           <w:color w:val="202122"/>
         </w:rPr>
-        <w:t xml:space="preserve">"Are </w:t>
-      </w:r>
-      <w:proofErr w:type="gramStart"/>
-      <w:r>
-        <w:rPr>
-          <w:rFonts w:ascii="Roboto Mono" w:eastAsia="Roboto Mono" w:hAnsi="Roboto Mono" w:cs="Roboto Mono"/>
-          <w:color w:val="202122"/>
-        </w:rPr>
-        <w:t>you</w:t>
-      </w:r>
-      <w:proofErr w:type="gramEnd"/>
-      <w:r>
-        <w:rPr>
-          <w:rFonts w:ascii="Roboto Mono" w:eastAsia="Roboto Mono" w:hAnsi="Roboto Mono" w:cs="Roboto Mono"/>
-          <w:color w:val="202122"/>
-        </w:rPr>
-        <w:t xml:space="preserve"> my friend?"</w:t>
+        <w:t>"Are you my friend?"</w:t>
       </w:r>
     </w:p>
     <w:p>
@@ -12605,19 +11238,18 @@
           <w:sz w:val="18"/>
           <w:highlight w:val="lightGray"/>
         </w:rPr>
-        <w:t xml:space="preserve">: Persons Table -&gt; ID Column: 1, </w:t>
-      </w:r>
-      <w:proofErr w:type="spellStart"/>
-      <w:r>
-        <w:rPr>
-          <w:rFonts w:ascii="Arial" w:eastAsia="Arial" w:hAnsi="Arial"/>
+        <w:t xml:space="preserve">: Persons Table -&gt; ID Column: 1, Name_En Column: Motasem Essam] -&gt; </w:t>
+      </w:r>
+      <w:r>
+        <w:rPr>
+          <w:rFonts w:ascii="Arial" w:eastAsia="Arial" w:hAnsi="Arial"/>
+          <w:b/>
           <w:color w:val="000000"/>
           <w:sz w:val="18"/>
           <w:highlight w:val="lightGray"/>
         </w:rPr>
-        <w:t>Name_En</w:t>
-      </w:r>
-      <w:proofErr w:type="spellEnd"/>
+        <w:t>From:</w:t>
+      </w:r>
       <w:r>
         <w:rPr>
           <w:rFonts w:ascii="Arial" w:eastAsia="Arial" w:hAnsi="Arial"/>
@@ -12625,46 +11257,7 @@
           <w:sz w:val="18"/>
           <w:highlight w:val="lightGray"/>
         </w:rPr>
-        <w:t xml:space="preserve"> Column: Motasem Essam] -&gt; </w:t>
-      </w:r>
-      <w:r>
-        <w:rPr>
-          <w:rFonts w:ascii="Arial" w:eastAsia="Arial" w:hAnsi="Arial"/>
-          <w:b/>
-          <w:color w:val="000000"/>
-          <w:sz w:val="18"/>
-          <w:highlight w:val="lightGray"/>
-        </w:rPr>
-        <w:t>From:</w:t>
-      </w:r>
-      <w:r>
-        <w:rPr>
-          <w:rFonts w:ascii="Arial" w:eastAsia="Arial" w:hAnsi="Arial"/>
-          <w:color w:val="000000"/>
-          <w:sz w:val="18"/>
-          <w:highlight w:val="lightGray"/>
-        </w:rPr>
-        <w:t xml:space="preserve"> [</w:t>
-      </w:r>
-      <w:proofErr w:type="spellStart"/>
-      <w:r>
-        <w:rPr>
-          <w:rFonts w:ascii="Arial" w:eastAsia="Arial" w:hAnsi="Arial"/>
-          <w:color w:val="000000"/>
-          <w:sz w:val="18"/>
-          <w:highlight w:val="lightGray"/>
-        </w:rPr>
-        <w:t>Chatgpt</w:t>
-      </w:r>
-      <w:proofErr w:type="spellEnd"/>
-      <w:r>
-        <w:rPr>
-          <w:rFonts w:ascii="Arial" w:eastAsia="Arial" w:hAnsi="Arial"/>
-          <w:color w:val="000000"/>
-          <w:sz w:val="18"/>
-          <w:highlight w:val="lightGray"/>
-        </w:rPr>
-        <w:t xml:space="preserve"> (GPT-4-turbo)] </w:t>
+        <w:t xml:space="preserve"> [ChatGPT] </w:t>
       </w:r>
       <w:r>
         <w:rPr>
@@ -13340,27 +11933,7 @@
           <w:szCs w:val="18"/>
           <w:highlight w:val="lightGray"/>
         </w:rPr>
-        <w:t xml:space="preserve">: Persons Table -&gt; ID Column: 1, </w:t>
-      </w:r>
-      <w:proofErr w:type="spellStart"/>
-      <w:r>
-        <w:rPr>
-          <w:rFonts w:ascii="Arial" w:eastAsia="Arial" w:hAnsi="Arial"/>
-          <w:sz w:val="18"/>
-          <w:szCs w:val="18"/>
-          <w:highlight w:val="lightGray"/>
-        </w:rPr>
-        <w:t>Name_En</w:t>
-      </w:r>
-      <w:proofErr w:type="spellEnd"/>
-      <w:r>
-        <w:rPr>
-          <w:rFonts w:ascii="Arial" w:eastAsia="Arial" w:hAnsi="Arial"/>
-          <w:sz w:val="18"/>
-          <w:szCs w:val="18"/>
-          <w:highlight w:val="lightGray"/>
-        </w:rPr>
-        <w:t xml:space="preserve"> Column: Motasem Essam] -&gt; </w:t>
+        <w:t xml:space="preserve">: Persons Table -&gt; ID Column: 1, Name_En Column: Motasem Essam] -&gt; </w:t>
       </w:r>
       <w:r>
         <w:rPr>
@@ -13602,29 +12175,7 @@
           <w:szCs w:val="23"/>
           <w:highlight w:val="white"/>
         </w:rPr>
-        <w:t xml:space="preserve"> </w:t>
-      </w:r>
-      <w:proofErr w:type="gramStart"/>
-      <w:r>
-        <w:rPr>
-          <w:rFonts w:ascii="Roboto Mono" w:eastAsia="Roboto Mono" w:hAnsi="Roboto Mono" w:cs="Roboto Mono"/>
-          <w:color w:val="0C0D0E"/>
-          <w:sz w:val="23"/>
-          <w:szCs w:val="23"/>
-          <w:highlight w:val="white"/>
-        </w:rPr>
-        <w:t>an</w:t>
-      </w:r>
-      <w:proofErr w:type="gramEnd"/>
-      <w:r>
-        <w:rPr>
-          <w:rFonts w:ascii="Roboto Mono" w:eastAsia="Roboto Mono" w:hAnsi="Roboto Mono" w:cs="Roboto Mono"/>
-          <w:color w:val="0C0D0E"/>
-          <w:sz w:val="23"/>
-          <w:szCs w:val="23"/>
-          <w:highlight w:val="white"/>
-        </w:rPr>
-        <w:t xml:space="preserve"> assertion claims the reference of sentence, a statement is a sentence with a truth value, and a statement can be judged as true/false.</w:t>
+        <w:t xml:space="preserve"> an assertion claims the reference of sentence, a statement is a sentence with a truth value, and a statement can be judged as true/false.</w:t>
       </w:r>
     </w:p>
     <w:p>
@@ -13655,19 +12206,18 @@
           <w:sz w:val="18"/>
           <w:highlight w:val="lightGray"/>
         </w:rPr>
-        <w:t xml:space="preserve">: Persons Table -&gt; ID Column: 1, </w:t>
-      </w:r>
-      <w:proofErr w:type="spellStart"/>
-      <w:r>
-        <w:rPr>
-          <w:rFonts w:ascii="Arial" w:eastAsia="Arial" w:hAnsi="Arial"/>
+        <w:t xml:space="preserve">: Persons Table -&gt; ID Column: 1, Name_En Column: Motasem Essam] -&gt; </w:t>
+      </w:r>
+      <w:r>
+        <w:rPr>
+          <w:rFonts w:ascii="Arial" w:eastAsia="Arial" w:hAnsi="Arial"/>
+          <w:b/>
           <w:color w:val="000000"/>
           <w:sz w:val="18"/>
           <w:highlight w:val="lightGray"/>
         </w:rPr>
-        <w:t>Name_En</w:t>
-      </w:r>
-      <w:proofErr w:type="spellEnd"/>
+        <w:t>From:</w:t>
+      </w:r>
       <w:r>
         <w:rPr>
           <w:rFonts w:ascii="Arial" w:eastAsia="Arial" w:hAnsi="Arial"/>
@@ -13675,46 +12225,7 @@
           <w:sz w:val="18"/>
           <w:highlight w:val="lightGray"/>
         </w:rPr>
-        <w:t xml:space="preserve"> Column: Motasem Essam] -&gt; </w:t>
-      </w:r>
-      <w:r>
-        <w:rPr>
-          <w:rFonts w:ascii="Arial" w:eastAsia="Arial" w:hAnsi="Arial"/>
-          <w:b/>
-          <w:color w:val="000000"/>
-          <w:sz w:val="18"/>
-          <w:highlight w:val="lightGray"/>
-        </w:rPr>
-        <w:t>From:</w:t>
-      </w:r>
-      <w:r>
-        <w:rPr>
-          <w:rFonts w:ascii="Arial" w:eastAsia="Arial" w:hAnsi="Arial"/>
-          <w:color w:val="000000"/>
-          <w:sz w:val="18"/>
-          <w:highlight w:val="lightGray"/>
-        </w:rPr>
-        <w:t xml:space="preserve"> [</w:t>
-      </w:r>
-      <w:proofErr w:type="spellStart"/>
-      <w:r>
-        <w:rPr>
-          <w:rFonts w:ascii="Arial" w:eastAsia="Arial" w:hAnsi="Arial"/>
-          <w:color w:val="000000"/>
-          <w:sz w:val="18"/>
-          <w:highlight w:val="lightGray"/>
-        </w:rPr>
-        <w:t>Chatgpt</w:t>
-      </w:r>
-      <w:proofErr w:type="spellEnd"/>
-      <w:r>
-        <w:rPr>
-          <w:rFonts w:ascii="Arial" w:eastAsia="Arial" w:hAnsi="Arial"/>
-          <w:color w:val="000000"/>
-          <w:sz w:val="18"/>
-          <w:highlight w:val="lightGray"/>
-        </w:rPr>
-        <w:t xml:space="preserve"> (GPT-4-turbo)] </w:t>
+        <w:t xml:space="preserve"> [ChatGPT] </w:t>
       </w:r>
       <w:r>
         <w:rPr>
@@ -14366,27 +12877,7 @@
           <w:szCs w:val="18"/>
           <w:highlight w:val="lightGray"/>
         </w:rPr>
-        <w:t xml:space="preserve">: Persons Table -&gt; ID Column: 1, </w:t>
-      </w:r>
-      <w:proofErr w:type="spellStart"/>
-      <w:r>
-        <w:rPr>
-          <w:rFonts w:ascii="Arial" w:eastAsia="Arial" w:hAnsi="Arial"/>
-          <w:sz w:val="18"/>
-          <w:szCs w:val="18"/>
-          <w:highlight w:val="lightGray"/>
-        </w:rPr>
-        <w:t>Name_En</w:t>
-      </w:r>
-      <w:proofErr w:type="spellEnd"/>
-      <w:r>
-        <w:rPr>
-          <w:rFonts w:ascii="Arial" w:eastAsia="Arial" w:hAnsi="Arial"/>
-          <w:sz w:val="18"/>
-          <w:szCs w:val="18"/>
-          <w:highlight w:val="lightGray"/>
-        </w:rPr>
-        <w:t xml:space="preserve"> Column: Motasem Essam] -&gt; </w:t>
+        <w:t xml:space="preserve">: Persons Table -&gt; ID Column: 1, Name_En Column: Motasem Essam] -&gt; </w:t>
       </w:r>
       <w:r>
         <w:rPr>
@@ -14711,19 +13202,18 @@
           <w:sz w:val="18"/>
           <w:highlight w:val="lightGray"/>
         </w:rPr>
-        <w:t xml:space="preserve">: Persons Table -&gt; ID Column: 1, </w:t>
-      </w:r>
-      <w:proofErr w:type="spellStart"/>
-      <w:r>
-        <w:rPr>
-          <w:rFonts w:ascii="Arial" w:eastAsia="Arial" w:hAnsi="Arial"/>
+        <w:t xml:space="preserve">: Persons Table -&gt; ID Column: 1, Name_En Column: Motasem Essam] -&gt; </w:t>
+      </w:r>
+      <w:r>
+        <w:rPr>
+          <w:rFonts w:ascii="Arial" w:eastAsia="Arial" w:hAnsi="Arial"/>
+          <w:b/>
           <w:color w:val="000000"/>
           <w:sz w:val="18"/>
           <w:highlight w:val="lightGray"/>
         </w:rPr>
-        <w:t>Name_En</w:t>
-      </w:r>
-      <w:proofErr w:type="spellEnd"/>
+        <w:t>From:</w:t>
+      </w:r>
       <w:r>
         <w:rPr>
           <w:rFonts w:ascii="Arial" w:eastAsia="Arial" w:hAnsi="Arial"/>
@@ -14731,46 +13221,7 @@
           <w:sz w:val="18"/>
           <w:highlight w:val="lightGray"/>
         </w:rPr>
-        <w:t xml:space="preserve"> Column: Motasem Essam] -&gt; </w:t>
-      </w:r>
-      <w:r>
-        <w:rPr>
-          <w:rFonts w:ascii="Arial" w:eastAsia="Arial" w:hAnsi="Arial"/>
-          <w:b/>
-          <w:color w:val="000000"/>
-          <w:sz w:val="18"/>
-          <w:highlight w:val="lightGray"/>
-        </w:rPr>
-        <w:t>From:</w:t>
-      </w:r>
-      <w:r>
-        <w:rPr>
-          <w:rFonts w:ascii="Arial" w:eastAsia="Arial" w:hAnsi="Arial"/>
-          <w:color w:val="000000"/>
-          <w:sz w:val="18"/>
-          <w:highlight w:val="lightGray"/>
-        </w:rPr>
-        <w:t xml:space="preserve"> [</w:t>
-      </w:r>
-      <w:proofErr w:type="spellStart"/>
-      <w:r>
-        <w:rPr>
-          <w:rFonts w:ascii="Arial" w:eastAsia="Arial" w:hAnsi="Arial"/>
-          <w:color w:val="000000"/>
-          <w:sz w:val="18"/>
-          <w:highlight w:val="lightGray"/>
-        </w:rPr>
-        <w:t>Chatgpt</w:t>
-      </w:r>
-      <w:proofErr w:type="spellEnd"/>
-      <w:r>
-        <w:rPr>
-          <w:rFonts w:ascii="Arial" w:eastAsia="Arial" w:hAnsi="Arial"/>
-          <w:color w:val="000000"/>
-          <w:sz w:val="18"/>
-          <w:highlight w:val="lightGray"/>
-        </w:rPr>
-        <w:t xml:space="preserve"> (GPT-4-turbo)] </w:t>
+        <w:t xml:space="preserve"> [ChatGPT] </w:t>
       </w:r>
       <w:r>
         <w:rPr>
@@ -15359,19 +13810,18 @@
           <w:sz w:val="18"/>
           <w:highlight w:val="lightGray"/>
         </w:rPr>
-        <w:t xml:space="preserve">: Persons Table -&gt; ID Column: 1, </w:t>
-      </w:r>
-      <w:proofErr w:type="spellStart"/>
-      <w:r>
-        <w:rPr>
-          <w:rFonts w:ascii="Arial" w:eastAsia="Arial" w:hAnsi="Arial"/>
+        <w:t xml:space="preserve">: Persons Table -&gt; ID Column: 1, Name_En Column: Motasem Essam] -&gt; </w:t>
+      </w:r>
+      <w:r>
+        <w:rPr>
+          <w:rFonts w:ascii="Arial" w:eastAsia="Arial" w:hAnsi="Arial"/>
+          <w:b/>
           <w:color w:val="000000"/>
           <w:sz w:val="18"/>
           <w:highlight w:val="lightGray"/>
         </w:rPr>
-        <w:t>Name_En</w:t>
-      </w:r>
-      <w:proofErr w:type="spellEnd"/>
+        <w:t>From:</w:t>
+      </w:r>
       <w:r>
         <w:rPr>
           <w:rFonts w:ascii="Arial" w:eastAsia="Arial" w:hAnsi="Arial"/>
@@ -15379,46 +13829,7 @@
           <w:sz w:val="18"/>
           <w:highlight w:val="lightGray"/>
         </w:rPr>
-        <w:t xml:space="preserve"> Column: Motasem Essam] -&gt; </w:t>
-      </w:r>
-      <w:r>
-        <w:rPr>
-          <w:rFonts w:ascii="Arial" w:eastAsia="Arial" w:hAnsi="Arial"/>
-          <w:b/>
-          <w:color w:val="000000"/>
-          <w:sz w:val="18"/>
-          <w:highlight w:val="lightGray"/>
-        </w:rPr>
-        <w:t>From:</w:t>
-      </w:r>
-      <w:r>
-        <w:rPr>
-          <w:rFonts w:ascii="Arial" w:eastAsia="Arial" w:hAnsi="Arial"/>
-          <w:color w:val="000000"/>
-          <w:sz w:val="18"/>
-          <w:highlight w:val="lightGray"/>
-        </w:rPr>
-        <w:t xml:space="preserve"> [</w:t>
-      </w:r>
-      <w:proofErr w:type="spellStart"/>
-      <w:r>
-        <w:rPr>
-          <w:rFonts w:ascii="Arial" w:eastAsia="Arial" w:hAnsi="Arial"/>
-          <w:color w:val="000000"/>
-          <w:sz w:val="18"/>
-          <w:highlight w:val="lightGray"/>
-        </w:rPr>
-        <w:t>Chatgpt</w:t>
-      </w:r>
-      <w:proofErr w:type="spellEnd"/>
-      <w:r>
-        <w:rPr>
-          <w:rFonts w:ascii="Arial" w:eastAsia="Arial" w:hAnsi="Arial"/>
-          <w:color w:val="000000"/>
-          <w:sz w:val="18"/>
-          <w:highlight w:val="lightGray"/>
-        </w:rPr>
-        <w:t xml:space="preserve"> (GPT-4-turbo)] </w:t>
+        <w:t xml:space="preserve"> [ChatGPT] </w:t>
       </w:r>
       <w:r>
         <w:rPr>
@@ -15489,63 +13900,7 @@
         <w:rPr>
           <w:rFonts w:ascii="Roboto Mono" w:eastAsia="Roboto Mono" w:hAnsi="Roboto Mono" w:cs="Roboto Mono"/>
         </w:rPr>
-        <w:t>: For any two things, if they are equal to the same thing, they are equal to each other. (e.g., If a=</w:t>
-      </w:r>
-      <w:proofErr w:type="spellStart"/>
-      <w:r>
-        <w:rPr>
-          <w:rFonts w:ascii="Roboto Mono" w:eastAsia="Roboto Mono" w:hAnsi="Roboto Mono" w:cs="Roboto Mono"/>
-        </w:rPr>
-        <w:t>ba</w:t>
-      </w:r>
-      <w:proofErr w:type="spellEnd"/>
-      <w:r>
-        <w:rPr>
-          <w:rFonts w:ascii="Roboto Mono" w:eastAsia="Roboto Mono" w:hAnsi="Roboto Mono" w:cs="Roboto Mono"/>
-        </w:rPr>
-        <w:t xml:space="preserve"> = </w:t>
-      </w:r>
-      <w:proofErr w:type="spellStart"/>
-      <w:r>
-        <w:rPr>
-          <w:rFonts w:ascii="Roboto Mono" w:eastAsia="Roboto Mono" w:hAnsi="Roboto Mono" w:cs="Roboto Mono"/>
-        </w:rPr>
-        <w:t>ba</w:t>
-      </w:r>
-      <w:proofErr w:type="spellEnd"/>
-      <w:r>
-        <w:rPr>
-          <w:rFonts w:ascii="Roboto Mono" w:eastAsia="Roboto Mono" w:hAnsi="Roboto Mono" w:cs="Roboto Mono"/>
-        </w:rPr>
-        <w:t>=b and b=</w:t>
-      </w:r>
-      <w:proofErr w:type="spellStart"/>
-      <w:r>
-        <w:rPr>
-          <w:rFonts w:ascii="Roboto Mono" w:eastAsia="Roboto Mono" w:hAnsi="Roboto Mono" w:cs="Roboto Mono"/>
-        </w:rPr>
-        <w:t>cb</w:t>
-      </w:r>
-      <w:proofErr w:type="spellEnd"/>
-      <w:r>
-        <w:rPr>
-          <w:rFonts w:ascii="Roboto Mono" w:eastAsia="Roboto Mono" w:hAnsi="Roboto Mono" w:cs="Roboto Mono"/>
-        </w:rPr>
-        <w:t xml:space="preserve"> = </w:t>
-      </w:r>
-      <w:proofErr w:type="spellStart"/>
-      <w:r>
-        <w:rPr>
-          <w:rFonts w:ascii="Roboto Mono" w:eastAsia="Roboto Mono" w:hAnsi="Roboto Mono" w:cs="Roboto Mono"/>
-        </w:rPr>
-        <w:t>cb</w:t>
-      </w:r>
-      <w:proofErr w:type="spellEnd"/>
-      <w:r>
-        <w:rPr>
-          <w:rFonts w:ascii="Roboto Mono" w:eastAsia="Roboto Mono" w:hAnsi="Roboto Mono" w:cs="Roboto Mono"/>
-        </w:rPr>
-        <w:t>=c, then a=ca = ca=c).</w:t>
+        <w:t>: For any two things, if they are equal to the same thing, they are equal to each other. (e.g., If a=ba = ba=b and b=cb = cb=c, then a=ca = ca=c).</w:t>
       </w:r>
       <w:r>
         <w:rPr>
@@ -15601,63 +13956,7 @@
         <w:rPr>
           <w:rFonts w:ascii="Roboto Mono" w:eastAsia="Roboto Mono" w:hAnsi="Roboto Mono" w:cs="Roboto Mono"/>
         </w:rPr>
-        <w:t xml:space="preserve">: If </w:t>
-      </w:r>
-      <w:proofErr w:type="spellStart"/>
-      <w:r>
-        <w:rPr>
-          <w:rFonts w:ascii="Roboto Mono" w:eastAsia="Roboto Mono" w:hAnsi="Roboto Mono" w:cs="Roboto Mono"/>
-        </w:rPr>
-        <w:t>aaa</w:t>
-      </w:r>
-      <w:proofErr w:type="spellEnd"/>
-      <w:r>
-        <w:rPr>
-          <w:rFonts w:ascii="Roboto Mono" w:eastAsia="Roboto Mono" w:hAnsi="Roboto Mono" w:cs="Roboto Mono"/>
-        </w:rPr>
-        <w:t xml:space="preserve"> and </w:t>
-      </w:r>
-      <w:proofErr w:type="spellStart"/>
-      <w:r>
-        <w:rPr>
-          <w:rFonts w:ascii="Roboto Mono" w:eastAsia="Roboto Mono" w:hAnsi="Roboto Mono" w:cs="Roboto Mono"/>
-        </w:rPr>
-        <w:t>bbb</w:t>
-      </w:r>
-      <w:proofErr w:type="spellEnd"/>
-      <w:r>
-        <w:rPr>
-          <w:rFonts w:ascii="Roboto Mono" w:eastAsia="Roboto Mono" w:hAnsi="Roboto Mono" w:cs="Roboto Mono"/>
-        </w:rPr>
-        <w:t xml:space="preserve"> are numbers, then their sum, </w:t>
-      </w:r>
-      <w:proofErr w:type="spellStart"/>
-      <w:r>
-        <w:rPr>
-          <w:rFonts w:ascii="Roboto Mono" w:eastAsia="Roboto Mono" w:hAnsi="Roboto Mono" w:cs="Roboto Mono"/>
-        </w:rPr>
-        <w:t>a+ba</w:t>
-      </w:r>
-      <w:proofErr w:type="spellEnd"/>
-      <w:r>
-        <w:rPr>
-          <w:rFonts w:ascii="Roboto Mono" w:eastAsia="Roboto Mono" w:hAnsi="Roboto Mono" w:cs="Roboto Mono"/>
-        </w:rPr>
-        <w:t xml:space="preserve"> + </w:t>
-      </w:r>
-      <w:proofErr w:type="spellStart"/>
-      <w:r>
-        <w:rPr>
-          <w:rFonts w:ascii="Roboto Mono" w:eastAsia="Roboto Mono" w:hAnsi="Roboto Mono" w:cs="Roboto Mono"/>
-        </w:rPr>
-        <w:t>ba+b</w:t>
-      </w:r>
-      <w:proofErr w:type="spellEnd"/>
-      <w:r>
-        <w:rPr>
-          <w:rFonts w:ascii="Roboto Mono" w:eastAsia="Roboto Mono" w:hAnsi="Roboto Mono" w:cs="Roboto Mono"/>
-        </w:rPr>
-        <w:t>, is also a number.</w:t>
+        <w:t>: If aaa and bbb are numbers, then their sum, a+ba + ba+b, is also a number.</w:t>
       </w:r>
       <w:r>
         <w:rPr>
@@ -15729,21 +14028,7 @@
         <w:rPr>
           <w:rFonts w:ascii="Roboto Mono" w:eastAsia="Roboto Mono" w:hAnsi="Roboto Mono" w:cs="Roboto Mono"/>
         </w:rPr>
-        <w:t xml:space="preserve">: A </w:t>
-      </w:r>
-      <w:proofErr w:type="gramStart"/>
-      <w:r>
-        <w:rPr>
-          <w:rFonts w:ascii="Roboto Mono" w:eastAsia="Roboto Mono" w:hAnsi="Roboto Mono" w:cs="Roboto Mono"/>
-        </w:rPr>
-        <w:t>straight line</w:t>
-      </w:r>
-      <w:proofErr w:type="gramEnd"/>
-      <w:r>
-        <w:rPr>
-          <w:rFonts w:ascii="Roboto Mono" w:eastAsia="Roboto Mono" w:hAnsi="Roboto Mono" w:cs="Roboto Mono"/>
-        </w:rPr>
-        <w:t xml:space="preserve"> segment can be drawn joining any two points.</w:t>
+        <w:t>: A straight line segment can be drawn joining any two points.</w:t>
       </w:r>
       <w:r>
         <w:rPr>
@@ -15771,21 +14056,7 @@
         <w:rPr>
           <w:rFonts w:ascii="Roboto Mono" w:eastAsia="Roboto Mono" w:hAnsi="Roboto Mono" w:cs="Roboto Mono"/>
         </w:rPr>
-        <w:t xml:space="preserve">: Any </w:t>
-      </w:r>
-      <w:proofErr w:type="gramStart"/>
-      <w:r>
-        <w:rPr>
-          <w:rFonts w:ascii="Roboto Mono" w:eastAsia="Roboto Mono" w:hAnsi="Roboto Mono" w:cs="Roboto Mono"/>
-        </w:rPr>
-        <w:t>straight line</w:t>
-      </w:r>
-      <w:proofErr w:type="gramEnd"/>
-      <w:r>
-        <w:rPr>
-          <w:rFonts w:ascii="Roboto Mono" w:eastAsia="Roboto Mono" w:hAnsi="Roboto Mono" w:cs="Roboto Mono"/>
-        </w:rPr>
-        <w:t xml:space="preserve"> segment can be extended indefinitely in a straight line.</w:t>
+        <w:t>: Any straight line segment can be extended indefinitely in a straight line.</w:t>
       </w:r>
       <w:r>
         <w:rPr>
@@ -15872,77 +14143,7 @@
             <w:rPr>
               <w:rFonts w:ascii="Cardo" w:eastAsia="Cardo" w:hAnsi="Cardo" w:cs="Cardo"/>
             </w:rPr>
-            <w:t xml:space="preserve">: Two sets are equal if they have exactly the same elements. (i.e., A=BA = BA=B if and only if for all xxx, </w:t>
-          </w:r>
-          <w:proofErr w:type="spellStart"/>
-          <w:r>
-            <w:rPr>
-              <w:rFonts w:ascii="Cardo" w:eastAsia="Cardo" w:hAnsi="Cardo" w:cs="Cardo"/>
-            </w:rPr>
-            <w:t>x∈</w:t>
-          </w:r>
-          <w:proofErr w:type="gramStart"/>
-          <w:r>
-            <w:rPr>
-              <w:rFonts w:ascii="Cardo" w:eastAsia="Cardo" w:hAnsi="Cardo" w:cs="Cardo"/>
-            </w:rPr>
-            <w:t>A</w:t>
-          </w:r>
-          <w:proofErr w:type="spellEnd"/>
-          <w:r>
-            <w:rPr>
-              <w:rFonts w:ascii="Cardo" w:eastAsia="Cardo" w:hAnsi="Cardo" w:cs="Cardo"/>
-            </w:rPr>
-            <w:t>  ⟺</w:t>
-          </w:r>
-          <w:proofErr w:type="gramEnd"/>
-          <w:r>
-            <w:rPr>
-              <w:rFonts w:ascii="Cardo" w:eastAsia="Cardo" w:hAnsi="Cardo" w:cs="Cardo"/>
-            </w:rPr>
-            <w:t>  </w:t>
-          </w:r>
-          <w:proofErr w:type="spellStart"/>
-          <w:r>
-            <w:rPr>
-              <w:rFonts w:ascii="Cardo" w:eastAsia="Cardo" w:hAnsi="Cardo" w:cs="Cardo"/>
-            </w:rPr>
-            <w:t>x∈Bx</w:t>
-          </w:r>
-          <w:proofErr w:type="spellEnd"/>
-          <w:r>
-            <w:rPr>
-              <w:rFonts w:ascii="Cardo" w:eastAsia="Cardo" w:hAnsi="Cardo" w:cs="Cardo"/>
-            </w:rPr>
-            <w:t xml:space="preserve"> \in A \</w:t>
-          </w:r>
-          <w:proofErr w:type="spellStart"/>
-          <w:r>
-            <w:rPr>
-              <w:rFonts w:ascii="Cardo" w:eastAsia="Cardo" w:hAnsi="Cardo" w:cs="Cardo"/>
-            </w:rPr>
-            <w:t>iff</w:t>
-          </w:r>
-          <w:proofErr w:type="spellEnd"/>
-          <w:r>
-            <w:rPr>
-              <w:rFonts w:ascii="Cardo" w:eastAsia="Cardo" w:hAnsi="Cardo" w:cs="Cardo"/>
-            </w:rPr>
-            <w:t xml:space="preserve"> x \in </w:t>
-          </w:r>
-          <w:proofErr w:type="spellStart"/>
-          <w:r>
-            <w:rPr>
-              <w:rFonts w:ascii="Cardo" w:eastAsia="Cardo" w:hAnsi="Cardo" w:cs="Cardo"/>
-            </w:rPr>
-            <w:t>Bx∈A⟺x∈B</w:t>
-          </w:r>
-          <w:proofErr w:type="spellEnd"/>
-          <w:r>
-            <w:rPr>
-              <w:rFonts w:ascii="Cardo" w:eastAsia="Cardo" w:hAnsi="Cardo" w:cs="Cardo"/>
-            </w:rPr>
-            <w:t>).</w:t>
+            <w:t>: Two sets are equal if they have exactly the same elements. (i.e., A=BA = BA=B if and only if for all xxx, x∈A  ⟺  x∈Bx \in A \iff x \in Bx∈A⟺x∈B).</w:t>
           </w:r>
           <w:r>
             <w:rPr>
@@ -15972,143 +14173,7 @@
         <w:rPr>
           <w:rFonts w:ascii="Roboto Mono" w:eastAsia="Roboto Mono" w:hAnsi="Roboto Mono" w:cs="Roboto Mono"/>
         </w:rPr>
-        <w:t xml:space="preserve">: For any two sets </w:t>
-      </w:r>
-      <w:proofErr w:type="spellStart"/>
-      <w:r>
-        <w:rPr>
-          <w:rFonts w:ascii="Roboto Mono" w:eastAsia="Roboto Mono" w:hAnsi="Roboto Mono" w:cs="Roboto Mono"/>
-        </w:rPr>
-        <w:t>aaa</w:t>
-      </w:r>
-      <w:proofErr w:type="spellEnd"/>
-      <w:r>
-        <w:rPr>
-          <w:rFonts w:ascii="Roboto Mono" w:eastAsia="Roboto Mono" w:hAnsi="Roboto Mono" w:cs="Roboto Mono"/>
-        </w:rPr>
-        <w:t xml:space="preserve"> and </w:t>
-      </w:r>
-      <w:proofErr w:type="spellStart"/>
-      <w:r>
-        <w:rPr>
-          <w:rFonts w:ascii="Roboto Mono" w:eastAsia="Roboto Mono" w:hAnsi="Roboto Mono" w:cs="Roboto Mono"/>
-        </w:rPr>
-        <w:t>bbb</w:t>
-      </w:r>
-      <w:proofErr w:type="spellEnd"/>
-      <w:r>
-        <w:rPr>
-          <w:rFonts w:ascii="Roboto Mono" w:eastAsia="Roboto Mono" w:hAnsi="Roboto Mono" w:cs="Roboto Mono"/>
-        </w:rPr>
-        <w:t xml:space="preserve">, there is a set that contains exactly </w:t>
-      </w:r>
-      <w:proofErr w:type="spellStart"/>
-      <w:r>
-        <w:rPr>
-          <w:rFonts w:ascii="Roboto Mono" w:eastAsia="Roboto Mono" w:hAnsi="Roboto Mono" w:cs="Roboto Mono"/>
-        </w:rPr>
-        <w:t>aaa</w:t>
-      </w:r>
-      <w:proofErr w:type="spellEnd"/>
-      <w:r>
-        <w:rPr>
-          <w:rFonts w:ascii="Roboto Mono" w:eastAsia="Roboto Mono" w:hAnsi="Roboto Mono" w:cs="Roboto Mono"/>
-        </w:rPr>
-        <w:t xml:space="preserve"> and </w:t>
-      </w:r>
-      <w:proofErr w:type="spellStart"/>
-      <w:r>
-        <w:rPr>
-          <w:rFonts w:ascii="Roboto Mono" w:eastAsia="Roboto Mono" w:hAnsi="Roboto Mono" w:cs="Roboto Mono"/>
-        </w:rPr>
-        <w:t>bbb</w:t>
-      </w:r>
-      <w:proofErr w:type="spellEnd"/>
-      <w:r>
-        <w:rPr>
-          <w:rFonts w:ascii="Roboto Mono" w:eastAsia="Roboto Mono" w:hAnsi="Roboto Mono" w:cs="Roboto Mono"/>
-        </w:rPr>
-        <w:t xml:space="preserve"> as elements. (i.e., {</w:t>
-      </w:r>
-      <w:proofErr w:type="spellStart"/>
-      <w:proofErr w:type="gramStart"/>
-      <w:r>
-        <w:rPr>
-          <w:rFonts w:ascii="Roboto Mono" w:eastAsia="Roboto Mono" w:hAnsi="Roboto Mono" w:cs="Roboto Mono"/>
-        </w:rPr>
-        <w:t>a,b</w:t>
-      </w:r>
-      <w:proofErr w:type="spellEnd"/>
-      <w:proofErr w:type="gramEnd"/>
-      <w:r>
-        <w:rPr>
-          <w:rFonts w:ascii="Roboto Mono" w:eastAsia="Roboto Mono" w:hAnsi="Roboto Mono" w:cs="Roboto Mono"/>
-        </w:rPr>
-        <w:t>}</w:t>
-      </w:r>
-      <w:proofErr w:type="gramStart"/>
-      <w:r>
-        <w:rPr>
-          <w:rFonts w:ascii="Roboto Mono" w:eastAsia="Roboto Mono" w:hAnsi="Roboto Mono" w:cs="Roboto Mono"/>
-        </w:rPr>
-        <w:t>\{</w:t>
-      </w:r>
-      <w:proofErr w:type="gramEnd"/>
-      <w:r>
-        <w:rPr>
-          <w:rFonts w:ascii="Roboto Mono" w:eastAsia="Roboto Mono" w:hAnsi="Roboto Mono" w:cs="Roboto Mono"/>
-        </w:rPr>
-        <w:t>a, b</w:t>
-      </w:r>
-      <w:proofErr w:type="gramStart"/>
-      <w:r>
-        <w:rPr>
-          <w:rFonts w:ascii="Roboto Mono" w:eastAsia="Roboto Mono" w:hAnsi="Roboto Mono" w:cs="Roboto Mono"/>
-        </w:rPr>
-        <w:t>\}{</w:t>
-      </w:r>
-      <w:proofErr w:type="spellStart"/>
-      <w:r>
-        <w:rPr>
-          <w:rFonts w:ascii="Roboto Mono" w:eastAsia="Roboto Mono" w:hAnsi="Roboto Mono" w:cs="Roboto Mono"/>
-        </w:rPr>
-        <w:t>a,b</w:t>
-      </w:r>
-      <w:proofErr w:type="spellEnd"/>
-      <w:proofErr w:type="gramEnd"/>
-      <w:r>
-        <w:rPr>
-          <w:rFonts w:ascii="Roboto Mono" w:eastAsia="Roboto Mono" w:hAnsi="Roboto Mono" w:cs="Roboto Mono"/>
-        </w:rPr>
-        <w:t xml:space="preserve">} is a set containing </w:t>
-      </w:r>
-      <w:proofErr w:type="spellStart"/>
-      <w:r>
-        <w:rPr>
-          <w:rFonts w:ascii="Roboto Mono" w:eastAsia="Roboto Mono" w:hAnsi="Roboto Mono" w:cs="Roboto Mono"/>
-        </w:rPr>
-        <w:t>aaa</w:t>
-      </w:r>
-      <w:proofErr w:type="spellEnd"/>
-      <w:r>
-        <w:rPr>
-          <w:rFonts w:ascii="Roboto Mono" w:eastAsia="Roboto Mono" w:hAnsi="Roboto Mono" w:cs="Roboto Mono"/>
-        </w:rPr>
-        <w:t xml:space="preserve"> and </w:t>
-      </w:r>
-      <w:proofErr w:type="spellStart"/>
-      <w:r>
-        <w:rPr>
-          <w:rFonts w:ascii="Roboto Mono" w:eastAsia="Roboto Mono" w:hAnsi="Roboto Mono" w:cs="Roboto Mono"/>
-        </w:rPr>
-        <w:t>bbb</w:t>
-      </w:r>
-      <w:proofErr w:type="spellEnd"/>
-      <w:r>
-        <w:rPr>
-          <w:rFonts w:ascii="Roboto Mono" w:eastAsia="Roboto Mono" w:hAnsi="Roboto Mono" w:cs="Roboto Mono"/>
-        </w:rPr>
-        <w:t>).</w:t>
+        <w:t>: For any two sets aaa and bbb, there is a set that contains exactly aaa and bbb as elements. (i.e., {a,b}\{a, b\}{a,b} is a set containing aaa and bbb).</w:t>
       </w:r>
       <w:r>
         <w:rPr>
@@ -16186,35 +14251,7 @@
             <w:rPr>
               <w:rFonts w:ascii="Nova Mono" w:eastAsia="Nova Mono" w:hAnsi="Nova Mono" w:cs="Nova Mono"/>
             </w:rPr>
-            <w:t>: A statement cannot be both true and false at the same time (i.e., ¬(A∧¬</w:t>
-          </w:r>
-          <w:proofErr w:type="gramStart"/>
-          <w:r>
-            <w:rPr>
-              <w:rFonts w:ascii="Nova Mono" w:eastAsia="Nova Mono" w:hAnsi="Nova Mono" w:cs="Nova Mono"/>
-            </w:rPr>
-            <w:t>A)\neg(</w:t>
-          </w:r>
-          <w:proofErr w:type="gramEnd"/>
-          <w:r>
-            <w:rPr>
-              <w:rFonts w:ascii="Nova Mono" w:eastAsia="Nova Mono" w:hAnsi="Nova Mono" w:cs="Nova Mono"/>
-            </w:rPr>
-            <w:t xml:space="preserve">A \land \neg </w:t>
-          </w:r>
-          <w:proofErr w:type="gramStart"/>
-          <w:r>
-            <w:rPr>
-              <w:rFonts w:ascii="Nova Mono" w:eastAsia="Nova Mono" w:hAnsi="Nova Mono" w:cs="Nova Mono"/>
-            </w:rPr>
-            <w:t>A)¬</w:t>
-          </w:r>
-          <w:proofErr w:type="gramEnd"/>
-          <w:r>
-            <w:rPr>
-              <w:rFonts w:ascii="Nova Mono" w:eastAsia="Nova Mono" w:hAnsi="Nova Mono" w:cs="Nova Mono"/>
-            </w:rPr>
-            <w:t>(A∧¬A)).</w:t>
+            <w:t>: A statement cannot be both true and false at the same time (i.e., ¬(A∧¬A)\neg(A \land \neg A)¬(A∧¬A)).</w:t>
           </w:r>
           <w:r>
             <w:rPr>
@@ -16450,19 +14487,18 @@
           <w:sz w:val="18"/>
           <w:highlight w:val="lightGray"/>
         </w:rPr>
-        <w:t xml:space="preserve">: Persons Table -&gt; ID Column: 1, </w:t>
-      </w:r>
-      <w:proofErr w:type="spellStart"/>
-      <w:r>
-        <w:rPr>
-          <w:rFonts w:ascii="Arial" w:eastAsia="Arial" w:hAnsi="Arial"/>
+        <w:t xml:space="preserve">: Persons Table -&gt; ID Column: 1, Name_En Column: Motasem Essam] -&gt; </w:t>
+      </w:r>
+      <w:r>
+        <w:rPr>
+          <w:rFonts w:ascii="Arial" w:eastAsia="Arial" w:hAnsi="Arial"/>
+          <w:b/>
           <w:color w:val="000000"/>
           <w:sz w:val="18"/>
           <w:highlight w:val="lightGray"/>
         </w:rPr>
-        <w:t>Name_En</w:t>
-      </w:r>
-      <w:proofErr w:type="spellEnd"/>
+        <w:t>From:</w:t>
+      </w:r>
       <w:r>
         <w:rPr>
           <w:rFonts w:ascii="Arial" w:eastAsia="Arial" w:hAnsi="Arial"/>
@@ -16470,46 +14506,7 @@
           <w:sz w:val="18"/>
           <w:highlight w:val="lightGray"/>
         </w:rPr>
-        <w:t xml:space="preserve"> Column: Motasem Essam] -&gt; </w:t>
-      </w:r>
-      <w:r>
-        <w:rPr>
-          <w:rFonts w:ascii="Arial" w:eastAsia="Arial" w:hAnsi="Arial"/>
-          <w:b/>
-          <w:color w:val="000000"/>
-          <w:sz w:val="18"/>
-          <w:highlight w:val="lightGray"/>
-        </w:rPr>
-        <w:t>From:</w:t>
-      </w:r>
-      <w:r>
-        <w:rPr>
-          <w:rFonts w:ascii="Arial" w:eastAsia="Arial" w:hAnsi="Arial"/>
-          <w:color w:val="000000"/>
-          <w:sz w:val="18"/>
-          <w:highlight w:val="lightGray"/>
-        </w:rPr>
-        <w:t xml:space="preserve"> [</w:t>
-      </w:r>
-      <w:proofErr w:type="spellStart"/>
-      <w:r>
-        <w:rPr>
-          <w:rFonts w:ascii="Arial" w:eastAsia="Arial" w:hAnsi="Arial"/>
-          <w:color w:val="000000"/>
-          <w:sz w:val="18"/>
-          <w:highlight w:val="lightGray"/>
-        </w:rPr>
-        <w:t>Chatgpt</w:t>
-      </w:r>
-      <w:proofErr w:type="spellEnd"/>
-      <w:r>
-        <w:rPr>
-          <w:rFonts w:ascii="Arial" w:eastAsia="Arial" w:hAnsi="Arial"/>
-          <w:color w:val="000000"/>
-          <w:sz w:val="18"/>
-          <w:highlight w:val="lightGray"/>
-        </w:rPr>
-        <w:t xml:space="preserve"> (GPT-4-turbo)] </w:t>
+        <w:t xml:space="preserve"> [ChatGPT] </w:t>
       </w:r>
       <w:r>
         <w:rPr>
@@ -16668,21 +14665,7 @@
         <w:rPr>
           <w:rFonts w:ascii="Roboto Mono" w:eastAsia="Roboto Mono" w:hAnsi="Roboto Mono" w:cs="Roboto Mono"/>
         </w:rPr>
-        <w:t xml:space="preserve">For example, "The sum of two even numbers </w:t>
-      </w:r>
-      <w:proofErr w:type="gramStart"/>
-      <w:r>
-        <w:rPr>
-          <w:rFonts w:ascii="Roboto Mono" w:eastAsia="Roboto Mono" w:hAnsi="Roboto Mono" w:cs="Roboto Mono"/>
-        </w:rPr>
-        <w:t>is</w:t>
-      </w:r>
-      <w:proofErr w:type="gramEnd"/>
-      <w:r>
-        <w:rPr>
-          <w:rFonts w:ascii="Roboto Mono" w:eastAsia="Roboto Mono" w:hAnsi="Roboto Mono" w:cs="Roboto Mono"/>
-        </w:rPr>
-        <w:t xml:space="preserve"> even" is an assertion because it presents a claim about a mathematical fact, which can be proved or disproved.</w:t>
+        <w:t>For example, "The sum of two even numbers is even" is an assertion because it presents a claim about a mathematical fact, which can be proved or disproved.</w:t>
       </w:r>
       <w:r>
         <w:rPr>
@@ -17277,27 +15260,7 @@
           <w:szCs w:val="18"/>
           <w:highlight w:val="lightGray"/>
         </w:rPr>
-        <w:t xml:space="preserve">: Persons Table -&gt; ID Column: 1, </w:t>
-      </w:r>
-      <w:proofErr w:type="spellStart"/>
-      <w:r>
-        <w:rPr>
-          <w:rFonts w:ascii="Arial" w:eastAsia="Arial" w:hAnsi="Arial"/>
-          <w:sz w:val="18"/>
-          <w:szCs w:val="18"/>
-          <w:highlight w:val="lightGray"/>
-        </w:rPr>
-        <w:t>Name_En</w:t>
-      </w:r>
-      <w:proofErr w:type="spellEnd"/>
-      <w:r>
-        <w:rPr>
-          <w:rFonts w:ascii="Arial" w:eastAsia="Arial" w:hAnsi="Arial"/>
-          <w:sz w:val="18"/>
-          <w:szCs w:val="18"/>
-          <w:highlight w:val="lightGray"/>
-        </w:rPr>
-        <w:t xml:space="preserve"> Column: Motasem Essam] -&gt; </w:t>
+        <w:t xml:space="preserve">: Persons Table -&gt; ID Column: 1, Name_En Column: Motasem Essam] -&gt; </w:t>
       </w:r>
       <w:r>
         <w:rPr>
@@ -17602,27 +15565,7 @@
           <w:szCs w:val="18"/>
           <w:highlight w:val="lightGray"/>
         </w:rPr>
-        <w:t xml:space="preserve">: Persons Table -&gt; ID Column: 1, </w:t>
-      </w:r>
-      <w:proofErr w:type="spellStart"/>
-      <w:r>
-        <w:rPr>
-          <w:rFonts w:asciiTheme="minorBidi" w:eastAsia="Arial" w:hAnsiTheme="minorBidi"/>
-          <w:sz w:val="18"/>
-          <w:szCs w:val="18"/>
-          <w:highlight w:val="lightGray"/>
-        </w:rPr>
-        <w:t>Name_En</w:t>
-      </w:r>
-      <w:proofErr w:type="spellEnd"/>
-      <w:r>
-        <w:rPr>
-          <w:rFonts w:asciiTheme="minorBidi" w:eastAsia="Arial" w:hAnsiTheme="minorBidi"/>
-          <w:sz w:val="18"/>
-          <w:szCs w:val="18"/>
-          <w:highlight w:val="lightGray"/>
-        </w:rPr>
-        <w:t xml:space="preserve"> Column: Motasem Essam] -&gt; </w:t>
+        <w:t xml:space="preserve">: Persons Table -&gt; ID Column: 1, Name_En Column: Motasem Essam] -&gt; </w:t>
       </w:r>
       <w:r>
         <w:rPr>
@@ -17947,27 +15890,7 @@
           <w:szCs w:val="18"/>
           <w:highlight w:val="lightGray"/>
         </w:rPr>
-        <w:t xml:space="preserve">: Persons Table -&gt; ID Column: 1, </w:t>
-      </w:r>
-      <w:proofErr w:type="spellStart"/>
-      <w:r>
-        <w:rPr>
-          <w:rFonts w:asciiTheme="minorBidi" w:eastAsia="Arial" w:hAnsiTheme="minorBidi"/>
-          <w:sz w:val="18"/>
-          <w:szCs w:val="18"/>
-          <w:highlight w:val="lightGray"/>
-        </w:rPr>
-        <w:t>Name_En</w:t>
-      </w:r>
-      <w:proofErr w:type="spellEnd"/>
-      <w:r>
-        <w:rPr>
-          <w:rFonts w:asciiTheme="minorBidi" w:eastAsia="Arial" w:hAnsiTheme="minorBidi"/>
-          <w:sz w:val="18"/>
-          <w:szCs w:val="18"/>
-          <w:highlight w:val="lightGray"/>
-        </w:rPr>
-        <w:t xml:space="preserve"> Column: Motasem Essam] -&gt; </w:t>
+        <w:t xml:space="preserve">: Persons Table -&gt; ID Column: 1, Name_En Column: Motasem Essam] -&gt; </w:t>
       </w:r>
       <w:r>
         <w:rPr>
@@ -18336,27 +16259,7 @@
           <w:szCs w:val="18"/>
           <w:highlight w:val="lightGray"/>
         </w:rPr>
-        <w:t xml:space="preserve"> Persons Table -&gt; ID Column: 1, </w:t>
-      </w:r>
-      <w:proofErr w:type="spellStart"/>
-      <w:r>
-        <w:rPr>
-          <w:rFonts w:ascii="Arial" w:eastAsia="Arial" w:hAnsi="Arial"/>
-          <w:sz w:val="18"/>
-          <w:szCs w:val="18"/>
-          <w:highlight w:val="lightGray"/>
-        </w:rPr>
-        <w:t>Name_En</w:t>
-      </w:r>
-      <w:proofErr w:type="spellEnd"/>
-      <w:r>
-        <w:rPr>
-          <w:rFonts w:ascii="Arial" w:eastAsia="Arial" w:hAnsi="Arial"/>
-          <w:sz w:val="18"/>
-          <w:szCs w:val="18"/>
-          <w:highlight w:val="lightGray"/>
-        </w:rPr>
-        <w:t xml:space="preserve"> Column: Motasem Essam] </w:t>
+        <w:t xml:space="preserve"> Persons Table -&gt; ID Column: 1, Name_En Column: Motasem Essam] </w:t>
       </w:r>
       <w:r>
         <w:rPr>
@@ -18376,27 +16279,7 @@
           <w:szCs w:val="18"/>
           <w:highlight w:val="lightGray"/>
         </w:rPr>
-        <w:t xml:space="preserve"> Persons Table -&gt; ID Column: 1, </w:t>
-      </w:r>
-      <w:proofErr w:type="spellStart"/>
-      <w:r>
-        <w:rPr>
-          <w:rFonts w:ascii="Arial" w:eastAsia="Arial" w:hAnsi="Arial"/>
-          <w:sz w:val="18"/>
-          <w:szCs w:val="18"/>
-          <w:highlight w:val="lightGray"/>
-        </w:rPr>
-        <w:t>Name_En</w:t>
-      </w:r>
-      <w:proofErr w:type="spellEnd"/>
-      <w:r>
-        <w:rPr>
-          <w:rFonts w:ascii="Arial" w:eastAsia="Arial" w:hAnsi="Arial"/>
-          <w:sz w:val="18"/>
-          <w:szCs w:val="18"/>
-          <w:highlight w:val="lightGray"/>
-        </w:rPr>
-        <w:t xml:space="preserve"> Column: </w:t>
+        <w:t xml:space="preserve"> Persons Table -&gt; ID Column: 1, Name_En Column: </w:t>
       </w:r>
       <w:r>
         <w:rPr>
@@ -18624,27 +16507,7 @@
           <w:szCs w:val="18"/>
           <w:highlight w:val="lightGray"/>
         </w:rPr>
-        <w:t xml:space="preserve">: Persons Table -&gt; ID Column: 1, </w:t>
-      </w:r>
-      <w:proofErr w:type="spellStart"/>
-      <w:r>
-        <w:rPr>
-          <w:rFonts w:ascii="Arial" w:eastAsia="Arial" w:hAnsi="Arial"/>
-          <w:sz w:val="18"/>
-          <w:szCs w:val="18"/>
-          <w:highlight w:val="lightGray"/>
-        </w:rPr>
-        <w:t>Name_En</w:t>
-      </w:r>
-      <w:proofErr w:type="spellEnd"/>
-      <w:r>
-        <w:rPr>
-          <w:rFonts w:ascii="Arial" w:eastAsia="Arial" w:hAnsi="Arial"/>
-          <w:sz w:val="18"/>
-          <w:szCs w:val="18"/>
-          <w:highlight w:val="lightGray"/>
-        </w:rPr>
-        <w:t xml:space="preserve"> Column: Motasem Essam] -&gt; </w:t>
+        <w:t xml:space="preserve">: Persons Table -&gt; ID Column: 1, Name_En Column: Motasem Essam] -&gt; </w:t>
       </w:r>
       <w:r>
         <w:rPr>
@@ -18971,27 +16834,7 @@
           <w:szCs w:val="18"/>
           <w:highlight w:val="lightGray"/>
         </w:rPr>
-        <w:t xml:space="preserve">: Persons Table -&gt; ID Column: 1, </w:t>
-      </w:r>
-      <w:proofErr w:type="spellStart"/>
-      <w:r>
-        <w:rPr>
-          <w:rFonts w:ascii="Arial" w:eastAsia="Arial" w:hAnsi="Arial"/>
-          <w:sz w:val="18"/>
-          <w:szCs w:val="18"/>
-          <w:highlight w:val="lightGray"/>
-        </w:rPr>
-        <w:t>Name_En</w:t>
-      </w:r>
-      <w:proofErr w:type="spellEnd"/>
-      <w:r>
-        <w:rPr>
-          <w:rFonts w:ascii="Arial" w:eastAsia="Arial" w:hAnsi="Arial"/>
-          <w:sz w:val="18"/>
-          <w:szCs w:val="18"/>
-          <w:highlight w:val="lightGray"/>
-        </w:rPr>
-        <w:t xml:space="preserve"> Column: Motasem Essam] -&gt; </w:t>
+        <w:t xml:space="preserve">: Persons Table -&gt; ID Column: 1, Name_En Column: Motasem Essam] -&gt; </w:t>
       </w:r>
       <w:r>
         <w:rPr>
@@ -19346,27 +17189,7 @@
           <w:szCs w:val="18"/>
           <w:highlight w:val="lightGray"/>
         </w:rPr>
-        <w:t xml:space="preserve">: Persons Table -&gt; ID Column: 1, </w:t>
-      </w:r>
-      <w:proofErr w:type="spellStart"/>
-      <w:r>
-        <w:rPr>
-          <w:rFonts w:ascii="Arial" w:eastAsia="Arial" w:hAnsi="Arial"/>
-          <w:sz w:val="18"/>
-          <w:szCs w:val="18"/>
-          <w:highlight w:val="lightGray"/>
-        </w:rPr>
-        <w:t>Name_En</w:t>
-      </w:r>
-      <w:proofErr w:type="spellEnd"/>
-      <w:r>
-        <w:rPr>
-          <w:rFonts w:ascii="Arial" w:eastAsia="Arial" w:hAnsi="Arial"/>
-          <w:sz w:val="18"/>
-          <w:szCs w:val="18"/>
-          <w:highlight w:val="lightGray"/>
-        </w:rPr>
-        <w:t xml:space="preserve"> Column: Motasem Essam] -&gt; </w:t>
+        <w:t xml:space="preserve">: Persons Table -&gt; ID Column: 1, Name_En Column: Motasem Essam] -&gt; </w:t>
       </w:r>
       <w:r>
         <w:rPr>
@@ -19647,19 +17470,18 @@
           <w:sz w:val="18"/>
           <w:highlight w:val="lightGray"/>
         </w:rPr>
-        <w:t xml:space="preserve">: Persons Table -&gt; ID Column: 1, </w:t>
-      </w:r>
-      <w:proofErr w:type="spellStart"/>
-      <w:r>
-        <w:rPr>
-          <w:rFonts w:ascii="Arial" w:eastAsia="Arial" w:hAnsi="Arial"/>
+        <w:t xml:space="preserve">: Persons Table -&gt; ID Column: 1, Name_En Column: Motasem Essam] -&gt; </w:t>
+      </w:r>
+      <w:r>
+        <w:rPr>
+          <w:rFonts w:ascii="Arial" w:eastAsia="Arial" w:hAnsi="Arial"/>
+          <w:b/>
           <w:color w:val="000000"/>
           <w:sz w:val="18"/>
           <w:highlight w:val="lightGray"/>
         </w:rPr>
-        <w:t>Name_En</w:t>
-      </w:r>
-      <w:proofErr w:type="spellEnd"/>
+        <w:t>From:</w:t>
+      </w:r>
       <w:r>
         <w:rPr>
           <w:rFonts w:ascii="Arial" w:eastAsia="Arial" w:hAnsi="Arial"/>
@@ -19667,46 +17489,7 @@
           <w:sz w:val="18"/>
           <w:highlight w:val="lightGray"/>
         </w:rPr>
-        <w:t xml:space="preserve"> Column: Motasem Essam] -&gt; </w:t>
-      </w:r>
-      <w:r>
-        <w:rPr>
-          <w:rFonts w:ascii="Arial" w:eastAsia="Arial" w:hAnsi="Arial"/>
-          <w:b/>
-          <w:color w:val="000000"/>
-          <w:sz w:val="18"/>
-          <w:highlight w:val="lightGray"/>
-        </w:rPr>
-        <w:t>From:</w:t>
-      </w:r>
-      <w:r>
-        <w:rPr>
-          <w:rFonts w:ascii="Arial" w:eastAsia="Arial" w:hAnsi="Arial"/>
-          <w:color w:val="000000"/>
-          <w:sz w:val="18"/>
-          <w:highlight w:val="lightGray"/>
-        </w:rPr>
-        <w:t xml:space="preserve"> [</w:t>
-      </w:r>
-      <w:proofErr w:type="spellStart"/>
-      <w:r>
-        <w:rPr>
-          <w:rFonts w:ascii="Arial" w:eastAsia="Arial" w:hAnsi="Arial"/>
-          <w:color w:val="000000"/>
-          <w:sz w:val="18"/>
-          <w:highlight w:val="lightGray"/>
-        </w:rPr>
-        <w:t>Chatgpt</w:t>
-      </w:r>
-      <w:proofErr w:type="spellEnd"/>
-      <w:r>
-        <w:rPr>
-          <w:rFonts w:ascii="Arial" w:eastAsia="Arial" w:hAnsi="Arial"/>
-          <w:color w:val="000000"/>
-          <w:sz w:val="18"/>
-          <w:highlight w:val="lightGray"/>
-        </w:rPr>
-        <w:t xml:space="preserve"> (GPT-4-turbo)] </w:t>
+        <w:t xml:space="preserve"> [ChatGPT] </w:t>
       </w:r>
       <w:r>
         <w:rPr>
@@ -20222,27 +18005,7 @@
           <w:szCs w:val="18"/>
           <w:highlight w:val="lightGray"/>
         </w:rPr>
-        <w:t xml:space="preserve">: Persons Table -&gt; ID Column: 1, </w:t>
-      </w:r>
-      <w:proofErr w:type="spellStart"/>
-      <w:r>
-        <w:rPr>
-          <w:rFonts w:ascii="Arial" w:eastAsia="Arial" w:hAnsi="Arial"/>
-          <w:sz w:val="18"/>
-          <w:szCs w:val="18"/>
-          <w:highlight w:val="lightGray"/>
-        </w:rPr>
-        <w:t>Name_En</w:t>
-      </w:r>
-      <w:proofErr w:type="spellEnd"/>
-      <w:r>
-        <w:rPr>
-          <w:rFonts w:ascii="Arial" w:eastAsia="Arial" w:hAnsi="Arial"/>
-          <w:sz w:val="18"/>
-          <w:szCs w:val="18"/>
-          <w:highlight w:val="lightGray"/>
-        </w:rPr>
-        <w:t xml:space="preserve"> Column: Motasem Essam] -&gt; </w:t>
+        <w:t xml:space="preserve">: Persons Table -&gt; ID Column: 1, Name_En Column: Motasem Essam] -&gt; </w:t>
       </w:r>
       <w:r>
         <w:rPr>
@@ -20572,13 +18335,8 @@
       <w:bookmarkStart w:id="49" w:name="_heading=h.9wqeybg3o2by" w:colFirst="0" w:colLast="0"/>
       <w:bookmarkEnd w:id="49"/>
       <w:r>
-        <w:t xml:space="preserve">Types of </w:t>
-      </w:r>
-      <w:proofErr w:type="gramStart"/>
-      <w:r>
-        <w:t>Theorem</w:t>
-      </w:r>
-      <w:proofErr w:type="gramEnd"/>
+        <w:t>Types of Theorem</w:t>
+      </w:r>
     </w:p>
     <w:p>
       <w:pPr>
@@ -20645,27 +18403,7 @@
           <w:szCs w:val="18"/>
           <w:highlight w:val="lightGray"/>
         </w:rPr>
-        <w:t xml:space="preserve">: Persons Table -&gt; ID Column: 1, </w:t>
-      </w:r>
-      <w:proofErr w:type="spellStart"/>
-      <w:r>
-        <w:rPr>
-          <w:rFonts w:ascii="Arial" w:eastAsia="Arial" w:hAnsi="Arial"/>
-          <w:sz w:val="18"/>
-          <w:szCs w:val="18"/>
-          <w:highlight w:val="lightGray"/>
-        </w:rPr>
-        <w:t>Name_En</w:t>
-      </w:r>
-      <w:proofErr w:type="spellEnd"/>
-      <w:r>
-        <w:rPr>
-          <w:rFonts w:ascii="Arial" w:eastAsia="Arial" w:hAnsi="Arial"/>
-          <w:sz w:val="18"/>
-          <w:szCs w:val="18"/>
-          <w:highlight w:val="lightGray"/>
-        </w:rPr>
-        <w:t xml:space="preserve"> Column: Motasem Essam] -&gt; </w:t>
+        <w:t xml:space="preserve">: Persons Table -&gt; ID Column: 1, Name_En Column: Motasem Essam] -&gt; </w:t>
       </w:r>
       <w:r>
         <w:rPr>
@@ -21128,27 +18866,7 @@
           <w:szCs w:val="18"/>
           <w:highlight w:val="lightGray"/>
         </w:rPr>
-        <w:t xml:space="preserve">: Persons Table -&gt; ID Column: 1, </w:t>
-      </w:r>
-      <w:proofErr w:type="spellStart"/>
-      <w:r>
-        <w:rPr>
-          <w:rFonts w:ascii="Arial" w:eastAsia="Arial" w:hAnsi="Arial"/>
-          <w:sz w:val="18"/>
-          <w:szCs w:val="18"/>
-          <w:highlight w:val="lightGray"/>
-        </w:rPr>
-        <w:t>Name_En</w:t>
-      </w:r>
-      <w:proofErr w:type="spellEnd"/>
-      <w:r>
-        <w:rPr>
-          <w:rFonts w:ascii="Arial" w:eastAsia="Arial" w:hAnsi="Arial"/>
-          <w:sz w:val="18"/>
-          <w:szCs w:val="18"/>
-          <w:highlight w:val="lightGray"/>
-        </w:rPr>
-        <w:t xml:space="preserve"> Column: Motasem Essam] -&gt; </w:t>
+        <w:t xml:space="preserve">: Persons Table -&gt; ID Column: 1, Name_En Column: Motasem Essam] -&gt; </w:t>
       </w:r>
       <w:r>
         <w:rPr>
@@ -21479,27 +19197,7 @@
           <w:szCs w:val="18"/>
           <w:highlight w:val="lightGray"/>
         </w:rPr>
-        <w:t xml:space="preserve">: Persons Table -&gt; ID Column: 1, </w:t>
-      </w:r>
-      <w:proofErr w:type="spellStart"/>
-      <w:r>
-        <w:rPr>
-          <w:rFonts w:ascii="Arial" w:eastAsia="Arial" w:hAnsi="Arial"/>
-          <w:sz w:val="18"/>
-          <w:szCs w:val="18"/>
-          <w:highlight w:val="lightGray"/>
-        </w:rPr>
-        <w:t>Name_En</w:t>
-      </w:r>
-      <w:proofErr w:type="spellEnd"/>
-      <w:r>
-        <w:rPr>
-          <w:rFonts w:ascii="Arial" w:eastAsia="Arial" w:hAnsi="Arial"/>
-          <w:sz w:val="18"/>
-          <w:szCs w:val="18"/>
-          <w:highlight w:val="lightGray"/>
-        </w:rPr>
-        <w:t xml:space="preserve"> Column: Motasem Essam] -&gt; </w:t>
+        <w:t xml:space="preserve">: Persons Table -&gt; ID Column: 1, Name_En Column: Motasem Essam] -&gt; </w:t>
       </w:r>
       <w:r>
         <w:rPr>
@@ -21836,27 +19534,7 @@
           <w:szCs w:val="18"/>
           <w:highlight w:val="lightGray"/>
         </w:rPr>
-        <w:t xml:space="preserve">: Persons Table -&gt; ID Column: 1, </w:t>
-      </w:r>
-      <w:proofErr w:type="spellStart"/>
-      <w:r>
-        <w:rPr>
-          <w:rFonts w:ascii="Arial" w:eastAsia="Arial" w:hAnsi="Arial"/>
-          <w:sz w:val="18"/>
-          <w:szCs w:val="18"/>
-          <w:highlight w:val="lightGray"/>
-        </w:rPr>
-        <w:t>Name_En</w:t>
-      </w:r>
-      <w:proofErr w:type="spellEnd"/>
-      <w:r>
-        <w:rPr>
-          <w:rFonts w:ascii="Arial" w:eastAsia="Arial" w:hAnsi="Arial"/>
-          <w:sz w:val="18"/>
-          <w:szCs w:val="18"/>
-          <w:highlight w:val="lightGray"/>
-        </w:rPr>
-        <w:t xml:space="preserve"> Column: Motasem Essam] -&gt; </w:t>
+        <w:t xml:space="preserve">: Persons Table -&gt; ID Column: 1, Name_En Column: Motasem Essam] -&gt; </w:t>
       </w:r>
       <w:r>
         <w:rPr>
@@ -22183,27 +19861,7 @@
           <w:szCs w:val="18"/>
           <w:highlight w:val="lightGray"/>
         </w:rPr>
-        <w:t xml:space="preserve">: Persons Table -&gt; ID Column: 1, </w:t>
-      </w:r>
-      <w:proofErr w:type="spellStart"/>
-      <w:r>
-        <w:rPr>
-          <w:rFonts w:ascii="Arial" w:eastAsia="Arial" w:hAnsi="Arial"/>
-          <w:sz w:val="18"/>
-          <w:szCs w:val="18"/>
-          <w:highlight w:val="lightGray"/>
-        </w:rPr>
-        <w:t>Name_En</w:t>
-      </w:r>
-      <w:proofErr w:type="spellEnd"/>
-      <w:r>
-        <w:rPr>
-          <w:rFonts w:ascii="Arial" w:eastAsia="Arial" w:hAnsi="Arial"/>
-          <w:sz w:val="18"/>
-          <w:szCs w:val="18"/>
-          <w:highlight w:val="lightGray"/>
-        </w:rPr>
-        <w:t xml:space="preserve"> Column: Motasem Essam] -&gt; </w:t>
+        <w:t xml:space="preserve">: Persons Table -&gt; ID Column: 1, Name_En Column: Motasem Essam] -&gt; </w:t>
       </w:r>
       <w:r>
         <w:rPr>
@@ -22534,27 +20192,7 @@
           <w:szCs w:val="18"/>
           <w:highlight w:val="lightGray"/>
         </w:rPr>
-        <w:t xml:space="preserve">: Persons Table -&gt; ID Column: 1, </w:t>
-      </w:r>
-      <w:proofErr w:type="spellStart"/>
-      <w:r>
-        <w:rPr>
-          <w:rFonts w:ascii="Arial" w:eastAsia="Arial" w:hAnsi="Arial"/>
-          <w:sz w:val="18"/>
-          <w:szCs w:val="18"/>
-          <w:highlight w:val="lightGray"/>
-        </w:rPr>
-        <w:t>Name_En</w:t>
-      </w:r>
-      <w:proofErr w:type="spellEnd"/>
-      <w:r>
-        <w:rPr>
-          <w:rFonts w:ascii="Arial" w:eastAsia="Arial" w:hAnsi="Arial"/>
-          <w:sz w:val="18"/>
-          <w:szCs w:val="18"/>
-          <w:highlight w:val="lightGray"/>
-        </w:rPr>
-        <w:t xml:space="preserve"> Column: Motasem Essam] -&gt; </w:t>
+        <w:t xml:space="preserve">: Persons Table -&gt; ID Column: 1, Name_En Column: Motasem Essam] -&gt; </w:t>
       </w:r>
       <w:r>
         <w:rPr>
@@ -22851,27 +20489,7 @@
           <w:szCs w:val="18"/>
           <w:highlight w:val="lightGray"/>
         </w:rPr>
-        <w:t xml:space="preserve">: Persons Table -&gt; ID Column: 1, </w:t>
-      </w:r>
-      <w:proofErr w:type="spellStart"/>
-      <w:r>
-        <w:rPr>
-          <w:rFonts w:ascii="Arial" w:eastAsia="Arial" w:hAnsi="Arial"/>
-          <w:sz w:val="18"/>
-          <w:szCs w:val="18"/>
-          <w:highlight w:val="lightGray"/>
-        </w:rPr>
-        <w:t>Name_En</w:t>
-      </w:r>
-      <w:proofErr w:type="spellEnd"/>
-      <w:r>
-        <w:rPr>
-          <w:rFonts w:ascii="Arial" w:eastAsia="Arial" w:hAnsi="Arial"/>
-          <w:sz w:val="18"/>
-          <w:szCs w:val="18"/>
-          <w:highlight w:val="lightGray"/>
-        </w:rPr>
-        <w:t xml:space="preserve"> Column: Motasem Essam] -&gt; </w:t>
+        <w:t xml:space="preserve">: Persons Table -&gt; ID Column: 1, Name_En Column: Motasem Essam] -&gt; </w:t>
       </w:r>
       <w:r>
         <w:rPr>
@@ -23203,27 +20821,7 @@
           <w:szCs w:val="18"/>
           <w:highlight w:val="lightGray"/>
         </w:rPr>
-        <w:t xml:space="preserve">: Persons Table -&gt; ID Column: 1, </w:t>
-      </w:r>
-      <w:proofErr w:type="spellStart"/>
-      <w:r>
-        <w:rPr>
-          <w:rFonts w:ascii="Arial" w:eastAsia="Arial" w:hAnsi="Arial"/>
-          <w:sz w:val="18"/>
-          <w:szCs w:val="18"/>
-          <w:highlight w:val="lightGray"/>
-        </w:rPr>
-        <w:t>Name_En</w:t>
-      </w:r>
-      <w:proofErr w:type="spellEnd"/>
-      <w:r>
-        <w:rPr>
-          <w:rFonts w:ascii="Arial" w:eastAsia="Arial" w:hAnsi="Arial"/>
-          <w:sz w:val="18"/>
-          <w:szCs w:val="18"/>
-          <w:highlight w:val="lightGray"/>
-        </w:rPr>
-        <w:t xml:space="preserve"> Column: Motasem Essam] -&gt; </w:t>
+        <w:t xml:space="preserve">: Persons Table -&gt; ID Column: 1, Name_En Column: Motasem Essam] -&gt; </w:t>
       </w:r>
       <w:r>
         <w:rPr>
@@ -23557,27 +21155,7 @@
           <w:szCs w:val="18"/>
           <w:highlight w:val="lightGray"/>
         </w:rPr>
-        <w:t xml:space="preserve">: Persons Table -&gt; ID Column: 1, </w:t>
-      </w:r>
-      <w:proofErr w:type="spellStart"/>
-      <w:r>
-        <w:rPr>
-          <w:rFonts w:ascii="Arial" w:eastAsia="Arial" w:hAnsi="Arial"/>
-          <w:sz w:val="18"/>
-          <w:szCs w:val="18"/>
-          <w:highlight w:val="lightGray"/>
-        </w:rPr>
-        <w:t>Name_En</w:t>
-      </w:r>
-      <w:proofErr w:type="spellEnd"/>
-      <w:r>
-        <w:rPr>
-          <w:rFonts w:ascii="Arial" w:eastAsia="Arial" w:hAnsi="Arial"/>
-          <w:sz w:val="18"/>
-          <w:szCs w:val="18"/>
-          <w:highlight w:val="lightGray"/>
-        </w:rPr>
-        <w:t xml:space="preserve"> Column: Motasem Essam] -&gt; </w:t>
+        <w:t xml:space="preserve">: Persons Table -&gt; ID Column: 1, Name_En Column: Motasem Essam] -&gt; </w:t>
       </w:r>
       <w:r>
         <w:rPr>
@@ -23915,27 +21493,7 @@
           <w:szCs w:val="18"/>
           <w:highlight w:val="lightGray"/>
         </w:rPr>
-        <w:t xml:space="preserve">: Persons Table -&gt; ID Column: 1, </w:t>
-      </w:r>
-      <w:proofErr w:type="spellStart"/>
-      <w:r>
-        <w:rPr>
-          <w:rFonts w:ascii="Arial" w:eastAsia="Arial" w:hAnsi="Arial"/>
-          <w:sz w:val="18"/>
-          <w:szCs w:val="18"/>
-          <w:highlight w:val="lightGray"/>
-        </w:rPr>
-        <w:t>Name_En</w:t>
-      </w:r>
-      <w:proofErr w:type="spellEnd"/>
-      <w:r>
-        <w:rPr>
-          <w:rFonts w:ascii="Arial" w:eastAsia="Arial" w:hAnsi="Arial"/>
-          <w:sz w:val="18"/>
-          <w:szCs w:val="18"/>
-          <w:highlight w:val="lightGray"/>
-        </w:rPr>
-        <w:t xml:space="preserve"> Column: Motasem Essam] -&gt; </w:t>
+        <w:t xml:space="preserve">: Persons Table -&gt; ID Column: 1, Name_En Column: Motasem Essam] -&gt; </w:t>
       </w:r>
       <w:r>
         <w:rPr>
@@ -24612,19 +22170,18 @@
           <w:sz w:val="18"/>
           <w:highlight w:val="lightGray"/>
         </w:rPr>
-        <w:t xml:space="preserve">: Persons Table -&gt; ID Column: 1, </w:t>
-      </w:r>
-      <w:proofErr w:type="spellStart"/>
-      <w:r>
-        <w:rPr>
-          <w:rFonts w:ascii="Arial" w:eastAsia="Arial" w:hAnsi="Arial"/>
+        <w:t xml:space="preserve">: Persons Table -&gt; ID Column: 1, Name_En Column: Motasem Essam] -&gt; </w:t>
+      </w:r>
+      <w:r>
+        <w:rPr>
+          <w:rFonts w:ascii="Arial" w:eastAsia="Arial" w:hAnsi="Arial"/>
+          <w:b/>
           <w:color w:val="000000"/>
           <w:sz w:val="18"/>
           <w:highlight w:val="lightGray"/>
         </w:rPr>
-        <w:t>Name_En</w:t>
-      </w:r>
-      <w:proofErr w:type="spellEnd"/>
+        <w:t>From:</w:t>
+      </w:r>
       <w:r>
         <w:rPr>
           <w:rFonts w:ascii="Arial" w:eastAsia="Arial" w:hAnsi="Arial"/>
@@ -24632,46 +22189,7 @@
           <w:sz w:val="18"/>
           <w:highlight w:val="lightGray"/>
         </w:rPr>
-        <w:t xml:space="preserve"> Column: Motasem Essam] -&gt; </w:t>
-      </w:r>
-      <w:r>
-        <w:rPr>
-          <w:rFonts w:ascii="Arial" w:eastAsia="Arial" w:hAnsi="Arial"/>
-          <w:b/>
-          <w:color w:val="000000"/>
-          <w:sz w:val="18"/>
-          <w:highlight w:val="lightGray"/>
-        </w:rPr>
-        <w:t>From:</w:t>
-      </w:r>
-      <w:r>
-        <w:rPr>
-          <w:rFonts w:ascii="Arial" w:eastAsia="Arial" w:hAnsi="Arial"/>
-          <w:color w:val="000000"/>
-          <w:sz w:val="18"/>
-          <w:highlight w:val="lightGray"/>
-        </w:rPr>
-        <w:t xml:space="preserve"> [</w:t>
-      </w:r>
-      <w:proofErr w:type="spellStart"/>
-      <w:r>
-        <w:rPr>
-          <w:rFonts w:ascii="Arial" w:eastAsia="Arial" w:hAnsi="Arial"/>
-          <w:color w:val="000000"/>
-          <w:sz w:val="18"/>
-          <w:highlight w:val="lightGray"/>
-        </w:rPr>
-        <w:t>Chatgpt</w:t>
-      </w:r>
-      <w:proofErr w:type="spellEnd"/>
-      <w:r>
-        <w:rPr>
-          <w:rFonts w:ascii="Arial" w:eastAsia="Arial" w:hAnsi="Arial"/>
-          <w:color w:val="000000"/>
-          <w:sz w:val="18"/>
-          <w:highlight w:val="lightGray"/>
-        </w:rPr>
-        <w:t xml:space="preserve"> (GPT-4-turbo)] </w:t>
+        <w:t xml:space="preserve"> [ChatGPT] </w:t>
       </w:r>
       <w:r>
         <w:rPr>
@@ -24777,19 +22295,18 @@
           <w:sz w:val="18"/>
           <w:highlight w:val="lightGray"/>
         </w:rPr>
-        <w:t xml:space="preserve">: Persons Table -&gt; ID Column: 1, </w:t>
-      </w:r>
-      <w:proofErr w:type="spellStart"/>
-      <w:r>
-        <w:rPr>
-          <w:rFonts w:ascii="Arial" w:eastAsia="Arial" w:hAnsi="Arial"/>
+        <w:t xml:space="preserve">: Persons Table -&gt; ID Column: 1, Name_En Column: Motasem Essam] -&gt; </w:t>
+      </w:r>
+      <w:r>
+        <w:rPr>
+          <w:rFonts w:ascii="Arial" w:eastAsia="Arial" w:hAnsi="Arial"/>
+          <w:b/>
           <w:color w:val="000000"/>
           <w:sz w:val="18"/>
           <w:highlight w:val="lightGray"/>
         </w:rPr>
-        <w:t>Name_En</w:t>
-      </w:r>
-      <w:proofErr w:type="spellEnd"/>
+        <w:t>From:</w:t>
+      </w:r>
       <w:r>
         <w:rPr>
           <w:rFonts w:ascii="Arial" w:eastAsia="Arial" w:hAnsi="Arial"/>
@@ -24797,7 +22314,7 @@
           <w:sz w:val="18"/>
           <w:highlight w:val="lightGray"/>
         </w:rPr>
-        <w:t xml:space="preserve"> Column: Motasem Essam] -&gt; </w:t>
+        <w:t xml:space="preserve"> [ChatGPT] </w:t>
       </w:r>
       <w:r>
         <w:rPr>
@@ -24807,7 +22324,7 @@
           <w:sz w:val="18"/>
           <w:highlight w:val="lightGray"/>
         </w:rPr>
-        <w:t>From:</w:t>
+        <w:t xml:space="preserve">on </w:t>
       </w:r>
       <w:r>
         <w:rPr>
@@ -24816,49 +22333,9 @@
           <w:sz w:val="18"/>
           <w:highlight w:val="lightGray"/>
         </w:rPr>
-        <w:t xml:space="preserve"> [</w:t>
-      </w:r>
-      <w:proofErr w:type="spellStart"/>
-      <w:r>
-        <w:rPr>
-          <w:rFonts w:ascii="Arial" w:eastAsia="Arial" w:hAnsi="Arial"/>
-          <w:color w:val="000000"/>
-          <w:sz w:val="18"/>
-          <w:highlight w:val="lightGray"/>
-        </w:rPr>
-        <w:t>Chatgpt</w:t>
-      </w:r>
-      <w:proofErr w:type="spellEnd"/>
-      <w:r>
-        <w:rPr>
-          <w:rFonts w:ascii="Arial" w:eastAsia="Arial" w:hAnsi="Arial"/>
-          <w:color w:val="000000"/>
-          <w:sz w:val="18"/>
-          <w:highlight w:val="lightGray"/>
-        </w:rPr>
-        <w:t xml:space="preserve"> (GPT-4-turbo)] </w:t>
-      </w:r>
-      <w:r>
-        <w:rPr>
-          <w:rFonts w:ascii="Arial" w:eastAsia="Arial" w:hAnsi="Arial"/>
-          <w:b/>
-          <w:color w:val="000000"/>
-          <w:sz w:val="18"/>
-          <w:highlight w:val="lightGray"/>
-        </w:rPr>
-        <w:t xml:space="preserve">on </w:t>
-      </w:r>
-      <w:r>
-        <w:rPr>
-          <w:rFonts w:ascii="Arial" w:eastAsia="Arial" w:hAnsi="Arial"/>
-          <w:color w:val="000000"/>
-          <w:sz w:val="18"/>
-          <w:highlight w:val="lightGray"/>
-        </w:rPr>
         <w:t>[7/17/2025]</w:t>
       </w:r>
     </w:p>
-    <w:p/>
     <w:p>
       <w:pPr>
         <w:rPr>
@@ -24927,7 +22404,6 @@
           <w:rFonts w:ascii="Roboto Mono" w:eastAsia="Roboto Mono" w:hAnsi="Roboto Mono" w:cs="Roboto Mono"/>
           <w:b/>
         </w:rPr>
-        <w:lastRenderedPageBreak/>
         <w:t>Example</w:t>
       </w:r>
       <w:r>
@@ -25371,6 +22847,7 @@
         <w:rPr>
           <w:b/>
         </w:rPr>
+        <w:lastRenderedPageBreak/>
         <w:t>4- Disjunctive Syllogism</w:t>
       </w:r>
       <w:r>
@@ -26182,8 +23659,6 @@
         <w:t>Conclusion: It is raining. (P)</w:t>
       </w:r>
     </w:p>
-    <w:p/>
-    <w:p/>
     <w:sectPr>
       <w:pgSz w:w="12240" w:h="15840"/>
       <w:pgMar w:top="1440" w:right="1440" w:bottom="1440" w:left="1440" w:header="720" w:footer="720" w:gutter="0"/>

</xml_diff>